<commit_message>
First pass at results (in docx for now)
</commit_message>
<xml_diff>
--- a/writing/submissions/JESP/R2/smile_R2_writing_full.docx
+++ b/writing/submissions/JESP/R2/smile_R2_writing_full.docx
@@ -1,6 +1,6 @@
 
 <file path=word/document.xml><?xml version="1.0" encoding="utf-8"?>
-<w:document xmlns:wpc="http://schemas.microsoft.com/office/word/2010/wordprocessingCanvas" xmlns:cx="http://schemas.microsoft.com/office/drawing/2014/chartex" xmlns:cx1="http://schemas.microsoft.com/office/drawing/2015/9/8/chartex" xmlns:cx2="http://schemas.microsoft.com/office/drawing/2015/10/21/chartex" xmlns:cx3="http://schemas.microsoft.com/office/drawing/2016/5/9/chartex" xmlns:cx4="http://schemas.microsoft.com/office/drawing/2016/5/10/chartex" xmlns:cx5="http://schemas.microsoft.com/office/drawing/2016/5/11/chartex" xmlns:cx6="http://schemas.microsoft.com/office/drawing/2016/5/12/chartex" xmlns:cx7="http://schemas.microsoft.com/office/drawing/2016/5/13/chartex" xmlns:cx8="http://schemas.microsoft.com/office/drawing/2016/5/14/chartex" xmlns:mc="http://schemas.openxmlformats.org/markup-compatibility/2006" xmlns:aink="http://schemas.microsoft.com/office/drawing/2016/ink" xmlns:am3d="http://schemas.microsoft.com/office/drawing/2017/model3d" xmlns:o="urn:schemas-microsoft-com:office:office" xmlns:oel="http://schemas.microsoft.com/office/2019/extlst" xmlns:r="http://schemas.openxmlformats.org/officeDocument/2006/relationships" xmlns:m="http://schemas.openxmlformats.org/officeDocument/2006/math" xmlns:v="urn:schemas-microsoft-com:vml" xmlns:wp14="http://schemas.microsoft.com/office/word/2010/wordprocessingDrawing" xmlns:wp="http://schemas.openxmlformats.org/drawingml/2006/wordprocessingDrawing" xmlns:w10="urn:schemas-microsoft-com:office:word" xmlns:w="http://schemas.openxmlformats.org/wordprocessingml/2006/main" xmlns:w14="http://schemas.microsoft.com/office/word/2010/wordml" xmlns:w15="http://schemas.microsoft.com/office/word/2012/wordml" xmlns:w16cex="http://schemas.microsoft.com/office/word/2018/wordml/cex" xmlns:w16cid="http://schemas.microsoft.com/office/word/2016/wordml/cid" xmlns:w16="http://schemas.microsoft.com/office/word/2018/wordml" xmlns:w16du="http://schemas.microsoft.com/office/word/2023/wordml/word16du" xmlns:w16sdtdh="http://schemas.microsoft.com/office/word/2020/wordml/sdtdatahash" xmlns:w16sdtfl="http://schemas.microsoft.com/office/word/2024/wordml/sdtformatlock" xmlns:w16se="http://schemas.microsoft.com/office/word/2015/wordml/symex" xmlns:wpg="http://schemas.microsoft.com/office/word/2010/wordprocessingGroup" xmlns:wpi="http://schemas.microsoft.com/office/word/2010/wordprocessingInk" xmlns:wne="http://schemas.microsoft.com/office/word/2006/wordml" xmlns:wps="http://schemas.microsoft.com/office/word/2010/wordprocessingShape" mc:Ignorable="w14 w15 w16se w16cid w16 w16cex w16sdtdh w16sdtfl w16du wp14">
+<w:document xmlns:wpc="http://schemas.microsoft.com/office/word/2010/wordprocessingCanvas" xmlns:cx="http://schemas.microsoft.com/office/drawing/2014/chartex" xmlns:cx1="http://schemas.microsoft.com/office/drawing/2015/9/8/chartex" xmlns:cx2="http://schemas.microsoft.com/office/drawing/2015/10/21/chartex" xmlns:cx3="http://schemas.microsoft.com/office/drawing/2016/5/9/chartex" xmlns:cx4="http://schemas.microsoft.com/office/drawing/2016/5/10/chartex" xmlns:cx5="http://schemas.microsoft.com/office/drawing/2016/5/11/chartex" xmlns:cx6="http://schemas.microsoft.com/office/drawing/2016/5/12/chartex" xmlns:cx7="http://schemas.microsoft.com/office/drawing/2016/5/13/chartex" xmlns:cx8="http://schemas.microsoft.com/office/drawing/2016/5/14/chartex" xmlns:mc="http://schemas.openxmlformats.org/markup-compatibility/2006" xmlns:m="http://schemas.openxmlformats.org/officeDocument/2006/math" xmlns:aink="http://schemas.microsoft.com/office/drawing/2016/ink" xmlns:am3d="http://schemas.microsoft.com/office/drawing/2017/model3d" xmlns:oel="http://schemas.microsoft.com/office/2019/extlst" xmlns:r="http://schemas.openxmlformats.org/officeDocument/2006/relationships" xmlns:wp14="http://schemas.microsoft.com/office/word/2010/wordprocessingDrawing" xmlns:wp="http://schemas.openxmlformats.org/drawingml/2006/wordprocessingDrawing" xmlns:wpg="http://schemas.microsoft.com/office/word/2010/wordprocessingGroup" xmlns:wpi="http://schemas.microsoft.com/office/word/2010/wordprocessingInk" xmlns:wps="http://schemas.microsoft.com/office/word/2010/wordprocessingShape" xmlns:o="urn:schemas-microsoft-com:office:office" xmlns:v="urn:schemas-microsoft-com:vml" xmlns:w10="urn:schemas-microsoft-com:office:word" xmlns:w="http://schemas.openxmlformats.org/wordprocessingml/2006/main" xmlns:w14="http://schemas.microsoft.com/office/word/2010/wordml" xmlns:w15="http://schemas.microsoft.com/office/word/2012/wordml" xmlns:w16cei="http://schemas.microsoft.com/office/word/2026/wordml/cei" xmlns:w16cex="http://schemas.microsoft.com/office/word/2018/wordml/cex" xmlns:w16cid="http://schemas.microsoft.com/office/word/2016/wordml/cid" xmlns:w16="http://schemas.microsoft.com/office/word/2018/wordml" xmlns:w16sdtdh="http://schemas.microsoft.com/office/word/2020/wordml/sdtdatahash" xmlns:w16sdtfl="http://schemas.microsoft.com/office/word/2024/wordml/sdtformatlock" xmlns:w16se="http://schemas.microsoft.com/office/word/2015/wordml/symex" xmlns:w16du="http://schemas.microsoft.com/office/word/2023/wordml/word16du" xmlns:wne="http://schemas.microsoft.com/office/word/2006/wordml" mc:Ignorable="w14 w15 w16se w16cid w16 w16cex w16sdtdh w16sdtfl w16du wp14">
   <w:body>
     <w:p>
       <w:pPr>
@@ -6302,7 +6302,35 @@
         <w:rPr>
           <w:rFonts w:cs="Times New Roman"/>
         </w:rPr>
-        <w:t xml:space="preserve">Overview of potential patterns when </w:t>
+        <w:t xml:space="preserve">Overview of </w:t>
+      </w:r>
+      <w:del w:id="8" w:author="Coles, Nicholas A." w:date="2026-08-05T15:35:00Z" w16du:dateUtc="2026-08-05T19:35:00Z">
+        <w:r>
+          <w:rPr>
+            <w:rFonts w:cs="Times New Roman"/>
+          </w:rPr>
+          <w:delText xml:space="preserve">potential </w:delText>
+        </w:r>
+      </w:del>
+      <w:ins w:id="9" w:author="Coles, Nicholas A." w:date="2026-08-05T15:35:00Z" w16du:dateUtc="2026-08-05T19:35:00Z">
+        <w:r>
+          <w:rPr>
+            <w:rFonts w:cs="Times New Roman"/>
+          </w:rPr>
+          <w:t>hypothesized and actual</w:t>
+        </w:r>
+        <w:r>
+          <w:rPr>
+            <w:rFonts w:cs="Times New Roman"/>
+          </w:rPr>
+          <w:t xml:space="preserve"> </w:t>
+        </w:r>
+      </w:ins>
+      <w:r>
+        <w:rPr>
+          <w:rFonts w:cs="Times New Roman"/>
+        </w:rPr>
+        <w:t xml:space="preserve">patterns when </w:t>
       </w:r>
       <w:r>
         <w:rPr>
@@ -6374,8 +6402,16 @@
         <w:rPr>
           <w:rFonts w:cs="Times New Roman"/>
         </w:rPr>
-        <w:t xml:space="preserve">'s denote a predicted </w:t>
-      </w:r>
+        <w:t xml:space="preserve">'s denote a </w:t>
+      </w:r>
+      <w:del w:id="10" w:author="Coles, Nicholas A." w:date="2026-08-05T15:35:00Z" w16du:dateUtc="2026-08-05T19:35:00Z">
+        <w:r>
+          <w:rPr>
+            <w:rFonts w:cs="Times New Roman"/>
+          </w:rPr>
+          <w:delText xml:space="preserve">predicted </w:delText>
+        </w:r>
+      </w:del>
       <w:r>
         <w:rPr>
           <w:rFonts w:cs="Times New Roman"/>
@@ -6400,12 +6436,68 @@
         </w:rPr>
         <w:t>ace Movement on self-reported happiness</w:t>
       </w:r>
-      <w:r>
-        <w:rPr>
-          <w:rFonts w:cs="Times New Roman"/>
-        </w:rPr>
-        <w:t>.</w:t>
-      </w:r>
+      <w:ins w:id="11" w:author="Coles, Nicholas A." w:date="2026-08-05T15:33:00Z" w16du:dateUtc="2026-08-05T19:33:00Z">
+        <w:r>
+          <w:rPr>
+            <w:rFonts w:cs="Times New Roman"/>
+          </w:rPr>
+          <w:t xml:space="preserve">, </w:t>
+        </w:r>
+      </w:ins>
+      <w:proofErr w:type="gramStart"/>
+      <w:ins w:id="12" w:author="Coles, Nicholas A." w:date="2026-08-05T15:34:00Z" w16du:dateUtc="2026-08-05T19:34:00Z">
+        <w:r>
+          <w:rPr>
+            <w:rFonts w:ascii="Segoe UI Symbol" w:eastAsia="Times New Roman" w:hAnsi="Segoe UI Symbol" w:cs="Segoe UI Symbol"/>
+            <w:color w:val="000000"/>
+          </w:rPr>
+          <w:t>X</w:t>
+        </w:r>
+        <w:r>
+          <w:rPr>
+            <w:rFonts w:ascii="Segoe UI Symbol" w:eastAsia="Times New Roman" w:hAnsi="Segoe UI Symbol" w:cs="Segoe UI Symbol"/>
+            <w:color w:val="000000"/>
+          </w:rPr>
+          <w:t>’</w:t>
+        </w:r>
+        <w:r>
+          <w:rPr>
+            <w:rFonts w:cs="Times New Roman"/>
+          </w:rPr>
+          <w:t>s</w:t>
+        </w:r>
+        <w:proofErr w:type="gramEnd"/>
+        <w:r>
+          <w:rPr>
+            <w:rFonts w:cs="Times New Roman"/>
+          </w:rPr>
+          <w:t xml:space="preserve"> denote </w:t>
+        </w:r>
+      </w:ins>
+      <w:ins w:id="13" w:author="Coles, Nicholas A." w:date="2026-08-05T15:35:00Z" w16du:dateUtc="2026-08-05T19:35:00Z">
+        <w:r>
+          <w:rPr>
+            <w:rFonts w:cs="Times New Roman"/>
+          </w:rPr>
+          <w:t xml:space="preserve">a negative effect, and </w:t>
+        </w:r>
+      </w:ins>
+      <w:ins w:id="14" w:author="Coles, Nicholas A." w:date="2026-08-05T15:36:00Z" w16du:dateUtc="2026-08-05T19:36:00Z">
+        <w:r>
+          <w:rPr>
+            <w:rFonts w:cs="Times New Roman"/>
+          </w:rPr>
+          <w:t>blank cells denote a null effect.</w:t>
+        </w:r>
+      </w:ins>
+      <w:del w:id="15" w:author="Coles, Nicholas A." w:date="2026-08-05T15:36:00Z" w16du:dateUtc="2026-08-05T19:36:00Z">
+        <w:r>
+          <w:rPr>
+            <w:rFonts w:cs="Times New Roman"/>
+          </w:rPr>
+          <w:delText>.</w:delText>
+        </w:r>
+      </w:del>
       <w:r>
         <w:rPr>
           <w:rFonts w:cs="Times New Roman"/>
@@ -6427,17 +6519,42 @@
     </w:p>
     <w:tbl>
       <w:tblPr>
-        <w:tblW w:w="12134" w:type="dxa"/>
+        <w:tblW w:w="13230" w:type="dxa"/>
+        <w:tblLayout w:type="fixed"/>
         <w:tblLook w:val="04A0" w:firstRow="1" w:lastRow="0" w:firstColumn="1" w:lastColumn="0" w:noHBand="0" w:noVBand="1"/>
       </w:tblPr>
       <w:tblGrid>
-        <w:gridCol w:w="2250"/>
+        <w:gridCol w:w="2162"/>
         <w:gridCol w:w="2610"/>
         <w:gridCol w:w="1443"/>
-        <w:gridCol w:w="345"/>
-        <w:gridCol w:w="2556"/>
-        <w:gridCol w:w="1380"/>
-        <w:gridCol w:w="1550"/>
+        <w:gridCol w:w="276"/>
+        <w:gridCol w:w="2600"/>
+        <w:gridCol w:w="1283"/>
+        <w:gridCol w:w="1506"/>
+        <w:gridCol w:w="270"/>
+        <w:gridCol w:w="1080"/>
+        <w:tblGridChange w:id="16">
+          <w:tblGrid>
+            <w:gridCol w:w="2162"/>
+            <w:gridCol w:w="88"/>
+            <w:gridCol w:w="2522"/>
+            <w:gridCol w:w="88"/>
+            <w:gridCol w:w="1355"/>
+            <w:gridCol w:w="88"/>
+            <w:gridCol w:w="188"/>
+            <w:gridCol w:w="157"/>
+            <w:gridCol w:w="2443"/>
+            <w:gridCol w:w="113"/>
+            <w:gridCol w:w="1170"/>
+            <w:gridCol w:w="210"/>
+            <w:gridCol w:w="1296"/>
+            <w:gridCol w:w="254"/>
+            <w:gridCol w:w="16"/>
+            <w:gridCol w:w="270"/>
+            <w:gridCol w:w="286"/>
+            <w:gridCol w:w="524"/>
+          </w:tblGrid>
+        </w:tblGridChange>
       </w:tblGrid>
       <w:tr>
         <w:trPr>
@@ -6445,7 +6562,7 @@
         </w:trPr>
         <w:tc>
           <w:tcPr>
-            <w:tcW w:w="6303" w:type="dxa"/>
+            <w:tcW w:w="6215" w:type="dxa"/>
             <w:gridSpan w:val="3"/>
             <w:tcBorders>
               <w:top w:val="single" w:sz="4" w:space="0" w:color="auto"/>
@@ -6475,31 +6592,13 @@
                 <w:bCs/>
                 <w:color w:val="000000"/>
               </w:rPr>
-              <w:t xml:space="preserve">Factor </w:t>
-            </w:r>
-            <w:r>
-              <w:rPr>
-                <w:rFonts w:eastAsia="Times New Roman" w:cs="Times New Roman"/>
-                <w:b/>
-                <w:bCs/>
-                <w:color w:val="000000"/>
-              </w:rPr>
-              <w:t>L</w:t>
-            </w:r>
-            <w:r>
-              <w:rPr>
-                <w:rFonts w:eastAsia="Times New Roman" w:cs="Times New Roman"/>
-                <w:b/>
-                <w:bCs/>
-                <w:color w:val="000000"/>
-              </w:rPr>
-              <w:t>evels</w:t>
+              <w:t>Factor Levels</w:t>
             </w:r>
           </w:p>
         </w:tc>
         <w:tc>
           <w:tcPr>
-            <w:tcW w:w="345" w:type="dxa"/>
+            <w:tcW w:w="276" w:type="dxa"/>
             <w:tcBorders>
               <w:top w:val="single" w:sz="4" w:space="0" w:color="auto"/>
               <w:left w:val="nil"/>
@@ -6525,7 +6624,7 @@
         </w:tc>
         <w:tc>
           <w:tcPr>
-            <w:tcW w:w="5486" w:type="dxa"/>
+            <w:tcW w:w="5389" w:type="dxa"/>
             <w:gridSpan w:val="3"/>
             <w:tcBorders>
               <w:top w:val="single" w:sz="4" w:space="0" w:color="auto"/>
@@ -6559,6 +6658,75 @@
             </w:r>
           </w:p>
         </w:tc>
+        <w:tc>
+          <w:tcPr>
+            <w:tcW w:w="270" w:type="dxa"/>
+            <w:tcBorders>
+              <w:top w:val="single" w:sz="4" w:space="0" w:color="auto"/>
+              <w:left w:val="nil"/>
+              <w:right w:val="nil"/>
+            </w:tcBorders>
+          </w:tcPr>
+          <w:p>
+            <w:pPr>
+              <w:spacing w:after="0" w:line="360" w:lineRule="auto"/>
+              <w:jc w:val="center"/>
+              <w:rPr>
+                <w:rFonts w:eastAsia="Times New Roman" w:cs="Times New Roman"/>
+                <w:b/>
+                <w:bCs/>
+                <w:color w:val="000000"/>
+              </w:rPr>
+            </w:pPr>
+          </w:p>
+        </w:tc>
+        <w:tc>
+          <w:tcPr>
+            <w:tcW w:w="1080" w:type="dxa"/>
+            <w:vMerge w:val="restart"/>
+            <w:tcBorders>
+              <w:top w:val="single" w:sz="4" w:space="0" w:color="auto"/>
+              <w:left w:val="nil"/>
+              <w:right w:val="nil"/>
+            </w:tcBorders>
+          </w:tcPr>
+          <w:p>
+            <w:pPr>
+              <w:spacing w:after="0" w:line="360" w:lineRule="auto"/>
+              <w:jc w:val="center"/>
+              <w:rPr>
+                <w:ins w:id="17" w:author="Coles, Nicholas A." w:date="2026-08-05T15:32:00Z" w16du:dateUtc="2026-08-05T19:32:00Z"/>
+                <w:rFonts w:eastAsia="Times New Roman" w:cs="Times New Roman"/>
+                <w:b/>
+                <w:bCs/>
+                <w:color w:val="000000"/>
+              </w:rPr>
+            </w:pPr>
+          </w:p>
+          <w:p>
+            <w:pPr>
+              <w:spacing w:after="0" w:line="360" w:lineRule="auto"/>
+              <w:jc w:val="center"/>
+              <w:rPr>
+                <w:rFonts w:eastAsia="Times New Roman" w:cs="Times New Roman"/>
+                <w:b/>
+                <w:bCs/>
+                <w:color w:val="000000"/>
+              </w:rPr>
+            </w:pPr>
+            <w:ins w:id="18" w:author="Coles, Nicholas A." w:date="2026-08-05T15:31:00Z" w16du:dateUtc="2026-08-05T19:31:00Z">
+              <w:r>
+                <w:rPr>
+                  <w:rFonts w:eastAsia="Times New Roman" w:cs="Times New Roman"/>
+                  <w:b/>
+                  <w:bCs/>
+                  <w:color w:val="000000"/>
+                </w:rPr>
+                <w:t>Results</w:t>
+              </w:r>
+            </w:ins>
+          </w:p>
+        </w:tc>
       </w:tr>
       <w:tr>
         <w:trPr>
@@ -6566,7 +6734,7 @@
         </w:trPr>
         <w:tc>
           <w:tcPr>
-            <w:tcW w:w="2250" w:type="dxa"/>
+            <w:tcW w:w="2162" w:type="dxa"/>
             <w:tcBorders>
               <w:top w:val="nil"/>
               <w:left w:val="nil"/>
@@ -6668,7 +6836,7 @@
         </w:tc>
         <w:tc>
           <w:tcPr>
-            <w:tcW w:w="345" w:type="dxa"/>
+            <w:tcW w:w="276" w:type="dxa"/>
             <w:tcBorders>
               <w:top w:val="nil"/>
               <w:left w:val="nil"/>
@@ -6702,7 +6870,7 @@
         </w:tc>
         <w:tc>
           <w:tcPr>
-            <w:tcW w:w="2556" w:type="dxa"/>
+            <w:tcW w:w="2600" w:type="dxa"/>
             <w:tcBorders>
               <w:top w:val="nil"/>
               <w:left w:val="nil"/>
@@ -6730,31 +6898,13 @@
                 <w:bCs/>
                 <w:color w:val="000000"/>
               </w:rPr>
-              <w:t xml:space="preserve">Emotion </w:t>
-            </w:r>
-            <w:r>
-              <w:rPr>
-                <w:rFonts w:eastAsia="Times New Roman" w:cs="Times New Roman"/>
-                <w:b/>
-                <w:bCs/>
-                <w:color w:val="000000"/>
-              </w:rPr>
-              <w:t>I</w:t>
-            </w:r>
-            <w:r>
-              <w:rPr>
-                <w:rFonts w:eastAsia="Times New Roman" w:cs="Times New Roman"/>
-                <w:b/>
-                <w:bCs/>
-                <w:color w:val="000000"/>
-              </w:rPr>
-              <w:t>ncongruence</w:t>
+              <w:t>Emotion Incongruence</w:t>
             </w:r>
           </w:p>
         </w:tc>
         <w:tc>
           <w:tcPr>
-            <w:tcW w:w="1380" w:type="dxa"/>
+            <w:tcW w:w="1283" w:type="dxa"/>
             <w:tcBorders>
               <w:top w:val="nil"/>
               <w:left w:val="nil"/>
@@ -6788,7 +6938,7 @@
         </w:tc>
         <w:tc>
           <w:tcPr>
-            <w:tcW w:w="1550" w:type="dxa"/>
+            <w:tcW w:w="1506" w:type="dxa"/>
             <w:tcBorders>
               <w:top w:val="nil"/>
               <w:left w:val="nil"/>
@@ -6820,14 +6970,72 @@
             </w:r>
           </w:p>
         </w:tc>
+        <w:tc>
+          <w:tcPr>
+            <w:tcW w:w="270" w:type="dxa"/>
+            <w:tcBorders>
+              <w:top w:val="nil"/>
+              <w:left w:val="nil"/>
+              <w:right w:val="nil"/>
+            </w:tcBorders>
+          </w:tcPr>
+          <w:p>
+            <w:pPr>
+              <w:spacing w:after="0" w:line="360" w:lineRule="auto"/>
+              <w:rPr>
+                <w:rFonts w:eastAsia="Times New Roman" w:cs="Times New Roman"/>
+                <w:b/>
+                <w:bCs/>
+                <w:color w:val="000000"/>
+              </w:rPr>
+            </w:pPr>
+          </w:p>
+        </w:tc>
+        <w:tc>
+          <w:tcPr>
+            <w:tcW w:w="1080" w:type="dxa"/>
+            <w:vMerge/>
+            <w:tcBorders>
+              <w:left w:val="nil"/>
+              <w:bottom w:val="single" w:sz="4" w:space="0" w:color="auto"/>
+              <w:right w:val="nil"/>
+            </w:tcBorders>
+          </w:tcPr>
+          <w:p>
+            <w:pPr>
+              <w:spacing w:after="0" w:line="360" w:lineRule="auto"/>
+              <w:rPr>
+                <w:rFonts w:eastAsia="Times New Roman" w:cs="Times New Roman"/>
+                <w:b/>
+                <w:bCs/>
+                <w:color w:val="000000"/>
+              </w:rPr>
+            </w:pPr>
+          </w:p>
+        </w:tc>
       </w:tr>
       <w:tr>
+        <w:tblPrEx>
+          <w:tblW w:w="13230" w:type="dxa"/>
+          <w:tblLayout w:type="fixed"/>
+          <w:tblPrExChange w:id="19" w:author="Coles, Nicholas A." w:date="2026-08-05T15:30:00Z" w16du:dateUtc="2026-08-05T19:30:00Z">
+            <w:tblPrEx>
+              <w:tblW w:w="12420" w:type="dxa"/>
+            </w:tblPrEx>
+          </w:tblPrExChange>
+        </w:tblPrEx>
         <w:trPr>
           <w:trHeight w:val="320"/>
+          <w:trPrChange w:id="20" w:author="Coles, Nicholas A." w:date="2026-08-05T15:30:00Z" w16du:dateUtc="2026-08-05T19:30:00Z">
+            <w:trPr>
+              <w:gridAfter w:val="0"/>
+              <w:trHeight w:val="320"/>
+            </w:trPr>
+          </w:trPrChange>
         </w:trPr>
         <w:tc>
           <w:tcPr>
-            <w:tcW w:w="2250" w:type="dxa"/>
+            <w:tcW w:w="2162" w:type="dxa"/>
             <w:tcBorders>
               <w:top w:val="nil"/>
               <w:left w:val="nil"/>
@@ -6837,6 +7045,21 @@
             <w:noWrap/>
             <w:vAlign w:val="bottom"/>
             <w:hideMark/>
+            <w:tcPrChange w:id="21" w:author="Coles, Nicholas A." w:date="2026-08-05T15:30:00Z" w16du:dateUtc="2026-08-05T19:30:00Z">
+              <w:tcPr>
+                <w:tcW w:w="2250" w:type="dxa"/>
+                <w:gridSpan w:val="2"/>
+                <w:tcBorders>
+                  <w:top w:val="nil"/>
+                  <w:left w:val="nil"/>
+                  <w:bottom w:val="nil"/>
+                  <w:right w:val="nil"/>
+                </w:tcBorders>
+                <w:noWrap/>
+                <w:vAlign w:val="bottom"/>
+                <w:hideMark/>
+              </w:tcPr>
+            </w:tcPrChange>
           </w:tcPr>
           <w:p>
             <w:pPr>
@@ -6867,6 +7090,21 @@
             <w:noWrap/>
             <w:vAlign w:val="bottom"/>
             <w:hideMark/>
+            <w:tcPrChange w:id="22" w:author="Coles, Nicholas A." w:date="2026-08-05T15:30:00Z" w16du:dateUtc="2026-08-05T19:30:00Z">
+              <w:tcPr>
+                <w:tcW w:w="2610" w:type="dxa"/>
+                <w:gridSpan w:val="2"/>
+                <w:tcBorders>
+                  <w:top w:val="nil"/>
+                  <w:left w:val="nil"/>
+                  <w:bottom w:val="nil"/>
+                  <w:right w:val="nil"/>
+                </w:tcBorders>
+                <w:noWrap/>
+                <w:vAlign w:val="bottom"/>
+                <w:hideMark/>
+              </w:tcPr>
+            </w:tcPrChange>
           </w:tcPr>
           <w:p>
             <w:pPr>
@@ -6897,6 +7135,21 @@
             <w:noWrap/>
             <w:vAlign w:val="bottom"/>
             <w:hideMark/>
+            <w:tcPrChange w:id="23" w:author="Coles, Nicholas A." w:date="2026-08-05T15:30:00Z" w16du:dateUtc="2026-08-05T19:30:00Z">
+              <w:tcPr>
+                <w:tcW w:w="1443" w:type="dxa"/>
+                <w:gridSpan w:val="2"/>
+                <w:tcBorders>
+                  <w:top w:val="nil"/>
+                  <w:left w:val="nil"/>
+                  <w:bottom w:val="nil"/>
+                  <w:right w:val="nil"/>
+                </w:tcBorders>
+                <w:noWrap/>
+                <w:vAlign w:val="bottom"/>
+                <w:hideMark/>
+              </w:tcPr>
+            </w:tcPrChange>
           </w:tcPr>
           <w:p>
             <w:pPr>
@@ -6906,20 +7159,37 @@
                 <w:color w:val="000000"/>
               </w:rPr>
             </w:pPr>
+            <w:ins w:id="24" w:author="Coles, Nicholas A." w:date="2026-08-05T15:17:00Z" w16du:dateUtc="2026-08-05T19:17:00Z">
+              <w:r>
+                <w:rPr>
+                  <w:rFonts w:eastAsia="Times New Roman" w:cs="Times New Roman"/>
+                  <w:color w:val="000000"/>
+                </w:rPr>
+                <w:t>n</w:t>
+              </w:r>
+            </w:ins>
+            <w:del w:id="25" w:author="Coles, Nicholas A." w:date="2026-08-05T15:17:00Z" w16du:dateUtc="2026-08-05T19:17:00Z">
+              <w:r>
+                <w:rPr>
+                  <w:rFonts w:eastAsia="Times New Roman" w:cs="Times New Roman"/>
+                  <w:color w:val="000000"/>
+                </w:rPr>
+                <w:delText>N</w:delText>
+              </w:r>
+            </w:del>
             <w:r>
               <w:rPr>
                 <w:rFonts w:eastAsia="Times New Roman" w:cs="Times New Roman"/>
                 <w:color w:val="000000"/>
               </w:rPr>
-              <w:t>No</w:t>
+              <w:t>o</w:t>
             </w:r>
           </w:p>
         </w:tc>
         <w:tc>
           <w:tcPr>
-            <w:tcW w:w="345" w:type="dxa"/>
+            <w:tcW w:w="276" w:type="dxa"/>
             <w:tcBorders>
-              <w:top w:val="nil"/>
               <w:left w:val="nil"/>
               <w:bottom w:val="nil"/>
               <w:right w:val="nil"/>
@@ -6927,6 +7197,21 @@
             <w:noWrap/>
             <w:vAlign w:val="bottom"/>
             <w:hideMark/>
+            <w:tcPrChange w:id="26" w:author="Coles, Nicholas A." w:date="2026-08-05T15:30:00Z" w16du:dateUtc="2026-08-05T19:30:00Z">
+              <w:tcPr>
+                <w:tcW w:w="345" w:type="dxa"/>
+                <w:gridSpan w:val="2"/>
+                <w:tcBorders>
+                  <w:top w:val="nil"/>
+                  <w:left w:val="nil"/>
+                  <w:bottom w:val="nil"/>
+                  <w:right w:val="nil"/>
+                </w:tcBorders>
+                <w:noWrap/>
+                <w:vAlign w:val="bottom"/>
+                <w:hideMark/>
+              </w:tcPr>
+            </w:tcPrChange>
           </w:tcPr>
           <w:p>
             <w:pPr>
@@ -6940,9 +7225,8 @@
         </w:tc>
         <w:tc>
           <w:tcPr>
-            <w:tcW w:w="2556" w:type="dxa"/>
+            <w:tcW w:w="2600" w:type="dxa"/>
             <w:tcBorders>
-              <w:top w:val="nil"/>
               <w:left w:val="nil"/>
               <w:bottom w:val="nil"/>
               <w:right w:val="nil"/>
@@ -6950,6 +7234,21 @@
             <w:noWrap/>
             <w:vAlign w:val="center"/>
             <w:hideMark/>
+            <w:tcPrChange w:id="27" w:author="Coles, Nicholas A." w:date="2026-08-05T15:30:00Z" w16du:dateUtc="2026-08-05T19:30:00Z">
+              <w:tcPr>
+                <w:tcW w:w="2556" w:type="dxa"/>
+                <w:gridSpan w:val="2"/>
+                <w:tcBorders>
+                  <w:top w:val="nil"/>
+                  <w:left w:val="nil"/>
+                  <w:bottom w:val="nil"/>
+                  <w:right w:val="nil"/>
+                </w:tcBorders>
+                <w:noWrap/>
+                <w:vAlign w:val="center"/>
+                <w:hideMark/>
+              </w:tcPr>
+            </w:tcPrChange>
           </w:tcPr>
           <w:p>
             <w:pPr>
@@ -6971,9 +7270,8 @@
         </w:tc>
         <w:tc>
           <w:tcPr>
-            <w:tcW w:w="1380" w:type="dxa"/>
+            <w:tcW w:w="1283" w:type="dxa"/>
             <w:tcBorders>
-              <w:top w:val="nil"/>
               <w:left w:val="nil"/>
               <w:bottom w:val="nil"/>
               <w:right w:val="nil"/>
@@ -6981,6 +7279,21 @@
             <w:noWrap/>
             <w:vAlign w:val="center"/>
             <w:hideMark/>
+            <w:tcPrChange w:id="28" w:author="Coles, Nicholas A." w:date="2026-08-05T15:30:00Z" w16du:dateUtc="2026-08-05T19:30:00Z">
+              <w:tcPr>
+                <w:tcW w:w="1380" w:type="dxa"/>
+                <w:gridSpan w:val="2"/>
+                <w:tcBorders>
+                  <w:top w:val="nil"/>
+                  <w:left w:val="nil"/>
+                  <w:bottom w:val="nil"/>
+                  <w:right w:val="nil"/>
+                </w:tcBorders>
+                <w:noWrap/>
+                <w:vAlign w:val="center"/>
+                <w:hideMark/>
+              </w:tcPr>
+            </w:tcPrChange>
           </w:tcPr>
           <w:p>
             <w:pPr>
@@ -7002,9 +7315,8 @@
         </w:tc>
         <w:tc>
           <w:tcPr>
-            <w:tcW w:w="1550" w:type="dxa"/>
+            <w:tcW w:w="1506" w:type="dxa"/>
             <w:tcBorders>
-              <w:top w:val="nil"/>
               <w:left w:val="nil"/>
               <w:bottom w:val="nil"/>
               <w:right w:val="nil"/>
@@ -7012,6 +7324,21 @@
             <w:noWrap/>
             <w:vAlign w:val="bottom"/>
             <w:hideMark/>
+            <w:tcPrChange w:id="29" w:author="Coles, Nicholas A." w:date="2026-08-05T15:30:00Z" w16du:dateUtc="2026-08-05T19:30:00Z">
+              <w:tcPr>
+                <w:tcW w:w="1550" w:type="dxa"/>
+                <w:gridSpan w:val="2"/>
+                <w:tcBorders>
+                  <w:top w:val="nil"/>
+                  <w:left w:val="nil"/>
+                  <w:bottom w:val="nil"/>
+                  <w:right w:val="nil"/>
+                </w:tcBorders>
+                <w:noWrap/>
+                <w:vAlign w:val="bottom"/>
+                <w:hideMark/>
+              </w:tcPr>
+            </w:tcPrChange>
           </w:tcPr>
           <w:p>
             <w:pPr>
@@ -7031,14 +7358,102 @@
             </w:r>
           </w:p>
         </w:tc>
+        <w:tc>
+          <w:tcPr>
+            <w:tcW w:w="270" w:type="dxa"/>
+            <w:tcBorders>
+              <w:left w:val="nil"/>
+              <w:bottom w:val="nil"/>
+              <w:right w:val="nil"/>
+            </w:tcBorders>
+            <w:tcPrChange w:id="30" w:author="Coles, Nicholas A." w:date="2026-08-05T15:30:00Z" w16du:dateUtc="2026-08-05T19:30:00Z">
+              <w:tcPr>
+                <w:tcW w:w="286" w:type="dxa"/>
+                <w:gridSpan w:val="2"/>
+                <w:tcBorders>
+                  <w:top w:val="nil"/>
+                  <w:left w:val="nil"/>
+                  <w:bottom w:val="nil"/>
+                  <w:right w:val="nil"/>
+                </w:tcBorders>
+              </w:tcPr>
+            </w:tcPrChange>
+          </w:tcPr>
+          <w:p>
+            <w:pPr>
+              <w:spacing w:after="0" w:line="360" w:lineRule="auto"/>
+              <w:jc w:val="center"/>
+              <w:rPr>
+                <w:rFonts w:ascii="Segoe UI Symbol" w:eastAsia="Times New Roman" w:hAnsi="Segoe UI Symbol" w:cs="Segoe UI Symbol"/>
+                <w:color w:val="000000"/>
+              </w:rPr>
+            </w:pPr>
+          </w:p>
+        </w:tc>
+        <w:tc>
+          <w:tcPr>
+            <w:tcW w:w="1080" w:type="dxa"/>
+            <w:tcBorders>
+              <w:top w:val="nil"/>
+              <w:left w:val="nil"/>
+              <w:bottom w:val="nil"/>
+              <w:right w:val="nil"/>
+            </w:tcBorders>
+            <w:tcPrChange w:id="31" w:author="Coles, Nicholas A." w:date="2026-08-05T15:30:00Z" w16du:dateUtc="2026-08-05T19:30:00Z">
+              <w:tcPr>
+                <w:tcW w:w="286" w:type="dxa"/>
+                <w:tcBorders>
+                  <w:top w:val="nil"/>
+                  <w:left w:val="nil"/>
+                  <w:bottom w:val="nil"/>
+                  <w:right w:val="nil"/>
+                </w:tcBorders>
+              </w:tcPr>
+            </w:tcPrChange>
+          </w:tcPr>
+          <w:p>
+            <w:pPr>
+              <w:spacing w:after="0" w:line="360" w:lineRule="auto"/>
+              <w:jc w:val="center"/>
+              <w:rPr>
+                <w:rFonts w:ascii="Segoe UI Symbol" w:eastAsia="Times New Roman" w:hAnsi="Segoe UI Symbol" w:cs="Segoe UI Symbol"/>
+                <w:color w:val="000000"/>
+              </w:rPr>
+            </w:pPr>
+            <w:ins w:id="32" w:author="Coles, Nicholas A." w:date="2026-08-05T15:32:00Z" w16du:dateUtc="2026-08-05T19:32:00Z">
+              <w:r>
+                <w:rPr>
+                  <w:rFonts w:ascii="Segoe UI Symbol" w:eastAsia="Times New Roman" w:hAnsi="Segoe UI Symbol" w:cs="Segoe UI Symbol"/>
+                  <w:color w:val="000000"/>
+                </w:rPr>
+                <w:t>X</w:t>
+              </w:r>
+            </w:ins>
+          </w:p>
+        </w:tc>
       </w:tr>
       <w:tr>
+        <w:tblPrEx>
+          <w:tblW w:w="13230" w:type="dxa"/>
+          <w:tblLayout w:type="fixed"/>
+          <w:tblPrExChange w:id="33" w:author="Coles, Nicholas A." w:date="2026-08-05T15:30:00Z" w16du:dateUtc="2026-08-05T19:30:00Z">
+            <w:tblPrEx>
+              <w:tblW w:w="12420" w:type="dxa"/>
+            </w:tblPrEx>
+          </w:tblPrExChange>
+        </w:tblPrEx>
         <w:trPr>
           <w:trHeight w:val="320"/>
+          <w:trPrChange w:id="34" w:author="Coles, Nicholas A." w:date="2026-08-05T15:30:00Z" w16du:dateUtc="2026-08-05T19:30:00Z">
+            <w:trPr>
+              <w:gridAfter w:val="0"/>
+              <w:trHeight w:val="320"/>
+            </w:trPr>
+          </w:trPrChange>
         </w:trPr>
         <w:tc>
           <w:tcPr>
-            <w:tcW w:w="2250" w:type="dxa"/>
+            <w:tcW w:w="2162" w:type="dxa"/>
             <w:tcBorders>
               <w:top w:val="nil"/>
               <w:left w:val="nil"/>
@@ -7048,6 +7463,21 @@
             <w:noWrap/>
             <w:vAlign w:val="bottom"/>
             <w:hideMark/>
+            <w:tcPrChange w:id="35" w:author="Coles, Nicholas A." w:date="2026-08-05T15:30:00Z" w16du:dateUtc="2026-08-05T19:30:00Z">
+              <w:tcPr>
+                <w:tcW w:w="2250" w:type="dxa"/>
+                <w:gridSpan w:val="2"/>
+                <w:tcBorders>
+                  <w:top w:val="nil"/>
+                  <w:left w:val="nil"/>
+                  <w:bottom w:val="nil"/>
+                  <w:right w:val="nil"/>
+                </w:tcBorders>
+                <w:noWrap/>
+                <w:vAlign w:val="bottom"/>
+                <w:hideMark/>
+              </w:tcPr>
+            </w:tcPrChange>
           </w:tcPr>
           <w:p>
             <w:pPr>
@@ -7070,6 +7500,21 @@
             <w:noWrap/>
             <w:vAlign w:val="bottom"/>
             <w:hideMark/>
+            <w:tcPrChange w:id="36" w:author="Coles, Nicholas A." w:date="2026-08-05T15:30:00Z" w16du:dateUtc="2026-08-05T19:30:00Z">
+              <w:tcPr>
+                <w:tcW w:w="2610" w:type="dxa"/>
+                <w:gridSpan w:val="2"/>
+                <w:tcBorders>
+                  <w:top w:val="nil"/>
+                  <w:left w:val="nil"/>
+                  <w:bottom w:val="nil"/>
+                  <w:right w:val="nil"/>
+                </w:tcBorders>
+                <w:noWrap/>
+                <w:vAlign w:val="bottom"/>
+                <w:hideMark/>
+              </w:tcPr>
+            </w:tcPrChange>
           </w:tcPr>
           <w:p>
             <w:pPr>
@@ -7092,6 +7537,21 @@
             <w:noWrap/>
             <w:vAlign w:val="bottom"/>
             <w:hideMark/>
+            <w:tcPrChange w:id="37" w:author="Coles, Nicholas A." w:date="2026-08-05T15:30:00Z" w16du:dateUtc="2026-08-05T19:30:00Z">
+              <w:tcPr>
+                <w:tcW w:w="1443" w:type="dxa"/>
+                <w:gridSpan w:val="2"/>
+                <w:tcBorders>
+                  <w:top w:val="nil"/>
+                  <w:left w:val="nil"/>
+                  <w:bottom w:val="nil"/>
+                  <w:right w:val="nil"/>
+                </w:tcBorders>
+                <w:noWrap/>
+                <w:vAlign w:val="bottom"/>
+                <w:hideMark/>
+              </w:tcPr>
+            </w:tcPrChange>
           </w:tcPr>
           <w:p>
             <w:pPr>
@@ -7101,18 +7561,36 @@
                 <w:color w:val="000000"/>
               </w:rPr>
             </w:pPr>
+            <w:ins w:id="38" w:author="Coles, Nicholas A." w:date="2026-08-05T15:18:00Z" w16du:dateUtc="2026-08-05T19:18:00Z">
+              <w:r>
+                <w:rPr>
+                  <w:rFonts w:eastAsia="Times New Roman" w:cs="Times New Roman"/>
+                  <w:color w:val="000000"/>
+                </w:rPr>
+                <w:t>y</w:t>
+              </w:r>
+            </w:ins>
+            <w:del w:id="39" w:author="Coles, Nicholas A." w:date="2026-08-05T15:18:00Z" w16du:dateUtc="2026-08-05T19:18:00Z">
+              <w:r>
+                <w:rPr>
+                  <w:rFonts w:eastAsia="Times New Roman" w:cs="Times New Roman"/>
+                  <w:color w:val="000000"/>
+                </w:rPr>
+                <w:delText>Y</w:delText>
+              </w:r>
+            </w:del>
             <w:r>
               <w:rPr>
                 <w:rFonts w:eastAsia="Times New Roman" w:cs="Times New Roman"/>
                 <w:color w:val="000000"/>
               </w:rPr>
-              <w:t>Yes</w:t>
+              <w:t>es</w:t>
             </w:r>
           </w:p>
         </w:tc>
         <w:tc>
           <w:tcPr>
-            <w:tcW w:w="345" w:type="dxa"/>
+            <w:tcW w:w="276" w:type="dxa"/>
             <w:tcBorders>
               <w:top w:val="nil"/>
               <w:left w:val="nil"/>
@@ -7122,6 +7600,21 @@
             <w:noWrap/>
             <w:vAlign w:val="bottom"/>
             <w:hideMark/>
+            <w:tcPrChange w:id="40" w:author="Coles, Nicholas A." w:date="2026-08-05T15:30:00Z" w16du:dateUtc="2026-08-05T19:30:00Z">
+              <w:tcPr>
+                <w:tcW w:w="345" w:type="dxa"/>
+                <w:gridSpan w:val="2"/>
+                <w:tcBorders>
+                  <w:top w:val="nil"/>
+                  <w:left w:val="nil"/>
+                  <w:bottom w:val="nil"/>
+                  <w:right w:val="nil"/>
+                </w:tcBorders>
+                <w:noWrap/>
+                <w:vAlign w:val="bottom"/>
+                <w:hideMark/>
+              </w:tcPr>
+            </w:tcPrChange>
           </w:tcPr>
           <w:p>
             <w:pPr>
@@ -7135,7 +7628,7 @@
         </w:tc>
         <w:tc>
           <w:tcPr>
-            <w:tcW w:w="2556" w:type="dxa"/>
+            <w:tcW w:w="2600" w:type="dxa"/>
             <w:tcBorders>
               <w:top w:val="nil"/>
               <w:left w:val="nil"/>
@@ -7145,6 +7638,21 @@
             <w:noWrap/>
             <w:vAlign w:val="center"/>
             <w:hideMark/>
+            <w:tcPrChange w:id="41" w:author="Coles, Nicholas A." w:date="2026-08-05T15:30:00Z" w16du:dateUtc="2026-08-05T19:30:00Z">
+              <w:tcPr>
+                <w:tcW w:w="2556" w:type="dxa"/>
+                <w:gridSpan w:val="2"/>
+                <w:tcBorders>
+                  <w:top w:val="nil"/>
+                  <w:left w:val="nil"/>
+                  <w:bottom w:val="nil"/>
+                  <w:right w:val="nil"/>
+                </w:tcBorders>
+                <w:noWrap/>
+                <w:vAlign w:val="center"/>
+                <w:hideMark/>
+              </w:tcPr>
+            </w:tcPrChange>
           </w:tcPr>
           <w:p>
             <w:pPr>
@@ -7166,7 +7674,7 @@
         </w:tc>
         <w:tc>
           <w:tcPr>
-            <w:tcW w:w="1380" w:type="dxa"/>
+            <w:tcW w:w="1283" w:type="dxa"/>
             <w:tcBorders>
               <w:top w:val="nil"/>
               <w:left w:val="nil"/>
@@ -7176,6 +7684,21 @@
             <w:noWrap/>
             <w:vAlign w:val="center"/>
             <w:hideMark/>
+            <w:tcPrChange w:id="42" w:author="Coles, Nicholas A." w:date="2026-08-05T15:30:00Z" w16du:dateUtc="2026-08-05T19:30:00Z">
+              <w:tcPr>
+                <w:tcW w:w="1380" w:type="dxa"/>
+                <w:gridSpan w:val="2"/>
+                <w:tcBorders>
+                  <w:top w:val="nil"/>
+                  <w:left w:val="nil"/>
+                  <w:bottom w:val="nil"/>
+                  <w:right w:val="nil"/>
+                </w:tcBorders>
+                <w:noWrap/>
+                <w:vAlign w:val="center"/>
+                <w:hideMark/>
+              </w:tcPr>
+            </w:tcPrChange>
           </w:tcPr>
           <w:p>
             <w:pPr>
@@ -7197,7 +7720,7 @@
         </w:tc>
         <w:tc>
           <w:tcPr>
-            <w:tcW w:w="1550" w:type="dxa"/>
+            <w:tcW w:w="1506" w:type="dxa"/>
             <w:tcBorders>
               <w:top w:val="nil"/>
               <w:left w:val="nil"/>
@@ -7207,6 +7730,21 @@
             <w:noWrap/>
             <w:vAlign w:val="center"/>
             <w:hideMark/>
+            <w:tcPrChange w:id="43" w:author="Coles, Nicholas A." w:date="2026-08-05T15:30:00Z" w16du:dateUtc="2026-08-05T19:30:00Z">
+              <w:tcPr>
+                <w:tcW w:w="1550" w:type="dxa"/>
+                <w:gridSpan w:val="2"/>
+                <w:tcBorders>
+                  <w:top w:val="nil"/>
+                  <w:left w:val="nil"/>
+                  <w:bottom w:val="nil"/>
+                  <w:right w:val="nil"/>
+                </w:tcBorders>
+                <w:noWrap/>
+                <w:vAlign w:val="center"/>
+                <w:hideMark/>
+              </w:tcPr>
+            </w:tcPrChange>
           </w:tcPr>
           <w:p>
             <w:pPr>
@@ -7219,14 +7757,103 @@
             </w:pPr>
           </w:p>
         </w:tc>
+        <w:tc>
+          <w:tcPr>
+            <w:tcW w:w="270" w:type="dxa"/>
+            <w:tcBorders>
+              <w:top w:val="nil"/>
+              <w:left w:val="nil"/>
+              <w:bottom w:val="nil"/>
+              <w:right w:val="nil"/>
+            </w:tcBorders>
+            <w:tcPrChange w:id="44" w:author="Coles, Nicholas A." w:date="2026-08-05T15:30:00Z" w16du:dateUtc="2026-08-05T19:30:00Z">
+              <w:tcPr>
+                <w:tcW w:w="286" w:type="dxa"/>
+                <w:gridSpan w:val="2"/>
+                <w:tcBorders>
+                  <w:top w:val="nil"/>
+                  <w:left w:val="nil"/>
+                  <w:bottom w:val="nil"/>
+                  <w:right w:val="nil"/>
+                </w:tcBorders>
+              </w:tcPr>
+            </w:tcPrChange>
+          </w:tcPr>
+          <w:p>
+            <w:pPr>
+              <w:spacing w:before="0" w:after="0" w:line="360" w:lineRule="auto"/>
+              <w:jc w:val="center"/>
+              <w:rPr>
+                <w:rFonts w:eastAsia="Times New Roman" w:cs="Times New Roman"/>
+                <w:color w:val="000000"/>
+              </w:rPr>
+            </w:pPr>
+          </w:p>
+        </w:tc>
+        <w:tc>
+          <w:tcPr>
+            <w:tcW w:w="1080" w:type="dxa"/>
+            <w:tcBorders>
+              <w:top w:val="nil"/>
+              <w:left w:val="nil"/>
+              <w:bottom w:val="nil"/>
+              <w:right w:val="nil"/>
+            </w:tcBorders>
+            <w:tcPrChange w:id="45" w:author="Coles, Nicholas A." w:date="2026-08-05T15:30:00Z" w16du:dateUtc="2026-08-05T19:30:00Z">
+              <w:tcPr>
+                <w:tcW w:w="286" w:type="dxa"/>
+                <w:tcBorders>
+                  <w:top w:val="nil"/>
+                  <w:left w:val="nil"/>
+                  <w:bottom w:val="nil"/>
+                  <w:right w:val="nil"/>
+                </w:tcBorders>
+              </w:tcPr>
+            </w:tcPrChange>
+          </w:tcPr>
+          <w:p>
+            <w:pPr>
+              <w:spacing w:before="0" w:after="0" w:line="360" w:lineRule="auto"/>
+              <w:jc w:val="center"/>
+              <w:rPr>
+                <w:rFonts w:eastAsia="Times New Roman" w:cs="Times New Roman"/>
+                <w:color w:val="000000"/>
+              </w:rPr>
+            </w:pPr>
+            <w:ins w:id="46" w:author="Coles, Nicholas A." w:date="2026-08-05T15:32:00Z" w16du:dateUtc="2026-08-05T19:32:00Z">
+              <w:r>
+                <w:rPr>
+                  <w:rFonts w:ascii="Segoe UI Symbol" w:eastAsia="Times New Roman" w:hAnsi="Segoe UI Symbol" w:cs="Segoe UI Symbol"/>
+                  <w:color w:val="000000"/>
+                </w:rPr>
+                <w:t>X</w:t>
+              </w:r>
+            </w:ins>
+          </w:p>
+        </w:tc>
       </w:tr>
       <w:tr>
+        <w:tblPrEx>
+          <w:tblW w:w="13230" w:type="dxa"/>
+          <w:tblLayout w:type="fixed"/>
+          <w:tblPrExChange w:id="47" w:author="Coles, Nicholas A." w:date="2026-08-05T15:30:00Z" w16du:dateUtc="2026-08-05T19:30:00Z">
+            <w:tblPrEx>
+              <w:tblW w:w="12420" w:type="dxa"/>
+            </w:tblPrEx>
+          </w:tblPrExChange>
+        </w:tblPrEx>
         <w:trPr>
           <w:trHeight w:val="320"/>
+          <w:trPrChange w:id="48" w:author="Coles, Nicholas A." w:date="2026-08-05T15:30:00Z" w16du:dateUtc="2026-08-05T19:30:00Z">
+            <w:trPr>
+              <w:gridAfter w:val="0"/>
+              <w:trHeight w:val="320"/>
+            </w:trPr>
+          </w:trPrChange>
         </w:trPr>
         <w:tc>
           <w:tcPr>
-            <w:tcW w:w="2250" w:type="dxa"/>
+            <w:tcW w:w="2162" w:type="dxa"/>
             <w:tcBorders>
               <w:top w:val="nil"/>
               <w:left w:val="nil"/>
@@ -7236,6 +7863,21 @@
             <w:noWrap/>
             <w:vAlign w:val="bottom"/>
             <w:hideMark/>
+            <w:tcPrChange w:id="49" w:author="Coles, Nicholas A." w:date="2026-08-05T15:30:00Z" w16du:dateUtc="2026-08-05T19:30:00Z">
+              <w:tcPr>
+                <w:tcW w:w="2250" w:type="dxa"/>
+                <w:gridSpan w:val="2"/>
+                <w:tcBorders>
+                  <w:top w:val="nil"/>
+                  <w:left w:val="nil"/>
+                  <w:bottom w:val="nil"/>
+                  <w:right w:val="nil"/>
+                </w:tcBorders>
+                <w:noWrap/>
+                <w:vAlign w:val="bottom"/>
+                <w:hideMark/>
+              </w:tcPr>
+            </w:tcPrChange>
           </w:tcPr>
           <w:p>
             <w:pPr>
@@ -7259,6 +7901,21 @@
             <w:noWrap/>
             <w:vAlign w:val="bottom"/>
             <w:hideMark/>
+            <w:tcPrChange w:id="50" w:author="Coles, Nicholas A." w:date="2026-08-05T15:30:00Z" w16du:dateUtc="2026-08-05T19:30:00Z">
+              <w:tcPr>
+                <w:tcW w:w="2610" w:type="dxa"/>
+                <w:gridSpan w:val="2"/>
+                <w:tcBorders>
+                  <w:top w:val="nil"/>
+                  <w:left w:val="nil"/>
+                  <w:bottom w:val="nil"/>
+                  <w:right w:val="nil"/>
+                </w:tcBorders>
+                <w:noWrap/>
+                <w:vAlign w:val="bottom"/>
+                <w:hideMark/>
+              </w:tcPr>
+            </w:tcPrChange>
           </w:tcPr>
           <w:p>
             <w:pPr>
@@ -7289,6 +7946,21 @@
             <w:noWrap/>
             <w:vAlign w:val="bottom"/>
             <w:hideMark/>
+            <w:tcPrChange w:id="51" w:author="Coles, Nicholas A." w:date="2026-08-05T15:30:00Z" w16du:dateUtc="2026-08-05T19:30:00Z">
+              <w:tcPr>
+                <w:tcW w:w="1443" w:type="dxa"/>
+                <w:gridSpan w:val="2"/>
+                <w:tcBorders>
+                  <w:top w:val="nil"/>
+                  <w:left w:val="nil"/>
+                  <w:bottom w:val="nil"/>
+                  <w:right w:val="nil"/>
+                </w:tcBorders>
+                <w:noWrap/>
+                <w:vAlign w:val="bottom"/>
+                <w:hideMark/>
+              </w:tcPr>
+            </w:tcPrChange>
           </w:tcPr>
           <w:p>
             <w:pPr>
@@ -7298,18 +7970,36 @@
                 <w:color w:val="000000"/>
               </w:rPr>
             </w:pPr>
+            <w:ins w:id="52" w:author="Coles, Nicholas A." w:date="2026-08-05T15:18:00Z" w16du:dateUtc="2026-08-05T19:18:00Z">
+              <w:r>
+                <w:rPr>
+                  <w:rFonts w:eastAsia="Times New Roman" w:cs="Times New Roman"/>
+                  <w:color w:val="000000"/>
+                </w:rPr>
+                <w:t>n</w:t>
+              </w:r>
+            </w:ins>
+            <w:del w:id="53" w:author="Coles, Nicholas A." w:date="2026-08-05T15:18:00Z" w16du:dateUtc="2026-08-05T19:18:00Z">
+              <w:r>
+                <w:rPr>
+                  <w:rFonts w:eastAsia="Times New Roman" w:cs="Times New Roman"/>
+                  <w:color w:val="000000"/>
+                </w:rPr>
+                <w:delText>N</w:delText>
+              </w:r>
+            </w:del>
             <w:r>
               <w:rPr>
                 <w:rFonts w:eastAsia="Times New Roman" w:cs="Times New Roman"/>
                 <w:color w:val="000000"/>
               </w:rPr>
-              <w:t>No</w:t>
+              <w:t>o</w:t>
             </w:r>
           </w:p>
         </w:tc>
         <w:tc>
           <w:tcPr>
-            <w:tcW w:w="345" w:type="dxa"/>
+            <w:tcW w:w="276" w:type="dxa"/>
             <w:tcBorders>
               <w:top w:val="nil"/>
               <w:left w:val="nil"/>
@@ -7319,6 +8009,21 @@
             <w:noWrap/>
             <w:vAlign w:val="bottom"/>
             <w:hideMark/>
+            <w:tcPrChange w:id="54" w:author="Coles, Nicholas A." w:date="2026-08-05T15:30:00Z" w16du:dateUtc="2026-08-05T19:30:00Z">
+              <w:tcPr>
+                <w:tcW w:w="345" w:type="dxa"/>
+                <w:gridSpan w:val="2"/>
+                <w:tcBorders>
+                  <w:top w:val="nil"/>
+                  <w:left w:val="nil"/>
+                  <w:bottom w:val="nil"/>
+                  <w:right w:val="nil"/>
+                </w:tcBorders>
+                <w:noWrap/>
+                <w:vAlign w:val="bottom"/>
+                <w:hideMark/>
+              </w:tcPr>
+            </w:tcPrChange>
           </w:tcPr>
           <w:p>
             <w:pPr>
@@ -7332,7 +8037,7 @@
         </w:tc>
         <w:tc>
           <w:tcPr>
-            <w:tcW w:w="2556" w:type="dxa"/>
+            <w:tcW w:w="2600" w:type="dxa"/>
             <w:tcBorders>
               <w:top w:val="nil"/>
               <w:left w:val="nil"/>
@@ -7342,6 +8047,21 @@
             <w:noWrap/>
             <w:vAlign w:val="center"/>
             <w:hideMark/>
+            <w:tcPrChange w:id="55" w:author="Coles, Nicholas A." w:date="2026-08-05T15:30:00Z" w16du:dateUtc="2026-08-05T19:30:00Z">
+              <w:tcPr>
+                <w:tcW w:w="2556" w:type="dxa"/>
+                <w:gridSpan w:val="2"/>
+                <w:tcBorders>
+                  <w:top w:val="nil"/>
+                  <w:left w:val="nil"/>
+                  <w:bottom w:val="nil"/>
+                  <w:right w:val="nil"/>
+                </w:tcBorders>
+                <w:noWrap/>
+                <w:vAlign w:val="center"/>
+                <w:hideMark/>
+              </w:tcPr>
+            </w:tcPrChange>
           </w:tcPr>
           <w:p>
             <w:pPr>
@@ -7362,7 +8082,7 @@
         </w:tc>
         <w:tc>
           <w:tcPr>
-            <w:tcW w:w="1380" w:type="dxa"/>
+            <w:tcW w:w="1283" w:type="dxa"/>
             <w:tcBorders>
               <w:top w:val="nil"/>
               <w:left w:val="nil"/>
@@ -7372,6 +8092,21 @@
             <w:noWrap/>
             <w:vAlign w:val="center"/>
             <w:hideMark/>
+            <w:tcPrChange w:id="56" w:author="Coles, Nicholas A." w:date="2026-08-05T15:30:00Z" w16du:dateUtc="2026-08-05T19:30:00Z">
+              <w:tcPr>
+                <w:tcW w:w="1380" w:type="dxa"/>
+                <w:gridSpan w:val="2"/>
+                <w:tcBorders>
+                  <w:top w:val="nil"/>
+                  <w:left w:val="nil"/>
+                  <w:bottom w:val="nil"/>
+                  <w:right w:val="nil"/>
+                </w:tcBorders>
+                <w:noWrap/>
+                <w:vAlign w:val="center"/>
+                <w:hideMark/>
+              </w:tcPr>
+            </w:tcPrChange>
           </w:tcPr>
           <w:p>
             <w:pPr>
@@ -7386,7 +8121,7 @@
         </w:tc>
         <w:tc>
           <w:tcPr>
-            <w:tcW w:w="1550" w:type="dxa"/>
+            <w:tcW w:w="1506" w:type="dxa"/>
             <w:tcBorders>
               <w:top w:val="nil"/>
               <w:left w:val="nil"/>
@@ -7396,6 +8131,21 @@
             <w:noWrap/>
             <w:vAlign w:val="bottom"/>
             <w:hideMark/>
+            <w:tcPrChange w:id="57" w:author="Coles, Nicholas A." w:date="2026-08-05T15:30:00Z" w16du:dateUtc="2026-08-05T19:30:00Z">
+              <w:tcPr>
+                <w:tcW w:w="1550" w:type="dxa"/>
+                <w:gridSpan w:val="2"/>
+                <w:tcBorders>
+                  <w:top w:val="nil"/>
+                  <w:left w:val="nil"/>
+                  <w:bottom w:val="nil"/>
+                  <w:right w:val="nil"/>
+                </w:tcBorders>
+                <w:noWrap/>
+                <w:vAlign w:val="bottom"/>
+                <w:hideMark/>
+              </w:tcPr>
+            </w:tcPrChange>
           </w:tcPr>
           <w:p>
             <w:pPr>
@@ -7415,14 +8165,103 @@
             </w:r>
           </w:p>
         </w:tc>
+        <w:tc>
+          <w:tcPr>
+            <w:tcW w:w="270" w:type="dxa"/>
+            <w:tcBorders>
+              <w:top w:val="nil"/>
+              <w:left w:val="nil"/>
+              <w:bottom w:val="nil"/>
+              <w:right w:val="nil"/>
+            </w:tcBorders>
+            <w:tcPrChange w:id="58" w:author="Coles, Nicholas A." w:date="2026-08-05T15:30:00Z" w16du:dateUtc="2026-08-05T19:30:00Z">
+              <w:tcPr>
+                <w:tcW w:w="286" w:type="dxa"/>
+                <w:gridSpan w:val="2"/>
+                <w:tcBorders>
+                  <w:top w:val="nil"/>
+                  <w:left w:val="nil"/>
+                  <w:bottom w:val="nil"/>
+                  <w:right w:val="nil"/>
+                </w:tcBorders>
+              </w:tcPr>
+            </w:tcPrChange>
+          </w:tcPr>
+          <w:p>
+            <w:pPr>
+              <w:spacing w:before="0" w:after="0" w:line="360" w:lineRule="auto"/>
+              <w:jc w:val="center"/>
+              <w:rPr>
+                <w:rFonts w:ascii="Segoe UI Symbol" w:eastAsia="Times New Roman" w:hAnsi="Segoe UI Symbol" w:cs="Segoe UI Symbol"/>
+                <w:color w:val="000000"/>
+              </w:rPr>
+            </w:pPr>
+          </w:p>
+        </w:tc>
+        <w:tc>
+          <w:tcPr>
+            <w:tcW w:w="1080" w:type="dxa"/>
+            <w:tcBorders>
+              <w:top w:val="nil"/>
+              <w:left w:val="nil"/>
+              <w:bottom w:val="nil"/>
+              <w:right w:val="nil"/>
+            </w:tcBorders>
+            <w:tcPrChange w:id="59" w:author="Coles, Nicholas A." w:date="2026-08-05T15:30:00Z" w16du:dateUtc="2026-08-05T19:30:00Z">
+              <w:tcPr>
+                <w:tcW w:w="286" w:type="dxa"/>
+                <w:tcBorders>
+                  <w:top w:val="nil"/>
+                  <w:left w:val="nil"/>
+                  <w:bottom w:val="nil"/>
+                  <w:right w:val="nil"/>
+                </w:tcBorders>
+              </w:tcPr>
+            </w:tcPrChange>
+          </w:tcPr>
+          <w:p>
+            <w:pPr>
+              <w:spacing w:before="0" w:after="0" w:line="360" w:lineRule="auto"/>
+              <w:jc w:val="center"/>
+              <w:rPr>
+                <w:rFonts w:ascii="Segoe UI Symbol" w:eastAsia="Times New Roman" w:hAnsi="Segoe UI Symbol" w:cs="Segoe UI Symbol"/>
+                <w:color w:val="000000"/>
+              </w:rPr>
+            </w:pPr>
+            <w:ins w:id="60" w:author="Coles, Nicholas A." w:date="2026-08-05T15:32:00Z" w16du:dateUtc="2026-08-05T19:32:00Z">
+              <w:r>
+                <w:rPr>
+                  <w:rFonts w:ascii="Segoe UI Symbol" w:eastAsia="Times New Roman" w:hAnsi="Segoe UI Symbol" w:cs="Segoe UI Symbol"/>
+                  <w:color w:val="000000"/>
+                </w:rPr>
+                <w:t>X</w:t>
+              </w:r>
+            </w:ins>
+          </w:p>
+        </w:tc>
       </w:tr>
       <w:tr>
+        <w:tblPrEx>
+          <w:tblW w:w="13230" w:type="dxa"/>
+          <w:tblLayout w:type="fixed"/>
+          <w:tblPrExChange w:id="61" w:author="Coles, Nicholas A." w:date="2026-08-05T15:30:00Z" w16du:dateUtc="2026-08-05T19:30:00Z">
+            <w:tblPrEx>
+              <w:tblW w:w="12420" w:type="dxa"/>
+            </w:tblPrEx>
+          </w:tblPrExChange>
+        </w:tblPrEx>
         <w:trPr>
           <w:trHeight w:val="320"/>
+          <w:trPrChange w:id="62" w:author="Coles, Nicholas A." w:date="2026-08-05T15:30:00Z" w16du:dateUtc="2026-08-05T19:30:00Z">
+            <w:trPr>
+              <w:gridAfter w:val="0"/>
+              <w:trHeight w:val="320"/>
+            </w:trPr>
+          </w:trPrChange>
         </w:trPr>
         <w:tc>
           <w:tcPr>
-            <w:tcW w:w="2250" w:type="dxa"/>
+            <w:tcW w:w="2162" w:type="dxa"/>
             <w:tcBorders>
               <w:top w:val="nil"/>
               <w:left w:val="nil"/>
@@ -7432,6 +8271,21 @@
             <w:noWrap/>
             <w:vAlign w:val="bottom"/>
             <w:hideMark/>
+            <w:tcPrChange w:id="63" w:author="Coles, Nicholas A." w:date="2026-08-05T15:30:00Z" w16du:dateUtc="2026-08-05T19:30:00Z">
+              <w:tcPr>
+                <w:tcW w:w="2250" w:type="dxa"/>
+                <w:gridSpan w:val="2"/>
+                <w:tcBorders>
+                  <w:top w:val="nil"/>
+                  <w:left w:val="nil"/>
+                  <w:bottom w:val="nil"/>
+                  <w:right w:val="nil"/>
+                </w:tcBorders>
+                <w:noWrap/>
+                <w:vAlign w:val="bottom"/>
+                <w:hideMark/>
+              </w:tcPr>
+            </w:tcPrChange>
           </w:tcPr>
           <w:p>
             <w:pPr>
@@ -7454,6 +8308,21 @@
             <w:noWrap/>
             <w:vAlign w:val="bottom"/>
             <w:hideMark/>
+            <w:tcPrChange w:id="64" w:author="Coles, Nicholas A." w:date="2026-08-05T15:30:00Z" w16du:dateUtc="2026-08-05T19:30:00Z">
+              <w:tcPr>
+                <w:tcW w:w="2610" w:type="dxa"/>
+                <w:gridSpan w:val="2"/>
+                <w:tcBorders>
+                  <w:top w:val="nil"/>
+                  <w:left w:val="nil"/>
+                  <w:bottom w:val="nil"/>
+                  <w:right w:val="nil"/>
+                </w:tcBorders>
+                <w:noWrap/>
+                <w:vAlign w:val="bottom"/>
+                <w:hideMark/>
+              </w:tcPr>
+            </w:tcPrChange>
           </w:tcPr>
           <w:p>
             <w:pPr>
@@ -7476,6 +8345,21 @@
             <w:noWrap/>
             <w:vAlign w:val="bottom"/>
             <w:hideMark/>
+            <w:tcPrChange w:id="65" w:author="Coles, Nicholas A." w:date="2026-08-05T15:30:00Z" w16du:dateUtc="2026-08-05T19:30:00Z">
+              <w:tcPr>
+                <w:tcW w:w="1443" w:type="dxa"/>
+                <w:gridSpan w:val="2"/>
+                <w:tcBorders>
+                  <w:top w:val="nil"/>
+                  <w:left w:val="nil"/>
+                  <w:bottom w:val="nil"/>
+                  <w:right w:val="nil"/>
+                </w:tcBorders>
+                <w:noWrap/>
+                <w:vAlign w:val="bottom"/>
+                <w:hideMark/>
+              </w:tcPr>
+            </w:tcPrChange>
           </w:tcPr>
           <w:p>
             <w:pPr>
@@ -7485,18 +8369,36 @@
                 <w:color w:val="000000"/>
               </w:rPr>
             </w:pPr>
+            <w:ins w:id="66" w:author="Coles, Nicholas A." w:date="2026-08-05T15:18:00Z" w16du:dateUtc="2026-08-05T19:18:00Z">
+              <w:r>
+                <w:rPr>
+                  <w:rFonts w:eastAsia="Times New Roman" w:cs="Times New Roman"/>
+                  <w:color w:val="000000"/>
+                </w:rPr>
+                <w:t>y</w:t>
+              </w:r>
+            </w:ins>
+            <w:del w:id="67" w:author="Coles, Nicholas A." w:date="2026-08-05T15:18:00Z" w16du:dateUtc="2026-08-05T19:18:00Z">
+              <w:r>
+                <w:rPr>
+                  <w:rFonts w:eastAsia="Times New Roman" w:cs="Times New Roman"/>
+                  <w:color w:val="000000"/>
+                </w:rPr>
+                <w:delText>Y</w:delText>
+              </w:r>
+            </w:del>
             <w:r>
               <w:rPr>
                 <w:rFonts w:eastAsia="Times New Roman" w:cs="Times New Roman"/>
                 <w:color w:val="000000"/>
               </w:rPr>
-              <w:t>Yes</w:t>
+              <w:t>es</w:t>
             </w:r>
           </w:p>
         </w:tc>
         <w:tc>
           <w:tcPr>
-            <w:tcW w:w="345" w:type="dxa"/>
+            <w:tcW w:w="276" w:type="dxa"/>
             <w:tcBorders>
               <w:top w:val="nil"/>
               <w:left w:val="nil"/>
@@ -7506,6 +8408,21 @@
             <w:noWrap/>
             <w:vAlign w:val="bottom"/>
             <w:hideMark/>
+            <w:tcPrChange w:id="68" w:author="Coles, Nicholas A." w:date="2026-08-05T15:30:00Z" w16du:dateUtc="2026-08-05T19:30:00Z">
+              <w:tcPr>
+                <w:tcW w:w="345" w:type="dxa"/>
+                <w:gridSpan w:val="2"/>
+                <w:tcBorders>
+                  <w:top w:val="nil"/>
+                  <w:left w:val="nil"/>
+                  <w:bottom w:val="nil"/>
+                  <w:right w:val="nil"/>
+                </w:tcBorders>
+                <w:noWrap/>
+                <w:vAlign w:val="bottom"/>
+                <w:hideMark/>
+              </w:tcPr>
+            </w:tcPrChange>
           </w:tcPr>
           <w:p>
             <w:pPr>
@@ -7519,7 +8436,7 @@
         </w:tc>
         <w:tc>
           <w:tcPr>
-            <w:tcW w:w="2556" w:type="dxa"/>
+            <w:tcW w:w="2600" w:type="dxa"/>
             <w:tcBorders>
               <w:top w:val="nil"/>
               <w:left w:val="nil"/>
@@ -7529,6 +8446,21 @@
             <w:noWrap/>
             <w:vAlign w:val="center"/>
             <w:hideMark/>
+            <w:tcPrChange w:id="69" w:author="Coles, Nicholas A." w:date="2026-08-05T15:30:00Z" w16du:dateUtc="2026-08-05T19:30:00Z">
+              <w:tcPr>
+                <w:tcW w:w="2556" w:type="dxa"/>
+                <w:gridSpan w:val="2"/>
+                <w:tcBorders>
+                  <w:top w:val="nil"/>
+                  <w:left w:val="nil"/>
+                  <w:bottom w:val="nil"/>
+                  <w:right w:val="nil"/>
+                </w:tcBorders>
+                <w:noWrap/>
+                <w:vAlign w:val="center"/>
+                <w:hideMark/>
+              </w:tcPr>
+            </w:tcPrChange>
           </w:tcPr>
           <w:p>
             <w:pPr>
@@ -7549,7 +8481,7 @@
         </w:tc>
         <w:tc>
           <w:tcPr>
-            <w:tcW w:w="1380" w:type="dxa"/>
+            <w:tcW w:w="1283" w:type="dxa"/>
             <w:tcBorders>
               <w:top w:val="nil"/>
               <w:left w:val="nil"/>
@@ -7559,6 +8491,21 @@
             <w:noWrap/>
             <w:vAlign w:val="center"/>
             <w:hideMark/>
+            <w:tcPrChange w:id="70" w:author="Coles, Nicholas A." w:date="2026-08-05T15:30:00Z" w16du:dateUtc="2026-08-05T19:30:00Z">
+              <w:tcPr>
+                <w:tcW w:w="1380" w:type="dxa"/>
+                <w:gridSpan w:val="2"/>
+                <w:tcBorders>
+                  <w:top w:val="nil"/>
+                  <w:left w:val="nil"/>
+                  <w:bottom w:val="nil"/>
+                  <w:right w:val="nil"/>
+                </w:tcBorders>
+                <w:noWrap/>
+                <w:vAlign w:val="center"/>
+                <w:hideMark/>
+              </w:tcPr>
+            </w:tcPrChange>
           </w:tcPr>
           <w:p>
             <w:pPr>
@@ -7573,7 +8520,7 @@
         </w:tc>
         <w:tc>
           <w:tcPr>
-            <w:tcW w:w="1550" w:type="dxa"/>
+            <w:tcW w:w="1506" w:type="dxa"/>
             <w:tcBorders>
               <w:top w:val="nil"/>
               <w:left w:val="nil"/>
@@ -7583,6 +8530,21 @@
             <w:noWrap/>
             <w:vAlign w:val="center"/>
             <w:hideMark/>
+            <w:tcPrChange w:id="71" w:author="Coles, Nicholas A." w:date="2026-08-05T15:30:00Z" w16du:dateUtc="2026-08-05T19:30:00Z">
+              <w:tcPr>
+                <w:tcW w:w="1550" w:type="dxa"/>
+                <w:gridSpan w:val="2"/>
+                <w:tcBorders>
+                  <w:top w:val="nil"/>
+                  <w:left w:val="nil"/>
+                  <w:bottom w:val="nil"/>
+                  <w:right w:val="nil"/>
+                </w:tcBorders>
+                <w:noWrap/>
+                <w:vAlign w:val="center"/>
+                <w:hideMark/>
+              </w:tcPr>
+            </w:tcPrChange>
           </w:tcPr>
           <w:p>
             <w:pPr>
@@ -7595,14 +8557,103 @@
             </w:pPr>
           </w:p>
         </w:tc>
+        <w:tc>
+          <w:tcPr>
+            <w:tcW w:w="270" w:type="dxa"/>
+            <w:tcBorders>
+              <w:top w:val="nil"/>
+              <w:left w:val="nil"/>
+              <w:bottom w:val="nil"/>
+              <w:right w:val="nil"/>
+            </w:tcBorders>
+            <w:tcPrChange w:id="72" w:author="Coles, Nicholas A." w:date="2026-08-05T15:30:00Z" w16du:dateUtc="2026-08-05T19:30:00Z">
+              <w:tcPr>
+                <w:tcW w:w="286" w:type="dxa"/>
+                <w:gridSpan w:val="2"/>
+                <w:tcBorders>
+                  <w:top w:val="nil"/>
+                  <w:left w:val="nil"/>
+                  <w:bottom w:val="nil"/>
+                  <w:right w:val="nil"/>
+                </w:tcBorders>
+              </w:tcPr>
+            </w:tcPrChange>
+          </w:tcPr>
+          <w:p>
+            <w:pPr>
+              <w:spacing w:before="0" w:after="0" w:line="360" w:lineRule="auto"/>
+              <w:jc w:val="center"/>
+              <w:rPr>
+                <w:rFonts w:eastAsia="Times New Roman" w:cs="Times New Roman"/>
+                <w:color w:val="000000"/>
+              </w:rPr>
+            </w:pPr>
+          </w:p>
+        </w:tc>
+        <w:tc>
+          <w:tcPr>
+            <w:tcW w:w="1080" w:type="dxa"/>
+            <w:tcBorders>
+              <w:top w:val="nil"/>
+              <w:left w:val="nil"/>
+              <w:bottom w:val="nil"/>
+              <w:right w:val="nil"/>
+            </w:tcBorders>
+            <w:tcPrChange w:id="73" w:author="Coles, Nicholas A." w:date="2026-08-05T15:30:00Z" w16du:dateUtc="2026-08-05T19:30:00Z">
+              <w:tcPr>
+                <w:tcW w:w="286" w:type="dxa"/>
+                <w:tcBorders>
+                  <w:top w:val="nil"/>
+                  <w:left w:val="nil"/>
+                  <w:bottom w:val="nil"/>
+                  <w:right w:val="nil"/>
+                </w:tcBorders>
+              </w:tcPr>
+            </w:tcPrChange>
+          </w:tcPr>
+          <w:p>
+            <w:pPr>
+              <w:spacing w:before="0" w:after="0" w:line="360" w:lineRule="auto"/>
+              <w:jc w:val="center"/>
+              <w:rPr>
+                <w:rFonts w:eastAsia="Times New Roman" w:cs="Times New Roman"/>
+                <w:color w:val="000000"/>
+              </w:rPr>
+            </w:pPr>
+            <w:ins w:id="74" w:author="Coles, Nicholas A." w:date="2026-08-05T15:32:00Z" w16du:dateUtc="2026-08-05T19:32:00Z">
+              <w:r>
+                <w:rPr>
+                  <w:rFonts w:ascii="Segoe UI Symbol" w:eastAsia="Times New Roman" w:hAnsi="Segoe UI Symbol" w:cs="Segoe UI Symbol"/>
+                  <w:color w:val="000000"/>
+                </w:rPr>
+                <w:t>X</w:t>
+              </w:r>
+            </w:ins>
+          </w:p>
+        </w:tc>
       </w:tr>
       <w:tr>
+        <w:tblPrEx>
+          <w:tblW w:w="13230" w:type="dxa"/>
+          <w:tblLayout w:type="fixed"/>
+          <w:tblPrExChange w:id="75" w:author="Coles, Nicholas A." w:date="2026-08-05T15:30:00Z" w16du:dateUtc="2026-08-05T19:30:00Z">
+            <w:tblPrEx>
+              <w:tblW w:w="12420" w:type="dxa"/>
+            </w:tblPrEx>
+          </w:tblPrExChange>
+        </w:tblPrEx>
         <w:trPr>
           <w:trHeight w:val="320"/>
+          <w:trPrChange w:id="76" w:author="Coles, Nicholas A." w:date="2026-08-05T15:30:00Z" w16du:dateUtc="2026-08-05T19:30:00Z">
+            <w:trPr>
+              <w:gridAfter w:val="0"/>
+              <w:trHeight w:val="320"/>
+            </w:trPr>
+          </w:trPrChange>
         </w:trPr>
         <w:tc>
           <w:tcPr>
-            <w:tcW w:w="2250" w:type="dxa"/>
+            <w:tcW w:w="2162" w:type="dxa"/>
             <w:tcBorders>
               <w:top w:val="nil"/>
               <w:left w:val="nil"/>
@@ -7612,6 +8663,21 @@
             <w:noWrap/>
             <w:vAlign w:val="bottom"/>
             <w:hideMark/>
+            <w:tcPrChange w:id="77" w:author="Coles, Nicholas A." w:date="2026-08-05T15:30:00Z" w16du:dateUtc="2026-08-05T19:30:00Z">
+              <w:tcPr>
+                <w:tcW w:w="2250" w:type="dxa"/>
+                <w:gridSpan w:val="2"/>
+                <w:tcBorders>
+                  <w:top w:val="nil"/>
+                  <w:left w:val="nil"/>
+                  <w:bottom w:val="nil"/>
+                  <w:right w:val="nil"/>
+                </w:tcBorders>
+                <w:noWrap/>
+                <w:vAlign w:val="bottom"/>
+                <w:hideMark/>
+              </w:tcPr>
+            </w:tcPrChange>
           </w:tcPr>
           <w:p>
             <w:pPr>
@@ -7642,6 +8708,21 @@
             <w:noWrap/>
             <w:vAlign w:val="bottom"/>
             <w:hideMark/>
+            <w:tcPrChange w:id="78" w:author="Coles, Nicholas A." w:date="2026-08-05T15:30:00Z" w16du:dateUtc="2026-08-05T19:30:00Z">
+              <w:tcPr>
+                <w:tcW w:w="2610" w:type="dxa"/>
+                <w:gridSpan w:val="2"/>
+                <w:tcBorders>
+                  <w:top w:val="nil"/>
+                  <w:left w:val="nil"/>
+                  <w:bottom w:val="nil"/>
+                  <w:right w:val="nil"/>
+                </w:tcBorders>
+                <w:noWrap/>
+                <w:vAlign w:val="bottom"/>
+                <w:hideMark/>
+              </w:tcPr>
+            </w:tcPrChange>
           </w:tcPr>
           <w:p>
             <w:pPr>
@@ -7672,6 +8753,21 @@
             <w:noWrap/>
             <w:vAlign w:val="bottom"/>
             <w:hideMark/>
+            <w:tcPrChange w:id="79" w:author="Coles, Nicholas A." w:date="2026-08-05T15:30:00Z" w16du:dateUtc="2026-08-05T19:30:00Z">
+              <w:tcPr>
+                <w:tcW w:w="1443" w:type="dxa"/>
+                <w:gridSpan w:val="2"/>
+                <w:tcBorders>
+                  <w:top w:val="nil"/>
+                  <w:left w:val="nil"/>
+                  <w:bottom w:val="nil"/>
+                  <w:right w:val="nil"/>
+                </w:tcBorders>
+                <w:noWrap/>
+                <w:vAlign w:val="bottom"/>
+                <w:hideMark/>
+              </w:tcPr>
+            </w:tcPrChange>
           </w:tcPr>
           <w:p>
             <w:pPr>
@@ -7681,18 +8777,36 @@
                 <w:color w:val="000000"/>
               </w:rPr>
             </w:pPr>
+            <w:ins w:id="80" w:author="Coles, Nicholas A." w:date="2026-08-05T15:18:00Z" w16du:dateUtc="2026-08-05T19:18:00Z">
+              <w:r>
+                <w:rPr>
+                  <w:rFonts w:eastAsia="Times New Roman" w:cs="Times New Roman"/>
+                  <w:color w:val="000000"/>
+                </w:rPr>
+                <w:t>n</w:t>
+              </w:r>
+            </w:ins>
+            <w:del w:id="81" w:author="Coles, Nicholas A." w:date="2026-08-05T15:18:00Z" w16du:dateUtc="2026-08-05T19:18:00Z">
+              <w:r>
+                <w:rPr>
+                  <w:rFonts w:eastAsia="Times New Roman" w:cs="Times New Roman"/>
+                  <w:color w:val="000000"/>
+                </w:rPr>
+                <w:delText>N</w:delText>
+              </w:r>
+            </w:del>
             <w:r>
               <w:rPr>
                 <w:rFonts w:eastAsia="Times New Roman" w:cs="Times New Roman"/>
                 <w:color w:val="000000"/>
               </w:rPr>
-              <w:t>No</w:t>
+              <w:t>o</w:t>
             </w:r>
           </w:p>
         </w:tc>
         <w:tc>
           <w:tcPr>
-            <w:tcW w:w="345" w:type="dxa"/>
+            <w:tcW w:w="276" w:type="dxa"/>
             <w:tcBorders>
               <w:top w:val="nil"/>
               <w:left w:val="nil"/>
@@ -7702,6 +8816,21 @@
             <w:noWrap/>
             <w:vAlign w:val="bottom"/>
             <w:hideMark/>
+            <w:tcPrChange w:id="82" w:author="Coles, Nicholas A." w:date="2026-08-05T15:30:00Z" w16du:dateUtc="2026-08-05T19:30:00Z">
+              <w:tcPr>
+                <w:tcW w:w="345" w:type="dxa"/>
+                <w:gridSpan w:val="2"/>
+                <w:tcBorders>
+                  <w:top w:val="nil"/>
+                  <w:left w:val="nil"/>
+                  <w:bottom w:val="nil"/>
+                  <w:right w:val="nil"/>
+                </w:tcBorders>
+                <w:noWrap/>
+                <w:vAlign w:val="bottom"/>
+                <w:hideMark/>
+              </w:tcPr>
+            </w:tcPrChange>
           </w:tcPr>
           <w:p>
             <w:pPr>
@@ -7715,7 +8844,7 @@
         </w:tc>
         <w:tc>
           <w:tcPr>
-            <w:tcW w:w="2556" w:type="dxa"/>
+            <w:tcW w:w="2600" w:type="dxa"/>
             <w:tcBorders>
               <w:top w:val="nil"/>
               <w:left w:val="nil"/>
@@ -7725,6 +8854,21 @@
             <w:noWrap/>
             <w:vAlign w:val="center"/>
             <w:hideMark/>
+            <w:tcPrChange w:id="83" w:author="Coles, Nicholas A." w:date="2026-08-05T15:30:00Z" w16du:dateUtc="2026-08-05T19:30:00Z">
+              <w:tcPr>
+                <w:tcW w:w="2556" w:type="dxa"/>
+                <w:gridSpan w:val="2"/>
+                <w:tcBorders>
+                  <w:top w:val="nil"/>
+                  <w:left w:val="nil"/>
+                  <w:bottom w:val="nil"/>
+                  <w:right w:val="nil"/>
+                </w:tcBorders>
+                <w:noWrap/>
+                <w:vAlign w:val="center"/>
+                <w:hideMark/>
+              </w:tcPr>
+            </w:tcPrChange>
           </w:tcPr>
           <w:p>
             <w:pPr>
@@ -7739,7 +8883,7 @@
         </w:tc>
         <w:tc>
           <w:tcPr>
-            <w:tcW w:w="1380" w:type="dxa"/>
+            <w:tcW w:w="1283" w:type="dxa"/>
             <w:tcBorders>
               <w:top w:val="nil"/>
               <w:left w:val="nil"/>
@@ -7749,6 +8893,21 @@
             <w:noWrap/>
             <w:vAlign w:val="center"/>
             <w:hideMark/>
+            <w:tcPrChange w:id="84" w:author="Coles, Nicholas A." w:date="2026-08-05T15:30:00Z" w16du:dateUtc="2026-08-05T19:30:00Z">
+              <w:tcPr>
+                <w:tcW w:w="1380" w:type="dxa"/>
+                <w:gridSpan w:val="2"/>
+                <w:tcBorders>
+                  <w:top w:val="nil"/>
+                  <w:left w:val="nil"/>
+                  <w:bottom w:val="nil"/>
+                  <w:right w:val="nil"/>
+                </w:tcBorders>
+                <w:noWrap/>
+                <w:vAlign w:val="center"/>
+                <w:hideMark/>
+              </w:tcPr>
+            </w:tcPrChange>
           </w:tcPr>
           <w:p>
             <w:pPr>
@@ -7770,7 +8929,7 @@
         </w:tc>
         <w:tc>
           <w:tcPr>
-            <w:tcW w:w="1550" w:type="dxa"/>
+            <w:tcW w:w="1506" w:type="dxa"/>
             <w:tcBorders>
               <w:top w:val="nil"/>
               <w:left w:val="nil"/>
@@ -7780,6 +8939,21 @@
             <w:noWrap/>
             <w:vAlign w:val="bottom"/>
             <w:hideMark/>
+            <w:tcPrChange w:id="85" w:author="Coles, Nicholas A." w:date="2026-08-05T15:30:00Z" w16du:dateUtc="2026-08-05T19:30:00Z">
+              <w:tcPr>
+                <w:tcW w:w="1550" w:type="dxa"/>
+                <w:gridSpan w:val="2"/>
+                <w:tcBorders>
+                  <w:top w:val="nil"/>
+                  <w:left w:val="nil"/>
+                  <w:bottom w:val="nil"/>
+                  <w:right w:val="nil"/>
+                </w:tcBorders>
+                <w:noWrap/>
+                <w:vAlign w:val="bottom"/>
+                <w:hideMark/>
+              </w:tcPr>
+            </w:tcPrChange>
           </w:tcPr>
           <w:p>
             <w:pPr>
@@ -7798,14 +8972,103 @@
             </w:r>
           </w:p>
         </w:tc>
+        <w:tc>
+          <w:tcPr>
+            <w:tcW w:w="270" w:type="dxa"/>
+            <w:tcBorders>
+              <w:top w:val="nil"/>
+              <w:left w:val="nil"/>
+              <w:bottom w:val="nil"/>
+              <w:right w:val="nil"/>
+            </w:tcBorders>
+            <w:tcPrChange w:id="86" w:author="Coles, Nicholas A." w:date="2026-08-05T15:30:00Z" w16du:dateUtc="2026-08-05T19:30:00Z">
+              <w:tcPr>
+                <w:tcW w:w="286" w:type="dxa"/>
+                <w:gridSpan w:val="2"/>
+                <w:tcBorders>
+                  <w:top w:val="nil"/>
+                  <w:left w:val="nil"/>
+                  <w:bottom w:val="nil"/>
+                  <w:right w:val="nil"/>
+                </w:tcBorders>
+              </w:tcPr>
+            </w:tcPrChange>
+          </w:tcPr>
+          <w:p>
+            <w:pPr>
+              <w:spacing w:before="0" w:after="0" w:line="360" w:lineRule="auto"/>
+              <w:jc w:val="center"/>
+              <w:rPr>
+                <w:rFonts w:ascii="Segoe UI Symbol" w:eastAsia="Times New Roman" w:hAnsi="Segoe UI Symbol" w:cs="Segoe UI Symbol"/>
+                <w:color w:val="000000"/>
+              </w:rPr>
+            </w:pPr>
+          </w:p>
+        </w:tc>
+        <w:tc>
+          <w:tcPr>
+            <w:tcW w:w="1080" w:type="dxa"/>
+            <w:tcBorders>
+              <w:top w:val="nil"/>
+              <w:left w:val="nil"/>
+              <w:bottom w:val="nil"/>
+              <w:right w:val="nil"/>
+            </w:tcBorders>
+            <w:tcPrChange w:id="87" w:author="Coles, Nicholas A." w:date="2026-08-05T15:30:00Z" w16du:dateUtc="2026-08-05T19:30:00Z">
+              <w:tcPr>
+                <w:tcW w:w="286" w:type="dxa"/>
+                <w:tcBorders>
+                  <w:top w:val="nil"/>
+                  <w:left w:val="nil"/>
+                  <w:bottom w:val="nil"/>
+                  <w:right w:val="nil"/>
+                </w:tcBorders>
+              </w:tcPr>
+            </w:tcPrChange>
+          </w:tcPr>
+          <w:p>
+            <w:pPr>
+              <w:spacing w:before="0" w:after="0" w:line="360" w:lineRule="auto"/>
+              <w:jc w:val="center"/>
+              <w:rPr>
+                <w:rFonts w:ascii="Segoe UI Symbol" w:eastAsia="Times New Roman" w:hAnsi="Segoe UI Symbol" w:cs="Segoe UI Symbol"/>
+                <w:color w:val="000000"/>
+              </w:rPr>
+            </w:pPr>
+            <w:ins w:id="88" w:author="Coles, Nicholas A." w:date="2026-08-05T15:32:00Z" w16du:dateUtc="2026-08-05T19:32:00Z">
+              <w:r>
+                <w:rPr>
+                  <w:rFonts w:ascii="Segoe UI Symbol" w:eastAsia="Times New Roman" w:hAnsi="Segoe UI Symbol" w:cs="Segoe UI Symbol"/>
+                  <w:color w:val="000000"/>
+                </w:rPr>
+                <w:t>✓</w:t>
+              </w:r>
+            </w:ins>
+          </w:p>
+        </w:tc>
       </w:tr>
       <w:tr>
+        <w:tblPrEx>
+          <w:tblW w:w="13230" w:type="dxa"/>
+          <w:tblLayout w:type="fixed"/>
+          <w:tblPrExChange w:id="89" w:author="Coles, Nicholas A." w:date="2026-08-05T15:30:00Z" w16du:dateUtc="2026-08-05T19:30:00Z">
+            <w:tblPrEx>
+              <w:tblW w:w="12420" w:type="dxa"/>
+            </w:tblPrEx>
+          </w:tblPrExChange>
+        </w:tblPrEx>
         <w:trPr>
           <w:trHeight w:val="320"/>
+          <w:trPrChange w:id="90" w:author="Coles, Nicholas A." w:date="2026-08-05T15:30:00Z" w16du:dateUtc="2026-08-05T19:30:00Z">
+            <w:trPr>
+              <w:gridAfter w:val="0"/>
+              <w:trHeight w:val="320"/>
+            </w:trPr>
+          </w:trPrChange>
         </w:trPr>
         <w:tc>
           <w:tcPr>
-            <w:tcW w:w="2250" w:type="dxa"/>
+            <w:tcW w:w="2162" w:type="dxa"/>
             <w:tcBorders>
               <w:top w:val="nil"/>
               <w:left w:val="nil"/>
@@ -7815,6 +9078,21 @@
             <w:noWrap/>
             <w:vAlign w:val="bottom"/>
             <w:hideMark/>
+            <w:tcPrChange w:id="91" w:author="Coles, Nicholas A." w:date="2026-08-05T15:30:00Z" w16du:dateUtc="2026-08-05T19:30:00Z">
+              <w:tcPr>
+                <w:tcW w:w="2250" w:type="dxa"/>
+                <w:gridSpan w:val="2"/>
+                <w:tcBorders>
+                  <w:top w:val="nil"/>
+                  <w:left w:val="nil"/>
+                  <w:bottom w:val="nil"/>
+                  <w:right w:val="nil"/>
+                </w:tcBorders>
+                <w:noWrap/>
+                <w:vAlign w:val="bottom"/>
+                <w:hideMark/>
+              </w:tcPr>
+            </w:tcPrChange>
           </w:tcPr>
           <w:p>
             <w:pPr>
@@ -7837,6 +9115,21 @@
             <w:noWrap/>
             <w:vAlign w:val="bottom"/>
             <w:hideMark/>
+            <w:tcPrChange w:id="92" w:author="Coles, Nicholas A." w:date="2026-08-05T15:30:00Z" w16du:dateUtc="2026-08-05T19:30:00Z">
+              <w:tcPr>
+                <w:tcW w:w="2610" w:type="dxa"/>
+                <w:gridSpan w:val="2"/>
+                <w:tcBorders>
+                  <w:top w:val="nil"/>
+                  <w:left w:val="nil"/>
+                  <w:bottom w:val="nil"/>
+                  <w:right w:val="nil"/>
+                </w:tcBorders>
+                <w:noWrap/>
+                <w:vAlign w:val="bottom"/>
+                <w:hideMark/>
+              </w:tcPr>
+            </w:tcPrChange>
           </w:tcPr>
           <w:p>
             <w:pPr>
@@ -7859,6 +9152,21 @@
             <w:noWrap/>
             <w:vAlign w:val="bottom"/>
             <w:hideMark/>
+            <w:tcPrChange w:id="93" w:author="Coles, Nicholas A." w:date="2026-08-05T15:30:00Z" w16du:dateUtc="2026-08-05T19:30:00Z">
+              <w:tcPr>
+                <w:tcW w:w="1443" w:type="dxa"/>
+                <w:gridSpan w:val="2"/>
+                <w:tcBorders>
+                  <w:top w:val="nil"/>
+                  <w:left w:val="nil"/>
+                  <w:bottom w:val="nil"/>
+                  <w:right w:val="nil"/>
+                </w:tcBorders>
+                <w:noWrap/>
+                <w:vAlign w:val="bottom"/>
+                <w:hideMark/>
+              </w:tcPr>
+            </w:tcPrChange>
           </w:tcPr>
           <w:p>
             <w:pPr>
@@ -7868,18 +9176,36 @@
                 <w:color w:val="000000"/>
               </w:rPr>
             </w:pPr>
+            <w:ins w:id="94" w:author="Coles, Nicholas A." w:date="2026-08-05T15:18:00Z" w16du:dateUtc="2026-08-05T19:18:00Z">
+              <w:r>
+                <w:rPr>
+                  <w:rFonts w:eastAsia="Times New Roman" w:cs="Times New Roman"/>
+                  <w:color w:val="000000"/>
+                </w:rPr>
+                <w:t>y</w:t>
+              </w:r>
+            </w:ins>
+            <w:del w:id="95" w:author="Coles, Nicholas A." w:date="2026-08-05T15:18:00Z" w16du:dateUtc="2026-08-05T19:18:00Z">
+              <w:r>
+                <w:rPr>
+                  <w:rFonts w:eastAsia="Times New Roman" w:cs="Times New Roman"/>
+                  <w:color w:val="000000"/>
+                </w:rPr>
+                <w:delText>Y</w:delText>
+              </w:r>
+            </w:del>
             <w:r>
               <w:rPr>
                 <w:rFonts w:eastAsia="Times New Roman" w:cs="Times New Roman"/>
                 <w:color w:val="000000"/>
               </w:rPr>
-              <w:t>Yes</w:t>
+              <w:t>es</w:t>
             </w:r>
           </w:p>
         </w:tc>
         <w:tc>
           <w:tcPr>
-            <w:tcW w:w="345" w:type="dxa"/>
+            <w:tcW w:w="276" w:type="dxa"/>
             <w:tcBorders>
               <w:top w:val="nil"/>
               <w:left w:val="nil"/>
@@ -7889,6 +9215,21 @@
             <w:noWrap/>
             <w:vAlign w:val="bottom"/>
             <w:hideMark/>
+            <w:tcPrChange w:id="96" w:author="Coles, Nicholas A." w:date="2026-08-05T15:30:00Z" w16du:dateUtc="2026-08-05T19:30:00Z">
+              <w:tcPr>
+                <w:tcW w:w="345" w:type="dxa"/>
+                <w:gridSpan w:val="2"/>
+                <w:tcBorders>
+                  <w:top w:val="nil"/>
+                  <w:left w:val="nil"/>
+                  <w:bottom w:val="nil"/>
+                  <w:right w:val="nil"/>
+                </w:tcBorders>
+                <w:noWrap/>
+                <w:vAlign w:val="bottom"/>
+                <w:hideMark/>
+              </w:tcPr>
+            </w:tcPrChange>
           </w:tcPr>
           <w:p>
             <w:pPr>
@@ -7902,7 +9243,7 @@
         </w:tc>
         <w:tc>
           <w:tcPr>
-            <w:tcW w:w="2556" w:type="dxa"/>
+            <w:tcW w:w="2600" w:type="dxa"/>
             <w:tcBorders>
               <w:top w:val="nil"/>
               <w:left w:val="nil"/>
@@ -7912,6 +9253,21 @@
             <w:noWrap/>
             <w:vAlign w:val="center"/>
             <w:hideMark/>
+            <w:tcPrChange w:id="97" w:author="Coles, Nicholas A." w:date="2026-08-05T15:30:00Z" w16du:dateUtc="2026-08-05T19:30:00Z">
+              <w:tcPr>
+                <w:tcW w:w="2556" w:type="dxa"/>
+                <w:gridSpan w:val="2"/>
+                <w:tcBorders>
+                  <w:top w:val="nil"/>
+                  <w:left w:val="nil"/>
+                  <w:bottom w:val="nil"/>
+                  <w:right w:val="nil"/>
+                </w:tcBorders>
+                <w:noWrap/>
+                <w:vAlign w:val="center"/>
+                <w:hideMark/>
+              </w:tcPr>
+            </w:tcPrChange>
           </w:tcPr>
           <w:p>
             <w:pPr>
@@ -7926,7 +9282,7 @@
         </w:tc>
         <w:tc>
           <w:tcPr>
-            <w:tcW w:w="1380" w:type="dxa"/>
+            <w:tcW w:w="1283" w:type="dxa"/>
             <w:tcBorders>
               <w:top w:val="nil"/>
               <w:left w:val="nil"/>
@@ -7936,6 +9292,21 @@
             <w:noWrap/>
             <w:vAlign w:val="center"/>
             <w:hideMark/>
+            <w:tcPrChange w:id="98" w:author="Coles, Nicholas A." w:date="2026-08-05T15:30:00Z" w16du:dateUtc="2026-08-05T19:30:00Z">
+              <w:tcPr>
+                <w:tcW w:w="1380" w:type="dxa"/>
+                <w:gridSpan w:val="2"/>
+                <w:tcBorders>
+                  <w:top w:val="nil"/>
+                  <w:left w:val="nil"/>
+                  <w:bottom w:val="nil"/>
+                  <w:right w:val="nil"/>
+                </w:tcBorders>
+                <w:noWrap/>
+                <w:vAlign w:val="center"/>
+                <w:hideMark/>
+              </w:tcPr>
+            </w:tcPrChange>
           </w:tcPr>
           <w:p>
             <w:pPr>
@@ -7957,7 +9328,7 @@
         </w:tc>
         <w:tc>
           <w:tcPr>
-            <w:tcW w:w="1550" w:type="dxa"/>
+            <w:tcW w:w="1506" w:type="dxa"/>
             <w:tcBorders>
               <w:top w:val="nil"/>
               <w:left w:val="nil"/>
@@ -7967,6 +9338,21 @@
             <w:noWrap/>
             <w:vAlign w:val="center"/>
             <w:hideMark/>
+            <w:tcPrChange w:id="99" w:author="Coles, Nicholas A." w:date="2026-08-05T15:30:00Z" w16du:dateUtc="2026-08-05T19:30:00Z">
+              <w:tcPr>
+                <w:tcW w:w="1550" w:type="dxa"/>
+                <w:gridSpan w:val="2"/>
+                <w:tcBorders>
+                  <w:top w:val="nil"/>
+                  <w:left w:val="nil"/>
+                  <w:bottom w:val="nil"/>
+                  <w:right w:val="nil"/>
+                </w:tcBorders>
+                <w:noWrap/>
+                <w:vAlign w:val="center"/>
+                <w:hideMark/>
+              </w:tcPr>
+            </w:tcPrChange>
           </w:tcPr>
           <w:p>
             <w:pPr>
@@ -7979,14 +9365,103 @@
             </w:pPr>
           </w:p>
         </w:tc>
+        <w:tc>
+          <w:tcPr>
+            <w:tcW w:w="270" w:type="dxa"/>
+            <w:tcBorders>
+              <w:top w:val="nil"/>
+              <w:left w:val="nil"/>
+              <w:bottom w:val="nil"/>
+              <w:right w:val="nil"/>
+            </w:tcBorders>
+            <w:tcPrChange w:id="100" w:author="Coles, Nicholas A." w:date="2026-08-05T15:30:00Z" w16du:dateUtc="2026-08-05T19:30:00Z">
+              <w:tcPr>
+                <w:tcW w:w="286" w:type="dxa"/>
+                <w:gridSpan w:val="2"/>
+                <w:tcBorders>
+                  <w:top w:val="nil"/>
+                  <w:left w:val="nil"/>
+                  <w:bottom w:val="nil"/>
+                  <w:right w:val="nil"/>
+                </w:tcBorders>
+              </w:tcPr>
+            </w:tcPrChange>
+          </w:tcPr>
+          <w:p>
+            <w:pPr>
+              <w:spacing w:before="0" w:after="0" w:line="360" w:lineRule="auto"/>
+              <w:jc w:val="center"/>
+              <w:rPr>
+                <w:rFonts w:eastAsia="Times New Roman" w:cs="Times New Roman"/>
+                <w:color w:val="000000"/>
+              </w:rPr>
+            </w:pPr>
+          </w:p>
+        </w:tc>
+        <w:tc>
+          <w:tcPr>
+            <w:tcW w:w="1080" w:type="dxa"/>
+            <w:tcBorders>
+              <w:top w:val="nil"/>
+              <w:left w:val="nil"/>
+              <w:bottom w:val="nil"/>
+              <w:right w:val="nil"/>
+            </w:tcBorders>
+            <w:tcPrChange w:id="101" w:author="Coles, Nicholas A." w:date="2026-08-05T15:30:00Z" w16du:dateUtc="2026-08-05T19:30:00Z">
+              <w:tcPr>
+                <w:tcW w:w="286" w:type="dxa"/>
+                <w:tcBorders>
+                  <w:top w:val="nil"/>
+                  <w:left w:val="nil"/>
+                  <w:bottom w:val="nil"/>
+                  <w:right w:val="nil"/>
+                </w:tcBorders>
+              </w:tcPr>
+            </w:tcPrChange>
+          </w:tcPr>
+          <w:p>
+            <w:pPr>
+              <w:spacing w:before="0" w:after="0" w:line="360" w:lineRule="auto"/>
+              <w:jc w:val="center"/>
+              <w:rPr>
+                <w:rFonts w:eastAsia="Times New Roman" w:cs="Times New Roman"/>
+                <w:color w:val="000000"/>
+              </w:rPr>
+            </w:pPr>
+            <w:ins w:id="102" w:author="Coles, Nicholas A." w:date="2026-08-05T15:32:00Z" w16du:dateUtc="2026-08-05T19:32:00Z">
+              <w:r>
+                <w:rPr>
+                  <w:rFonts w:ascii="Segoe UI Symbol" w:eastAsia="Times New Roman" w:hAnsi="Segoe UI Symbol" w:cs="Segoe UI Symbol"/>
+                  <w:color w:val="000000"/>
+                </w:rPr>
+                <w:t>✓</w:t>
+              </w:r>
+            </w:ins>
+          </w:p>
+        </w:tc>
       </w:tr>
       <w:tr>
+        <w:tblPrEx>
+          <w:tblW w:w="13230" w:type="dxa"/>
+          <w:tblLayout w:type="fixed"/>
+          <w:tblPrExChange w:id="103" w:author="Coles, Nicholas A." w:date="2026-08-05T15:30:00Z" w16du:dateUtc="2026-08-05T19:30:00Z">
+            <w:tblPrEx>
+              <w:tblW w:w="12420" w:type="dxa"/>
+            </w:tblPrEx>
+          </w:tblPrExChange>
+        </w:tblPrEx>
         <w:trPr>
           <w:trHeight w:val="320"/>
+          <w:trPrChange w:id="104" w:author="Coles, Nicholas A." w:date="2026-08-05T15:30:00Z" w16du:dateUtc="2026-08-05T19:30:00Z">
+            <w:trPr>
+              <w:gridAfter w:val="0"/>
+              <w:trHeight w:val="320"/>
+            </w:trPr>
+          </w:trPrChange>
         </w:trPr>
         <w:tc>
           <w:tcPr>
-            <w:tcW w:w="2250" w:type="dxa"/>
+            <w:tcW w:w="2162" w:type="dxa"/>
             <w:tcBorders>
               <w:top w:val="nil"/>
               <w:left w:val="nil"/>
@@ -7996,6 +9471,21 @@
             <w:noWrap/>
             <w:vAlign w:val="bottom"/>
             <w:hideMark/>
+            <w:tcPrChange w:id="105" w:author="Coles, Nicholas A." w:date="2026-08-05T15:30:00Z" w16du:dateUtc="2026-08-05T19:30:00Z">
+              <w:tcPr>
+                <w:tcW w:w="2250" w:type="dxa"/>
+                <w:gridSpan w:val="2"/>
+                <w:tcBorders>
+                  <w:top w:val="nil"/>
+                  <w:left w:val="nil"/>
+                  <w:bottom w:val="nil"/>
+                  <w:right w:val="nil"/>
+                </w:tcBorders>
+                <w:noWrap/>
+                <w:vAlign w:val="bottom"/>
+                <w:hideMark/>
+              </w:tcPr>
+            </w:tcPrChange>
           </w:tcPr>
           <w:p>
             <w:pPr>
@@ -8019,6 +9509,21 @@
             <w:noWrap/>
             <w:vAlign w:val="bottom"/>
             <w:hideMark/>
+            <w:tcPrChange w:id="106" w:author="Coles, Nicholas A." w:date="2026-08-05T15:30:00Z" w16du:dateUtc="2026-08-05T19:30:00Z">
+              <w:tcPr>
+                <w:tcW w:w="2610" w:type="dxa"/>
+                <w:gridSpan w:val="2"/>
+                <w:tcBorders>
+                  <w:top w:val="nil"/>
+                  <w:left w:val="nil"/>
+                  <w:bottom w:val="nil"/>
+                  <w:right w:val="nil"/>
+                </w:tcBorders>
+                <w:noWrap/>
+                <w:vAlign w:val="bottom"/>
+                <w:hideMark/>
+              </w:tcPr>
+            </w:tcPrChange>
           </w:tcPr>
           <w:p>
             <w:pPr>
@@ -8049,6 +9554,21 @@
             <w:noWrap/>
             <w:vAlign w:val="bottom"/>
             <w:hideMark/>
+            <w:tcPrChange w:id="107" w:author="Coles, Nicholas A." w:date="2026-08-05T15:30:00Z" w16du:dateUtc="2026-08-05T19:30:00Z">
+              <w:tcPr>
+                <w:tcW w:w="1443" w:type="dxa"/>
+                <w:gridSpan w:val="2"/>
+                <w:tcBorders>
+                  <w:top w:val="nil"/>
+                  <w:left w:val="nil"/>
+                  <w:bottom w:val="nil"/>
+                  <w:right w:val="nil"/>
+                </w:tcBorders>
+                <w:noWrap/>
+                <w:vAlign w:val="bottom"/>
+                <w:hideMark/>
+              </w:tcPr>
+            </w:tcPrChange>
           </w:tcPr>
           <w:p>
             <w:pPr>
@@ -8058,18 +9578,36 @@
                 <w:color w:val="000000"/>
               </w:rPr>
             </w:pPr>
+            <w:ins w:id="108" w:author="Coles, Nicholas A." w:date="2026-08-05T15:18:00Z" w16du:dateUtc="2026-08-05T19:18:00Z">
+              <w:r>
+                <w:rPr>
+                  <w:rFonts w:eastAsia="Times New Roman" w:cs="Times New Roman"/>
+                  <w:color w:val="000000"/>
+                </w:rPr>
+                <w:t>n</w:t>
+              </w:r>
+            </w:ins>
+            <w:del w:id="109" w:author="Coles, Nicholas A." w:date="2026-08-05T15:18:00Z" w16du:dateUtc="2026-08-05T19:18:00Z">
+              <w:r>
+                <w:rPr>
+                  <w:rFonts w:eastAsia="Times New Roman" w:cs="Times New Roman"/>
+                  <w:color w:val="000000"/>
+                </w:rPr>
+                <w:delText>N</w:delText>
+              </w:r>
+            </w:del>
             <w:r>
               <w:rPr>
                 <w:rFonts w:eastAsia="Times New Roman" w:cs="Times New Roman"/>
                 <w:color w:val="000000"/>
               </w:rPr>
-              <w:t>No</w:t>
+              <w:t>o</w:t>
             </w:r>
           </w:p>
         </w:tc>
         <w:tc>
           <w:tcPr>
-            <w:tcW w:w="345" w:type="dxa"/>
+            <w:tcW w:w="276" w:type="dxa"/>
             <w:tcBorders>
               <w:top w:val="nil"/>
               <w:left w:val="nil"/>
@@ -8079,6 +9617,21 @@
             <w:noWrap/>
             <w:vAlign w:val="bottom"/>
             <w:hideMark/>
+            <w:tcPrChange w:id="110" w:author="Coles, Nicholas A." w:date="2026-08-05T15:30:00Z" w16du:dateUtc="2026-08-05T19:30:00Z">
+              <w:tcPr>
+                <w:tcW w:w="345" w:type="dxa"/>
+                <w:gridSpan w:val="2"/>
+                <w:tcBorders>
+                  <w:top w:val="nil"/>
+                  <w:left w:val="nil"/>
+                  <w:bottom w:val="nil"/>
+                  <w:right w:val="nil"/>
+                </w:tcBorders>
+                <w:noWrap/>
+                <w:vAlign w:val="bottom"/>
+                <w:hideMark/>
+              </w:tcPr>
+            </w:tcPrChange>
           </w:tcPr>
           <w:p>
             <w:pPr>
@@ -8092,7 +9645,7 @@
         </w:tc>
         <w:tc>
           <w:tcPr>
-            <w:tcW w:w="2556" w:type="dxa"/>
+            <w:tcW w:w="2600" w:type="dxa"/>
             <w:tcBorders>
               <w:top w:val="nil"/>
               <w:left w:val="nil"/>
@@ -8102,6 +9655,21 @@
             <w:noWrap/>
             <w:vAlign w:val="bottom"/>
             <w:hideMark/>
+            <w:tcPrChange w:id="111" w:author="Coles, Nicholas A." w:date="2026-08-05T15:30:00Z" w16du:dateUtc="2026-08-05T19:30:00Z">
+              <w:tcPr>
+                <w:tcW w:w="2556" w:type="dxa"/>
+                <w:gridSpan w:val="2"/>
+                <w:tcBorders>
+                  <w:top w:val="nil"/>
+                  <w:left w:val="nil"/>
+                  <w:bottom w:val="nil"/>
+                  <w:right w:val="nil"/>
+                </w:tcBorders>
+                <w:noWrap/>
+                <w:vAlign w:val="bottom"/>
+                <w:hideMark/>
+              </w:tcPr>
+            </w:tcPrChange>
           </w:tcPr>
           <w:p>
             <w:pPr>
@@ -8115,7 +9683,7 @@
         </w:tc>
         <w:tc>
           <w:tcPr>
-            <w:tcW w:w="1380" w:type="dxa"/>
+            <w:tcW w:w="1283" w:type="dxa"/>
             <w:tcBorders>
               <w:top w:val="nil"/>
               <w:left w:val="nil"/>
@@ -8125,6 +9693,21 @@
             <w:noWrap/>
             <w:vAlign w:val="bottom"/>
             <w:hideMark/>
+            <w:tcPrChange w:id="112" w:author="Coles, Nicholas A." w:date="2026-08-05T15:30:00Z" w16du:dateUtc="2026-08-05T19:30:00Z">
+              <w:tcPr>
+                <w:tcW w:w="1380" w:type="dxa"/>
+                <w:gridSpan w:val="2"/>
+                <w:tcBorders>
+                  <w:top w:val="nil"/>
+                  <w:left w:val="nil"/>
+                  <w:bottom w:val="nil"/>
+                  <w:right w:val="nil"/>
+                </w:tcBorders>
+                <w:noWrap/>
+                <w:vAlign w:val="bottom"/>
+                <w:hideMark/>
+              </w:tcPr>
+            </w:tcPrChange>
           </w:tcPr>
           <w:p>
             <w:pPr>
@@ -8138,7 +9721,7 @@
         </w:tc>
         <w:tc>
           <w:tcPr>
-            <w:tcW w:w="1550" w:type="dxa"/>
+            <w:tcW w:w="1506" w:type="dxa"/>
             <w:tcBorders>
               <w:top w:val="nil"/>
               <w:left w:val="nil"/>
@@ -8148,6 +9731,21 @@
             <w:noWrap/>
             <w:vAlign w:val="bottom"/>
             <w:hideMark/>
+            <w:tcPrChange w:id="113" w:author="Coles, Nicholas A." w:date="2026-08-05T15:30:00Z" w16du:dateUtc="2026-08-05T19:30:00Z">
+              <w:tcPr>
+                <w:tcW w:w="1550" w:type="dxa"/>
+                <w:gridSpan w:val="2"/>
+                <w:tcBorders>
+                  <w:top w:val="nil"/>
+                  <w:left w:val="nil"/>
+                  <w:bottom w:val="nil"/>
+                  <w:right w:val="nil"/>
+                </w:tcBorders>
+                <w:noWrap/>
+                <w:vAlign w:val="bottom"/>
+                <w:hideMark/>
+              </w:tcPr>
+            </w:tcPrChange>
           </w:tcPr>
           <w:p>
             <w:pPr>
@@ -8166,14 +9764,94 @@
             </w:r>
           </w:p>
         </w:tc>
+        <w:tc>
+          <w:tcPr>
+            <w:tcW w:w="270" w:type="dxa"/>
+            <w:tcBorders>
+              <w:top w:val="nil"/>
+              <w:left w:val="nil"/>
+              <w:bottom w:val="nil"/>
+              <w:right w:val="nil"/>
+            </w:tcBorders>
+            <w:tcPrChange w:id="114" w:author="Coles, Nicholas A." w:date="2026-08-05T15:30:00Z" w16du:dateUtc="2026-08-05T19:30:00Z">
+              <w:tcPr>
+                <w:tcW w:w="286" w:type="dxa"/>
+                <w:gridSpan w:val="2"/>
+                <w:tcBorders>
+                  <w:top w:val="nil"/>
+                  <w:left w:val="nil"/>
+                  <w:bottom w:val="nil"/>
+                  <w:right w:val="nil"/>
+                </w:tcBorders>
+              </w:tcPr>
+            </w:tcPrChange>
+          </w:tcPr>
+          <w:p>
+            <w:pPr>
+              <w:spacing w:before="0" w:after="0" w:line="360" w:lineRule="auto"/>
+              <w:jc w:val="center"/>
+              <w:rPr>
+                <w:rFonts w:ascii="Segoe UI Symbol" w:eastAsia="Times New Roman" w:hAnsi="Segoe UI Symbol" w:cs="Segoe UI Symbol"/>
+                <w:color w:val="000000"/>
+              </w:rPr>
+            </w:pPr>
+          </w:p>
+        </w:tc>
+        <w:tc>
+          <w:tcPr>
+            <w:tcW w:w="1080" w:type="dxa"/>
+            <w:tcBorders>
+              <w:top w:val="nil"/>
+              <w:left w:val="nil"/>
+              <w:bottom w:val="nil"/>
+              <w:right w:val="nil"/>
+            </w:tcBorders>
+            <w:tcPrChange w:id="115" w:author="Coles, Nicholas A." w:date="2026-08-05T15:30:00Z" w16du:dateUtc="2026-08-05T19:30:00Z">
+              <w:tcPr>
+                <w:tcW w:w="286" w:type="dxa"/>
+                <w:tcBorders>
+                  <w:top w:val="nil"/>
+                  <w:left w:val="nil"/>
+                  <w:bottom w:val="nil"/>
+                  <w:right w:val="nil"/>
+                </w:tcBorders>
+              </w:tcPr>
+            </w:tcPrChange>
+          </w:tcPr>
+          <w:p>
+            <w:pPr>
+              <w:spacing w:before="0" w:after="0" w:line="360" w:lineRule="auto"/>
+              <w:jc w:val="center"/>
+              <w:rPr>
+                <w:rFonts w:ascii="Segoe UI Symbol" w:eastAsia="Times New Roman" w:hAnsi="Segoe UI Symbol" w:cs="Segoe UI Symbol"/>
+                <w:color w:val="000000"/>
+              </w:rPr>
+            </w:pPr>
+          </w:p>
+        </w:tc>
       </w:tr>
       <w:tr>
+        <w:tblPrEx>
+          <w:tblW w:w="13230" w:type="dxa"/>
+          <w:tblLayout w:type="fixed"/>
+          <w:tblPrExChange w:id="116" w:author="Coles, Nicholas A." w:date="2026-08-05T15:30:00Z" w16du:dateUtc="2026-08-05T19:30:00Z">
+            <w:tblPrEx>
+              <w:tblW w:w="12420" w:type="dxa"/>
+            </w:tblPrEx>
+          </w:tblPrExChange>
+        </w:tblPrEx>
         <w:trPr>
           <w:trHeight w:val="300"/>
+          <w:trPrChange w:id="117" w:author="Coles, Nicholas A." w:date="2026-08-05T15:30:00Z" w16du:dateUtc="2026-08-05T19:30:00Z">
+            <w:trPr>
+              <w:gridAfter w:val="0"/>
+              <w:trHeight w:val="300"/>
+            </w:trPr>
+          </w:trPrChange>
         </w:trPr>
         <w:tc>
           <w:tcPr>
-            <w:tcW w:w="2250" w:type="dxa"/>
+            <w:tcW w:w="2162" w:type="dxa"/>
             <w:tcBorders>
               <w:top w:val="nil"/>
               <w:left w:val="nil"/>
@@ -8183,6 +9861,21 @@
             <w:noWrap/>
             <w:vAlign w:val="bottom"/>
             <w:hideMark/>
+            <w:tcPrChange w:id="118" w:author="Coles, Nicholas A." w:date="2026-08-05T15:30:00Z" w16du:dateUtc="2026-08-05T19:30:00Z">
+              <w:tcPr>
+                <w:tcW w:w="2250" w:type="dxa"/>
+                <w:gridSpan w:val="2"/>
+                <w:tcBorders>
+                  <w:top w:val="nil"/>
+                  <w:left w:val="nil"/>
+                  <w:bottom w:val="single" w:sz="4" w:space="0" w:color="auto"/>
+                  <w:right w:val="nil"/>
+                </w:tcBorders>
+                <w:noWrap/>
+                <w:vAlign w:val="bottom"/>
+                <w:hideMark/>
+              </w:tcPr>
+            </w:tcPrChange>
           </w:tcPr>
           <w:p>
             <w:pPr>
@@ -8213,6 +9906,21 @@
             <w:noWrap/>
             <w:vAlign w:val="bottom"/>
             <w:hideMark/>
+            <w:tcPrChange w:id="119" w:author="Coles, Nicholas A." w:date="2026-08-05T15:30:00Z" w16du:dateUtc="2026-08-05T19:30:00Z">
+              <w:tcPr>
+                <w:tcW w:w="2610" w:type="dxa"/>
+                <w:gridSpan w:val="2"/>
+                <w:tcBorders>
+                  <w:top w:val="nil"/>
+                  <w:left w:val="nil"/>
+                  <w:bottom w:val="single" w:sz="4" w:space="0" w:color="auto"/>
+                  <w:right w:val="nil"/>
+                </w:tcBorders>
+                <w:noWrap/>
+                <w:vAlign w:val="bottom"/>
+                <w:hideMark/>
+              </w:tcPr>
+            </w:tcPrChange>
           </w:tcPr>
           <w:p>
             <w:pPr>
@@ -8243,6 +9951,21 @@
             <w:noWrap/>
             <w:vAlign w:val="bottom"/>
             <w:hideMark/>
+            <w:tcPrChange w:id="120" w:author="Coles, Nicholas A." w:date="2026-08-05T15:30:00Z" w16du:dateUtc="2026-08-05T19:30:00Z">
+              <w:tcPr>
+                <w:tcW w:w="1443" w:type="dxa"/>
+                <w:gridSpan w:val="2"/>
+                <w:tcBorders>
+                  <w:top w:val="nil"/>
+                  <w:left w:val="nil"/>
+                  <w:bottom w:val="single" w:sz="4" w:space="0" w:color="auto"/>
+                  <w:right w:val="nil"/>
+                </w:tcBorders>
+                <w:noWrap/>
+                <w:vAlign w:val="bottom"/>
+                <w:hideMark/>
+              </w:tcPr>
+            </w:tcPrChange>
           </w:tcPr>
           <w:p>
             <w:pPr>
@@ -8252,18 +9975,36 @@
                 <w:color w:val="000000"/>
               </w:rPr>
             </w:pPr>
+            <w:ins w:id="121" w:author="Coles, Nicholas A." w:date="2026-08-05T15:18:00Z" w16du:dateUtc="2026-08-05T19:18:00Z">
+              <w:r>
+                <w:rPr>
+                  <w:rFonts w:eastAsia="Times New Roman" w:cs="Times New Roman"/>
+                  <w:color w:val="000000"/>
+                </w:rPr>
+                <w:t>y</w:t>
+              </w:r>
+            </w:ins>
+            <w:del w:id="122" w:author="Coles, Nicholas A." w:date="2026-08-05T15:18:00Z" w16du:dateUtc="2026-08-05T19:18:00Z">
+              <w:r>
+                <w:rPr>
+                  <w:rFonts w:eastAsia="Times New Roman" w:cs="Times New Roman"/>
+                  <w:color w:val="000000"/>
+                </w:rPr>
+                <w:delText>Y</w:delText>
+              </w:r>
+            </w:del>
             <w:r>
               <w:rPr>
                 <w:rFonts w:eastAsia="Times New Roman" w:cs="Times New Roman"/>
                 <w:color w:val="000000"/>
               </w:rPr>
-              <w:t>Yes</w:t>
+              <w:t>es</w:t>
             </w:r>
           </w:p>
         </w:tc>
         <w:tc>
           <w:tcPr>
-            <w:tcW w:w="345" w:type="dxa"/>
+            <w:tcW w:w="276" w:type="dxa"/>
             <w:tcBorders>
               <w:top w:val="nil"/>
               <w:left w:val="nil"/>
@@ -8273,6 +10014,21 @@
             <w:noWrap/>
             <w:vAlign w:val="bottom"/>
             <w:hideMark/>
+            <w:tcPrChange w:id="123" w:author="Coles, Nicholas A." w:date="2026-08-05T15:30:00Z" w16du:dateUtc="2026-08-05T19:30:00Z">
+              <w:tcPr>
+                <w:tcW w:w="345" w:type="dxa"/>
+                <w:gridSpan w:val="2"/>
+                <w:tcBorders>
+                  <w:top w:val="nil"/>
+                  <w:left w:val="nil"/>
+                  <w:bottom w:val="single" w:sz="4" w:space="0" w:color="auto"/>
+                  <w:right w:val="nil"/>
+                </w:tcBorders>
+                <w:noWrap/>
+                <w:vAlign w:val="bottom"/>
+                <w:hideMark/>
+              </w:tcPr>
+            </w:tcPrChange>
           </w:tcPr>
           <w:p>
             <w:pPr>
@@ -8293,7 +10049,7 @@
         </w:tc>
         <w:tc>
           <w:tcPr>
-            <w:tcW w:w="2556" w:type="dxa"/>
+            <w:tcW w:w="2600" w:type="dxa"/>
             <w:tcBorders>
               <w:top w:val="nil"/>
               <w:left w:val="nil"/>
@@ -8303,6 +10059,21 @@
             <w:noWrap/>
             <w:vAlign w:val="bottom"/>
             <w:hideMark/>
+            <w:tcPrChange w:id="124" w:author="Coles, Nicholas A." w:date="2026-08-05T15:30:00Z" w16du:dateUtc="2026-08-05T19:30:00Z">
+              <w:tcPr>
+                <w:tcW w:w="2556" w:type="dxa"/>
+                <w:gridSpan w:val="2"/>
+                <w:tcBorders>
+                  <w:top w:val="nil"/>
+                  <w:left w:val="nil"/>
+                  <w:bottom w:val="single" w:sz="4" w:space="0" w:color="auto"/>
+                  <w:right w:val="nil"/>
+                </w:tcBorders>
+                <w:noWrap/>
+                <w:vAlign w:val="bottom"/>
+                <w:hideMark/>
+              </w:tcPr>
+            </w:tcPrChange>
           </w:tcPr>
           <w:p>
             <w:pPr>
@@ -8323,7 +10094,7 @@
         </w:tc>
         <w:tc>
           <w:tcPr>
-            <w:tcW w:w="1380" w:type="dxa"/>
+            <w:tcW w:w="1283" w:type="dxa"/>
             <w:tcBorders>
               <w:top w:val="nil"/>
               <w:left w:val="nil"/>
@@ -8333,6 +10104,21 @@
             <w:noWrap/>
             <w:vAlign w:val="bottom"/>
             <w:hideMark/>
+            <w:tcPrChange w:id="125" w:author="Coles, Nicholas A." w:date="2026-08-05T15:30:00Z" w16du:dateUtc="2026-08-05T19:30:00Z">
+              <w:tcPr>
+                <w:tcW w:w="1380" w:type="dxa"/>
+                <w:gridSpan w:val="2"/>
+                <w:tcBorders>
+                  <w:top w:val="nil"/>
+                  <w:left w:val="nil"/>
+                  <w:bottom w:val="single" w:sz="4" w:space="0" w:color="auto"/>
+                  <w:right w:val="nil"/>
+                </w:tcBorders>
+                <w:noWrap/>
+                <w:vAlign w:val="bottom"/>
+                <w:hideMark/>
+              </w:tcPr>
+            </w:tcPrChange>
           </w:tcPr>
           <w:p>
             <w:pPr>
@@ -8353,7 +10139,7 @@
         </w:tc>
         <w:tc>
           <w:tcPr>
-            <w:tcW w:w="1550" w:type="dxa"/>
+            <w:tcW w:w="1506" w:type="dxa"/>
             <w:tcBorders>
               <w:top w:val="nil"/>
               <w:left w:val="nil"/>
@@ -8363,6 +10149,84 @@
             <w:noWrap/>
             <w:vAlign w:val="center"/>
             <w:hideMark/>
+            <w:tcPrChange w:id="126" w:author="Coles, Nicholas A." w:date="2026-08-05T15:30:00Z" w16du:dateUtc="2026-08-05T19:30:00Z">
+              <w:tcPr>
+                <w:tcW w:w="1550" w:type="dxa"/>
+                <w:gridSpan w:val="2"/>
+                <w:tcBorders>
+                  <w:top w:val="nil"/>
+                  <w:left w:val="nil"/>
+                  <w:bottom w:val="single" w:sz="4" w:space="0" w:color="auto"/>
+                  <w:right w:val="nil"/>
+                </w:tcBorders>
+                <w:noWrap/>
+                <w:vAlign w:val="center"/>
+                <w:hideMark/>
+              </w:tcPr>
+            </w:tcPrChange>
+          </w:tcPr>
+          <w:p>
+            <w:pPr>
+              <w:spacing w:before="0" w:after="0" w:line="360" w:lineRule="auto"/>
+              <w:rPr>
+                <w:rFonts w:eastAsia="Times New Roman" w:cs="Times New Roman"/>
+                <w:color w:val="000000"/>
+              </w:rPr>
+            </w:pPr>
+          </w:p>
+        </w:tc>
+        <w:tc>
+          <w:tcPr>
+            <w:tcW w:w="270" w:type="dxa"/>
+            <w:tcBorders>
+              <w:top w:val="nil"/>
+              <w:left w:val="nil"/>
+              <w:bottom w:val="single" w:sz="4" w:space="0" w:color="auto"/>
+              <w:right w:val="nil"/>
+            </w:tcBorders>
+            <w:tcPrChange w:id="127" w:author="Coles, Nicholas A." w:date="2026-08-05T15:30:00Z" w16du:dateUtc="2026-08-05T19:30:00Z">
+              <w:tcPr>
+                <w:tcW w:w="286" w:type="dxa"/>
+                <w:gridSpan w:val="2"/>
+                <w:tcBorders>
+                  <w:top w:val="nil"/>
+                  <w:left w:val="nil"/>
+                  <w:bottom w:val="single" w:sz="4" w:space="0" w:color="auto"/>
+                  <w:right w:val="nil"/>
+                </w:tcBorders>
+              </w:tcPr>
+            </w:tcPrChange>
+          </w:tcPr>
+          <w:p>
+            <w:pPr>
+              <w:spacing w:before="0" w:after="0" w:line="360" w:lineRule="auto"/>
+              <w:rPr>
+                <w:rFonts w:eastAsia="Times New Roman" w:cs="Times New Roman"/>
+                <w:color w:val="000000"/>
+              </w:rPr>
+            </w:pPr>
+          </w:p>
+        </w:tc>
+        <w:tc>
+          <w:tcPr>
+            <w:tcW w:w="1080" w:type="dxa"/>
+            <w:tcBorders>
+              <w:top w:val="nil"/>
+              <w:left w:val="nil"/>
+              <w:bottom w:val="single" w:sz="4" w:space="0" w:color="auto"/>
+              <w:right w:val="nil"/>
+            </w:tcBorders>
+            <w:tcPrChange w:id="128" w:author="Coles, Nicholas A." w:date="2026-08-05T15:30:00Z" w16du:dateUtc="2026-08-05T19:30:00Z">
+              <w:tcPr>
+                <w:tcW w:w="286" w:type="dxa"/>
+                <w:tcBorders>
+                  <w:top w:val="nil"/>
+                  <w:left w:val="nil"/>
+                  <w:bottom w:val="single" w:sz="4" w:space="0" w:color="auto"/>
+                  <w:right w:val="nil"/>
+                </w:tcBorders>
+              </w:tcPr>
+            </w:tcPrChange>
           </w:tcPr>
           <w:p>
             <w:pPr>
@@ -8395,7 +10259,7 @@
       <w:pPr>
         <w:pStyle w:val="Heading2"/>
       </w:pPr>
-      <w:bookmarkStart w:id="8" w:name="primary-analyses"/>
+      <w:bookmarkStart w:id="129" w:name="primary-analyses"/>
       <w:bookmarkEnd w:id="7"/>
       <w:r>
         <w:lastRenderedPageBreak/>
@@ -8773,21 +10637,7 @@
         <w:rPr>
           <w:rFonts w:cs="Times New Roman"/>
         </w:rPr>
-        <w:t xml:space="preserve">priors on the alternative hypotheses and the default Markov chain Monte Carlo settings (Morey &amp; </w:t>
-      </w:r>
-      <w:proofErr w:type="spellStart"/>
-      <w:r>
-        <w:rPr>
-          <w:rFonts w:cs="Times New Roman"/>
-        </w:rPr>
-        <w:t>Rouder</w:t>
-      </w:r>
-      <w:proofErr w:type="spellEnd"/>
-      <w:r>
-        <w:rPr>
-          <w:rFonts w:cs="Times New Roman"/>
-        </w:rPr>
-        <w:t xml:space="preserve">, 2024). </w:t>
+        <w:t xml:space="preserve">priors on the alternative hypotheses and the default Markov chain Monte Carlo settings (Morey &amp; Rouder, 2024). </w:t>
       </w:r>
     </w:p>
     <w:p>
@@ -9116,8 +10966,8 @@
       <w:pPr>
         <w:pStyle w:val="Heading2"/>
       </w:pPr>
-      <w:bookmarkStart w:id="9" w:name="exploratory-analyses"/>
-      <w:bookmarkEnd w:id="8"/>
+      <w:bookmarkStart w:id="130" w:name="exploratory-analyses"/>
+      <w:bookmarkEnd w:id="129"/>
       <w:r>
         <w:t xml:space="preserve">Exploratory </w:t>
       </w:r>
@@ -9171,8 +11021,8 @@
       <w:pPr>
         <w:pStyle w:val="Heading2"/>
       </w:pPr>
-      <w:bookmarkStart w:id="10" w:name="power-simulation"/>
-      <w:bookmarkEnd w:id="9"/>
+      <w:bookmarkStart w:id="131" w:name="power-simulation"/>
+      <w:bookmarkEnd w:id="130"/>
       <w:r>
         <w:t xml:space="preserve">Power </w:t>
       </w:r>
@@ -9388,40 +11238,972 @@
         <w:t>s of Face Movement are positive in two conditions and null in six other conditions.</w:t>
       </w:r>
       <w:bookmarkEnd w:id="4"/>
-      <w:bookmarkEnd w:id="10"/>
+      <w:bookmarkEnd w:id="131"/>
     </w:p>
     <w:p>
       <w:pPr>
+        <w:pStyle w:val="Heading2"/>
+        <w:jc w:val="center"/>
+        <w:rPr>
+          <w:ins w:id="132" w:author="Coles, Nicholas A." w:date="2026-08-05T15:07:00Z" w16du:dateUtc="2026-08-05T19:07:00Z"/>
+        </w:rPr>
+        <w:pPrChange w:id="133" w:author="Coles, Nicholas A." w:date="2026-08-05T15:07:00Z" w16du:dateUtc="2026-08-05T19:07:00Z">
+          <w:pPr>
+            <w:pStyle w:val="Heading2"/>
+          </w:pPr>
+        </w:pPrChange>
+      </w:pPr>
+      <w:ins w:id="134" w:author="Coles, Nicholas A." w:date="2026-08-05T15:08:00Z" w16du:dateUtc="2026-08-05T19:08:00Z">
+        <w:r>
+          <w:t>Results</w:t>
+        </w:r>
+      </w:ins>
+    </w:p>
+    <w:p>
+      <w:pPr>
         <w:spacing w:before="0"/>
         <w:ind w:firstLine="720"/>
         <w:rPr>
-          <w:rFonts w:cs="Times New Roman"/>
-        </w:rPr>
-      </w:pPr>
+          <w:ins w:id="135" w:author="Coles, Nicholas A." w:date="2026-08-05T15:13:00Z" w16du:dateUtc="2026-08-05T19:13:00Z"/>
+          <w:rFonts w:cs="Times New Roman"/>
+        </w:rPr>
+      </w:pPr>
+      <w:ins w:id="136" w:author="Coles, Nicholas A." w:date="2026-08-05T15:08:00Z" w16du:dateUtc="2026-08-05T19:08:00Z">
+        <w:r>
+          <w:rPr>
+            <w:rFonts w:cs="Times New Roman"/>
+          </w:rPr>
+          <w:t xml:space="preserve">Ultimately, we uncovered a three-way interaction whose patterns </w:t>
+        </w:r>
+      </w:ins>
+      <w:ins w:id="137" w:author="Coles, Nicholas A." w:date="2026-08-05T15:12:00Z" w16du:dateUtc="2026-08-05T19:12:00Z">
+        <w:r>
+          <w:rPr>
+            <w:rFonts w:cs="Times New Roman"/>
+          </w:rPr>
+          <w:t>refuted</w:t>
+        </w:r>
+      </w:ins>
+      <w:ins w:id="138" w:author="Coles, Nicholas A." w:date="2026-08-05T15:09:00Z" w16du:dateUtc="2026-08-05T19:09:00Z">
+        <w:r>
+          <w:rPr>
+            <w:rFonts w:cs="Times New Roman"/>
+          </w:rPr>
+          <w:t xml:space="preserve"> each of our tested hypotheses</w:t>
+        </w:r>
+      </w:ins>
+      <w:ins w:id="139" w:author="Coles, Nicholas A." w:date="2026-08-05T15:11:00Z" w16du:dateUtc="2026-08-05T19:11:00Z">
+        <w:r>
+          <w:rPr>
+            <w:rFonts w:cs="Times New Roman"/>
+          </w:rPr>
+          <w:t xml:space="preserve">, </w:t>
+        </w:r>
+        <w:proofErr w:type="gramStart"/>
+        <w:r>
+          <w:rPr>
+            <w:rFonts w:cs="Times New Roman"/>
+            <w:i/>
+            <w:iCs/>
+          </w:rPr>
+          <w:t>F</w:t>
+        </w:r>
+        <w:r>
+          <w:rPr>
+            <w:rFonts w:cs="Times New Roman"/>
+          </w:rPr>
+          <w:t>(</w:t>
+        </w:r>
+        <w:proofErr w:type="gramEnd"/>
+        <w:r>
+          <w:rPr>
+            <w:rFonts w:cs="Times New Roman"/>
+          </w:rPr>
+          <w:t>X</w:t>
+        </w:r>
+      </w:ins>
+      <w:ins w:id="140" w:author="Coles, Nicholas A." w:date="2026-08-05T15:12:00Z" w16du:dateUtc="2026-08-05T19:12:00Z">
+        <w:r>
+          <w:rPr>
+            <w:rFonts w:cs="Times New Roman"/>
+          </w:rPr>
+          <w:t xml:space="preserve">, X) = X, </w:t>
+        </w:r>
+        <w:r>
+          <w:rPr>
+            <w:rFonts w:cs="Times New Roman"/>
+            <w:i/>
+            <w:iCs/>
+          </w:rPr>
+          <w:t>p</w:t>
+        </w:r>
+        <w:r>
+          <w:rPr>
+            <w:rFonts w:cs="Times New Roman"/>
+          </w:rPr>
+          <w:t xml:space="preserve"> = X, BF10 = X</w:t>
+        </w:r>
+      </w:ins>
+      <w:ins w:id="141" w:author="Coles, Nicholas A." w:date="2026-08-05T15:09:00Z" w16du:dateUtc="2026-08-05T19:09:00Z">
+        <w:r>
+          <w:rPr>
+            <w:rFonts w:cs="Times New Roman"/>
+          </w:rPr>
+          <w:t xml:space="preserve">. Instead, results </w:t>
+        </w:r>
+      </w:ins>
+      <w:ins w:id="142" w:author="Coles, Nicholas A." w:date="2026-08-05T15:10:00Z" w16du:dateUtc="2026-08-05T19:10:00Z">
+        <w:r>
+          <w:rPr>
+            <w:rFonts w:cs="Times New Roman"/>
+          </w:rPr>
+          <w:t>supported an unexpected narrative: I</w:t>
+        </w:r>
+      </w:ins>
+      <w:ins w:id="143" w:author="Coles, Nicholas A." w:date="2026-08-05T15:09:00Z" w16du:dateUtc="2026-08-05T19:09:00Z">
+        <w:r>
+          <w:rPr>
+            <w:rFonts w:cs="Times New Roman"/>
+          </w:rPr>
+          <w:t xml:space="preserve">n positive contexts, posed smiles </w:t>
+        </w:r>
+      </w:ins>
+      <w:ins w:id="144" w:author="Coles, Nicholas A." w:date="2026-08-05T15:11:00Z" w16du:dateUtc="2026-08-05T19:11:00Z">
+        <w:r>
+          <w:rPr>
+            <w:rFonts w:cs="Times New Roman"/>
+          </w:rPr>
+          <w:t xml:space="preserve">are </w:t>
+        </w:r>
+      </w:ins>
+      <w:ins w:id="145" w:author="Coles, Nicholas A." w:date="2026-08-05T15:09:00Z" w16du:dateUtc="2026-08-05T19:09:00Z">
+        <w:r>
+          <w:rPr>
+            <w:rFonts w:cs="Times New Roman"/>
+          </w:rPr>
+          <w:t>mood-dampening detraction</w:t>
+        </w:r>
+      </w:ins>
+      <w:ins w:id="146" w:author="Coles, Nicholas A." w:date="2026-08-05T15:10:00Z" w16du:dateUtc="2026-08-05T19:10:00Z">
+        <w:r>
+          <w:rPr>
+            <w:rFonts w:cs="Times New Roman"/>
+          </w:rPr>
+          <w:t xml:space="preserve">s; in negative contexts, they </w:t>
+        </w:r>
+      </w:ins>
+      <w:ins w:id="147" w:author="Coles, Nicholas A." w:date="2026-08-05T15:11:00Z" w16du:dateUtc="2026-08-05T19:11:00Z">
+        <w:r>
+          <w:rPr>
+            <w:rFonts w:cs="Times New Roman"/>
+          </w:rPr>
+          <w:t xml:space="preserve">are </w:t>
+        </w:r>
+      </w:ins>
+      <w:ins w:id="148" w:author="Coles, Nicholas A." w:date="2026-08-05T15:10:00Z" w16du:dateUtc="2026-08-05T19:10:00Z">
+        <w:r>
+          <w:rPr>
+            <w:rFonts w:cs="Times New Roman"/>
+          </w:rPr>
+          <w:t>mood-boosting tricks</w:t>
+        </w:r>
+      </w:ins>
+      <w:ins w:id="149" w:author="Coles, Nicholas A." w:date="2026-08-05T15:11:00Z" w16du:dateUtc="2026-08-05T19:11:00Z">
+        <w:r>
+          <w:rPr>
+            <w:rFonts w:cs="Times New Roman"/>
+          </w:rPr>
+          <w:t xml:space="preserve"> that quickly stop working.</w:t>
+        </w:r>
+      </w:ins>
     </w:p>
     <w:p>
       <w:pPr>
         <w:spacing w:before="0"/>
         <w:ind w:firstLine="720"/>
         <w:rPr>
-          <w:rFonts w:cs="Times New Roman"/>
-        </w:rPr>
-      </w:pPr>
+          <w:ins w:id="150" w:author="Coles, Nicholas A." w:date="2026-08-05T15:45:00Z" w16du:dateUtc="2026-08-05T19:45:00Z"/>
+          <w:rFonts w:cs="Times New Roman"/>
+        </w:rPr>
+      </w:pPr>
+      <w:ins w:id="151" w:author="Coles, Nicholas A." w:date="2026-08-05T15:14:00Z" w16du:dateUtc="2026-08-05T19:14:00Z">
+        <w:r>
+          <w:rPr>
+            <w:rFonts w:cs="Times New Roman"/>
+          </w:rPr>
+          <w:t xml:space="preserve">Our hypotheses were more strongly refuted in our examined positive emotional context: exposure to </w:t>
+        </w:r>
+      </w:ins>
+      <w:ins w:id="152" w:author="Coles, Nicholas A." w:date="2026-08-05T15:16:00Z" w16du:dateUtc="2026-08-05T19:16:00Z">
+        <w:r>
+          <w:rPr>
+            <w:rFonts w:cs="Times New Roman"/>
+          </w:rPr>
+          <w:t xml:space="preserve">happy </w:t>
+        </w:r>
+      </w:ins>
+      <w:ins w:id="153" w:author="Coles, Nicholas A." w:date="2026-08-05T15:14:00Z" w16du:dateUtc="2026-08-05T19:14:00Z">
+        <w:r>
+          <w:rPr>
+            <w:rFonts w:cs="Times New Roman"/>
+          </w:rPr>
+          <w:t>images.</w:t>
+        </w:r>
+      </w:ins>
+      <w:ins w:id="154" w:author="Coles, Nicholas A." w:date="2026-08-05T15:19:00Z" w16du:dateUtc="2026-08-05T19:19:00Z">
+        <w:r>
+          <w:rPr>
+            <w:rFonts w:cs="Times New Roman"/>
+          </w:rPr>
+          <w:t xml:space="preserve"> In positive contexts</w:t>
+        </w:r>
+      </w:ins>
+      <w:ins w:id="155" w:author="Coles, Nicholas A." w:date="2026-08-05T15:20:00Z" w16du:dateUtc="2026-08-05T19:20:00Z">
+        <w:r>
+          <w:rPr>
+            <w:rFonts w:cs="Times New Roman"/>
+          </w:rPr>
+          <w:t xml:space="preserve">, we </w:t>
+        </w:r>
+      </w:ins>
+      <w:ins w:id="156" w:author="Coles, Nicholas A." w:date="2026-08-05T15:21:00Z" w16du:dateUtc="2026-08-05T19:21:00Z">
+        <w:r>
+          <w:rPr>
+            <w:rFonts w:cs="Times New Roman"/>
+          </w:rPr>
+          <w:t xml:space="preserve">considered that posed smiles may </w:t>
+        </w:r>
+      </w:ins>
+      <w:ins w:id="157" w:author="Coles, Nicholas A." w:date="2026-08-05T15:23:00Z" w16du:dateUtc="2026-08-05T19:23:00Z">
+        <w:r>
+          <w:rPr>
+            <w:rFonts w:cs="Times New Roman"/>
+          </w:rPr>
+          <w:t>(a) only improve mood when performed once, (b) only improve mood</w:t>
+        </w:r>
+      </w:ins>
+      <w:ins w:id="158" w:author="Coles, Nicholas A." w:date="2026-08-05T15:24:00Z" w16du:dateUtc="2026-08-05T19:24:00Z">
+        <w:r>
+          <w:rPr>
+            <w:rFonts w:cs="Times New Roman"/>
+          </w:rPr>
+          <w:t xml:space="preserve"> when performed relatively voluntarily</w:t>
+        </w:r>
+      </w:ins>
+      <w:ins w:id="159" w:author="Coles, Nicholas A." w:date="2026-08-05T15:28:00Z" w16du:dateUtc="2026-08-05T19:28:00Z">
+        <w:r>
+          <w:rPr>
+            <w:rFonts w:cs="Times New Roman"/>
+          </w:rPr>
+          <w:t xml:space="preserve">, </w:t>
+        </w:r>
+      </w:ins>
+      <w:ins w:id="160" w:author="Coles, Nicholas A." w:date="2026-08-05T15:24:00Z" w16du:dateUtc="2026-08-05T19:24:00Z">
+        <w:r>
+          <w:rPr>
+            <w:rFonts w:cs="Times New Roman"/>
+          </w:rPr>
+          <w:t>or (c) potential</w:t>
+        </w:r>
+      </w:ins>
+      <w:ins w:id="161" w:author="Coles, Nicholas A." w:date="2026-08-05T15:25:00Z" w16du:dateUtc="2026-08-05T19:25:00Z">
+        <w:r>
+          <w:rPr>
+            <w:rFonts w:cs="Times New Roman"/>
+          </w:rPr>
+          <w:t xml:space="preserve">ly </w:t>
+        </w:r>
+      </w:ins>
+      <w:ins w:id="162" w:author="Coles, Nicholas A." w:date="2026-08-05T15:24:00Z" w16du:dateUtc="2026-08-05T19:24:00Z">
+        <w:r>
+          <w:rPr>
+            <w:rFonts w:cs="Times New Roman"/>
+          </w:rPr>
+          <w:t>improve mood in all</w:t>
+        </w:r>
+      </w:ins>
+      <w:ins w:id="163" w:author="Coles, Nicholas A." w:date="2026-08-05T15:25:00Z" w16du:dateUtc="2026-08-05T19:25:00Z">
+        <w:r>
+          <w:rPr>
+            <w:rFonts w:cs="Times New Roman"/>
+          </w:rPr>
+          <w:t xml:space="preserve"> the </w:t>
+        </w:r>
+        <w:proofErr w:type="gramStart"/>
+        <w:r>
+          <w:rPr>
+            <w:rFonts w:cs="Times New Roman"/>
+          </w:rPr>
+          <w:t>aforementioned conditions</w:t>
+        </w:r>
+        <w:proofErr w:type="gramEnd"/>
+        <w:r>
+          <w:rPr>
+            <w:rFonts w:cs="Times New Roman"/>
+          </w:rPr>
+          <w:t>. (</w:t>
+        </w:r>
+      </w:ins>
+      <w:ins w:id="164" w:author="Coles, Nicholas A." w:date="2026-08-05T15:27:00Z" w16du:dateUtc="2026-08-05T19:27:00Z">
+        <w:r>
+          <w:rPr>
+            <w:rFonts w:cs="Times New Roman"/>
+          </w:rPr>
+          <w:t xml:space="preserve">See Table 1 for </w:t>
+        </w:r>
+      </w:ins>
+      <w:ins w:id="165" w:author="Coles, Nicholas A." w:date="2026-08-05T15:26:00Z" w16du:dateUtc="2026-08-05T19:26:00Z">
+        <w:r>
+          <w:rPr>
+            <w:rFonts w:cs="Times New Roman"/>
+          </w:rPr>
+          <w:t xml:space="preserve">more information on these </w:t>
+        </w:r>
+        <w:r>
+          <w:rPr>
+            <w:rFonts w:cs="Times New Roman"/>
+          </w:rPr>
+          <w:t>repetition, punishment</w:t>
+        </w:r>
+        <w:r>
+          <w:rPr>
+            <w:rFonts w:cs="Times New Roman"/>
+          </w:rPr>
+          <w:t>, and emotion incongru</w:t>
+        </w:r>
+      </w:ins>
+      <w:ins w:id="166" w:author="Coles, Nicholas A." w:date="2026-08-05T15:27:00Z" w16du:dateUtc="2026-08-05T19:27:00Z">
+        <w:r>
+          <w:rPr>
+            <w:rFonts w:cs="Times New Roman"/>
+          </w:rPr>
+          <w:t>ence hypotheses.) Contrary to ea</w:t>
+        </w:r>
+      </w:ins>
+      <w:ins w:id="167" w:author="Coles, Nicholas A." w:date="2026-08-05T15:28:00Z" w16du:dateUtc="2026-08-05T19:28:00Z">
+        <w:r>
+          <w:rPr>
+            <w:rFonts w:cs="Times New Roman"/>
+          </w:rPr>
+          <w:t xml:space="preserve">ch of these hypotheses, we </w:t>
+        </w:r>
+      </w:ins>
+      <w:ins w:id="168" w:author="Coles, Nicholas A." w:date="2026-08-05T15:38:00Z" w16du:dateUtc="2026-08-05T19:38:00Z">
+        <w:r>
+          <w:rPr>
+            <w:rFonts w:cs="Times New Roman"/>
+          </w:rPr>
+          <w:t>found that posing a volunt</w:t>
+        </w:r>
+      </w:ins>
+      <w:ins w:id="169" w:author="Coles, Nicholas A." w:date="2026-08-05T15:39:00Z" w16du:dateUtc="2026-08-05T19:39:00Z">
+        <w:r>
+          <w:rPr>
+            <w:rFonts w:cs="Times New Roman"/>
+          </w:rPr>
+          <w:t xml:space="preserve">ary </w:t>
+        </w:r>
+      </w:ins>
+      <w:ins w:id="170" w:author="Coles, Nicholas A." w:date="2026-08-05T15:38:00Z" w16du:dateUtc="2026-08-05T19:38:00Z">
+        <w:r>
+          <w:rPr>
+            <w:rFonts w:cs="Times New Roman"/>
+          </w:rPr>
+          <w:t>smile in a</w:t>
+        </w:r>
+      </w:ins>
+      <w:ins w:id="171" w:author="Coles, Nicholas A." w:date="2026-08-05T15:39:00Z" w16du:dateUtc="2026-08-05T19:39:00Z">
+        <w:r>
+          <w:rPr>
+            <w:rFonts w:cs="Times New Roman"/>
+          </w:rPr>
+          <w:t xml:space="preserve">n already unambiguously </w:t>
+        </w:r>
+      </w:ins>
+      <w:ins w:id="172" w:author="Coles, Nicholas A." w:date="2026-08-05T15:38:00Z" w16du:dateUtc="2026-08-05T19:38:00Z">
+        <w:r>
+          <w:rPr>
+            <w:rFonts w:cs="Times New Roman"/>
+          </w:rPr>
+          <w:t>positive context</w:t>
+        </w:r>
+      </w:ins>
+      <w:ins w:id="173" w:author="Coles, Nicholas A." w:date="2026-08-05T15:39:00Z" w16du:dateUtc="2026-08-05T19:39:00Z">
+        <w:r>
+          <w:rPr>
+            <w:rFonts w:cs="Times New Roman"/>
+          </w:rPr>
+          <w:t xml:space="preserve"> led to virtually no shift in self-reported happiness</w:t>
+        </w:r>
+      </w:ins>
+      <w:ins w:id="174" w:author="Coles, Nicholas A." w:date="2026-08-05T15:57:00Z" w16du:dateUtc="2026-08-05T19:57:00Z">
+        <w:r>
+          <w:rPr>
+            <w:rFonts w:cs="Times New Roman"/>
+          </w:rPr>
+          <w:t xml:space="preserve"> (</w:t>
+        </w:r>
+      </w:ins>
+      <w:proofErr w:type="gramStart"/>
+      <w:ins w:id="175" w:author="Coles, Nicholas A." w:date="2026-08-05T15:40:00Z" w16du:dateUtc="2026-08-05T19:40:00Z">
+        <w:r>
+          <w:rPr>
+            <w:rFonts w:cs="Times New Roman"/>
+            <w:i/>
+            <w:iCs/>
+            <w:rPrChange w:id="176" w:author="Coles, Nicholas A." w:date="2026-08-05T15:40:00Z" w16du:dateUtc="2026-08-05T19:40:00Z">
+              <w:rPr>
+                <w:rFonts w:cs="Times New Roman"/>
+              </w:rPr>
+            </w:rPrChange>
+          </w:rPr>
+          <w:t>t</w:t>
+        </w:r>
+        <w:r>
+          <w:rPr>
+            <w:rFonts w:cs="Times New Roman"/>
+          </w:rPr>
+          <w:t>(</w:t>
+        </w:r>
+        <w:proofErr w:type="gramEnd"/>
+        <w:r>
+          <w:rPr>
+            <w:rFonts w:cs="Times New Roman"/>
+          </w:rPr>
+          <w:t xml:space="preserve">) = X, </w:t>
+        </w:r>
+        <w:r>
+          <w:rPr>
+            <w:rFonts w:cs="Times New Roman"/>
+            <w:i/>
+            <w:iCs/>
+          </w:rPr>
+          <w:t>p</w:t>
+        </w:r>
+        <w:r>
+          <w:rPr>
+            <w:rFonts w:cs="Times New Roman"/>
+          </w:rPr>
+          <w:t xml:space="preserve"> </w:t>
+        </w:r>
+      </w:ins>
+      <w:ins w:id="177" w:author="Coles, Nicholas A." w:date="2026-08-05T15:56:00Z" w16du:dateUtc="2026-08-05T19:56:00Z">
+        <w:r>
+          <w:rPr>
+            <w:rFonts w:cs="Times New Roman"/>
+          </w:rPr>
+          <w:t>=</w:t>
+        </w:r>
+      </w:ins>
+      <w:ins w:id="178" w:author="Coles, Nicholas A." w:date="2026-08-05T15:40:00Z" w16du:dateUtc="2026-08-05T19:40:00Z">
+        <w:r>
+          <w:rPr>
+            <w:rFonts w:cs="Times New Roman"/>
+          </w:rPr>
+          <w:t xml:space="preserve"> X, </w:t>
+        </w:r>
+        <w:r>
+          <w:rPr>
+            <w:rFonts w:cs="Times New Roman"/>
+            <w:i/>
+            <w:iCs/>
+          </w:rPr>
+          <w:t>d</w:t>
+        </w:r>
+        <w:r>
+          <w:rPr>
+            <w:rFonts w:cs="Times New Roman"/>
+          </w:rPr>
+          <w:t xml:space="preserve"> </w:t>
+        </w:r>
+      </w:ins>
+      <w:ins w:id="179" w:author="Coles, Nicholas A." w:date="2026-08-05T15:41:00Z" w16du:dateUtc="2026-08-05T19:41:00Z">
+        <w:r>
+          <w:rPr>
+            <w:rFonts w:cs="Times New Roman"/>
+          </w:rPr>
+          <w:t>= X, 95% CI [X, Y]</w:t>
+        </w:r>
+      </w:ins>
+      <w:ins w:id="180" w:author="Coles, Nicholas A." w:date="2026-08-05T15:57:00Z" w16du:dateUtc="2026-08-05T19:57:00Z">
+        <w:r>
+          <w:rPr>
+            <w:rFonts w:cs="Times New Roman"/>
+          </w:rPr>
+          <w:t>;</w:t>
+        </w:r>
+      </w:ins>
+      <w:ins w:id="181" w:author="Coles, Nicholas A." w:date="2026-08-05T16:35:00Z" w16du:dateUtc="2026-08-05T20:35:00Z">
+        <w:r>
+          <w:rPr>
+            <w:rFonts w:cs="Times New Roman"/>
+          </w:rPr>
+          <w:t xml:space="preserve"> Figure 1</w:t>
+        </w:r>
+      </w:ins>
+      <w:ins w:id="182" w:author="Coles, Nicholas A." w:date="2026-08-05T15:39:00Z" w16du:dateUtc="2026-08-05T19:39:00Z">
+        <w:r>
+          <w:rPr>
+            <w:rFonts w:cs="Times New Roman"/>
+          </w:rPr>
+          <w:t>)</w:t>
+        </w:r>
+      </w:ins>
+      <w:ins w:id="183" w:author="Coles, Nicholas A." w:date="2026-08-05T15:40:00Z" w16du:dateUtc="2026-08-05T19:40:00Z">
+        <w:r>
+          <w:rPr>
+            <w:rFonts w:cs="Times New Roman"/>
+          </w:rPr>
+          <w:t>.</w:t>
+        </w:r>
+      </w:ins>
+      <w:ins w:id="184" w:author="Coles, Nicholas A." w:date="2026-08-05T15:42:00Z" w16du:dateUtc="2026-08-05T19:42:00Z">
+        <w:r>
+          <w:rPr>
+            <w:rFonts w:cs="Times New Roman"/>
+          </w:rPr>
+          <w:t xml:space="preserve"> </w:t>
+        </w:r>
+      </w:ins>
+      <w:ins w:id="185" w:author="Coles, Nicholas A." w:date="2026-08-05T15:56:00Z" w16du:dateUtc="2026-08-05T19:56:00Z">
+        <w:r>
+          <w:rPr>
+            <w:rFonts w:cs="Times New Roman"/>
+          </w:rPr>
+          <w:t>Furthermore, w</w:t>
+        </w:r>
+      </w:ins>
+      <w:ins w:id="186" w:author="Coles, Nicholas A." w:date="2026-08-05T15:43:00Z" w16du:dateUtc="2026-08-05T19:43:00Z">
+        <w:r>
+          <w:rPr>
+            <w:rFonts w:cs="Times New Roman"/>
+          </w:rPr>
+          <w:t xml:space="preserve">hen </w:t>
+        </w:r>
+      </w:ins>
+      <w:ins w:id="187" w:author="Coles, Nicholas A." w:date="2026-08-05T15:45:00Z" w16du:dateUtc="2026-08-05T19:45:00Z">
+        <w:r>
+          <w:rPr>
+            <w:rFonts w:cs="Times New Roman"/>
+          </w:rPr>
+          <w:t>asked to complete the task repeatedly or under threat of punishment</w:t>
+        </w:r>
+      </w:ins>
+      <w:ins w:id="188" w:author="Coles, Nicholas A." w:date="2026-08-05T15:46:00Z" w16du:dateUtc="2026-08-05T19:46:00Z">
+        <w:r>
+          <w:rPr>
+            <w:rFonts w:cs="Times New Roman"/>
+          </w:rPr>
+          <w:t xml:space="preserve">, posing smiles in already positive contexts led to </w:t>
+        </w:r>
+        <w:r>
+          <w:rPr>
+            <w:rFonts w:cs="Times New Roman"/>
+            <w:i/>
+            <w:iCs/>
+          </w:rPr>
+          <w:t>decreases</w:t>
+        </w:r>
+        <w:r>
+          <w:rPr>
+            <w:rFonts w:cs="Times New Roman"/>
+          </w:rPr>
+          <w:t xml:space="preserve"> in self-reported happiness</w:t>
+        </w:r>
+      </w:ins>
+      <w:ins w:id="189" w:author="Coles, Nicholas A." w:date="2026-08-05T15:47:00Z" w16du:dateUtc="2026-08-05T19:47:00Z">
+        <w:r>
+          <w:rPr>
+            <w:rFonts w:cs="Times New Roman"/>
+          </w:rPr>
+          <w:t xml:space="preserve"> (</w:t>
+        </w:r>
+      </w:ins>
+      <w:ins w:id="190" w:author="Coles, Nicholas A." w:date="2026-08-05T15:48:00Z" w16du:dateUtc="2026-08-05T19:48:00Z">
+        <w:r>
+          <w:rPr>
+            <w:rFonts w:cs="Times New Roman"/>
+          </w:rPr>
+          <w:t xml:space="preserve">all </w:t>
+        </w:r>
+        <w:r>
+          <w:rPr>
+            <w:rFonts w:cs="Times New Roman"/>
+            <w:i/>
+            <w:iCs/>
+          </w:rPr>
+          <w:t>d</w:t>
+        </w:r>
+        <w:r>
+          <w:rPr>
+            <w:rFonts w:cs="Times New Roman"/>
+          </w:rPr>
+          <w:t xml:space="preserve"> &gt; </w:t>
+        </w:r>
+      </w:ins>
+      <w:ins w:id="191" w:author="Coles, Nicholas A." w:date="2026-08-05T15:49:00Z" w16du:dateUtc="2026-08-05T19:49:00Z">
+        <w:r>
+          <w:rPr>
+            <w:rFonts w:cs="Times New Roman"/>
+          </w:rPr>
+          <w:t xml:space="preserve">X, all </w:t>
+        </w:r>
+        <w:r>
+          <w:rPr>
+            <w:rFonts w:cs="Times New Roman"/>
+            <w:i/>
+            <w:iCs/>
+            <w:rPrChange w:id="192" w:author="Coles, Nicholas A." w:date="2026-08-05T15:49:00Z" w16du:dateUtc="2026-08-05T19:49:00Z">
+              <w:rPr>
+                <w:rFonts w:cs="Times New Roman"/>
+              </w:rPr>
+            </w:rPrChange>
+          </w:rPr>
+          <w:t>p</w:t>
+        </w:r>
+        <w:r>
+          <w:rPr>
+            <w:rFonts w:cs="Times New Roman"/>
+          </w:rPr>
+          <w:t xml:space="preserve"> &lt; .05; </w:t>
+        </w:r>
+      </w:ins>
+      <w:ins w:id="193" w:author="Coles, Nicholas A." w:date="2026-08-05T16:35:00Z" w16du:dateUtc="2026-08-05T20:35:00Z">
+        <w:r>
+          <w:rPr>
+            <w:rFonts w:cs="Times New Roman"/>
+          </w:rPr>
+          <w:t>Figure 1</w:t>
+        </w:r>
+      </w:ins>
+      <w:ins w:id="194" w:author="Coles, Nicholas A." w:date="2026-08-05T15:47:00Z" w16du:dateUtc="2026-08-05T19:47:00Z">
+        <w:r>
+          <w:rPr>
+            <w:rFonts w:cs="Times New Roman"/>
+          </w:rPr>
+          <w:t>).</w:t>
+        </w:r>
+      </w:ins>
     </w:p>
     <w:p>
       <w:pPr>
         <w:spacing w:before="0"/>
         <w:ind w:firstLine="720"/>
         <w:rPr>
-          <w:rFonts w:cs="Times New Roman"/>
-        </w:rPr>
-      </w:pPr>
+          <w:del w:id="195" w:author="Coles, Nicholas A." w:date="2026-08-05T15:59:00Z" w16du:dateUtc="2026-08-05T19:59:00Z"/>
+          <w:rFonts w:cs="Times New Roman"/>
+        </w:rPr>
+      </w:pPr>
+      <w:ins w:id="196" w:author="Coles, Nicholas A." w:date="2026-08-05T15:50:00Z" w16du:dateUtc="2026-08-05T19:50:00Z">
+        <w:r>
+          <w:rPr>
+            <w:rFonts w:cs="Times New Roman"/>
+          </w:rPr>
+          <w:t>In</w:t>
+        </w:r>
+      </w:ins>
+      <w:ins w:id="197" w:author="Coles, Nicholas A." w:date="2026-08-05T15:51:00Z" w16du:dateUtc="2026-08-05T19:51:00Z">
+        <w:r>
+          <w:rPr>
+            <w:rFonts w:cs="Times New Roman"/>
+          </w:rPr>
+          <w:t xml:space="preserve"> negative emotional contexts, we found that posing a single smile </w:t>
+        </w:r>
+      </w:ins>
+      <w:ins w:id="198" w:author="Coles, Nicholas A." w:date="2026-08-05T15:52:00Z" w16du:dateUtc="2026-08-05T19:52:00Z">
+        <w:r>
+          <w:rPr>
+            <w:rFonts w:cs="Times New Roman"/>
+          </w:rPr>
+          <w:t>led to small improvements in self-reported happiness</w:t>
+        </w:r>
+      </w:ins>
+      <w:ins w:id="199" w:author="Coles, Nicholas A." w:date="2026-08-05T15:54:00Z" w16du:dateUtc="2026-08-05T19:54:00Z">
+        <w:r>
+          <w:rPr>
+            <w:rFonts w:cs="Times New Roman"/>
+          </w:rPr>
+          <w:t xml:space="preserve">. This occurred regardless of whether smiles were posed </w:t>
+        </w:r>
+        <w:r>
+          <w:rPr>
+            <w:rFonts w:cs="Times New Roman"/>
+          </w:rPr>
+          <w:lastRenderedPageBreak/>
+          <w:t>voluntar</w:t>
+        </w:r>
+        <w:r>
+          <w:rPr>
+            <w:rFonts w:cs="Times New Roman"/>
+            <w:i/>
+            <w:iCs/>
+          </w:rPr>
+          <w:t xml:space="preserve">y </w:t>
+        </w:r>
+        <w:r>
+          <w:rPr>
+            <w:rFonts w:cs="Times New Roman"/>
+          </w:rPr>
+          <w:t>(</w:t>
+        </w:r>
+        <w:proofErr w:type="gramStart"/>
+        <w:r>
+          <w:rPr>
+            <w:rFonts w:cs="Times New Roman"/>
+            <w:i/>
+            <w:iCs/>
+          </w:rPr>
+          <w:t>t</w:t>
+        </w:r>
+        <w:r>
+          <w:rPr>
+            <w:rFonts w:cs="Times New Roman"/>
+          </w:rPr>
+          <w:t>(</w:t>
+        </w:r>
+        <w:proofErr w:type="gramEnd"/>
+        <w:r>
+          <w:rPr>
+            <w:rFonts w:cs="Times New Roman"/>
+          </w:rPr>
+          <w:t xml:space="preserve">) = X, </w:t>
+        </w:r>
+        <w:r>
+          <w:rPr>
+            <w:rFonts w:cs="Times New Roman"/>
+            <w:i/>
+            <w:iCs/>
+          </w:rPr>
+          <w:t>p</w:t>
+        </w:r>
+        <w:r>
+          <w:rPr>
+            <w:rFonts w:cs="Times New Roman"/>
+          </w:rPr>
+          <w:t xml:space="preserve"> &lt; X, </w:t>
+        </w:r>
+        <w:r>
+          <w:rPr>
+            <w:rFonts w:cs="Times New Roman"/>
+            <w:i/>
+            <w:iCs/>
+          </w:rPr>
+          <w:t>d</w:t>
+        </w:r>
+        <w:r>
+          <w:rPr>
+            <w:rFonts w:cs="Times New Roman"/>
+          </w:rPr>
+          <w:t xml:space="preserve"> = X, 95% CI [X, Y]) </w:t>
+        </w:r>
+        <w:r>
+          <w:rPr>
+            <w:rFonts w:cs="Times New Roman"/>
+          </w:rPr>
+          <w:t xml:space="preserve">or under threat of punishment </w:t>
+        </w:r>
+      </w:ins>
+      <w:ins w:id="200" w:author="Coles, Nicholas A." w:date="2026-08-05T15:55:00Z" w16du:dateUtc="2026-08-05T19:55:00Z">
+        <w:r>
+          <w:rPr>
+            <w:rFonts w:cs="Times New Roman"/>
+          </w:rPr>
+          <w:t>(</w:t>
+        </w:r>
+        <w:proofErr w:type="gramStart"/>
+        <w:r>
+          <w:rPr>
+            <w:rFonts w:cs="Times New Roman"/>
+            <w:i/>
+            <w:iCs/>
+          </w:rPr>
+          <w:t>t</w:t>
+        </w:r>
+        <w:r>
+          <w:rPr>
+            <w:rFonts w:cs="Times New Roman"/>
+          </w:rPr>
+          <w:t>(</w:t>
+        </w:r>
+        <w:proofErr w:type="gramEnd"/>
+        <w:r>
+          <w:rPr>
+            <w:rFonts w:cs="Times New Roman"/>
+          </w:rPr>
+          <w:t xml:space="preserve">) = X, </w:t>
+        </w:r>
+        <w:r>
+          <w:rPr>
+            <w:rFonts w:cs="Times New Roman"/>
+            <w:i/>
+            <w:iCs/>
+          </w:rPr>
+          <w:t>p</w:t>
+        </w:r>
+        <w:r>
+          <w:rPr>
+            <w:rFonts w:cs="Times New Roman"/>
+          </w:rPr>
+          <w:t xml:space="preserve"> &lt; X, </w:t>
+        </w:r>
+        <w:r>
+          <w:rPr>
+            <w:rFonts w:cs="Times New Roman"/>
+            <w:i/>
+            <w:iCs/>
+          </w:rPr>
+          <w:t>d</w:t>
+        </w:r>
+        <w:r>
+          <w:rPr>
+            <w:rFonts w:cs="Times New Roman"/>
+          </w:rPr>
+          <w:t xml:space="preserve"> = X, 95% CI [X, Y]</w:t>
+        </w:r>
+        <w:r>
+          <w:rPr>
+            <w:rFonts w:cs="Times New Roman"/>
+          </w:rPr>
+          <w:t xml:space="preserve">). When repeated 10 times, however, posing smiles in negative contexts led </w:t>
+        </w:r>
+      </w:ins>
+      <w:ins w:id="201" w:author="Coles, Nicholas A." w:date="2026-08-05T15:56:00Z" w16du:dateUtc="2026-08-05T19:56:00Z">
+        <w:r>
+          <w:rPr>
+            <w:rFonts w:cs="Times New Roman"/>
+          </w:rPr>
+          <w:t>to virtually no shift self-reported happiness</w:t>
+        </w:r>
+      </w:ins>
+      <w:ins w:id="202" w:author="Coles, Nicholas A." w:date="2026-08-05T15:58:00Z" w16du:dateUtc="2026-08-05T19:58:00Z">
+        <w:r>
+          <w:rPr>
+            <w:rFonts w:cs="Times New Roman"/>
+          </w:rPr>
+          <w:t xml:space="preserve"> (</w:t>
+        </w:r>
+        <w:proofErr w:type="gramStart"/>
+        <w:r>
+          <w:rPr>
+            <w:rFonts w:cs="Times New Roman"/>
+            <w:i/>
+            <w:iCs/>
+          </w:rPr>
+          <w:t>t</w:t>
+        </w:r>
+        <w:r>
+          <w:rPr>
+            <w:rFonts w:cs="Times New Roman"/>
+          </w:rPr>
+          <w:t>(</w:t>
+        </w:r>
+        <w:proofErr w:type="gramEnd"/>
+        <w:r>
+          <w:rPr>
+            <w:rFonts w:cs="Times New Roman"/>
+          </w:rPr>
+          <w:t xml:space="preserve">) </w:t>
+        </w:r>
+      </w:ins>
+      <w:ins w:id="203" w:author="Coles, Nicholas A." w:date="2026-08-05T15:59:00Z" w16du:dateUtc="2026-08-05T19:59:00Z">
+        <w:r>
+          <w:rPr>
+            <w:rFonts w:cs="Times New Roman"/>
+          </w:rPr>
+          <w:t>&lt;</w:t>
+        </w:r>
+      </w:ins>
+      <w:ins w:id="204" w:author="Coles, Nicholas A." w:date="2026-08-05T15:58:00Z" w16du:dateUtc="2026-08-05T19:58:00Z">
+        <w:r>
+          <w:rPr>
+            <w:rFonts w:cs="Times New Roman"/>
+          </w:rPr>
+          <w:t xml:space="preserve"> X, </w:t>
+        </w:r>
+        <w:r>
+          <w:rPr>
+            <w:rFonts w:cs="Times New Roman"/>
+            <w:i/>
+            <w:iCs/>
+          </w:rPr>
+          <w:t>p</w:t>
+        </w:r>
+        <w:r>
+          <w:rPr>
+            <w:rFonts w:cs="Times New Roman"/>
+          </w:rPr>
+          <w:t xml:space="preserve"> </w:t>
+        </w:r>
+      </w:ins>
+      <w:ins w:id="205" w:author="Coles, Nicholas A." w:date="2026-08-05T15:59:00Z" w16du:dateUtc="2026-08-05T19:59:00Z">
+        <w:r>
+          <w:rPr>
+            <w:rFonts w:cs="Times New Roman"/>
+          </w:rPr>
+          <w:t>&gt;</w:t>
+        </w:r>
+      </w:ins>
+      <w:ins w:id="206" w:author="Coles, Nicholas A." w:date="2026-08-05T15:58:00Z" w16du:dateUtc="2026-08-05T19:58:00Z">
+        <w:r>
+          <w:rPr>
+            <w:rFonts w:cs="Times New Roman"/>
+          </w:rPr>
+          <w:t xml:space="preserve"> X, </w:t>
+        </w:r>
+        <w:r>
+          <w:rPr>
+            <w:rFonts w:cs="Times New Roman"/>
+            <w:i/>
+            <w:iCs/>
+          </w:rPr>
+          <w:t>d</w:t>
+        </w:r>
+        <w:r>
+          <w:rPr>
+            <w:rFonts w:cs="Times New Roman"/>
+          </w:rPr>
+          <w:t xml:space="preserve"> </w:t>
+        </w:r>
+      </w:ins>
+      <w:ins w:id="207" w:author="Coles, Nicholas A." w:date="2026-08-05T15:59:00Z" w16du:dateUtc="2026-08-05T19:59:00Z">
+        <w:r>
+          <w:rPr>
+            <w:rFonts w:cs="Times New Roman"/>
+          </w:rPr>
+          <w:t>&lt;</w:t>
+        </w:r>
+      </w:ins>
+      <w:ins w:id="208" w:author="Coles, Nicholas A." w:date="2026-08-05T15:58:00Z" w16du:dateUtc="2026-08-05T19:58:00Z">
+        <w:r>
+          <w:rPr>
+            <w:rFonts w:cs="Times New Roman"/>
+          </w:rPr>
+          <w:t xml:space="preserve"> X</w:t>
+        </w:r>
+      </w:ins>
+      <w:ins w:id="209" w:author="Coles, Nicholas A." w:date="2026-08-05T15:59:00Z" w16du:dateUtc="2026-08-05T19:59:00Z">
+        <w:r>
+          <w:rPr>
+            <w:rFonts w:cs="Times New Roman"/>
+          </w:rPr>
+          <w:t xml:space="preserve">; </w:t>
+        </w:r>
+      </w:ins>
+      <w:ins w:id="210" w:author="Coles, Nicholas A." w:date="2026-08-05T15:58:00Z" w16du:dateUtc="2026-08-05T19:58:00Z">
+        <w:r>
+          <w:rPr>
+            <w:rFonts w:cs="Times New Roman"/>
+          </w:rPr>
+          <w:t>Figure 1).</w:t>
+        </w:r>
+      </w:ins>
     </w:p>
     <w:p>
       <w:pPr>
         <w:spacing w:before="0"/>
         <w:ind w:firstLine="720"/>
         <w:rPr>
+          <w:ins w:id="211" w:author="Coles, Nicholas A." w:date="2026-08-05T16:03:00Z" w16du:dateUtc="2026-08-05T20:03:00Z"/>
           <w:rFonts w:cs="Times New Roman"/>
         </w:rPr>
       </w:pPr>
@@ -9429,10 +12211,577 @@
     <w:p>
       <w:pPr>
         <w:spacing w:before="0"/>
+        <w:rPr>
+          <w:ins w:id="212" w:author="Coles, Nicholas A." w:date="2026-08-05T16:04:00Z" w16du:dateUtc="2026-08-05T20:04:00Z"/>
+          <w:rFonts w:cs="Times New Roman"/>
+          <w:b/>
+          <w:bCs/>
+          <w:rPrChange w:id="213" w:author="Coles, Nicholas A." w:date="2026-08-05T16:04:00Z" w16du:dateUtc="2026-08-05T20:04:00Z">
+            <w:rPr>
+              <w:ins w:id="214" w:author="Coles, Nicholas A." w:date="2026-08-05T16:04:00Z" w16du:dateUtc="2026-08-05T20:04:00Z"/>
+              <w:rFonts w:cs="Times New Roman"/>
+            </w:rPr>
+          </w:rPrChange>
+        </w:rPr>
+      </w:pPr>
+      <w:ins w:id="215" w:author="Coles, Nicholas A." w:date="2026-08-05T16:03:00Z" w16du:dateUtc="2026-08-05T20:03:00Z">
+        <w:r>
+          <w:rPr>
+            <w:rFonts w:cs="Times New Roman"/>
+            <w:b/>
+            <w:bCs/>
+            <w:rPrChange w:id="216" w:author="Coles, Nicholas A." w:date="2026-08-05T16:03:00Z" w16du:dateUtc="2026-08-05T20:03:00Z">
+              <w:rPr>
+                <w:rFonts w:cs="Times New Roman"/>
+              </w:rPr>
+            </w:rPrChange>
+          </w:rPr>
+          <w:t>Exploratory Results</w:t>
+        </w:r>
+      </w:ins>
+    </w:p>
+    <w:p>
+      <w:pPr>
+        <w:spacing w:before="0"/>
         <w:ind w:firstLine="720"/>
         <w:rPr>
-          <w:rFonts w:cs="Times New Roman"/>
-        </w:rPr>
+          <w:del w:id="217" w:author="Coles, Nicholas A." w:date="2026-08-05T16:28:00Z" w16du:dateUtc="2026-08-05T20:28:00Z"/>
+          <w:rFonts w:cs="Times New Roman"/>
+        </w:rPr>
+        <w:pPrChange w:id="218" w:author="Coles, Nicholas A." w:date="2026-08-05T16:30:00Z" w16du:dateUtc="2026-08-05T20:30:00Z">
+          <w:pPr>
+            <w:spacing w:before="0"/>
+            <w:ind w:firstLine="720"/>
+          </w:pPr>
+        </w:pPrChange>
+      </w:pPr>
+      <w:ins w:id="219" w:author="Coles, Nicholas A." w:date="2026-08-05T16:04:00Z" w16du:dateUtc="2026-08-05T20:04:00Z">
+        <w:r>
+          <w:rPr>
+            <w:rFonts w:cs="Times New Roman"/>
+          </w:rPr>
+          <w:t>Although outside the primary scope of our investigation</w:t>
+        </w:r>
+        <w:r>
+          <w:rPr>
+            <w:rFonts w:cs="Times New Roman"/>
+          </w:rPr>
+          <w:t xml:space="preserve">, we </w:t>
+        </w:r>
+      </w:ins>
+      <w:ins w:id="220" w:author="Coles, Nicholas A." w:date="2026-08-05T16:06:00Z" w16du:dateUtc="2026-08-05T20:06:00Z">
+        <w:r>
+          <w:rPr>
+            <w:rFonts w:cs="Times New Roman"/>
+          </w:rPr>
+          <w:t>examined whether posed smiles</w:t>
+        </w:r>
+      </w:ins>
+      <w:ins w:id="221" w:author="Coles, Nicholas A." w:date="2026-08-05T16:07:00Z" w16du:dateUtc="2026-08-05T20:07:00Z">
+        <w:r>
+          <w:rPr>
+            <w:rFonts w:cs="Times New Roman"/>
+          </w:rPr>
+          <w:t xml:space="preserve"> impact self-reported burnout and subjective well-being. Across every tested condition, we found no evidence that posed smiles impacted these outcomes</w:t>
+        </w:r>
+      </w:ins>
+      <w:ins w:id="222" w:author="Coles, Nicholas A." w:date="2026-08-05T16:08:00Z" w16du:dateUtc="2026-08-05T20:08:00Z">
+        <w:r>
+          <w:rPr>
+            <w:rFonts w:cs="Times New Roman"/>
+          </w:rPr>
+          <w:t xml:space="preserve"> (Figure 2A</w:t>
+        </w:r>
+      </w:ins>
+      <w:ins w:id="223" w:author="Coles, Nicholas A." w:date="2026-08-05T16:13:00Z" w16du:dateUtc="2026-08-05T20:13:00Z">
+        <w:r>
+          <w:rPr>
+            <w:rFonts w:cs="Times New Roman"/>
+          </w:rPr>
+          <w:t>, 2B</w:t>
+        </w:r>
+      </w:ins>
+      <w:ins w:id="224" w:author="Coles, Nicholas A." w:date="2026-08-05T16:08:00Z" w16du:dateUtc="2026-08-05T20:08:00Z">
+        <w:r>
+          <w:rPr>
+            <w:rFonts w:cs="Times New Roman"/>
+          </w:rPr>
+          <w:t>)</w:t>
+        </w:r>
+      </w:ins>
+      <w:ins w:id="225" w:author="Coles, Nicholas A." w:date="2026-08-05T16:07:00Z" w16du:dateUtc="2026-08-05T20:07:00Z">
+        <w:r>
+          <w:rPr>
+            <w:rFonts w:cs="Times New Roman"/>
+          </w:rPr>
+          <w:t>.</w:t>
+        </w:r>
+      </w:ins>
+      <w:ins w:id="226" w:author="Coles, Nicholas A." w:date="2026-08-05T16:13:00Z" w16du:dateUtc="2026-08-05T20:13:00Z">
+        <w:r>
+          <w:rPr>
+            <w:rFonts w:cs="Times New Roman"/>
+          </w:rPr>
+          <w:t xml:space="preserve"> We additionally examined </w:t>
+        </w:r>
+      </w:ins>
+      <w:ins w:id="227" w:author="Coles, Nicholas A." w:date="2026-08-05T16:14:00Z" w16du:dateUtc="2026-08-05T20:14:00Z">
+        <w:r>
+          <w:rPr>
+            <w:rFonts w:cs="Times New Roman"/>
+          </w:rPr>
+          <w:t>self-reported fear and anger – measures initially included to distract p</w:t>
+        </w:r>
+      </w:ins>
+      <w:ins w:id="228" w:author="Coles, Nicholas A." w:date="2026-08-05T16:15:00Z" w16du:dateUtc="2026-08-05T20:15:00Z">
+        <w:r>
+          <w:rPr>
+            <w:rFonts w:cs="Times New Roman"/>
+          </w:rPr>
+          <w:t>articipants from our interest in happiness</w:t>
+        </w:r>
+      </w:ins>
+      <w:ins w:id="229" w:author="Coles, Nicholas A." w:date="2026-08-05T16:14:00Z" w16du:dateUtc="2026-08-05T20:14:00Z">
+        <w:r>
+          <w:rPr>
+            <w:rFonts w:cs="Times New Roman"/>
+          </w:rPr>
+          <w:t>.</w:t>
+        </w:r>
+      </w:ins>
+      <w:ins w:id="230" w:author="Coles, Nicholas A." w:date="2026-08-05T16:15:00Z" w16du:dateUtc="2026-08-05T20:15:00Z">
+        <w:r>
+          <w:rPr>
+            <w:rFonts w:cs="Times New Roman"/>
+          </w:rPr>
+          <w:t xml:space="preserve"> For fear, we found some evidence </w:t>
+        </w:r>
+      </w:ins>
+      <w:ins w:id="231" w:author="Coles, Nicholas A." w:date="2026-08-05T16:16:00Z" w16du:dateUtc="2026-08-05T20:16:00Z">
+        <w:r>
+          <w:rPr>
+            <w:rFonts w:cs="Times New Roman"/>
+          </w:rPr>
+          <w:t>of decreases among participants who posed 10 consecutive smiles in negative contexts</w:t>
+        </w:r>
+      </w:ins>
+      <w:ins w:id="232" w:author="Coles, Nicholas A." w:date="2026-08-05T16:17:00Z" w16du:dateUtc="2026-08-05T20:17:00Z">
+        <w:r>
+          <w:rPr>
+            <w:rFonts w:cs="Times New Roman"/>
+          </w:rPr>
+          <w:t xml:space="preserve"> </w:t>
+        </w:r>
+        <w:r>
+          <w:rPr>
+            <w:rFonts w:cs="Times New Roman"/>
+          </w:rPr>
+          <w:t xml:space="preserve">(all </w:t>
+        </w:r>
+        <w:r>
+          <w:rPr>
+            <w:rFonts w:cs="Times New Roman"/>
+            <w:i/>
+            <w:iCs/>
+          </w:rPr>
+          <w:t>d</w:t>
+        </w:r>
+        <w:r>
+          <w:rPr>
+            <w:rFonts w:cs="Times New Roman"/>
+          </w:rPr>
+          <w:t xml:space="preserve"> &gt; X, all </w:t>
+        </w:r>
+        <w:r>
+          <w:rPr>
+            <w:rFonts w:cs="Times New Roman"/>
+            <w:i/>
+            <w:iCs/>
+          </w:rPr>
+          <w:t>p</w:t>
+        </w:r>
+        <w:r>
+          <w:rPr>
+            <w:rFonts w:cs="Times New Roman"/>
+          </w:rPr>
+          <w:t xml:space="preserve"> &lt; .05; Figure </w:t>
+        </w:r>
+      </w:ins>
+      <w:ins w:id="233" w:author="Coles, Nicholas A." w:date="2026-08-05T16:29:00Z" w16du:dateUtc="2026-08-05T20:29:00Z">
+        <w:r>
+          <w:rPr>
+            <w:rFonts w:cs="Times New Roman"/>
+          </w:rPr>
+          <w:t>2C</w:t>
+        </w:r>
+      </w:ins>
+      <w:ins w:id="234" w:author="Coles, Nicholas A." w:date="2026-08-05T16:17:00Z" w16du:dateUtc="2026-08-05T20:17:00Z">
+        <w:r>
+          <w:rPr>
+            <w:rFonts w:cs="Times New Roman"/>
+          </w:rPr>
+          <w:t>)</w:t>
+        </w:r>
+      </w:ins>
+      <w:ins w:id="235" w:author="Coles, Nicholas A." w:date="2026-08-05T16:16:00Z" w16du:dateUtc="2026-08-05T20:16:00Z">
+        <w:r>
+          <w:rPr>
+            <w:rFonts w:cs="Times New Roman"/>
+          </w:rPr>
+          <w:t xml:space="preserve">. </w:t>
+        </w:r>
+      </w:ins>
+      <w:ins w:id="236" w:author="Coles, Nicholas A." w:date="2026-08-05T16:17:00Z" w16du:dateUtc="2026-08-05T20:17:00Z">
+        <w:r>
+          <w:rPr>
+            <w:rFonts w:cs="Times New Roman"/>
+          </w:rPr>
+          <w:t>Bayesian</w:t>
+        </w:r>
+        <w:r>
+          <w:rPr>
+            <w:rFonts w:cs="Times New Roman"/>
+          </w:rPr>
+          <w:t xml:space="preserve"> analyses</w:t>
+        </w:r>
+      </w:ins>
+      <w:ins w:id="237" w:author="Coles, Nicholas A." w:date="2026-08-05T16:20:00Z" w16du:dateUtc="2026-08-05T20:20:00Z">
+        <w:r>
+          <w:rPr>
+            <w:rFonts w:cs="Times New Roman"/>
+          </w:rPr>
+          <w:t>, howeve</w:t>
+        </w:r>
+      </w:ins>
+      <w:ins w:id="238" w:author="Coles, Nicholas A." w:date="2026-08-05T16:21:00Z" w16du:dateUtc="2026-08-05T20:21:00Z">
+        <w:r>
+          <w:rPr>
+            <w:rFonts w:cs="Times New Roman"/>
+          </w:rPr>
+          <w:t>r, were generally inconclusive.</w:t>
+        </w:r>
+      </w:ins>
+      <w:ins w:id="239" w:author="Coles, Nicholas A." w:date="2026-08-05T16:18:00Z" w16du:dateUtc="2026-08-05T20:18:00Z">
+        <w:r>
+          <w:rPr>
+            <w:rFonts w:cs="Times New Roman"/>
+          </w:rPr>
+          <w:t xml:space="preserve"> </w:t>
+        </w:r>
+      </w:ins>
+      <w:ins w:id="240" w:author="Coles, Nicholas A." w:date="2026-08-05T16:25:00Z" w16du:dateUtc="2026-08-05T20:25:00Z">
+        <w:r>
+          <w:rPr>
+            <w:rFonts w:cs="Times New Roman"/>
+          </w:rPr>
+          <w:t>For anger, results were more conclusive</w:t>
+        </w:r>
+      </w:ins>
+      <w:ins w:id="241" w:author="Coles, Nicholas A." w:date="2026-08-05T16:30:00Z" w16du:dateUtc="2026-08-05T20:30:00Z">
+        <w:r>
+          <w:rPr>
+            <w:rFonts w:cs="Times New Roman"/>
+          </w:rPr>
+          <w:t xml:space="preserve"> (</w:t>
+        </w:r>
+        <w:r>
+          <w:rPr>
+            <w:rFonts w:cs="Times New Roman"/>
+          </w:rPr>
+          <w:t>Figure 2</w:t>
+        </w:r>
+        <w:r>
+          <w:rPr>
+            <w:rFonts w:cs="Times New Roman"/>
+          </w:rPr>
+          <w:t>D)</w:t>
+        </w:r>
+      </w:ins>
+      <w:ins w:id="242" w:author="Coles, Nicholas A." w:date="2026-08-05T16:25:00Z" w16du:dateUtc="2026-08-05T20:25:00Z">
+        <w:r>
+          <w:rPr>
+            <w:rFonts w:cs="Times New Roman"/>
+          </w:rPr>
+          <w:t>.</w:t>
+        </w:r>
+      </w:ins>
+      <w:ins w:id="243" w:author="Coles, Nicholas A." w:date="2026-08-05T16:29:00Z" w16du:dateUtc="2026-08-05T20:29:00Z">
+        <w:r>
+          <w:rPr>
+            <w:rFonts w:cs="Times New Roman"/>
+          </w:rPr>
+          <w:t xml:space="preserve"> </w:t>
+        </w:r>
+      </w:ins>
+      <w:ins w:id="244" w:author="Coles, Nicholas A." w:date="2026-08-05T16:23:00Z" w16du:dateUtc="2026-08-05T20:23:00Z">
+        <w:r>
+          <w:rPr>
+            <w:rFonts w:cs="Times New Roman"/>
+          </w:rPr>
+          <w:t>In negative contexts, posing smiles</w:t>
+        </w:r>
+      </w:ins>
+      <w:ins w:id="245" w:author="Coles, Nicholas A." w:date="2026-08-05T16:24:00Z" w16du:dateUtc="2026-08-05T20:24:00Z">
+        <w:r>
+          <w:rPr>
+            <w:rFonts w:cs="Times New Roman"/>
+          </w:rPr>
+          <w:t xml:space="preserve"> led to little-to-no shift in self-reported anger</w:t>
+        </w:r>
+      </w:ins>
+      <w:ins w:id="246" w:author="Coles, Nicholas A." w:date="2026-08-05T16:29:00Z" w16du:dateUtc="2026-08-05T20:29:00Z">
+        <w:r>
+          <w:rPr>
+            <w:rFonts w:cs="Times New Roman"/>
+          </w:rPr>
+          <w:t xml:space="preserve"> </w:t>
+        </w:r>
+        <w:r>
+          <w:rPr>
+            <w:rFonts w:cs="Times New Roman"/>
+          </w:rPr>
+          <w:t xml:space="preserve">(all </w:t>
+        </w:r>
+        <w:r>
+          <w:rPr>
+            <w:rFonts w:cs="Times New Roman"/>
+            <w:i/>
+            <w:iCs/>
+          </w:rPr>
+          <w:t>d</w:t>
+        </w:r>
+        <w:r>
+          <w:rPr>
+            <w:rFonts w:cs="Times New Roman"/>
+          </w:rPr>
+          <w:t xml:space="preserve"> &gt; X, all </w:t>
+        </w:r>
+        <w:r>
+          <w:rPr>
+            <w:rFonts w:cs="Times New Roman"/>
+            <w:i/>
+            <w:iCs/>
+          </w:rPr>
+          <w:t>p</w:t>
+        </w:r>
+        <w:r>
+          <w:rPr>
+            <w:rFonts w:cs="Times New Roman"/>
+          </w:rPr>
+          <w:t xml:space="preserve"> &lt; .05)</w:t>
+        </w:r>
+      </w:ins>
+      <w:ins w:id="247" w:author="Coles, Nicholas A." w:date="2026-08-05T16:24:00Z" w16du:dateUtc="2026-08-05T20:24:00Z">
+        <w:r>
+          <w:rPr>
+            <w:rFonts w:cs="Times New Roman"/>
+          </w:rPr>
+          <w:t>. In positive contexts</w:t>
+        </w:r>
+      </w:ins>
+      <w:ins w:id="248" w:author="Coles, Nicholas A." w:date="2026-08-05T16:25:00Z" w16du:dateUtc="2026-08-05T20:25:00Z">
+        <w:r>
+          <w:rPr>
+            <w:rFonts w:cs="Times New Roman"/>
+          </w:rPr>
+          <w:t xml:space="preserve">, posing smiles </w:t>
+        </w:r>
+      </w:ins>
+      <w:ins w:id="249" w:author="Coles, Nicholas A." w:date="2026-08-05T16:26:00Z" w16du:dateUtc="2026-08-05T20:26:00Z">
+        <w:r>
+          <w:rPr>
+            <w:rFonts w:cs="Times New Roman"/>
+          </w:rPr>
+          <w:t>consistently led to increases in anger</w:t>
+        </w:r>
+      </w:ins>
+      <w:ins w:id="250" w:author="Coles, Nicholas A." w:date="2026-08-05T16:29:00Z" w16du:dateUtc="2026-08-05T20:29:00Z">
+        <w:r>
+          <w:rPr>
+            <w:rFonts w:cs="Times New Roman"/>
+          </w:rPr>
+          <w:t xml:space="preserve"> </w:t>
+        </w:r>
+        <w:r>
+          <w:rPr>
+            <w:rFonts w:cs="Times New Roman"/>
+          </w:rPr>
+          <w:t xml:space="preserve">(all </w:t>
+        </w:r>
+        <w:r>
+          <w:rPr>
+            <w:rFonts w:cs="Times New Roman"/>
+            <w:i/>
+            <w:iCs/>
+          </w:rPr>
+          <w:t>d</w:t>
+        </w:r>
+        <w:r>
+          <w:rPr>
+            <w:rFonts w:cs="Times New Roman"/>
+          </w:rPr>
+          <w:t xml:space="preserve"> &gt; X, all </w:t>
+        </w:r>
+        <w:r>
+          <w:rPr>
+            <w:rFonts w:cs="Times New Roman"/>
+            <w:i/>
+            <w:iCs/>
+          </w:rPr>
+          <w:t>p</w:t>
+        </w:r>
+        <w:r>
+          <w:rPr>
+            <w:rFonts w:cs="Times New Roman"/>
+          </w:rPr>
+          <w:t xml:space="preserve"> &lt; .05)</w:t>
+        </w:r>
+      </w:ins>
+      <w:ins w:id="251" w:author="Coles, Nicholas A." w:date="2026-08-05T16:27:00Z" w16du:dateUtc="2026-08-05T20:27:00Z">
+        <w:r>
+          <w:rPr>
+            <w:rFonts w:cs="Times New Roman"/>
+          </w:rPr>
+          <w:t xml:space="preserve">. This occurred regardless of whether </w:t>
+        </w:r>
+      </w:ins>
+      <w:ins w:id="252" w:author="Coles, Nicholas A." w:date="2026-08-05T16:28:00Z" w16du:dateUtc="2026-08-05T20:28:00Z">
+        <w:r>
+          <w:rPr>
+            <w:rFonts w:cs="Times New Roman"/>
+          </w:rPr>
+          <w:t xml:space="preserve">participants </w:t>
+        </w:r>
+      </w:ins>
+      <w:ins w:id="253" w:author="Coles, Nicholas A." w:date="2026-08-05T16:27:00Z" w16du:dateUtc="2026-08-05T20:27:00Z">
+        <w:r>
+          <w:rPr>
+            <w:rFonts w:cs="Times New Roman"/>
+          </w:rPr>
+          <w:t>posed smiles</w:t>
+        </w:r>
+      </w:ins>
+      <w:ins w:id="254" w:author="Coles, Nicholas A." w:date="2026-08-05T16:26:00Z" w16du:dateUtc="2026-08-05T20:26:00Z">
+        <w:r>
+          <w:rPr>
+            <w:rFonts w:cs="Times New Roman"/>
+          </w:rPr>
+          <w:t xml:space="preserve"> </w:t>
+        </w:r>
+      </w:ins>
+      <w:ins w:id="255" w:author="Coles, Nicholas A." w:date="2026-08-05T16:27:00Z" w16du:dateUtc="2026-08-05T20:27:00Z">
+        <w:r>
+          <w:rPr>
+            <w:rFonts w:cs="Times New Roman"/>
+          </w:rPr>
+          <w:t xml:space="preserve">(a) </w:t>
+        </w:r>
+      </w:ins>
+      <w:ins w:id="256" w:author="Coles, Nicholas A." w:date="2026-08-05T16:26:00Z" w16du:dateUtc="2026-08-05T20:26:00Z">
+        <w:r>
+          <w:rPr>
+            <w:rFonts w:cs="Times New Roman"/>
+          </w:rPr>
+          <w:t>on</w:t>
+        </w:r>
+      </w:ins>
+      <w:ins w:id="257" w:author="Coles, Nicholas A." w:date="2026-08-05T16:27:00Z" w16du:dateUtc="2026-08-05T20:27:00Z">
+        <w:r>
+          <w:rPr>
+            <w:rFonts w:cs="Times New Roman"/>
+          </w:rPr>
+          <w:t>ce</w:t>
+        </w:r>
+        <w:r>
+          <w:rPr>
+            <w:rFonts w:cs="Times New Roman"/>
+          </w:rPr>
+          <w:t xml:space="preserve"> and </w:t>
+        </w:r>
+        <w:r>
+          <w:rPr>
+            <w:rFonts w:cs="Times New Roman"/>
+          </w:rPr>
+          <w:t>voluntar</w:t>
+        </w:r>
+        <w:r>
+          <w:rPr>
+            <w:rFonts w:cs="Times New Roman"/>
+          </w:rPr>
+          <w:t>ily</w:t>
+        </w:r>
+      </w:ins>
+      <w:ins w:id="258" w:author="Coles, Nicholas A." w:date="2026-08-05T16:28:00Z" w16du:dateUtc="2026-08-05T20:28:00Z">
+        <w:r>
+          <w:rPr>
+            <w:rFonts w:cs="Times New Roman"/>
+          </w:rPr>
+          <w:t xml:space="preserve">, (b) </w:t>
+        </w:r>
+      </w:ins>
+      <w:ins w:id="259" w:author="Coles, Nicholas A." w:date="2026-08-05T16:27:00Z" w16du:dateUtc="2026-08-05T20:27:00Z">
+        <w:r>
+          <w:rPr>
+            <w:rFonts w:cs="Times New Roman"/>
+          </w:rPr>
+          <w:t>ten t</w:t>
+        </w:r>
+      </w:ins>
+      <w:ins w:id="260" w:author="Coles, Nicholas A." w:date="2026-08-05T16:28:00Z" w16du:dateUtc="2026-08-05T20:28:00Z">
+        <w:r>
+          <w:rPr>
+            <w:rFonts w:cs="Times New Roman"/>
+          </w:rPr>
+          <w:t>imes under threat of punishment, and (c) all other tested conditions.</w:t>
+        </w:r>
+      </w:ins>
+    </w:p>
+    <w:p>
+      <w:pPr>
+        <w:spacing w:before="0"/>
+        <w:ind w:firstLine="720"/>
+        <w:rPr>
+          <w:del w:id="261" w:author="Coles, Nicholas A." w:date="2026-08-05T16:28:00Z" w16du:dateUtc="2026-08-05T20:28:00Z"/>
+          <w:rFonts w:cs="Times New Roman"/>
+        </w:rPr>
+        <w:pPrChange w:id="262" w:author="Coles, Nicholas A." w:date="2026-08-05T16:30:00Z" w16du:dateUtc="2026-08-05T20:30:00Z">
+          <w:pPr>
+            <w:spacing w:before="0"/>
+            <w:ind w:firstLine="720"/>
+          </w:pPr>
+        </w:pPrChange>
+      </w:pPr>
+    </w:p>
+    <w:p>
+      <w:pPr>
+        <w:spacing w:before="0"/>
+        <w:ind w:firstLine="720"/>
+        <w:rPr>
+          <w:del w:id="263" w:author="Coles, Nicholas A." w:date="2026-08-05T16:28:00Z" w16du:dateUtc="2026-08-05T20:28:00Z"/>
+          <w:rFonts w:cs="Times New Roman"/>
+        </w:rPr>
+        <w:pPrChange w:id="264" w:author="Coles, Nicholas A." w:date="2026-08-05T16:30:00Z" w16du:dateUtc="2026-08-05T20:30:00Z">
+          <w:pPr>
+            <w:spacing w:before="0"/>
+            <w:ind w:firstLine="720"/>
+          </w:pPr>
+        </w:pPrChange>
+      </w:pPr>
+    </w:p>
+    <w:p>
+      <w:pPr>
+        <w:spacing w:before="0"/>
+        <w:ind w:firstLine="720"/>
+        <w:rPr>
+          <w:del w:id="265" w:author="Coles, Nicholas A." w:date="2026-08-05T16:30:00Z" w16du:dateUtc="2026-08-05T20:30:00Z"/>
+          <w:rFonts w:cs="Times New Roman"/>
+        </w:rPr>
+        <w:pPrChange w:id="266" w:author="Coles, Nicholas A." w:date="2026-08-05T16:30:00Z" w16du:dateUtc="2026-08-05T20:30:00Z">
+          <w:pPr>
+            <w:spacing w:before="0"/>
+            <w:ind w:firstLine="720"/>
+          </w:pPr>
+        </w:pPrChange>
       </w:pPr>
     </w:p>
     <w:p>
@@ -10795,19 +14144,8 @@
           <w:iCs/>
           <w:color w:val="000000" w:themeColor="text1"/>
         </w:rPr>
-        <w:t xml:space="preserve">Nature Human </w:t>
-      </w:r>
-      <w:proofErr w:type="spellStart"/>
-      <w:r>
-        <w:rPr>
-          <w:rFonts w:eastAsia="Times New Roman" w:cs="Times New Roman"/>
-          <w:i/>
-          <w:iCs/>
-          <w:color w:val="000000" w:themeColor="text1"/>
-        </w:rPr>
-        <w:t>Behaviour</w:t>
-      </w:r>
-      <w:proofErr w:type="spellEnd"/>
+        <w:t>Nature Human Behaviour</w:t>
+      </w:r>
       <w:r>
         <w:rPr>
           <w:rFonts w:eastAsia="Times New Roman" w:cs="Times New Roman"/>
@@ -13134,23 +16472,7 @@
           <w:rFonts w:eastAsia="Times New Roman" w:cs="Times New Roman"/>
           <w:color w:val="000000" w:themeColor="text1"/>
         </w:rPr>
-        <w:t xml:space="preserve">Morey, R. D., &amp; </w:t>
-      </w:r>
-      <w:proofErr w:type="spellStart"/>
-      <w:r>
-        <w:rPr>
-          <w:rFonts w:eastAsia="Times New Roman" w:cs="Times New Roman"/>
-          <w:color w:val="000000" w:themeColor="text1"/>
-        </w:rPr>
-        <w:t>Rouder</w:t>
-      </w:r>
-      <w:proofErr w:type="spellEnd"/>
-      <w:r>
-        <w:rPr>
-          <w:rFonts w:eastAsia="Times New Roman" w:cs="Times New Roman"/>
-          <w:color w:val="000000" w:themeColor="text1"/>
-        </w:rPr>
-        <w:t xml:space="preserve">, J. N. (2024). </w:t>
+        <w:t xml:space="preserve">Morey, R. D., &amp; Rouder, J. N. (2024). </w:t>
       </w:r>
       <w:proofErr w:type="spellStart"/>
       <w:r>
@@ -14663,7 +17985,7 @@
 </file>
 
 <file path=word/endnotes.xml><?xml version="1.0" encoding="utf-8"?>
-<w:endnotes xmlns:wpc="http://schemas.microsoft.com/office/word/2010/wordprocessingCanvas" xmlns:cx="http://schemas.microsoft.com/office/drawing/2014/chartex" xmlns:cx1="http://schemas.microsoft.com/office/drawing/2015/9/8/chartex" xmlns:cx2="http://schemas.microsoft.com/office/drawing/2015/10/21/chartex" xmlns:cx3="http://schemas.microsoft.com/office/drawing/2016/5/9/chartex" xmlns:cx4="http://schemas.microsoft.com/office/drawing/2016/5/10/chartex" xmlns:cx5="http://schemas.microsoft.com/office/drawing/2016/5/11/chartex" xmlns:cx6="http://schemas.microsoft.com/office/drawing/2016/5/12/chartex" xmlns:cx7="http://schemas.microsoft.com/office/drawing/2016/5/13/chartex" xmlns:cx8="http://schemas.microsoft.com/office/drawing/2016/5/14/chartex" xmlns:mc="http://schemas.openxmlformats.org/markup-compatibility/2006" xmlns:aink="http://schemas.microsoft.com/office/drawing/2016/ink" xmlns:am3d="http://schemas.microsoft.com/office/drawing/2017/model3d" xmlns:o="urn:schemas-microsoft-com:office:office" xmlns:oel="http://schemas.microsoft.com/office/2019/extlst" xmlns:r="http://schemas.openxmlformats.org/officeDocument/2006/relationships" xmlns:m="http://schemas.openxmlformats.org/officeDocument/2006/math" xmlns:v="urn:schemas-microsoft-com:vml" xmlns:wp14="http://schemas.microsoft.com/office/word/2010/wordprocessingDrawing" xmlns:wp="http://schemas.openxmlformats.org/drawingml/2006/wordprocessingDrawing" xmlns:w10="urn:schemas-microsoft-com:office:word" xmlns:w="http://schemas.openxmlformats.org/wordprocessingml/2006/main" xmlns:w14="http://schemas.microsoft.com/office/word/2010/wordml" xmlns:w15="http://schemas.microsoft.com/office/word/2012/wordml" xmlns:w16cex="http://schemas.microsoft.com/office/word/2018/wordml/cex" xmlns:w16cid="http://schemas.microsoft.com/office/word/2016/wordml/cid" xmlns:w16="http://schemas.microsoft.com/office/word/2018/wordml" xmlns:w16du="http://schemas.microsoft.com/office/word/2023/wordml/word16du" xmlns:w16sdtdh="http://schemas.microsoft.com/office/word/2020/wordml/sdtdatahash" xmlns:w16sdtfl="http://schemas.microsoft.com/office/word/2024/wordml/sdtformatlock" xmlns:w16se="http://schemas.microsoft.com/office/word/2015/wordml/symex" xmlns:wpg="http://schemas.microsoft.com/office/word/2010/wordprocessingGroup" xmlns:wpi="http://schemas.microsoft.com/office/word/2010/wordprocessingInk" xmlns:wne="http://schemas.microsoft.com/office/word/2006/wordml" xmlns:wps="http://schemas.microsoft.com/office/word/2010/wordprocessingShape" mc:Ignorable="w14 w15 w16se w16cid w16 w16cex w16sdtdh w16sdtfl w16du wp14">
+<w:endnotes xmlns:wpc="http://schemas.microsoft.com/office/word/2010/wordprocessingCanvas" xmlns:cx="http://schemas.microsoft.com/office/drawing/2014/chartex" xmlns:cx1="http://schemas.microsoft.com/office/drawing/2015/9/8/chartex" xmlns:cx2="http://schemas.microsoft.com/office/drawing/2015/10/21/chartex" xmlns:cx3="http://schemas.microsoft.com/office/drawing/2016/5/9/chartex" xmlns:cx4="http://schemas.microsoft.com/office/drawing/2016/5/10/chartex" xmlns:cx5="http://schemas.microsoft.com/office/drawing/2016/5/11/chartex" xmlns:cx6="http://schemas.microsoft.com/office/drawing/2016/5/12/chartex" xmlns:cx7="http://schemas.microsoft.com/office/drawing/2016/5/13/chartex" xmlns:cx8="http://schemas.microsoft.com/office/drawing/2016/5/14/chartex" xmlns:mc="http://schemas.openxmlformats.org/markup-compatibility/2006" xmlns:m="http://schemas.openxmlformats.org/officeDocument/2006/math" xmlns:aink="http://schemas.microsoft.com/office/drawing/2016/ink" xmlns:am3d="http://schemas.microsoft.com/office/drawing/2017/model3d" xmlns:oel="http://schemas.microsoft.com/office/2019/extlst" xmlns:r="http://schemas.openxmlformats.org/officeDocument/2006/relationships" xmlns:wp14="http://schemas.microsoft.com/office/word/2010/wordprocessingDrawing" xmlns:wp="http://schemas.openxmlformats.org/drawingml/2006/wordprocessingDrawing" xmlns:wpg="http://schemas.microsoft.com/office/word/2010/wordprocessingGroup" xmlns:wpi="http://schemas.microsoft.com/office/word/2010/wordprocessingInk" xmlns:wps="http://schemas.microsoft.com/office/word/2010/wordprocessingShape" xmlns:o="urn:schemas-microsoft-com:office:office" xmlns:v="urn:schemas-microsoft-com:vml" xmlns:w10="urn:schemas-microsoft-com:office:word" xmlns:w="http://schemas.openxmlformats.org/wordprocessingml/2006/main" xmlns:w14="http://schemas.microsoft.com/office/word/2010/wordml" xmlns:w15="http://schemas.microsoft.com/office/word/2012/wordml" xmlns:w16cei="http://schemas.microsoft.com/office/word/2026/wordml/cei" xmlns:w16cex="http://schemas.microsoft.com/office/word/2018/wordml/cex" xmlns:w16cid="http://schemas.microsoft.com/office/word/2016/wordml/cid" xmlns:w16="http://schemas.microsoft.com/office/word/2018/wordml" xmlns:w16sdtdh="http://schemas.microsoft.com/office/word/2020/wordml/sdtdatahash" xmlns:w16sdtfl="http://schemas.microsoft.com/office/word/2024/wordml/sdtformatlock" xmlns:w16se="http://schemas.microsoft.com/office/word/2015/wordml/symex" xmlns:w16du="http://schemas.microsoft.com/office/word/2023/wordml/word16du" xmlns:wne="http://schemas.microsoft.com/office/word/2006/wordml" mc:Ignorable="w14 w15 w16se w16cid w16 w16cex w16sdtdh w16sdtfl w16du wp14">
   <w:endnote w:type="separator" w:id="-1">
     <w:p>
       <w:pPr>
@@ -14688,7 +18010,7 @@
 </file>
 
 <file path=word/footer1.xml><?xml version="1.0" encoding="utf-8"?>
-<w:ftr xmlns:wpc="http://schemas.microsoft.com/office/word/2010/wordprocessingCanvas" xmlns:cx="http://schemas.microsoft.com/office/drawing/2014/chartex" xmlns:cx1="http://schemas.microsoft.com/office/drawing/2015/9/8/chartex" xmlns:cx2="http://schemas.microsoft.com/office/drawing/2015/10/21/chartex" xmlns:cx3="http://schemas.microsoft.com/office/drawing/2016/5/9/chartex" xmlns:cx4="http://schemas.microsoft.com/office/drawing/2016/5/10/chartex" xmlns:cx5="http://schemas.microsoft.com/office/drawing/2016/5/11/chartex" xmlns:cx6="http://schemas.microsoft.com/office/drawing/2016/5/12/chartex" xmlns:cx7="http://schemas.microsoft.com/office/drawing/2016/5/13/chartex" xmlns:cx8="http://schemas.microsoft.com/office/drawing/2016/5/14/chartex" xmlns:mc="http://schemas.openxmlformats.org/markup-compatibility/2006" xmlns:aink="http://schemas.microsoft.com/office/drawing/2016/ink" xmlns:am3d="http://schemas.microsoft.com/office/drawing/2017/model3d" xmlns:o="urn:schemas-microsoft-com:office:office" xmlns:oel="http://schemas.microsoft.com/office/2019/extlst" xmlns:r="http://schemas.openxmlformats.org/officeDocument/2006/relationships" xmlns:m="http://schemas.openxmlformats.org/officeDocument/2006/math" xmlns:v="urn:schemas-microsoft-com:vml" xmlns:wp14="http://schemas.microsoft.com/office/word/2010/wordprocessingDrawing" xmlns:wp="http://schemas.openxmlformats.org/drawingml/2006/wordprocessingDrawing" xmlns:w10="urn:schemas-microsoft-com:office:word" xmlns:w="http://schemas.openxmlformats.org/wordprocessingml/2006/main" xmlns:w14="http://schemas.microsoft.com/office/word/2010/wordml" xmlns:w15="http://schemas.microsoft.com/office/word/2012/wordml" xmlns:w16cex="http://schemas.microsoft.com/office/word/2018/wordml/cex" xmlns:w16cid="http://schemas.microsoft.com/office/word/2016/wordml/cid" xmlns:w16="http://schemas.microsoft.com/office/word/2018/wordml" xmlns:w16du="http://schemas.microsoft.com/office/word/2023/wordml/word16du" xmlns:w16sdtdh="http://schemas.microsoft.com/office/word/2020/wordml/sdtdatahash" xmlns:w16sdtfl="http://schemas.microsoft.com/office/word/2024/wordml/sdtformatlock" xmlns:w16se="http://schemas.microsoft.com/office/word/2015/wordml/symex" xmlns:wpg="http://schemas.microsoft.com/office/word/2010/wordprocessingGroup" xmlns:wpi="http://schemas.microsoft.com/office/word/2010/wordprocessingInk" xmlns:wne="http://schemas.microsoft.com/office/word/2006/wordml" xmlns:wps="http://schemas.microsoft.com/office/word/2010/wordprocessingShape" mc:Ignorable="w14 w15 w16se w16cid w16 w16cex w16sdtdh w16sdtfl w16du wp14">
+<w:ftr xmlns:wpc="http://schemas.microsoft.com/office/word/2010/wordprocessingCanvas" xmlns:cx="http://schemas.microsoft.com/office/drawing/2014/chartex" xmlns:cx1="http://schemas.microsoft.com/office/drawing/2015/9/8/chartex" xmlns:cx2="http://schemas.microsoft.com/office/drawing/2015/10/21/chartex" xmlns:cx3="http://schemas.microsoft.com/office/drawing/2016/5/9/chartex" xmlns:cx4="http://schemas.microsoft.com/office/drawing/2016/5/10/chartex" xmlns:cx5="http://schemas.microsoft.com/office/drawing/2016/5/11/chartex" xmlns:cx6="http://schemas.microsoft.com/office/drawing/2016/5/12/chartex" xmlns:cx7="http://schemas.microsoft.com/office/drawing/2016/5/13/chartex" xmlns:cx8="http://schemas.microsoft.com/office/drawing/2016/5/14/chartex" xmlns:mc="http://schemas.openxmlformats.org/markup-compatibility/2006" xmlns:m="http://schemas.openxmlformats.org/officeDocument/2006/math" xmlns:aink="http://schemas.microsoft.com/office/drawing/2016/ink" xmlns:am3d="http://schemas.microsoft.com/office/drawing/2017/model3d" xmlns:oel="http://schemas.microsoft.com/office/2019/extlst" xmlns:r="http://schemas.openxmlformats.org/officeDocument/2006/relationships" xmlns:wp14="http://schemas.microsoft.com/office/word/2010/wordprocessingDrawing" xmlns:wp="http://schemas.openxmlformats.org/drawingml/2006/wordprocessingDrawing" xmlns:wpg="http://schemas.microsoft.com/office/word/2010/wordprocessingGroup" xmlns:wpi="http://schemas.microsoft.com/office/word/2010/wordprocessingInk" xmlns:wps="http://schemas.microsoft.com/office/word/2010/wordprocessingShape" xmlns:o="urn:schemas-microsoft-com:office:office" xmlns:v="urn:schemas-microsoft-com:vml" xmlns:w10="urn:schemas-microsoft-com:office:word" xmlns:w="http://schemas.openxmlformats.org/wordprocessingml/2006/main" xmlns:w14="http://schemas.microsoft.com/office/word/2010/wordml" xmlns:w15="http://schemas.microsoft.com/office/word/2012/wordml" xmlns:w16cei="http://schemas.microsoft.com/office/word/2026/wordml/cei" xmlns:w16cex="http://schemas.microsoft.com/office/word/2018/wordml/cex" xmlns:w16cid="http://schemas.microsoft.com/office/word/2016/wordml/cid" xmlns:w16="http://schemas.microsoft.com/office/word/2018/wordml" xmlns:w16sdtdh="http://schemas.microsoft.com/office/word/2020/wordml/sdtdatahash" xmlns:w16sdtfl="http://schemas.microsoft.com/office/word/2024/wordml/sdtformatlock" xmlns:w16se="http://schemas.microsoft.com/office/word/2015/wordml/symex" xmlns:w16du="http://schemas.microsoft.com/office/word/2023/wordml/word16du" xmlns:wne="http://schemas.microsoft.com/office/word/2006/wordml" mc:Ignorable="w14 w15 w16se w16cid w16 w16cex w16sdtdh w16sdtfl w16du wp14">
   <w:p>
     <w:pPr>
       <w:pStyle w:val="Footer"/>
@@ -14698,7 +18020,7 @@
 </file>
 
 <file path=word/footnotes.xml><?xml version="1.0" encoding="utf-8"?>
-<w:footnotes xmlns:wpc="http://schemas.microsoft.com/office/word/2010/wordprocessingCanvas" xmlns:cx="http://schemas.microsoft.com/office/drawing/2014/chartex" xmlns:cx1="http://schemas.microsoft.com/office/drawing/2015/9/8/chartex" xmlns:cx2="http://schemas.microsoft.com/office/drawing/2015/10/21/chartex" xmlns:cx3="http://schemas.microsoft.com/office/drawing/2016/5/9/chartex" xmlns:cx4="http://schemas.microsoft.com/office/drawing/2016/5/10/chartex" xmlns:cx5="http://schemas.microsoft.com/office/drawing/2016/5/11/chartex" xmlns:cx6="http://schemas.microsoft.com/office/drawing/2016/5/12/chartex" xmlns:cx7="http://schemas.microsoft.com/office/drawing/2016/5/13/chartex" xmlns:cx8="http://schemas.microsoft.com/office/drawing/2016/5/14/chartex" xmlns:mc="http://schemas.openxmlformats.org/markup-compatibility/2006" xmlns:aink="http://schemas.microsoft.com/office/drawing/2016/ink" xmlns:am3d="http://schemas.microsoft.com/office/drawing/2017/model3d" xmlns:o="urn:schemas-microsoft-com:office:office" xmlns:oel="http://schemas.microsoft.com/office/2019/extlst" xmlns:r="http://schemas.openxmlformats.org/officeDocument/2006/relationships" xmlns:m="http://schemas.openxmlformats.org/officeDocument/2006/math" xmlns:v="urn:schemas-microsoft-com:vml" xmlns:wp14="http://schemas.microsoft.com/office/word/2010/wordprocessingDrawing" xmlns:wp="http://schemas.openxmlformats.org/drawingml/2006/wordprocessingDrawing" xmlns:w10="urn:schemas-microsoft-com:office:word" xmlns:w="http://schemas.openxmlformats.org/wordprocessingml/2006/main" xmlns:w14="http://schemas.microsoft.com/office/word/2010/wordml" xmlns:w15="http://schemas.microsoft.com/office/word/2012/wordml" xmlns:w16cex="http://schemas.microsoft.com/office/word/2018/wordml/cex" xmlns:w16cid="http://schemas.microsoft.com/office/word/2016/wordml/cid" xmlns:w16="http://schemas.microsoft.com/office/word/2018/wordml" xmlns:w16du="http://schemas.microsoft.com/office/word/2023/wordml/word16du" xmlns:w16sdtdh="http://schemas.microsoft.com/office/word/2020/wordml/sdtdatahash" xmlns:w16sdtfl="http://schemas.microsoft.com/office/word/2024/wordml/sdtformatlock" xmlns:w16se="http://schemas.microsoft.com/office/word/2015/wordml/symex" xmlns:wpg="http://schemas.microsoft.com/office/word/2010/wordprocessingGroup" xmlns:wpi="http://schemas.microsoft.com/office/word/2010/wordprocessingInk" xmlns:wne="http://schemas.microsoft.com/office/word/2006/wordml" xmlns:wps="http://schemas.microsoft.com/office/word/2010/wordprocessingShape" mc:Ignorable="w14 w15 w16se w16cid w16 w16cex w16sdtdh w16sdtfl w16du wp14">
+<w:footnotes xmlns:wpc="http://schemas.microsoft.com/office/word/2010/wordprocessingCanvas" xmlns:cx="http://schemas.microsoft.com/office/drawing/2014/chartex" xmlns:cx1="http://schemas.microsoft.com/office/drawing/2015/9/8/chartex" xmlns:cx2="http://schemas.microsoft.com/office/drawing/2015/10/21/chartex" xmlns:cx3="http://schemas.microsoft.com/office/drawing/2016/5/9/chartex" xmlns:cx4="http://schemas.microsoft.com/office/drawing/2016/5/10/chartex" xmlns:cx5="http://schemas.microsoft.com/office/drawing/2016/5/11/chartex" xmlns:cx6="http://schemas.microsoft.com/office/drawing/2016/5/12/chartex" xmlns:cx7="http://schemas.microsoft.com/office/drawing/2016/5/13/chartex" xmlns:cx8="http://schemas.microsoft.com/office/drawing/2016/5/14/chartex" xmlns:mc="http://schemas.openxmlformats.org/markup-compatibility/2006" xmlns:m="http://schemas.openxmlformats.org/officeDocument/2006/math" xmlns:aink="http://schemas.microsoft.com/office/drawing/2016/ink" xmlns:am3d="http://schemas.microsoft.com/office/drawing/2017/model3d" xmlns:oel="http://schemas.microsoft.com/office/2019/extlst" xmlns:r="http://schemas.openxmlformats.org/officeDocument/2006/relationships" xmlns:wp14="http://schemas.microsoft.com/office/word/2010/wordprocessingDrawing" xmlns:wp="http://schemas.openxmlformats.org/drawingml/2006/wordprocessingDrawing" xmlns:wpg="http://schemas.microsoft.com/office/word/2010/wordprocessingGroup" xmlns:wpi="http://schemas.microsoft.com/office/word/2010/wordprocessingInk" xmlns:wps="http://schemas.microsoft.com/office/word/2010/wordprocessingShape" xmlns:o="urn:schemas-microsoft-com:office:office" xmlns:v="urn:schemas-microsoft-com:vml" xmlns:w10="urn:schemas-microsoft-com:office:word" xmlns:w="http://schemas.openxmlformats.org/wordprocessingml/2006/main" xmlns:w14="http://schemas.microsoft.com/office/word/2010/wordml" xmlns:w15="http://schemas.microsoft.com/office/word/2012/wordml" xmlns:w16cei="http://schemas.microsoft.com/office/word/2026/wordml/cei" xmlns:w16cex="http://schemas.microsoft.com/office/word/2018/wordml/cex" xmlns:w16cid="http://schemas.microsoft.com/office/word/2016/wordml/cid" xmlns:w16="http://schemas.microsoft.com/office/word/2018/wordml" xmlns:w16sdtdh="http://schemas.microsoft.com/office/word/2020/wordml/sdtdatahash" xmlns:w16sdtfl="http://schemas.microsoft.com/office/word/2024/wordml/sdtformatlock" xmlns:w16se="http://schemas.microsoft.com/office/word/2015/wordml/symex" xmlns:w16du="http://schemas.microsoft.com/office/word/2023/wordml/word16du" xmlns:wne="http://schemas.microsoft.com/office/word/2006/wordml" mc:Ignorable="w14 w15 w16se w16cid w16 w16cex w16sdtdh w16sdtfl w16du wp14">
   <w:footnote w:type="separator" w:id="-1">
     <w:p>
       <w:pPr>
@@ -14775,7 +18097,7 @@
 </file>
 
 <file path=word/header1.xml><?xml version="1.0" encoding="utf-8"?>
-<w:hdr xmlns:wpc="http://schemas.microsoft.com/office/word/2010/wordprocessingCanvas" xmlns:cx="http://schemas.microsoft.com/office/drawing/2014/chartex" xmlns:cx1="http://schemas.microsoft.com/office/drawing/2015/9/8/chartex" xmlns:cx2="http://schemas.microsoft.com/office/drawing/2015/10/21/chartex" xmlns:cx3="http://schemas.microsoft.com/office/drawing/2016/5/9/chartex" xmlns:cx4="http://schemas.microsoft.com/office/drawing/2016/5/10/chartex" xmlns:cx5="http://schemas.microsoft.com/office/drawing/2016/5/11/chartex" xmlns:cx6="http://schemas.microsoft.com/office/drawing/2016/5/12/chartex" xmlns:cx7="http://schemas.microsoft.com/office/drawing/2016/5/13/chartex" xmlns:cx8="http://schemas.microsoft.com/office/drawing/2016/5/14/chartex" xmlns:mc="http://schemas.openxmlformats.org/markup-compatibility/2006" xmlns:aink="http://schemas.microsoft.com/office/drawing/2016/ink" xmlns:am3d="http://schemas.microsoft.com/office/drawing/2017/model3d" xmlns:o="urn:schemas-microsoft-com:office:office" xmlns:oel="http://schemas.microsoft.com/office/2019/extlst" xmlns:r="http://schemas.openxmlformats.org/officeDocument/2006/relationships" xmlns:m="http://schemas.openxmlformats.org/officeDocument/2006/math" xmlns:v="urn:schemas-microsoft-com:vml" xmlns:wp14="http://schemas.microsoft.com/office/word/2010/wordprocessingDrawing" xmlns:wp="http://schemas.openxmlformats.org/drawingml/2006/wordprocessingDrawing" xmlns:w10="urn:schemas-microsoft-com:office:word" xmlns:w="http://schemas.openxmlformats.org/wordprocessingml/2006/main" xmlns:w14="http://schemas.microsoft.com/office/word/2010/wordml" xmlns:w15="http://schemas.microsoft.com/office/word/2012/wordml" xmlns:w16cex="http://schemas.microsoft.com/office/word/2018/wordml/cex" xmlns:w16cid="http://schemas.microsoft.com/office/word/2016/wordml/cid" xmlns:w16="http://schemas.microsoft.com/office/word/2018/wordml" xmlns:w16du="http://schemas.microsoft.com/office/word/2023/wordml/word16du" xmlns:w16sdtdh="http://schemas.microsoft.com/office/word/2020/wordml/sdtdatahash" xmlns:w16sdtfl="http://schemas.microsoft.com/office/word/2024/wordml/sdtformatlock" xmlns:w16se="http://schemas.microsoft.com/office/word/2015/wordml/symex" xmlns:wpg="http://schemas.microsoft.com/office/word/2010/wordprocessingGroup" xmlns:wpi="http://schemas.microsoft.com/office/word/2010/wordprocessingInk" xmlns:wne="http://schemas.microsoft.com/office/word/2006/wordml" xmlns:wps="http://schemas.microsoft.com/office/word/2010/wordprocessingShape" mc:Ignorable="w14 w15 w16se w16cid w16 w16cex w16sdtdh w16sdtfl w16du wp14">
+<w:hdr xmlns:wpc="http://schemas.microsoft.com/office/word/2010/wordprocessingCanvas" xmlns:cx="http://schemas.microsoft.com/office/drawing/2014/chartex" xmlns:cx1="http://schemas.microsoft.com/office/drawing/2015/9/8/chartex" xmlns:cx2="http://schemas.microsoft.com/office/drawing/2015/10/21/chartex" xmlns:cx3="http://schemas.microsoft.com/office/drawing/2016/5/9/chartex" xmlns:cx4="http://schemas.microsoft.com/office/drawing/2016/5/10/chartex" xmlns:cx5="http://schemas.microsoft.com/office/drawing/2016/5/11/chartex" xmlns:cx6="http://schemas.microsoft.com/office/drawing/2016/5/12/chartex" xmlns:cx7="http://schemas.microsoft.com/office/drawing/2016/5/13/chartex" xmlns:cx8="http://schemas.microsoft.com/office/drawing/2016/5/14/chartex" xmlns:mc="http://schemas.openxmlformats.org/markup-compatibility/2006" xmlns:m="http://schemas.openxmlformats.org/officeDocument/2006/math" xmlns:aink="http://schemas.microsoft.com/office/drawing/2016/ink" xmlns:am3d="http://schemas.microsoft.com/office/drawing/2017/model3d" xmlns:oel="http://schemas.microsoft.com/office/2019/extlst" xmlns:r="http://schemas.openxmlformats.org/officeDocument/2006/relationships" xmlns:wp14="http://schemas.microsoft.com/office/word/2010/wordprocessingDrawing" xmlns:wp="http://schemas.openxmlformats.org/drawingml/2006/wordprocessingDrawing" xmlns:wpg="http://schemas.microsoft.com/office/word/2010/wordprocessingGroup" xmlns:wpi="http://schemas.microsoft.com/office/word/2010/wordprocessingInk" xmlns:wps="http://schemas.microsoft.com/office/word/2010/wordprocessingShape" xmlns:o="urn:schemas-microsoft-com:office:office" xmlns:v="urn:schemas-microsoft-com:vml" xmlns:w10="urn:schemas-microsoft-com:office:word" xmlns:w="http://schemas.openxmlformats.org/wordprocessingml/2006/main" xmlns:w14="http://schemas.microsoft.com/office/word/2010/wordml" xmlns:w15="http://schemas.microsoft.com/office/word/2012/wordml" xmlns:w16cei="http://schemas.microsoft.com/office/word/2026/wordml/cei" xmlns:w16cex="http://schemas.microsoft.com/office/word/2018/wordml/cex" xmlns:w16cid="http://schemas.microsoft.com/office/word/2016/wordml/cid" xmlns:w16="http://schemas.microsoft.com/office/word/2018/wordml" xmlns:w16sdtdh="http://schemas.microsoft.com/office/word/2020/wordml/sdtdatahash" xmlns:w16sdtfl="http://schemas.microsoft.com/office/word/2024/wordml/sdtformatlock" xmlns:w16se="http://schemas.microsoft.com/office/word/2015/wordml/symex" xmlns:w16du="http://schemas.microsoft.com/office/word/2023/wordml/word16du" xmlns:wne="http://schemas.microsoft.com/office/word/2006/wordml" mc:Ignorable="w14 w15 w16se w16cid w16 w16cex w16sdtdh w16sdtfl w16du wp14">
   <w:sdt>
     <w:sdtPr>
       <w:rPr>
@@ -14840,7 +18162,7 @@
 </file>
 
 <file path=word/header2.xml><?xml version="1.0" encoding="utf-8"?>
-<w:hdr xmlns:wpc="http://schemas.microsoft.com/office/word/2010/wordprocessingCanvas" xmlns:cx="http://schemas.microsoft.com/office/drawing/2014/chartex" xmlns:cx1="http://schemas.microsoft.com/office/drawing/2015/9/8/chartex" xmlns:cx2="http://schemas.microsoft.com/office/drawing/2015/10/21/chartex" xmlns:cx3="http://schemas.microsoft.com/office/drawing/2016/5/9/chartex" xmlns:cx4="http://schemas.microsoft.com/office/drawing/2016/5/10/chartex" xmlns:cx5="http://schemas.microsoft.com/office/drawing/2016/5/11/chartex" xmlns:cx6="http://schemas.microsoft.com/office/drawing/2016/5/12/chartex" xmlns:cx7="http://schemas.microsoft.com/office/drawing/2016/5/13/chartex" xmlns:cx8="http://schemas.microsoft.com/office/drawing/2016/5/14/chartex" xmlns:mc="http://schemas.openxmlformats.org/markup-compatibility/2006" xmlns:aink="http://schemas.microsoft.com/office/drawing/2016/ink" xmlns:am3d="http://schemas.microsoft.com/office/drawing/2017/model3d" xmlns:o="urn:schemas-microsoft-com:office:office" xmlns:oel="http://schemas.microsoft.com/office/2019/extlst" xmlns:r="http://schemas.openxmlformats.org/officeDocument/2006/relationships" xmlns:m="http://schemas.openxmlformats.org/officeDocument/2006/math" xmlns:v="urn:schemas-microsoft-com:vml" xmlns:wp14="http://schemas.microsoft.com/office/word/2010/wordprocessingDrawing" xmlns:wp="http://schemas.openxmlformats.org/drawingml/2006/wordprocessingDrawing" xmlns:w10="urn:schemas-microsoft-com:office:word" xmlns:w="http://schemas.openxmlformats.org/wordprocessingml/2006/main" xmlns:w14="http://schemas.microsoft.com/office/word/2010/wordml" xmlns:w15="http://schemas.microsoft.com/office/word/2012/wordml" xmlns:w16cex="http://schemas.microsoft.com/office/word/2018/wordml/cex" xmlns:w16cid="http://schemas.microsoft.com/office/word/2016/wordml/cid" xmlns:w16="http://schemas.microsoft.com/office/word/2018/wordml" xmlns:w16du="http://schemas.microsoft.com/office/word/2023/wordml/word16du" xmlns:w16sdtdh="http://schemas.microsoft.com/office/word/2020/wordml/sdtdatahash" xmlns:w16sdtfl="http://schemas.microsoft.com/office/word/2024/wordml/sdtformatlock" xmlns:w16se="http://schemas.microsoft.com/office/word/2015/wordml/symex" xmlns:wpg="http://schemas.microsoft.com/office/word/2010/wordprocessingGroup" xmlns:wpi="http://schemas.microsoft.com/office/word/2010/wordprocessingInk" xmlns:wne="http://schemas.microsoft.com/office/word/2006/wordml" xmlns:wps="http://schemas.microsoft.com/office/word/2010/wordprocessingShape" mc:Ignorable="w14 w15 w16se w16cid w16 w16cex w16sdtdh w16sdtfl w16du wp14">
+<w:hdr xmlns:wpc="http://schemas.microsoft.com/office/word/2010/wordprocessingCanvas" xmlns:cx="http://schemas.microsoft.com/office/drawing/2014/chartex" xmlns:cx1="http://schemas.microsoft.com/office/drawing/2015/9/8/chartex" xmlns:cx2="http://schemas.microsoft.com/office/drawing/2015/10/21/chartex" xmlns:cx3="http://schemas.microsoft.com/office/drawing/2016/5/9/chartex" xmlns:cx4="http://schemas.microsoft.com/office/drawing/2016/5/10/chartex" xmlns:cx5="http://schemas.microsoft.com/office/drawing/2016/5/11/chartex" xmlns:cx6="http://schemas.microsoft.com/office/drawing/2016/5/12/chartex" xmlns:cx7="http://schemas.microsoft.com/office/drawing/2016/5/13/chartex" xmlns:cx8="http://schemas.microsoft.com/office/drawing/2016/5/14/chartex" xmlns:mc="http://schemas.openxmlformats.org/markup-compatibility/2006" xmlns:m="http://schemas.openxmlformats.org/officeDocument/2006/math" xmlns:aink="http://schemas.microsoft.com/office/drawing/2016/ink" xmlns:am3d="http://schemas.microsoft.com/office/drawing/2017/model3d" xmlns:oel="http://schemas.microsoft.com/office/2019/extlst" xmlns:r="http://schemas.openxmlformats.org/officeDocument/2006/relationships" xmlns:wp14="http://schemas.microsoft.com/office/word/2010/wordprocessingDrawing" xmlns:wp="http://schemas.openxmlformats.org/drawingml/2006/wordprocessingDrawing" xmlns:wpg="http://schemas.microsoft.com/office/word/2010/wordprocessingGroup" xmlns:wpi="http://schemas.microsoft.com/office/word/2010/wordprocessingInk" xmlns:wps="http://schemas.microsoft.com/office/word/2010/wordprocessingShape" xmlns:o="urn:schemas-microsoft-com:office:office" xmlns:v="urn:schemas-microsoft-com:vml" xmlns:w10="urn:schemas-microsoft-com:office:word" xmlns:w="http://schemas.openxmlformats.org/wordprocessingml/2006/main" xmlns:w14="http://schemas.microsoft.com/office/word/2010/wordml" xmlns:w15="http://schemas.microsoft.com/office/word/2012/wordml" xmlns:w16cei="http://schemas.microsoft.com/office/word/2026/wordml/cei" xmlns:w16cex="http://schemas.microsoft.com/office/word/2018/wordml/cex" xmlns:w16cid="http://schemas.microsoft.com/office/word/2016/wordml/cid" xmlns:w16="http://schemas.microsoft.com/office/word/2018/wordml" xmlns:w16sdtdh="http://schemas.microsoft.com/office/word/2020/wordml/sdtdatahash" xmlns:w16sdtfl="http://schemas.microsoft.com/office/word/2024/wordml/sdtformatlock" xmlns:w16se="http://schemas.microsoft.com/office/word/2015/wordml/symex" xmlns:w16du="http://schemas.microsoft.com/office/word/2023/wordml/word16du" xmlns:wne="http://schemas.microsoft.com/office/word/2006/wordml" mc:Ignorable="w14 w15 w16se w16cid w16 w16cex w16sdtdh w16sdtfl w16du wp14">
   <w:sdt>
     <w:sdtPr>
       <w:rPr>
@@ -14908,7 +18230,7 @@
 </file>
 
 <file path=word/header3.xml><?xml version="1.0" encoding="utf-8"?>
-<w:hdr xmlns:wpc="http://schemas.microsoft.com/office/word/2010/wordprocessingCanvas" xmlns:cx="http://schemas.microsoft.com/office/drawing/2014/chartex" xmlns:cx1="http://schemas.microsoft.com/office/drawing/2015/9/8/chartex" xmlns:cx2="http://schemas.microsoft.com/office/drawing/2015/10/21/chartex" xmlns:cx3="http://schemas.microsoft.com/office/drawing/2016/5/9/chartex" xmlns:cx4="http://schemas.microsoft.com/office/drawing/2016/5/10/chartex" xmlns:cx5="http://schemas.microsoft.com/office/drawing/2016/5/11/chartex" xmlns:cx6="http://schemas.microsoft.com/office/drawing/2016/5/12/chartex" xmlns:cx7="http://schemas.microsoft.com/office/drawing/2016/5/13/chartex" xmlns:cx8="http://schemas.microsoft.com/office/drawing/2016/5/14/chartex" xmlns:mc="http://schemas.openxmlformats.org/markup-compatibility/2006" xmlns:aink="http://schemas.microsoft.com/office/drawing/2016/ink" xmlns:am3d="http://schemas.microsoft.com/office/drawing/2017/model3d" xmlns:o="urn:schemas-microsoft-com:office:office" xmlns:oel="http://schemas.microsoft.com/office/2019/extlst" xmlns:r="http://schemas.openxmlformats.org/officeDocument/2006/relationships" xmlns:m="http://schemas.openxmlformats.org/officeDocument/2006/math" xmlns:v="urn:schemas-microsoft-com:vml" xmlns:wp14="http://schemas.microsoft.com/office/word/2010/wordprocessingDrawing" xmlns:wp="http://schemas.openxmlformats.org/drawingml/2006/wordprocessingDrawing" xmlns:w10="urn:schemas-microsoft-com:office:word" xmlns:w="http://schemas.openxmlformats.org/wordprocessingml/2006/main" xmlns:w14="http://schemas.microsoft.com/office/word/2010/wordml" xmlns:w15="http://schemas.microsoft.com/office/word/2012/wordml" xmlns:w16cex="http://schemas.microsoft.com/office/word/2018/wordml/cex" xmlns:w16cid="http://schemas.microsoft.com/office/word/2016/wordml/cid" xmlns:w16="http://schemas.microsoft.com/office/word/2018/wordml" xmlns:w16du="http://schemas.microsoft.com/office/word/2023/wordml/word16du" xmlns:w16sdtdh="http://schemas.microsoft.com/office/word/2020/wordml/sdtdatahash" xmlns:w16sdtfl="http://schemas.microsoft.com/office/word/2024/wordml/sdtformatlock" xmlns:w16se="http://schemas.microsoft.com/office/word/2015/wordml/symex" xmlns:wpg="http://schemas.microsoft.com/office/word/2010/wordprocessingGroup" xmlns:wpi="http://schemas.microsoft.com/office/word/2010/wordprocessingInk" xmlns:wne="http://schemas.microsoft.com/office/word/2006/wordml" xmlns:wps="http://schemas.microsoft.com/office/word/2010/wordprocessingShape" mc:Ignorable="w14 w15 w16se w16cid w16 w16cex w16sdtdh w16sdtfl w16du wp14">
+<w:hdr xmlns:wpc="http://schemas.microsoft.com/office/word/2010/wordprocessingCanvas" xmlns:cx="http://schemas.microsoft.com/office/drawing/2014/chartex" xmlns:cx1="http://schemas.microsoft.com/office/drawing/2015/9/8/chartex" xmlns:cx2="http://schemas.microsoft.com/office/drawing/2015/10/21/chartex" xmlns:cx3="http://schemas.microsoft.com/office/drawing/2016/5/9/chartex" xmlns:cx4="http://schemas.microsoft.com/office/drawing/2016/5/10/chartex" xmlns:cx5="http://schemas.microsoft.com/office/drawing/2016/5/11/chartex" xmlns:cx6="http://schemas.microsoft.com/office/drawing/2016/5/12/chartex" xmlns:cx7="http://schemas.microsoft.com/office/drawing/2016/5/13/chartex" xmlns:cx8="http://schemas.microsoft.com/office/drawing/2016/5/14/chartex" xmlns:mc="http://schemas.openxmlformats.org/markup-compatibility/2006" xmlns:m="http://schemas.openxmlformats.org/officeDocument/2006/math" xmlns:aink="http://schemas.microsoft.com/office/drawing/2016/ink" xmlns:am3d="http://schemas.microsoft.com/office/drawing/2017/model3d" xmlns:oel="http://schemas.microsoft.com/office/2019/extlst" xmlns:r="http://schemas.openxmlformats.org/officeDocument/2006/relationships" xmlns:wp14="http://schemas.microsoft.com/office/word/2010/wordprocessingDrawing" xmlns:wp="http://schemas.openxmlformats.org/drawingml/2006/wordprocessingDrawing" xmlns:wpg="http://schemas.microsoft.com/office/word/2010/wordprocessingGroup" xmlns:wpi="http://schemas.microsoft.com/office/word/2010/wordprocessingInk" xmlns:wps="http://schemas.microsoft.com/office/word/2010/wordprocessingShape" xmlns:o="urn:schemas-microsoft-com:office:office" xmlns:v="urn:schemas-microsoft-com:vml" xmlns:w10="urn:schemas-microsoft-com:office:word" xmlns:w="http://schemas.openxmlformats.org/wordprocessingml/2006/main" xmlns:w14="http://schemas.microsoft.com/office/word/2010/wordml" xmlns:w15="http://schemas.microsoft.com/office/word/2012/wordml" xmlns:w16cei="http://schemas.microsoft.com/office/word/2026/wordml/cei" xmlns:w16cex="http://schemas.microsoft.com/office/word/2018/wordml/cex" xmlns:w16cid="http://schemas.microsoft.com/office/word/2016/wordml/cid" xmlns:w16="http://schemas.microsoft.com/office/word/2018/wordml" xmlns:w16sdtdh="http://schemas.microsoft.com/office/word/2020/wordml/sdtdatahash" xmlns:w16sdtfl="http://schemas.microsoft.com/office/word/2024/wordml/sdtformatlock" xmlns:w16se="http://schemas.microsoft.com/office/word/2015/wordml/symex" xmlns:w16du="http://schemas.microsoft.com/office/word/2023/wordml/word16du" xmlns:wne="http://schemas.microsoft.com/office/word/2006/wordml" mc:Ignorable="w14 w15 w16se w16cid w16 w16cex w16sdtdh w16sdtfl w16du wp14">
   <w:sdt>
     <w:sdtPr>
       <w:rPr>
@@ -14979,7 +18301,7 @@
 </file>
 
 <file path=word/numbering.xml><?xml version="1.0" encoding="utf-8"?>
-<w:numbering xmlns:wpc="http://schemas.microsoft.com/office/word/2010/wordprocessingCanvas" xmlns:cx="http://schemas.microsoft.com/office/drawing/2014/chartex" xmlns:cx1="http://schemas.microsoft.com/office/drawing/2015/9/8/chartex" xmlns:cx2="http://schemas.microsoft.com/office/drawing/2015/10/21/chartex" xmlns:cx3="http://schemas.microsoft.com/office/drawing/2016/5/9/chartex" xmlns:cx4="http://schemas.microsoft.com/office/drawing/2016/5/10/chartex" xmlns:cx5="http://schemas.microsoft.com/office/drawing/2016/5/11/chartex" xmlns:cx6="http://schemas.microsoft.com/office/drawing/2016/5/12/chartex" xmlns:cx7="http://schemas.microsoft.com/office/drawing/2016/5/13/chartex" xmlns:cx8="http://schemas.microsoft.com/office/drawing/2016/5/14/chartex" xmlns:mc="http://schemas.openxmlformats.org/markup-compatibility/2006" xmlns:aink="http://schemas.microsoft.com/office/drawing/2016/ink" xmlns:am3d="http://schemas.microsoft.com/office/drawing/2017/model3d" xmlns:o="urn:schemas-microsoft-com:office:office" xmlns:oel="http://schemas.microsoft.com/office/2019/extlst" xmlns:r="http://schemas.openxmlformats.org/officeDocument/2006/relationships" xmlns:m="http://schemas.openxmlformats.org/officeDocument/2006/math" xmlns:v="urn:schemas-microsoft-com:vml" xmlns:wp14="http://schemas.microsoft.com/office/word/2010/wordprocessingDrawing" xmlns:wp="http://schemas.openxmlformats.org/drawingml/2006/wordprocessingDrawing" xmlns:w10="urn:schemas-microsoft-com:office:word" xmlns:w="http://schemas.openxmlformats.org/wordprocessingml/2006/main" xmlns:w14="http://schemas.microsoft.com/office/word/2010/wordml" xmlns:w15="http://schemas.microsoft.com/office/word/2012/wordml" xmlns:w16cex="http://schemas.microsoft.com/office/word/2018/wordml/cex" xmlns:w16cid="http://schemas.microsoft.com/office/word/2016/wordml/cid" xmlns:w16="http://schemas.microsoft.com/office/word/2018/wordml" xmlns:w16du="http://schemas.microsoft.com/office/word/2023/wordml/word16du" xmlns:w16sdtdh="http://schemas.microsoft.com/office/word/2020/wordml/sdtdatahash" xmlns:w16sdtfl="http://schemas.microsoft.com/office/word/2024/wordml/sdtformatlock" xmlns:w16se="http://schemas.microsoft.com/office/word/2015/wordml/symex" xmlns:wpg="http://schemas.microsoft.com/office/word/2010/wordprocessingGroup" xmlns:wpi="http://schemas.microsoft.com/office/word/2010/wordprocessingInk" xmlns:wne="http://schemas.microsoft.com/office/word/2006/wordml" xmlns:wps="http://schemas.microsoft.com/office/word/2010/wordprocessingShape" mc:Ignorable="w14 w15 w16se w16cid w16 w16cex w16sdtdh w16sdtfl w16du wp14">
+<w:numbering xmlns:wpc="http://schemas.microsoft.com/office/word/2010/wordprocessingCanvas" xmlns:cx="http://schemas.microsoft.com/office/drawing/2014/chartex" xmlns:cx1="http://schemas.microsoft.com/office/drawing/2015/9/8/chartex" xmlns:cx2="http://schemas.microsoft.com/office/drawing/2015/10/21/chartex" xmlns:cx3="http://schemas.microsoft.com/office/drawing/2016/5/9/chartex" xmlns:cx4="http://schemas.microsoft.com/office/drawing/2016/5/10/chartex" xmlns:cx5="http://schemas.microsoft.com/office/drawing/2016/5/11/chartex" xmlns:cx6="http://schemas.microsoft.com/office/drawing/2016/5/12/chartex" xmlns:cx7="http://schemas.microsoft.com/office/drawing/2016/5/13/chartex" xmlns:cx8="http://schemas.microsoft.com/office/drawing/2016/5/14/chartex" xmlns:mc="http://schemas.openxmlformats.org/markup-compatibility/2006" xmlns:m="http://schemas.openxmlformats.org/officeDocument/2006/math" xmlns:aink="http://schemas.microsoft.com/office/drawing/2016/ink" xmlns:am3d="http://schemas.microsoft.com/office/drawing/2017/model3d" xmlns:oel="http://schemas.microsoft.com/office/2019/extlst" xmlns:r="http://schemas.openxmlformats.org/officeDocument/2006/relationships" xmlns:wp14="http://schemas.microsoft.com/office/word/2010/wordprocessingDrawing" xmlns:wp="http://schemas.openxmlformats.org/drawingml/2006/wordprocessingDrawing" xmlns:wpg="http://schemas.microsoft.com/office/word/2010/wordprocessingGroup" xmlns:wpi="http://schemas.microsoft.com/office/word/2010/wordprocessingInk" xmlns:wps="http://schemas.microsoft.com/office/word/2010/wordprocessingShape" xmlns:o="urn:schemas-microsoft-com:office:office" xmlns:v="urn:schemas-microsoft-com:vml" xmlns:w10="urn:schemas-microsoft-com:office:word" xmlns:w="http://schemas.openxmlformats.org/wordprocessingml/2006/main" xmlns:w14="http://schemas.microsoft.com/office/word/2010/wordml" xmlns:w15="http://schemas.microsoft.com/office/word/2012/wordml" xmlns:w16cei="http://schemas.microsoft.com/office/word/2026/wordml/cei" xmlns:w16cex="http://schemas.microsoft.com/office/word/2018/wordml/cex" xmlns:w16cid="http://schemas.microsoft.com/office/word/2016/wordml/cid" xmlns:w16="http://schemas.microsoft.com/office/word/2018/wordml" xmlns:w16sdtdh="http://schemas.microsoft.com/office/word/2020/wordml/sdtdatahash" xmlns:w16sdtfl="http://schemas.microsoft.com/office/word/2024/wordml/sdtformatlock" xmlns:w16se="http://schemas.microsoft.com/office/word/2015/wordml/symex" xmlns:w16du="http://schemas.microsoft.com/office/word/2023/wordml/word16du" xmlns:wne="http://schemas.microsoft.com/office/word/2006/wordml" mc:Ignorable="w14 w15 w16se w16cid w16 w16cex w16sdtdh w16sdtfl w16du wp14">
   <w:abstractNum w:abstractNumId="0" w15:restartNumberingAfterBreak="0">
     <w:nsid w:val="EA454B4C"/>
     <w:multiLevelType w:val="multilevel"/>
@@ -16048,8 +19370,16 @@
 </w:numbering>
 </file>
 
+<file path=word/people.xml><?xml version="1.0" encoding="utf-8"?>
+<w15:people xmlns:wpc="http://schemas.microsoft.com/office/word/2010/wordprocessingCanvas" xmlns:cx="http://schemas.microsoft.com/office/drawing/2014/chartex" xmlns:cx1="http://schemas.microsoft.com/office/drawing/2015/9/8/chartex" xmlns:cx2="http://schemas.microsoft.com/office/drawing/2015/10/21/chartex" xmlns:cx3="http://schemas.microsoft.com/office/drawing/2016/5/9/chartex" xmlns:cx4="http://schemas.microsoft.com/office/drawing/2016/5/10/chartex" xmlns:cx5="http://schemas.microsoft.com/office/drawing/2016/5/11/chartex" xmlns:cx6="http://schemas.microsoft.com/office/drawing/2016/5/12/chartex" xmlns:cx7="http://schemas.microsoft.com/office/drawing/2016/5/13/chartex" xmlns:cx8="http://schemas.microsoft.com/office/drawing/2016/5/14/chartex" xmlns:mc="http://schemas.openxmlformats.org/markup-compatibility/2006" xmlns:m="http://schemas.openxmlformats.org/officeDocument/2006/math" xmlns:aink="http://schemas.microsoft.com/office/drawing/2016/ink" xmlns:am3d="http://schemas.microsoft.com/office/drawing/2017/model3d" xmlns:oel="http://schemas.microsoft.com/office/2019/extlst" xmlns:r="http://schemas.openxmlformats.org/officeDocument/2006/relationships" xmlns:wp14="http://schemas.microsoft.com/office/word/2010/wordprocessingDrawing" xmlns:wp="http://schemas.openxmlformats.org/drawingml/2006/wordprocessingDrawing" xmlns:wpg="http://schemas.microsoft.com/office/word/2010/wordprocessingGroup" xmlns:wpi="http://schemas.microsoft.com/office/word/2010/wordprocessingInk" xmlns:wps="http://schemas.microsoft.com/office/word/2010/wordprocessingShape" xmlns:o="urn:schemas-microsoft-com:office:office" xmlns:v="urn:schemas-microsoft-com:vml" xmlns:w10="urn:schemas-microsoft-com:office:word" xmlns:w="http://schemas.openxmlformats.org/wordprocessingml/2006/main" xmlns:w14="http://schemas.microsoft.com/office/word/2010/wordml" xmlns:w15="http://schemas.microsoft.com/office/word/2012/wordml" xmlns:w16cei="http://schemas.microsoft.com/office/word/2026/wordml/cei" xmlns:w16cex="http://schemas.microsoft.com/office/word/2018/wordml/cex" xmlns:w16cid="http://schemas.microsoft.com/office/word/2016/wordml/cid" xmlns:w16="http://schemas.microsoft.com/office/word/2018/wordml" xmlns:w16sdtdh="http://schemas.microsoft.com/office/word/2020/wordml/sdtdatahash" xmlns:w16sdtfl="http://schemas.microsoft.com/office/word/2024/wordml/sdtformatlock" xmlns:w16se="http://schemas.microsoft.com/office/word/2015/wordml/symex" xmlns:w16du="http://schemas.microsoft.com/office/word/2023/wordml/word16du" xmlns:wne="http://schemas.microsoft.com/office/word/2006/wordml" mc:Ignorable="w14 w15 w16se w16cid w16 w16cex w16sdtdh w16sdtfl w16du wp14">
+  <w15:person w15:author="Coles, Nicholas A.">
+    <w15:presenceInfo w15:providerId="AD" w15:userId="S::ncoles@ufl.edu::61b9afe7-c068-4f05-8312-876ce7563e32"/>
+  </w15:person>
+</w15:people>
+</file>
+
 <file path=word/styles.xml><?xml version="1.0" encoding="utf-8"?>
-<w:styles xmlns:mc="http://schemas.openxmlformats.org/markup-compatibility/2006" xmlns:r="http://schemas.openxmlformats.org/officeDocument/2006/relationships" xmlns:w="http://schemas.openxmlformats.org/wordprocessingml/2006/main" xmlns:w14="http://schemas.microsoft.com/office/word/2010/wordml" xmlns:w15="http://schemas.microsoft.com/office/word/2012/wordml" xmlns:w16cex="http://schemas.microsoft.com/office/word/2018/wordml/cex" xmlns:w16cid="http://schemas.microsoft.com/office/word/2016/wordml/cid" xmlns:w16="http://schemas.microsoft.com/office/word/2018/wordml" xmlns:w16du="http://schemas.microsoft.com/office/word/2023/wordml/word16du" xmlns:w16sdtdh="http://schemas.microsoft.com/office/word/2020/wordml/sdtdatahash" xmlns:w16sdtfl="http://schemas.microsoft.com/office/word/2024/wordml/sdtformatlock" xmlns:w16se="http://schemas.microsoft.com/office/word/2015/wordml/symex" mc:Ignorable="w14 w15 w16se w16cid w16 w16cex w16sdtdh w16sdtfl w16du">
+<w:styles xmlns:mc="http://schemas.openxmlformats.org/markup-compatibility/2006" xmlns:r="http://schemas.openxmlformats.org/officeDocument/2006/relationships" xmlns:w="http://schemas.openxmlformats.org/wordprocessingml/2006/main" xmlns:w14="http://schemas.microsoft.com/office/word/2010/wordml" xmlns:w15="http://schemas.microsoft.com/office/word/2012/wordml" xmlns:w16cex="http://schemas.microsoft.com/office/word/2018/wordml/cex" xmlns:w16cid="http://schemas.microsoft.com/office/word/2016/wordml/cid" xmlns:w16="http://schemas.microsoft.com/office/word/2018/wordml" xmlns:w16sdtdh="http://schemas.microsoft.com/office/word/2020/wordml/sdtdatahash" xmlns:w16sdtfl="http://schemas.microsoft.com/office/word/2024/wordml/sdtformatlock" xmlns:w16se="http://schemas.microsoft.com/office/word/2015/wordml/symex" xmlns:w16du="http://schemas.microsoft.com/office/word/2023/wordml/word16du" mc:Ignorable="w14 w15 w16se w16cid w16 w16cex w16sdtdh w16sdtfl w16du">
   <w:docDefaults>
     <w:rPrDefault>
       <w:rPr>
@@ -17917,6 +21247,10 @@
 </file>
 
 <file path=customXml/item1.xml><?xml version="1.0" encoding="utf-8"?>
+<b:Sources xmlns:b="http://schemas.openxmlformats.org/officeDocument/2006/bibliography" xmlns="http://schemas.openxmlformats.org/officeDocument/2006/bibliography" SelectedStyle="/APASixthEditionOfficeOnline.xsl" StyleName="APA" Version="6"/>
+</file>
+
+<file path=customXml/item2.xml><?xml version="1.0" encoding="utf-8"?>
 <p:properties xmlns:p="http://schemas.microsoft.com/office/2006/metadata/properties" xmlns:xsi="http://www.w3.org/2001/XMLSchema-instance" xmlns:pc="http://schemas.microsoft.com/office/infopath/2007/PartnerControls">
   <documentManagement>
     <lcf76f155ced4ddcb4097134ff3c332f xmlns="7cc633b7-a0d7-44f6-9ebf-b0bcc1d1386b">
@@ -17927,20 +21261,7 @@
 </p:properties>
 </file>
 
-<file path=customXml/item2.xml><?xml version="1.0" encoding="utf-8"?>
-<?mso-contentType ?>
-<FormTemplates xmlns="http://schemas.microsoft.com/sharepoint/v3/contenttype/forms">
-  <Display>DocumentLibraryForm</Display>
-  <Edit>DocumentLibraryForm</Edit>
-  <New>DocumentLibraryForm</New>
-</FormTemplates>
-</file>
-
 <file path=customXml/item3.xml><?xml version="1.0" encoding="utf-8"?>
-<b:Sources xmlns:b="http://schemas.openxmlformats.org/officeDocument/2006/bibliography" xmlns="http://schemas.openxmlformats.org/officeDocument/2006/bibliography" SelectedStyle="/APASixthEditionOfficeOnline.xsl" StyleName="APA" Version="6"/>
-</file>
-
-<file path=customXml/item4.xml><?xml version="1.0" encoding="utf-8"?>
 <ct:contentTypeSchema xmlns:ct="http://schemas.microsoft.com/office/2006/metadata/contentType" xmlns:ma="http://schemas.microsoft.com/office/2006/metadata/properties/metaAttributes" ct:_="" ma:_="" ma:contentTypeName="Document" ma:contentTypeID="0x0101002E9A67939B0F2B4787EAA086EFF368F8" ma:contentTypeVersion="13" ma:contentTypeDescription="Create a new document." ma:contentTypeScope="" ma:versionID="1e2d45d699f3c022c24befe3d63436e0">
   <xsd:schema xmlns:xsd="http://www.w3.org/2001/XMLSchema" xmlns:xs="http://www.w3.org/2001/XMLSchema" xmlns:p="http://schemas.microsoft.com/office/2006/metadata/properties" xmlns:ns2="7cc633b7-a0d7-44f6-9ebf-b0bcc1d1386b" xmlns:ns3="f1ebdc78-f2a0-4ed8-b1e0-396e97b61f03" targetNamespace="http://schemas.microsoft.com/office/2006/metadata/properties" ma:root="true" ma:fieldsID="6f1289b2472db1d26797b17df202279f" ns2:_="" ns3:_="">
     <xsd:import namespace="7cc633b7-a0d7-44f6-9ebf-b0bcc1d1386b"/>
@@ -18147,7 +21468,24 @@
 </ct:contentTypeSchema>
 </file>
 
+<file path=customXml/item4.xml><?xml version="1.0" encoding="utf-8"?>
+<?mso-contentType ?>
+<FormTemplates xmlns="http://schemas.microsoft.com/sharepoint/v3/contenttype/forms">
+  <Display>DocumentLibraryForm</Display>
+  <Edit>DocumentLibraryForm</Edit>
+  <New>DocumentLibraryForm</New>
+</FormTemplates>
+</file>
+
 <file path=customXml/itemProps1.xml><?xml version="1.0" encoding="utf-8"?>
+<ds:datastoreItem xmlns:ds="http://schemas.openxmlformats.org/officeDocument/2006/customXml" ds:itemID="{19F2856D-ADF1-EB4E-9755-DA74E0B24BA9}">
+  <ds:schemaRefs>
+    <ds:schemaRef ds:uri="http://schemas.openxmlformats.org/officeDocument/2006/bibliography"/>
+  </ds:schemaRefs>
+</ds:datastoreItem>
+</file>
+
+<file path=customXml/itemProps2.xml><?xml version="1.0" encoding="utf-8"?>
 <ds:datastoreItem xmlns:ds="http://schemas.openxmlformats.org/officeDocument/2006/customXml" ds:itemID="{A8C7605C-3D8A-46A9-8431-EF4D7F9C1B1F}">
   <ds:schemaRefs>
     <ds:schemaRef ds:uri="http://schemas.microsoft.com/office/2006/metadata/properties"/>
@@ -18158,23 +21496,7 @@
 </ds:datastoreItem>
 </file>
 
-<file path=customXml/itemProps2.xml><?xml version="1.0" encoding="utf-8"?>
-<ds:datastoreItem xmlns:ds="http://schemas.openxmlformats.org/officeDocument/2006/customXml" ds:itemID="{703402E2-36B3-4ABC-9C86-05E5908464F1}">
-  <ds:schemaRefs>
-    <ds:schemaRef ds:uri="http://schemas.microsoft.com/sharepoint/v3/contenttype/forms"/>
-  </ds:schemaRefs>
-</ds:datastoreItem>
-</file>
-
 <file path=customXml/itemProps3.xml><?xml version="1.0" encoding="utf-8"?>
-<ds:datastoreItem xmlns:ds="http://schemas.openxmlformats.org/officeDocument/2006/customXml" ds:itemID="{19F2856D-ADF1-EB4E-9755-DA74E0B24BA9}">
-  <ds:schemaRefs>
-    <ds:schemaRef ds:uri="http://schemas.openxmlformats.org/officeDocument/2006/bibliography"/>
-  </ds:schemaRefs>
-</ds:datastoreItem>
-</file>
-
-<file path=customXml/itemProps4.xml><?xml version="1.0" encoding="utf-8"?>
 <ds:datastoreItem xmlns:ds="http://schemas.openxmlformats.org/officeDocument/2006/customXml" ds:itemID="{D1FC85A0-0764-4F74-84C5-E4214834FDE7}">
   <ds:schemaRefs>
     <ds:schemaRef ds:uri="http://schemas.microsoft.com/office/2006/metadata/contentType"/>
@@ -18191,4 +21513,12 @@
     <ds:schemaRef ds:uri="http://schemas.microsoft.com/internal/obd"/>
   </ds:schemaRefs>
 </ds:datastoreItem>
+</file>
+
+<file path=customXml/itemProps4.xml><?xml version="1.0" encoding="utf-8"?>
+<ds:datastoreItem xmlns:ds="http://schemas.openxmlformats.org/officeDocument/2006/customXml" ds:itemID="{703402E2-36B3-4ABC-9C86-05E5908464F1}">
+  <ds:schemaRefs>
+    <ds:schemaRef ds:uri="http://schemas.microsoft.com/sharepoint/v3/contenttype/forms"/>
+  </ds:schemaRefs>
+</ds:datastoreItem>
 </file>
</xml_diff>

<commit_message>
Updated limitations and conclusion sectoin
</commit_message>
<xml_diff>
--- a/writing/submissions/JESP/R2/smile_R2_writing_full.docx
+++ b/writing/submissions/JESP/R2/smile_R2_writing_full.docx
@@ -2473,13 +2473,7 @@
           <w:rPr>
             <w:rFonts w:cs="Times New Roman"/>
           </w:rPr>
-          <w:t>was</w:t>
-        </w:r>
-        <w:r>
-          <w:rPr>
-            <w:rFonts w:cs="Times New Roman"/>
-          </w:rPr>
-          <w:t xml:space="preserve"> </w:t>
+          <w:t xml:space="preserve">was </w:t>
         </w:r>
       </w:ins>
       <w:r>
@@ -13565,43 +13559,7 @@
           <w:rPr>
             <w:rFonts w:cs="Times New Roman"/>
           </w:rPr>
-          <w:t xml:space="preserve">X% White, </w:t>
-        </w:r>
-        <w:r>
-          <w:rPr>
-            <w:rFonts w:cs="Times New Roman"/>
-          </w:rPr>
-          <w:t>X%</w:t>
-        </w:r>
-        <w:r>
-          <w:rPr>
-            <w:rFonts w:cs="Times New Roman"/>
-          </w:rPr>
-          <w:t xml:space="preserve"> Black, </w:t>
-        </w:r>
-        <w:r>
-          <w:rPr>
-            <w:rFonts w:cs="Times New Roman"/>
-          </w:rPr>
-          <w:t>X%</w:t>
-        </w:r>
-        <w:r>
-          <w:rPr>
-            <w:rFonts w:cs="Times New Roman"/>
-          </w:rPr>
-          <w:t xml:space="preserve"> Mixed, </w:t>
-        </w:r>
-        <w:r>
-          <w:rPr>
-            <w:rFonts w:cs="Times New Roman"/>
-          </w:rPr>
-          <w:t>X%</w:t>
-        </w:r>
-        <w:r>
-          <w:rPr>
-            <w:rFonts w:cs="Times New Roman"/>
-          </w:rPr>
-          <w:t xml:space="preserve"> Asian, </w:t>
+          <w:t xml:space="preserve">X% White, X% Black, X% Mixed, X% Asian, </w:t>
         </w:r>
       </w:ins>
       <w:ins w:id="346" w:author="Coles, Nicholas A." w:date="2026-08-15T20:14:00Z" w16du:dateUtc="2026-08-16T00:14:00Z">
@@ -13609,13 +13567,7 @@
           <w:rPr>
             <w:rFonts w:cs="Times New Roman"/>
           </w:rPr>
-          <w:t>X%</w:t>
-        </w:r>
-        <w:r>
-          <w:rPr>
-            <w:rFonts w:cs="Times New Roman"/>
-          </w:rPr>
-          <w:t xml:space="preserve"> Other</w:t>
+          <w:t>X% Other</w:t>
         </w:r>
       </w:ins>
       <w:ins w:id="347" w:author="Coles, Nicholas A." w:date="2026-08-05T16:45:00Z" w16du:dateUtc="2026-08-05T20:45:00Z">
@@ -13655,13 +13607,7 @@
           <w:rPr>
             <w:rFonts w:cs="Times New Roman"/>
           </w:rPr>
-          <w:t xml:space="preserve">more happiness when asked to pose smiles </w:t>
-        </w:r>
-        <w:r>
-          <w:rPr>
-            <w:rFonts w:cs="Times New Roman"/>
-          </w:rPr>
-          <w:t>(</w:t>
+          <w:t>more happiness when asked to pose smiles (</w:t>
         </w:r>
         <w:r>
           <w:rPr>
@@ -13695,13 +13641,7 @@
           <w:rPr>
             <w:rFonts w:cs="Times New Roman"/>
           </w:rPr>
-          <w:t xml:space="preserve">) </w:t>
-        </w:r>
-        <w:r>
-          <w:rPr>
-            <w:rFonts w:cs="Times New Roman"/>
-          </w:rPr>
-          <w:t xml:space="preserve">vs. express themselves naturally </w:t>
+          <w:t xml:space="preserve">) vs. express themselves naturally </w:t>
         </w:r>
       </w:ins>
       <w:ins w:id="352" w:author="Coles, Nicholas A." w:date="2026-08-14T10:20:00Z" w16du:dateUtc="2026-08-14T14:20:00Z">
@@ -16091,6 +16031,7 @@
           </w:rPr>
           <w:t xml:space="preserve"> (</w:t>
         </w:r>
+        <w:proofErr w:type="gramStart"/>
         <w:r>
           <w:rPr>
             <w:rFonts w:cs="Times New Roman"/>
@@ -16105,7 +16046,14 @@
           <w:rPr>
             <w:rFonts w:cs="Times New Roman"/>
           </w:rPr>
-          <w:t>()</w:t>
+          <w:t>(</w:t>
+        </w:r>
+        <w:proofErr w:type="gramEnd"/>
+        <w:r>
+          <w:rPr>
+            <w:rFonts w:cs="Times New Roman"/>
+          </w:rPr>
+          <w:t>)</w:t>
         </w:r>
       </w:ins>
       <w:ins w:id="569" w:author="Coles, Nicholas A." w:date="2026-08-14T10:37:00Z" w16du:dateUtc="2026-08-14T14:37:00Z">
@@ -16206,23 +16154,47 @@
           </w:pPr>
         </w:pPrChange>
       </w:pPr>
-      <w:ins w:id="578" w:author="Coles, Nicholas A." w:date="2026-08-14T11:30:00Z" w16du:dateUtc="2026-08-14T15:30:00Z">
-        <w:r>
-          <w:rPr>
-            <w:rFonts w:cs="Times New Roman"/>
-          </w:rPr>
-          <w:t>For decades, researchers and lay people</w:t>
-        </w:r>
-      </w:ins>
-      <w:ins w:id="579" w:author="Coles, Nicholas A." w:date="2026-08-14T11:31:00Z" w16du:dateUtc="2026-08-14T15:31:00Z">
-        <w:r>
-          <w:rPr>
-            <w:rFonts w:cs="Times New Roman"/>
-          </w:rPr>
-          <w:t xml:space="preserve"> alike have debated whether posing smiles makes people feel happy or miserable. The emotion embodiment literature</w:t>
-        </w:r>
-      </w:ins>
-      <w:ins w:id="580" w:author="Coles, Nicholas A." w:date="2026-08-14T11:32:00Z" w16du:dateUtc="2026-08-14T15:32:00Z">
+      <w:ins w:id="578" w:author="Coles, Nicholas A." w:date="2026-08-17T03:07:00Z" w16du:dateUtc="2026-08-17T07:07:00Z">
+        <w:r>
+          <w:rPr>
+            <w:rFonts w:cs="Times New Roman"/>
+          </w:rPr>
+          <w:t>R</w:t>
+        </w:r>
+      </w:ins>
+      <w:ins w:id="579" w:author="Coles, Nicholas A." w:date="2026-08-14T11:30:00Z" w16du:dateUtc="2026-08-14T15:30:00Z">
+        <w:r>
+          <w:rPr>
+            <w:rFonts w:cs="Times New Roman"/>
+          </w:rPr>
+          <w:t>esearchers and lay people</w:t>
+        </w:r>
+      </w:ins>
+      <w:ins w:id="580" w:author="Coles, Nicholas A." w:date="2026-08-14T11:31:00Z" w16du:dateUtc="2026-08-14T15:31:00Z">
+        <w:r>
+          <w:rPr>
+            <w:rFonts w:cs="Times New Roman"/>
+          </w:rPr>
+          <w:t xml:space="preserve"> alike have </w:t>
+        </w:r>
+      </w:ins>
+      <w:ins w:id="581" w:author="Coles, Nicholas A." w:date="2026-08-17T03:07:00Z" w16du:dateUtc="2026-08-17T07:07:00Z">
+        <w:r>
+          <w:rPr>
+            <w:rFonts w:cs="Times New Roman"/>
+          </w:rPr>
+          <w:t xml:space="preserve">long </w:t>
+        </w:r>
+      </w:ins>
+      <w:ins w:id="582" w:author="Coles, Nicholas A." w:date="2026-08-14T11:31:00Z" w16du:dateUtc="2026-08-14T15:31:00Z">
+        <w:r>
+          <w:rPr>
+            <w:rFonts w:cs="Times New Roman"/>
+          </w:rPr>
+          <w:t>debated whether posing smiles makes people feel happy or miserable. The emotion embodiment literature</w:t>
+        </w:r>
+      </w:ins>
+      <w:ins w:id="583" w:author="Coles, Nicholas A." w:date="2026-08-14T11:32:00Z" w16du:dateUtc="2026-08-14T15:32:00Z">
         <w:r>
           <w:rPr>
             <w:rFonts w:cs="Times New Roman"/>
@@ -16236,7 +16208,7 @@
           <w:t>provide</w:t>
         </w:r>
       </w:ins>
-      <w:ins w:id="581" w:author="Coles, Nicholas A." w:date="2026-08-16T02:15:00Z" w16du:dateUtc="2026-08-16T06:15:00Z">
+      <w:ins w:id="584" w:author="Coles, Nicholas A." w:date="2026-08-16T02:15:00Z" w16du:dateUtc="2026-08-16T06:15:00Z">
         <w:r>
           <w:rPr>
             <w:rFonts w:cs="Times New Roman"/>
@@ -16244,7 +16216,7 @@
           <w:t>s</w:t>
         </w:r>
       </w:ins>
-      <w:ins w:id="582" w:author="Coles, Nicholas A." w:date="2026-08-14T11:32:00Z" w16du:dateUtc="2026-08-14T15:32:00Z">
+      <w:ins w:id="585" w:author="Coles, Nicholas A." w:date="2026-08-14T11:32:00Z" w16du:dateUtc="2026-08-14T15:32:00Z">
         <w:r>
           <w:rPr>
             <w:rFonts w:cs="Times New Roman"/>
@@ -16252,7 +16224,7 @@
           <w:t xml:space="preserve"> </w:t>
         </w:r>
       </w:ins>
-      <w:ins w:id="583" w:author="Coles, Nicholas A." w:date="2026-08-14T11:33:00Z" w16du:dateUtc="2026-08-14T15:33:00Z">
+      <w:ins w:id="586" w:author="Coles, Nicholas A." w:date="2026-08-14T11:33:00Z" w16du:dateUtc="2026-08-14T15:33:00Z">
         <w:r>
           <w:rPr>
             <w:rFonts w:cs="Times New Roman"/>
@@ -16260,7 +16232,7 @@
           <w:t xml:space="preserve">a </w:t>
         </w:r>
       </w:ins>
-      <w:ins w:id="584" w:author="Coles, Nicholas A." w:date="2026-08-16T02:15:00Z" w16du:dateUtc="2026-08-16T06:15:00Z">
+      <w:ins w:id="587" w:author="Coles, Nicholas A." w:date="2026-08-16T02:15:00Z" w16du:dateUtc="2026-08-16T06:15:00Z">
         <w:r>
           <w:rPr>
             <w:rFonts w:cs="Times New Roman"/>
@@ -16268,7 +16240,7 @@
           <w:t xml:space="preserve">theoretical justification </w:t>
         </w:r>
       </w:ins>
-      <w:ins w:id="585" w:author="Coles, Nicholas A." w:date="2026-08-14T11:33:00Z" w16du:dateUtc="2026-08-14T15:33:00Z">
+      <w:ins w:id="588" w:author="Coles, Nicholas A." w:date="2026-08-14T11:33:00Z" w16du:dateUtc="2026-08-14T15:33:00Z">
         <w:r>
           <w:rPr>
             <w:rFonts w:cs="Times New Roman"/>
@@ -16276,7 +16248,7 @@
           <w:t xml:space="preserve">for suggesting </w:t>
         </w:r>
       </w:ins>
-      <w:ins w:id="586" w:author="Coles, Nicholas A." w:date="2026-08-14T11:32:00Z" w16du:dateUtc="2026-08-14T15:32:00Z">
+      <w:ins w:id="589" w:author="Coles, Nicholas A." w:date="2026-08-14T11:32:00Z" w16du:dateUtc="2026-08-14T15:32:00Z">
         <w:r>
           <w:rPr>
             <w:rFonts w:cs="Times New Roman"/>
@@ -16284,7 +16256,7 @@
           <w:t xml:space="preserve">that people </w:t>
         </w:r>
       </w:ins>
-      <w:ins w:id="587" w:author="Coles, Nicholas A." w:date="2026-08-16T02:15:00Z" w16du:dateUtc="2026-08-16T06:15:00Z">
+      <w:ins w:id="590" w:author="Coles, Nicholas A." w:date="2026-08-16T02:15:00Z" w16du:dateUtc="2026-08-16T06:15:00Z">
         <w:r>
           <w:rPr>
             <w:rFonts w:cs="Times New Roman"/>
@@ -16292,7 +16264,7 @@
           <w:t xml:space="preserve">would </w:t>
         </w:r>
       </w:ins>
-      <w:ins w:id="588" w:author="Coles, Nicholas A." w:date="2026-08-14T11:32:00Z" w16du:dateUtc="2026-08-14T15:32:00Z">
+      <w:ins w:id="591" w:author="Coles, Nicholas A." w:date="2026-08-14T11:32:00Z" w16du:dateUtc="2026-08-14T15:32:00Z">
         <w:r>
           <w:rPr>
             <w:rFonts w:cs="Times New Roman"/>
@@ -16300,7 +16272,7 @@
           <w:t xml:space="preserve">feel happier if they </w:t>
         </w:r>
       </w:ins>
-      <w:ins w:id="589" w:author="Coles, Nicholas A." w:date="2026-08-16T02:15:00Z" w16du:dateUtc="2026-08-16T06:15:00Z">
+      <w:ins w:id="592" w:author="Coles, Nicholas A." w:date="2026-08-16T02:15:00Z" w16du:dateUtc="2026-08-16T06:15:00Z">
         <w:r>
           <w:rPr>
             <w:rFonts w:cs="Times New Roman"/>
@@ -16308,7 +16280,7 @@
           <w:t xml:space="preserve">would </w:t>
         </w:r>
       </w:ins>
-      <w:ins w:id="590" w:author="Coles, Nicholas A." w:date="2026-08-14T11:32:00Z" w16du:dateUtc="2026-08-14T15:32:00Z">
+      <w:ins w:id="593" w:author="Coles, Nicholas A." w:date="2026-08-14T11:32:00Z" w16du:dateUtc="2026-08-14T15:32:00Z">
         <w:r>
           <w:rPr>
             <w:rFonts w:cs="Times New Roman"/>
@@ -16316,7 +16288,7 @@
           <w:t>“just smile” (Cole, 1954)</w:t>
         </w:r>
       </w:ins>
-      <w:ins w:id="591" w:author="Coles, Nicholas A." w:date="2026-08-14T11:33:00Z" w16du:dateUtc="2026-08-14T15:33:00Z">
+      <w:ins w:id="594" w:author="Coles, Nicholas A." w:date="2026-08-14T11:33:00Z" w16du:dateUtc="2026-08-14T15:33:00Z">
         <w:r>
           <w:rPr>
             <w:rFonts w:cs="Times New Roman"/>
@@ -16324,7 +16296,7 @@
           <w:t xml:space="preserve">. However, the </w:t>
         </w:r>
       </w:ins>
-      <w:ins w:id="592" w:author="Coles, Nicholas A." w:date="2026-08-14T11:32:00Z" w16du:dateUtc="2026-08-14T15:32:00Z">
+      <w:ins w:id="595" w:author="Coles, Nicholas A." w:date="2026-08-14T11:32:00Z" w16du:dateUtc="2026-08-14T15:32:00Z">
         <w:r>
           <w:rPr>
             <w:rFonts w:cs="Times New Roman"/>
@@ -16332,7 +16304,7 @@
           <w:t xml:space="preserve">emotion labor literature provides </w:t>
         </w:r>
       </w:ins>
-      <w:ins w:id="593" w:author="Coles, Nicholas A." w:date="2026-08-16T02:16:00Z" w16du:dateUtc="2026-08-16T06:16:00Z">
+      <w:ins w:id="596" w:author="Coles, Nicholas A." w:date="2026-08-16T02:16:00Z" w16du:dateUtc="2026-08-16T06:16:00Z">
         <w:r>
           <w:rPr>
             <w:rFonts w:cs="Times New Roman"/>
@@ -16340,7 +16312,7 @@
           <w:t xml:space="preserve">justification for </w:t>
         </w:r>
       </w:ins>
-      <w:ins w:id="594" w:author="Coles, Nicholas A." w:date="2026-08-14T11:34:00Z" w16du:dateUtc="2026-08-14T15:34:00Z">
+      <w:ins w:id="597" w:author="Coles, Nicholas A." w:date="2026-08-14T11:34:00Z" w16du:dateUtc="2026-08-14T15:34:00Z">
         <w:r>
           <w:rPr>
             <w:rFonts w:cs="Times New Roman"/>
@@ -16348,7 +16320,7 @@
           <w:t>warning against “pretending to be happy” (Che</w:t>
         </w:r>
       </w:ins>
-      <w:ins w:id="595" w:author="Coles, Nicholas A." w:date="2026-08-15T19:33:00Z" w16du:dateUtc="2026-08-15T23:33:00Z">
+      <w:ins w:id="598" w:author="Coles, Nicholas A." w:date="2026-08-15T19:33:00Z" w16du:dateUtc="2026-08-15T23:33:00Z">
         <w:r>
           <w:rPr>
             <w:rFonts w:cs="Times New Roman"/>
@@ -16356,7 +16328,7 @@
           <w:t>r</w:t>
         </w:r>
       </w:ins>
-      <w:ins w:id="596" w:author="Coles, Nicholas A." w:date="2026-08-14T11:34:00Z" w16du:dateUtc="2026-08-14T15:34:00Z">
+      <w:ins w:id="599" w:author="Coles, Nicholas A." w:date="2026-08-14T11:34:00Z" w16du:dateUtc="2026-08-14T15:34:00Z">
         <w:r>
           <w:rPr>
             <w:rFonts w:cs="Times New Roman"/>
@@ -16364,7 +16336,7 @@
           <w:t>ry, 2014), highlighting decreases in work-related m</w:t>
         </w:r>
       </w:ins>
-      <w:ins w:id="597" w:author="Coles, Nicholas A." w:date="2026-08-14T11:35:00Z" w16du:dateUtc="2026-08-14T15:35:00Z">
+      <w:ins w:id="600" w:author="Coles, Nicholas A." w:date="2026-08-14T11:35:00Z" w16du:dateUtc="2026-08-14T15:35:00Z">
         <w:r>
           <w:rPr>
             <w:rFonts w:cs="Times New Roman"/>
@@ -16372,7 +16344,7 @@
           <w:t>ood, well-being, and burnout</w:t>
         </w:r>
       </w:ins>
-      <w:ins w:id="598" w:author="Coles, Nicholas A." w:date="2026-08-14T11:34:00Z" w16du:dateUtc="2026-08-14T15:34:00Z">
+      <w:ins w:id="601" w:author="Coles, Nicholas A." w:date="2026-08-14T11:34:00Z" w16du:dateUtc="2026-08-14T15:34:00Z">
         <w:r>
           <w:rPr>
             <w:rFonts w:cs="Times New Roman"/>
@@ -16386,11 +16358,11 @@
         <w:spacing w:before="0"/>
         <w:ind w:firstLine="720"/>
         <w:rPr>
-          <w:ins w:id="599" w:author="Coles, Nicholas A." w:date="2026-08-14T11:37:00Z" w16du:dateUtc="2026-08-14T15:37:00Z"/>
+          <w:ins w:id="602" w:author="Coles, Nicholas A." w:date="2026-08-14T11:37:00Z" w16du:dateUtc="2026-08-14T15:37:00Z"/>
           <w:rFonts w:cs="Times New Roman"/>
         </w:rPr>
       </w:pPr>
-      <w:ins w:id="600" w:author="Coles, Nicholas A." w:date="2026-08-14T11:36:00Z" w16du:dateUtc="2026-08-14T15:36:00Z">
+      <w:ins w:id="603" w:author="Coles, Nicholas A." w:date="2026-08-14T11:36:00Z" w16du:dateUtc="2026-08-14T15:36:00Z">
         <w:r>
           <w:rPr>
             <w:rFonts w:cs="Times New Roman"/>
@@ -16398,7 +16370,7 @@
           <w:t xml:space="preserve"> </w:t>
         </w:r>
       </w:ins>
-      <w:ins w:id="601" w:author="Coles, Nicholas A." w:date="2026-08-14T10:00:00Z">
+      <w:ins w:id="604" w:author="Coles, Nicholas A." w:date="2026-08-14T10:00:00Z">
         <w:r>
           <w:rPr>
             <w:rFonts w:cs="Times New Roman"/>
@@ -16406,7 +16378,7 @@
           <w:t>In the present work, we hypothesized that each literature capture</w:t>
         </w:r>
       </w:ins>
-      <w:ins w:id="602" w:author="Coles, Nicholas A." w:date="2026-08-16T20:34:00Z" w16du:dateUtc="2026-08-17T00:34:00Z">
+      <w:ins w:id="605" w:author="Coles, Nicholas A." w:date="2026-08-16T20:34:00Z" w16du:dateUtc="2026-08-17T00:34:00Z">
         <w:r>
           <w:rPr>
             <w:rFonts w:cs="Times New Roman"/>
@@ -16414,7 +16386,7 @@
           <w:t>s</w:t>
         </w:r>
       </w:ins>
-      <w:ins w:id="603" w:author="Coles, Nicholas A." w:date="2026-08-14T10:00:00Z">
+      <w:ins w:id="606" w:author="Coles, Nicholas A." w:date="2026-08-14T10:00:00Z">
         <w:r>
           <w:rPr>
             <w:rFonts w:cs="Times New Roman"/>
@@ -16422,7 +16394,7 @@
           <w:t xml:space="preserve"> incomplete perspective</w:t>
         </w:r>
       </w:ins>
-      <w:ins w:id="604" w:author="Coles, Nicholas A." w:date="2026-08-14T12:00:00Z" w16du:dateUtc="2026-08-14T16:00:00Z">
+      <w:ins w:id="607" w:author="Coles, Nicholas A." w:date="2026-08-14T12:00:00Z" w16du:dateUtc="2026-08-14T16:00:00Z">
         <w:r>
           <w:rPr>
             <w:rFonts w:cs="Times New Roman"/>
@@ -16430,7 +16402,7 @@
           <w:t>s</w:t>
         </w:r>
       </w:ins>
-      <w:ins w:id="605" w:author="Coles, Nicholas A." w:date="2026-08-16T02:16:00Z" w16du:dateUtc="2026-08-16T06:16:00Z">
+      <w:ins w:id="608" w:author="Coles, Nicholas A." w:date="2026-08-16T02:16:00Z" w16du:dateUtc="2026-08-16T06:16:00Z">
         <w:r>
           <w:rPr>
             <w:rFonts w:cs="Times New Roman"/>
@@ -16438,7 +16410,7 @@
           <w:t xml:space="preserve">, </w:t>
         </w:r>
       </w:ins>
-      <w:ins w:id="606" w:author="Coles, Nicholas A." w:date="2026-08-14T10:00:00Z">
+      <w:ins w:id="609" w:author="Coles, Nicholas A." w:date="2026-08-14T10:00:00Z">
         <w:r>
           <w:rPr>
             <w:rFonts w:cs="Times New Roman"/>
@@ -16446,7 +16418,7 @@
           <w:t>proposing three hypotheses for why smiles sometimes increase and other times decrease happiness.</w:t>
         </w:r>
       </w:ins>
-      <w:ins w:id="607" w:author="Coles, Nicholas A." w:date="2026-08-14T11:36:00Z" w16du:dateUtc="2026-08-14T15:36:00Z">
+      <w:ins w:id="610" w:author="Coles, Nicholas A." w:date="2026-08-14T11:36:00Z" w16du:dateUtc="2026-08-14T15:36:00Z">
         <w:r>
           <w:rPr>
             <w:rFonts w:cs="Times New Roman"/>
@@ -16454,7 +16426,7 @@
           <w:t xml:space="preserve"> </w:t>
         </w:r>
       </w:ins>
-      <w:ins w:id="608" w:author="Coles, Nicholas A." w:date="2026-08-14T10:00:00Z">
+      <w:ins w:id="611" w:author="Coles, Nicholas A." w:date="2026-08-14T10:00:00Z">
         <w:r>
           <w:rPr>
             <w:rFonts w:cs="Times New Roman"/>
@@ -16462,7 +16434,7 @@
           <w:t xml:space="preserve">Ultimately, our results did lend support to both theoretical camps — </w:t>
         </w:r>
       </w:ins>
-      <w:ins w:id="609" w:author="Coles, Nicholas A." w:date="2026-08-16T08:18:00Z" w16du:dateUtc="2026-08-16T12:18:00Z">
+      <w:ins w:id="612" w:author="Coles, Nicholas A." w:date="2026-08-16T08:18:00Z" w16du:dateUtc="2026-08-16T12:18:00Z">
         <w:r>
           <w:rPr>
             <w:rFonts w:cs="Times New Roman"/>
@@ -16470,7 +16442,7 @@
           <w:t>but</w:t>
         </w:r>
       </w:ins>
-      <w:ins w:id="610" w:author="Coles, Nicholas A." w:date="2026-08-14T11:37:00Z" w16du:dateUtc="2026-08-14T15:37:00Z">
+      <w:ins w:id="613" w:author="Coles, Nicholas A." w:date="2026-08-14T11:37:00Z" w16du:dateUtc="2026-08-14T15:37:00Z">
         <w:r>
           <w:rPr>
             <w:rFonts w:cs="Times New Roman"/>
@@ -16478,7 +16450,7 @@
           <w:t xml:space="preserve"> </w:t>
         </w:r>
       </w:ins>
-      <w:ins w:id="611" w:author="Coles, Nicholas A." w:date="2026-08-14T10:00:00Z">
+      <w:ins w:id="614" w:author="Coles, Nicholas A." w:date="2026-08-14T10:00:00Z">
         <w:r>
           <w:rPr>
             <w:rFonts w:cs="Times New Roman"/>
@@ -16486,7 +16458,7 @@
           <w:t xml:space="preserve">in a manner that </w:t>
         </w:r>
       </w:ins>
-      <w:ins w:id="612" w:author="Coles, Nicholas A." w:date="2026-08-16T02:17:00Z" w16du:dateUtc="2026-08-16T06:17:00Z">
+      <w:ins w:id="615" w:author="Coles, Nicholas A." w:date="2026-08-16T02:17:00Z" w16du:dateUtc="2026-08-16T06:17:00Z">
         <w:r>
           <w:rPr>
             <w:rFonts w:cs="Times New Roman"/>
@@ -16494,7 +16466,7 @@
           <w:t xml:space="preserve">did not support any one of </w:t>
         </w:r>
       </w:ins>
-      <w:ins w:id="613" w:author="Coles, Nicholas A." w:date="2026-08-14T11:37:00Z" w16du:dateUtc="2026-08-14T15:37:00Z">
+      <w:ins w:id="616" w:author="Coles, Nicholas A." w:date="2026-08-14T11:37:00Z" w16du:dateUtc="2026-08-14T15:37:00Z">
         <w:r>
           <w:rPr>
             <w:rFonts w:cs="Times New Roman"/>
@@ -16502,7 +16474,7 @@
           <w:t xml:space="preserve">our tested </w:t>
         </w:r>
       </w:ins>
-      <w:ins w:id="614" w:author="Coles, Nicholas A." w:date="2026-08-14T10:00:00Z">
+      <w:ins w:id="617" w:author="Coles, Nicholas A." w:date="2026-08-14T10:00:00Z">
         <w:r>
           <w:rPr>
             <w:rFonts w:cs="Times New Roman"/>
@@ -16510,7 +16482,7 @@
           <w:t>hypothes</w:t>
         </w:r>
       </w:ins>
-      <w:ins w:id="615" w:author="Coles, Nicholas A." w:date="2026-08-14T11:37:00Z" w16du:dateUtc="2026-08-14T15:37:00Z">
+      <w:ins w:id="618" w:author="Coles, Nicholas A." w:date="2026-08-14T11:37:00Z" w16du:dateUtc="2026-08-14T15:37:00Z">
         <w:r>
           <w:rPr>
             <w:rFonts w:cs="Times New Roman"/>
@@ -16518,7 +16490,7 @@
           <w:t>es</w:t>
         </w:r>
       </w:ins>
-      <w:ins w:id="616" w:author="Coles, Nicholas A." w:date="2026-08-14T10:00:00Z">
+      <w:ins w:id="619" w:author="Coles, Nicholas A." w:date="2026-08-14T10:00:00Z">
         <w:r>
           <w:rPr>
             <w:rFonts w:cs="Times New Roman"/>
@@ -16532,11 +16504,11 @@
         <w:spacing w:before="0"/>
         <w:ind w:firstLine="720"/>
         <w:rPr>
-          <w:ins w:id="617" w:author="Coles, Nicholas A." w:date="2026-08-14T11:42:00Z" w16du:dateUtc="2026-08-14T15:42:00Z"/>
+          <w:ins w:id="620" w:author="Coles, Nicholas A." w:date="2026-08-14T11:42:00Z" w16du:dateUtc="2026-08-14T15:42:00Z"/>
           <w:rFonts w:cs="Times New Roman"/>
         </w:rPr>
       </w:pPr>
-      <w:ins w:id="618" w:author="Coles, Nicholas A." w:date="2026-08-16T02:17:00Z" w16du:dateUtc="2026-08-16T06:17:00Z">
+      <w:ins w:id="621" w:author="Coles, Nicholas A." w:date="2026-08-16T02:17:00Z" w16du:dateUtc="2026-08-16T06:17:00Z">
         <w:r>
           <w:rPr>
             <w:rFonts w:cs="Times New Roman"/>
@@ -16544,7 +16516,7 @@
           <w:t>Respectively, we tested a</w:t>
         </w:r>
       </w:ins>
-      <w:ins w:id="619" w:author="Coles, Nicholas A." w:date="2026-08-16T02:18:00Z" w16du:dateUtc="2026-08-16T06:18:00Z">
+      <w:ins w:id="622" w:author="Coles, Nicholas A." w:date="2026-08-16T02:18:00Z" w16du:dateUtc="2026-08-16T06:18:00Z">
         <w:r>
           <w:rPr>
             <w:rFonts w:cs="Times New Roman"/>
@@ -16552,7 +16524,7 @@
           <w:t xml:space="preserve">n </w:t>
         </w:r>
       </w:ins>
-      <w:ins w:id="620" w:author="Coles, Nicholas A." w:date="2026-08-14T11:37:00Z" w16du:dateUtc="2026-08-14T15:37:00Z">
+      <w:ins w:id="623" w:author="Coles, Nicholas A." w:date="2026-08-14T11:37:00Z" w16du:dateUtc="2026-08-14T15:37:00Z">
         <w:r>
           <w:rPr>
             <w:rFonts w:cs="Times New Roman"/>
@@ -16560,7 +16532,7 @@
           <w:t>emotion incongruence, repetition, and pu</w:t>
         </w:r>
       </w:ins>
-      <w:ins w:id="621" w:author="Coles, Nicholas A." w:date="2026-08-14T11:38:00Z" w16du:dateUtc="2026-08-14T15:38:00Z">
+      <w:ins w:id="624" w:author="Coles, Nicholas A." w:date="2026-08-14T11:38:00Z" w16du:dateUtc="2026-08-14T15:38:00Z">
         <w:r>
           <w:rPr>
             <w:rFonts w:cs="Times New Roman"/>
@@ -16568,7 +16540,7 @@
           <w:t>nishment hypothes</w:t>
         </w:r>
       </w:ins>
-      <w:ins w:id="622" w:author="Coles, Nicholas A." w:date="2026-08-16T02:18:00Z" w16du:dateUtc="2026-08-16T06:18:00Z">
+      <w:ins w:id="625" w:author="Coles, Nicholas A." w:date="2026-08-16T02:18:00Z" w16du:dateUtc="2026-08-16T06:18:00Z">
         <w:r>
           <w:rPr>
             <w:rFonts w:cs="Times New Roman"/>
@@ -16576,7 +16548,7 @@
           <w:t>i</w:t>
         </w:r>
       </w:ins>
-      <w:ins w:id="623" w:author="Coles, Nicholas A." w:date="2026-08-14T11:38:00Z" w16du:dateUtc="2026-08-14T15:38:00Z">
+      <w:ins w:id="626" w:author="Coles, Nicholas A." w:date="2026-08-14T11:38:00Z" w16du:dateUtc="2026-08-14T15:38:00Z">
         <w:r>
           <w:rPr>
             <w:rFonts w:cs="Times New Roman"/>
@@ -16584,7 +16556,7 @@
           <w:t>s</w:t>
         </w:r>
       </w:ins>
-      <w:ins w:id="624" w:author="Coles, Nicholas A." w:date="2026-08-14T11:39:00Z" w16du:dateUtc="2026-08-14T15:39:00Z">
+      <w:ins w:id="627" w:author="Coles, Nicholas A." w:date="2026-08-14T11:39:00Z" w16du:dateUtc="2026-08-14T15:39:00Z">
         <w:r>
           <w:rPr>
             <w:rFonts w:cs="Times New Roman"/>
@@ -16592,7 +16564,7 @@
           <w:t xml:space="preserve"> </w:t>
         </w:r>
       </w:ins>
-      <w:ins w:id="625" w:author="Coles, Nicholas A." w:date="2026-08-14T11:38:00Z" w16du:dateUtc="2026-08-14T15:38:00Z">
+      <w:ins w:id="628" w:author="Coles, Nicholas A." w:date="2026-08-14T11:38:00Z" w16du:dateUtc="2026-08-14T15:38:00Z">
         <w:r>
           <w:rPr>
             <w:rFonts w:cs="Times New Roman"/>
@@ -16600,7 +16572,7 @@
           <w:t xml:space="preserve">that </w:t>
         </w:r>
       </w:ins>
-      <w:ins w:id="626" w:author="Coles, Nicholas A." w:date="2026-08-16T02:18:00Z" w16du:dateUtc="2026-08-16T06:18:00Z">
+      <w:ins w:id="629" w:author="Coles, Nicholas A." w:date="2026-08-16T02:18:00Z" w16du:dateUtc="2026-08-16T06:18:00Z">
         <w:r>
           <w:rPr>
             <w:rFonts w:cs="Times New Roman"/>
@@ -16608,7 +16580,7 @@
           <w:t xml:space="preserve">predicted </w:t>
         </w:r>
       </w:ins>
-      <w:ins w:id="627" w:author="Coles, Nicholas A." w:date="2026-08-14T11:38:00Z" w16du:dateUtc="2026-08-14T15:38:00Z">
+      <w:ins w:id="630" w:author="Coles, Nicholas A." w:date="2026-08-14T11:38:00Z" w16du:dateUtc="2026-08-14T15:38:00Z">
         <w:r>
           <w:rPr>
             <w:rFonts w:cs="Times New Roman"/>
@@ -16616,7 +16588,7 @@
           <w:t xml:space="preserve">posed smiles would only increase happiness when </w:t>
         </w:r>
       </w:ins>
-      <w:ins w:id="628" w:author="Coles, Nicholas A." w:date="2026-08-14T11:39:00Z" w16du:dateUtc="2026-08-14T15:39:00Z">
+      <w:ins w:id="631" w:author="Coles, Nicholas A." w:date="2026-08-14T11:39:00Z" w16du:dateUtc="2026-08-14T15:39:00Z">
         <w:r>
           <w:rPr>
             <w:rFonts w:cs="Times New Roman"/>
@@ -16624,7 +16596,7 @@
           <w:t xml:space="preserve">completed </w:t>
         </w:r>
       </w:ins>
-      <w:ins w:id="629" w:author="Coles, Nicholas A." w:date="2026-08-14T11:38:00Z" w16du:dateUtc="2026-08-14T15:38:00Z">
+      <w:ins w:id="632" w:author="Coles, Nicholas A." w:date="2026-08-14T11:38:00Z" w16du:dateUtc="2026-08-14T15:38:00Z">
         <w:r>
           <w:rPr>
             <w:rFonts w:cs="Times New Roman"/>
@@ -16632,7 +16604,7 @@
           <w:t>(a) in positive conte</w:t>
         </w:r>
       </w:ins>
-      <w:ins w:id="630" w:author="Coles, Nicholas A." w:date="2026-08-14T11:39:00Z" w16du:dateUtc="2026-08-14T15:39:00Z">
+      <w:ins w:id="633" w:author="Coles, Nicholas A." w:date="2026-08-14T11:39:00Z" w16du:dateUtc="2026-08-14T15:39:00Z">
         <w:r>
           <w:rPr>
             <w:rFonts w:cs="Times New Roman"/>
@@ -16640,7 +16612,7 @@
           <w:t xml:space="preserve">xts, (b) non-repeatedly, </w:t>
         </w:r>
       </w:ins>
-      <w:ins w:id="631" w:author="Coles, Nicholas A." w:date="2026-08-14T11:40:00Z" w16du:dateUtc="2026-08-14T15:40:00Z">
+      <w:ins w:id="634" w:author="Coles, Nicholas A." w:date="2026-08-14T11:40:00Z" w16du:dateUtc="2026-08-14T15:40:00Z">
         <w:r>
           <w:rPr>
             <w:rFonts w:cs="Times New Roman"/>
@@ -16648,7 +16620,7 @@
           <w:t>or</w:t>
         </w:r>
       </w:ins>
-      <w:ins w:id="632" w:author="Coles, Nicholas A." w:date="2026-08-14T11:39:00Z" w16du:dateUtc="2026-08-14T15:39:00Z">
+      <w:ins w:id="635" w:author="Coles, Nicholas A." w:date="2026-08-14T11:39:00Z" w16du:dateUtc="2026-08-14T15:39:00Z">
         <w:r>
           <w:rPr>
             <w:rFonts w:cs="Times New Roman"/>
@@ -16656,7 +16628,7 @@
           <w:t xml:space="preserve"> (c) voluntarily.</w:t>
         </w:r>
       </w:ins>
-      <w:ins w:id="633" w:author="Coles, Nicholas A." w:date="2026-08-14T11:40:00Z" w16du:dateUtc="2026-08-14T15:40:00Z">
+      <w:ins w:id="636" w:author="Coles, Nicholas A." w:date="2026-08-14T11:40:00Z" w16du:dateUtc="2026-08-14T15:40:00Z">
         <w:r>
           <w:rPr>
             <w:rFonts w:cs="Times New Roman"/>
@@ -16664,7 +16636,7 @@
           <w:t xml:space="preserve"> Our results, instead, generated an </w:t>
         </w:r>
       </w:ins>
-      <w:ins w:id="634" w:author="Coles, Nicholas A." w:date="2026-08-14T10:00:00Z">
+      <w:ins w:id="637" w:author="Coles, Nicholas A." w:date="2026-08-14T10:00:00Z">
         <w:r>
           <w:rPr>
             <w:rFonts w:cs="Times New Roman"/>
@@ -16672,7 +16644,7 @@
           <w:t>unexpected narrative. In positive contexts, posed smiles were mood-dampening; in negative contexts, they were mood-</w:t>
         </w:r>
       </w:ins>
-      <w:ins w:id="635" w:author="Coles, Nicholas A." w:date="2026-08-14T11:40:00Z" w16du:dateUtc="2026-08-14T15:40:00Z">
+      <w:ins w:id="638" w:author="Coles, Nicholas A." w:date="2026-08-14T11:40:00Z" w16du:dateUtc="2026-08-14T15:40:00Z">
         <w:r>
           <w:rPr>
             <w:rFonts w:cs="Times New Roman"/>
@@ -16680,7 +16652,7 @@
           <w:t>improving when performed non-repeatedly</w:t>
         </w:r>
       </w:ins>
-      <w:ins w:id="636" w:author="Coles, Nicholas A." w:date="2026-08-14T10:00:00Z">
+      <w:ins w:id="639" w:author="Coles, Nicholas A." w:date="2026-08-14T10:00:00Z">
         <w:r>
           <w:rPr>
             <w:rFonts w:cs="Times New Roman"/>
@@ -16694,11 +16666,11 @@
         <w:spacing w:before="0"/>
         <w:ind w:firstLine="720"/>
         <w:rPr>
-          <w:ins w:id="637" w:author="Coles, Nicholas A." w:date="2026-08-14T11:45:00Z" w16du:dateUtc="2026-08-14T15:45:00Z"/>
+          <w:ins w:id="640" w:author="Coles, Nicholas A." w:date="2026-08-14T11:45:00Z" w16du:dateUtc="2026-08-14T15:45:00Z"/>
           <w:rFonts w:cs="Times New Roman"/>
         </w:rPr>
       </w:pPr>
-      <w:ins w:id="638" w:author="Coles, Nicholas A." w:date="2026-08-14T12:04:00Z" w16du:dateUtc="2026-08-14T16:04:00Z">
+      <w:ins w:id="641" w:author="Coles, Nicholas A." w:date="2026-08-14T12:04:00Z" w16du:dateUtc="2026-08-14T16:04:00Z">
         <w:r>
           <w:rPr>
             <w:rFonts w:cs="Times New Roman"/>
@@ -16706,7 +16678,7 @@
           <w:t>We observed the strongest support for emotion embodiment theory in negative conte</w:t>
         </w:r>
       </w:ins>
-      <w:ins w:id="639" w:author="Coles, Nicholas A." w:date="2026-08-14T12:05:00Z" w16du:dateUtc="2026-08-14T16:05:00Z">
+      <w:ins w:id="642" w:author="Coles, Nicholas A." w:date="2026-08-14T12:05:00Z" w16du:dateUtc="2026-08-14T16:05:00Z">
         <w:r>
           <w:rPr>
             <w:rFonts w:cs="Times New Roman"/>
@@ -16714,7 +16686,7 @@
           <w:t>xts</w:t>
         </w:r>
       </w:ins>
-      <w:ins w:id="640" w:author="Coles, Nicholas A." w:date="2026-08-14T12:10:00Z" w16du:dateUtc="2026-08-14T16:10:00Z">
+      <w:ins w:id="643" w:author="Coles, Nicholas A." w:date="2026-08-14T12:10:00Z" w16du:dateUtc="2026-08-14T16:10:00Z">
         <w:r>
           <w:rPr>
             <w:rFonts w:cs="Times New Roman"/>
@@ -16728,7 +16700,7 @@
           <w:t>(</w:t>
         </w:r>
       </w:ins>
-      <w:ins w:id="641" w:author="Coles, Nicholas A." w:date="2026-08-14T12:21:00Z" w16du:dateUtc="2026-08-14T16:21:00Z">
+      <w:ins w:id="644" w:author="Coles, Nicholas A." w:date="2026-08-14T12:21:00Z" w16du:dateUtc="2026-08-14T16:21:00Z">
         <w:r>
           <w:rPr>
             <w:rFonts w:cs="Times New Roman"/>
@@ -16757,7 +16729,7 @@
           <w:t>, Korb, &amp; Niedenthal, 2016</w:t>
         </w:r>
       </w:ins>
-      <w:ins w:id="642" w:author="Coles, Nicholas A." w:date="2026-08-14T12:10:00Z" w16du:dateUtc="2026-08-14T16:10:00Z">
+      <w:ins w:id="645" w:author="Coles, Nicholas A." w:date="2026-08-14T12:10:00Z" w16du:dateUtc="2026-08-14T16:10:00Z">
         <w:r>
           <w:rPr>
             <w:rFonts w:cs="Times New Roman"/>
@@ -16765,7 +16737,7 @@
           <w:t>)</w:t>
         </w:r>
       </w:ins>
-      <w:ins w:id="643" w:author="Coles, Nicholas A." w:date="2026-08-14T12:06:00Z" w16du:dateUtc="2026-08-14T16:06:00Z">
+      <w:ins w:id="646" w:author="Coles, Nicholas A." w:date="2026-08-14T12:06:00Z" w16du:dateUtc="2026-08-14T16:06:00Z">
         <w:r>
           <w:rPr>
             <w:rFonts w:cs="Times New Roman"/>
@@ -16773,7 +16745,7 @@
           <w:t xml:space="preserve">. Here, posing a single smile </w:t>
         </w:r>
       </w:ins>
-      <w:ins w:id="644" w:author="Coles, Nicholas A." w:date="2026-08-14T12:07:00Z" w16du:dateUtc="2026-08-14T16:07:00Z">
+      <w:ins w:id="647" w:author="Coles, Nicholas A." w:date="2026-08-14T12:07:00Z" w16du:dateUtc="2026-08-14T16:07:00Z">
         <w:r>
           <w:rPr>
             <w:rFonts w:cs="Times New Roman"/>
@@ -16781,7 +16753,7 @@
           <w:t>led to small improvements in self-reported happiness, regardless of whether it was done voluntarily</w:t>
         </w:r>
       </w:ins>
-      <w:ins w:id="645" w:author="Coles, Nicholas A." w:date="2026-08-16T02:20:00Z" w16du:dateUtc="2026-08-16T06:20:00Z">
+      <w:ins w:id="648" w:author="Coles, Nicholas A." w:date="2026-08-16T02:20:00Z" w16du:dateUtc="2026-08-16T06:20:00Z">
         <w:r>
           <w:rPr>
             <w:rFonts w:cs="Times New Roman"/>
@@ -16789,7 +16761,7 @@
           <w:t xml:space="preserve"> or to avoid financial punishment</w:t>
         </w:r>
       </w:ins>
-      <w:ins w:id="646" w:author="Coles, Nicholas A." w:date="2026-08-14T12:07:00Z" w16du:dateUtc="2026-08-14T16:07:00Z">
+      <w:ins w:id="649" w:author="Coles, Nicholas A." w:date="2026-08-14T12:07:00Z" w16du:dateUtc="2026-08-14T16:07:00Z">
         <w:r>
           <w:rPr>
             <w:rFonts w:cs="Times New Roman"/>
@@ -16797,7 +16769,7 @@
           <w:t>.</w:t>
         </w:r>
       </w:ins>
-      <w:ins w:id="647" w:author="Coles, Nicholas A." w:date="2026-08-14T12:08:00Z" w16du:dateUtc="2026-08-14T16:08:00Z">
+      <w:ins w:id="650" w:author="Coles, Nicholas A." w:date="2026-08-14T12:08:00Z" w16du:dateUtc="2026-08-14T16:08:00Z">
         <w:r>
           <w:rPr>
             <w:rFonts w:cs="Times New Roman"/>
@@ -16805,7 +16777,7 @@
           <w:t xml:space="preserve"> The magnitude</w:t>
         </w:r>
       </w:ins>
-      <w:ins w:id="648" w:author="Coles, Nicholas A." w:date="2026-08-16T02:22:00Z" w16du:dateUtc="2026-08-16T06:22:00Z">
+      <w:ins w:id="651" w:author="Coles, Nicholas A." w:date="2026-08-16T02:22:00Z" w16du:dateUtc="2026-08-16T06:22:00Z">
         <w:r>
           <w:rPr>
             <w:rFonts w:cs="Times New Roman"/>
@@ -16813,7 +16785,7 @@
           <w:t>s</w:t>
         </w:r>
       </w:ins>
-      <w:ins w:id="649" w:author="Coles, Nicholas A." w:date="2026-08-14T12:08:00Z" w16du:dateUtc="2026-08-14T16:08:00Z">
+      <w:ins w:id="652" w:author="Coles, Nicholas A." w:date="2026-08-14T12:08:00Z" w16du:dateUtc="2026-08-14T16:08:00Z">
         <w:r>
           <w:rPr>
             <w:rFonts w:cs="Times New Roman"/>
@@ -16859,7 +16831,7 @@
           <w:t>)</w:t>
         </w:r>
       </w:ins>
-      <w:ins w:id="650" w:author="Coles, Nicholas A." w:date="2026-08-16T02:25:00Z" w16du:dateUtc="2026-08-16T06:25:00Z">
+      <w:ins w:id="653" w:author="Coles, Nicholas A." w:date="2026-08-16T02:25:00Z" w16du:dateUtc="2026-08-16T06:25:00Z">
         <w:r>
           <w:rPr>
             <w:rFonts w:cs="Times New Roman"/>
@@ -16867,7 +16839,7 @@
           <w:t xml:space="preserve"> and</w:t>
         </w:r>
       </w:ins>
-      <w:ins w:id="651" w:author="Coles, Nicholas A." w:date="2026-08-14T12:08:00Z" w16du:dateUtc="2026-08-14T16:08:00Z">
+      <w:ins w:id="654" w:author="Coles, Nicholas A." w:date="2026-08-14T12:08:00Z" w16du:dateUtc="2026-08-14T16:08:00Z">
         <w:r>
           <w:rPr>
             <w:rFonts w:cs="Times New Roman"/>
@@ -16881,7 +16853,7 @@
           <w:t>adversarial collaboration (Coles et al., 2023).</w:t>
         </w:r>
       </w:ins>
-      <w:ins w:id="652" w:author="Coles, Nicholas A." w:date="2026-08-14T12:09:00Z" w16du:dateUtc="2026-08-14T16:09:00Z">
+      <w:ins w:id="655" w:author="Coles, Nicholas A." w:date="2026-08-14T12:09:00Z" w16du:dateUtc="2026-08-14T16:09:00Z">
         <w:r>
           <w:rPr>
             <w:rFonts w:cs="Times New Roman"/>
@@ -16889,7 +16861,7 @@
           <w:t xml:space="preserve"> However, when performed repeatedly, the effect </w:t>
         </w:r>
       </w:ins>
-      <w:ins w:id="653" w:author="Coles, Nicholas A." w:date="2026-08-14T12:10:00Z" w16du:dateUtc="2026-08-14T16:10:00Z">
+      <w:ins w:id="656" w:author="Coles, Nicholas A." w:date="2026-08-14T12:10:00Z" w16du:dateUtc="2026-08-14T16:10:00Z">
         <w:r>
           <w:rPr>
             <w:rFonts w:cs="Times New Roman"/>
@@ -16897,7 +16869,7 @@
           <w:t>was near zero</w:t>
         </w:r>
       </w:ins>
-      <w:ins w:id="654" w:author="Coles, Nicholas A." w:date="2026-08-14T11:44:00Z" w16du:dateUtc="2026-08-14T15:44:00Z">
+      <w:ins w:id="657" w:author="Coles, Nicholas A." w:date="2026-08-14T11:44:00Z" w16du:dateUtc="2026-08-14T15:44:00Z">
         <w:r>
           <w:rPr>
             <w:rFonts w:cs="Times New Roman"/>
@@ -16905,7 +16877,7 @@
           <w:t xml:space="preserve"> (see also </w:t>
         </w:r>
       </w:ins>
-      <w:ins w:id="655" w:author="Coles, Nicholas A." w:date="2026-08-14T12:22:00Z" w16du:dateUtc="2026-08-14T16:22:00Z">
+      <w:ins w:id="658" w:author="Coles, Nicholas A." w:date="2026-08-14T12:22:00Z" w16du:dateUtc="2026-08-14T16:22:00Z">
         <w:r>
           <w:rPr>
             <w:rFonts w:cs="Times New Roman"/>
@@ -16913,7 +16885,7 @@
           <w:t>Kraft &amp; Pressman, 2012; Luu, Acevedo, Pourmand, &amp; Pressman, 2025; Pressman, Acevedo, Hammond, &amp; Kraft-Feil, 2021</w:t>
         </w:r>
       </w:ins>
-      <w:ins w:id="656" w:author="Coles, Nicholas A." w:date="2026-08-14T11:44:00Z" w16du:dateUtc="2026-08-14T15:44:00Z">
+      <w:ins w:id="659" w:author="Coles, Nicholas A." w:date="2026-08-14T11:44:00Z" w16du:dateUtc="2026-08-14T15:44:00Z">
         <w:r>
           <w:rPr>
             <w:rFonts w:cs="Times New Roman"/>
@@ -16921,7 +16893,7 @@
           <w:t>)</w:t>
         </w:r>
       </w:ins>
-      <w:ins w:id="657" w:author="Coles, Nicholas A." w:date="2026-08-14T10:00:00Z">
+      <w:ins w:id="660" w:author="Coles, Nicholas A." w:date="2026-08-14T10:00:00Z">
         <w:r>
           <w:rPr>
             <w:rFonts w:cs="Times New Roman"/>
@@ -16949,11 +16921,11 @@
         <w:spacing w:before="0"/>
         <w:ind w:firstLine="720"/>
         <w:rPr>
-          <w:ins w:id="658" w:author="Coles, Nicholas A." w:date="2026-08-14T12:36:00Z" w16du:dateUtc="2026-08-14T16:36:00Z"/>
+          <w:ins w:id="661" w:author="Coles, Nicholas A." w:date="2026-08-14T12:36:00Z" w16du:dateUtc="2026-08-14T16:36:00Z"/>
           <w:rFonts w:cs="Times New Roman"/>
         </w:rPr>
       </w:pPr>
-      <w:ins w:id="659" w:author="Coles, Nicholas A." w:date="2026-08-14T12:12:00Z" w16du:dateUtc="2026-08-14T16:12:00Z">
+      <w:ins w:id="662" w:author="Coles, Nicholas A." w:date="2026-08-14T12:12:00Z" w16du:dateUtc="2026-08-14T16:12:00Z">
         <w:r>
           <w:rPr>
             <w:rFonts w:cs="Times New Roman"/>
@@ -16961,7 +16933,7 @@
           <w:t xml:space="preserve">We observed the strongest support for emotion labor theories in </w:t>
         </w:r>
       </w:ins>
-      <w:ins w:id="660" w:author="Coles, Nicholas A." w:date="2026-08-14T10:00:00Z">
+      <w:ins w:id="663" w:author="Coles, Nicholas A." w:date="2026-08-14T10:00:00Z">
         <w:r>
           <w:rPr>
             <w:rFonts w:cs="Times New Roman"/>
@@ -16969,7 +16941,7 @@
           <w:t>positive contexts</w:t>
         </w:r>
       </w:ins>
-      <w:ins w:id="661" w:author="Coles, Nicholas A." w:date="2026-08-14T12:24:00Z" w16du:dateUtc="2026-08-14T16:24:00Z">
+      <w:ins w:id="664" w:author="Coles, Nicholas A." w:date="2026-08-14T12:24:00Z" w16du:dateUtc="2026-08-14T16:24:00Z">
         <w:r>
           <w:rPr>
             <w:rFonts w:cs="Times New Roman"/>
@@ -17031,7 +17003,7 @@
           <w:t>Zapf et al., 2021)</w:t>
         </w:r>
       </w:ins>
-      <w:ins w:id="662" w:author="Coles, Nicholas A." w:date="2026-08-14T12:12:00Z" w16du:dateUtc="2026-08-14T16:12:00Z">
+      <w:ins w:id="665" w:author="Coles, Nicholas A." w:date="2026-08-14T12:12:00Z" w16du:dateUtc="2026-08-14T16:12:00Z">
         <w:r>
           <w:rPr>
             <w:rFonts w:cs="Times New Roman"/>
@@ -17039,7 +17011,7 @@
           <w:t>. Here, relative to expressing onesel</w:t>
         </w:r>
       </w:ins>
-      <w:ins w:id="663" w:author="Coles, Nicholas A." w:date="2026-08-14T12:13:00Z" w16du:dateUtc="2026-08-14T16:13:00Z">
+      <w:ins w:id="666" w:author="Coles, Nicholas A." w:date="2026-08-14T12:13:00Z" w16du:dateUtc="2026-08-14T16:13:00Z">
         <w:r>
           <w:rPr>
             <w:rFonts w:cs="Times New Roman"/>
@@ -17047,7 +17019,7 @@
           <w:t>f</w:t>
         </w:r>
       </w:ins>
-      <w:ins w:id="664" w:author="Coles, Nicholas A." w:date="2026-08-14T12:12:00Z" w16du:dateUtc="2026-08-14T16:12:00Z">
+      <w:ins w:id="667" w:author="Coles, Nicholas A." w:date="2026-08-14T12:12:00Z" w16du:dateUtc="2026-08-14T16:12:00Z">
         <w:r>
           <w:rPr>
             <w:rFonts w:cs="Times New Roman"/>
@@ -17055,7 +17027,7 @@
           <w:t xml:space="preserve"> naturally,</w:t>
         </w:r>
       </w:ins>
-      <w:ins w:id="665" w:author="Coles, Nicholas A." w:date="2026-08-14T10:00:00Z">
+      <w:ins w:id="668" w:author="Coles, Nicholas A." w:date="2026-08-14T10:00:00Z">
         <w:r>
           <w:rPr>
             <w:rFonts w:cs="Times New Roman"/>
@@ -17067,7 +17039,7 @@
             <w:rFonts w:cs="Times New Roman"/>
             <w:i/>
             <w:iCs/>
-            <w:rPrChange w:id="666" w:author="Coles, Nicholas A." w:date="2026-08-14T12:11:00Z" w16du:dateUtc="2026-08-14T16:11:00Z">
+            <w:rPrChange w:id="669" w:author="Coles, Nicholas A." w:date="2026-08-14T12:11:00Z" w16du:dateUtc="2026-08-14T16:11:00Z">
               <w:rPr>
                 <w:rFonts w:cs="Times New Roman"/>
               </w:rPr>
@@ -17082,7 +17054,7 @@
           <w:t xml:space="preserve"> in self-reported happiness. This was particularly pronounced when posing smiles repeatedly and/or under financial threat</w:t>
         </w:r>
       </w:ins>
-      <w:ins w:id="667" w:author="Coles, Nicholas A." w:date="2026-08-14T12:27:00Z" w16du:dateUtc="2026-08-14T16:27:00Z">
+      <w:ins w:id="670" w:author="Coles, Nicholas A." w:date="2026-08-14T12:27:00Z" w16du:dateUtc="2026-08-14T16:27:00Z">
         <w:r>
           <w:rPr>
             <w:rFonts w:cs="Times New Roman"/>
@@ -17090,7 +17062,7 @@
           <w:t xml:space="preserve"> – i.e., the conditions </w:t>
         </w:r>
       </w:ins>
-      <w:ins w:id="668" w:author="Coles, Nicholas A." w:date="2026-08-14T12:28:00Z" w16du:dateUtc="2026-08-14T16:28:00Z">
+      <w:ins w:id="671" w:author="Coles, Nicholas A." w:date="2026-08-14T12:28:00Z" w16du:dateUtc="2026-08-14T16:28:00Z">
         <w:r>
           <w:rPr>
             <w:rFonts w:cs="Times New Roman"/>
@@ -17110,7 +17082,7 @@
           <w:t xml:space="preserve"> conditions</w:t>
         </w:r>
       </w:ins>
-      <w:ins w:id="669" w:author="Coles, Nicholas A." w:date="2026-08-14T10:00:00Z">
+      <w:ins w:id="672" w:author="Coles, Nicholas A." w:date="2026-08-14T10:00:00Z">
         <w:r>
           <w:rPr>
             <w:rFonts w:cs="Times New Roman"/>
@@ -17118,7 +17090,7 @@
           <w:t>.</w:t>
         </w:r>
       </w:ins>
-      <w:ins w:id="670" w:author="Coles, Nicholas A." w:date="2026-08-14T11:51:00Z" w16du:dateUtc="2026-08-14T15:51:00Z">
+      <w:ins w:id="673" w:author="Coles, Nicholas A." w:date="2026-08-14T11:51:00Z" w16du:dateUtc="2026-08-14T15:51:00Z">
         <w:r>
           <w:rPr>
             <w:rFonts w:cs="Times New Roman"/>
@@ -17126,7 +17098,7 @@
           <w:t xml:space="preserve"> Furthermore, the</w:t>
         </w:r>
       </w:ins>
-      <w:ins w:id="671" w:author="Coles, Nicholas A." w:date="2026-08-14T11:52:00Z" w16du:dateUtc="2026-08-14T15:52:00Z">
+      <w:ins w:id="674" w:author="Coles, Nicholas A." w:date="2026-08-14T11:52:00Z" w16du:dateUtc="2026-08-14T15:52:00Z">
         <w:r>
           <w:rPr>
             <w:rFonts w:cs="Times New Roman"/>
@@ -17134,7 +17106,7 @@
           <w:t xml:space="preserve"> mood-dampening </w:t>
         </w:r>
       </w:ins>
-      <w:ins w:id="672" w:author="Coles, Nicholas A." w:date="2026-08-14T11:51:00Z" w16du:dateUtc="2026-08-14T15:51:00Z">
+      <w:ins w:id="675" w:author="Coles, Nicholas A." w:date="2026-08-14T11:51:00Z" w16du:dateUtc="2026-08-14T15:51:00Z">
         <w:r>
           <w:rPr>
             <w:rFonts w:cs="Times New Roman"/>
@@ -17142,7 +17114,7 @@
           <w:t>effects of smiling in po</w:t>
         </w:r>
       </w:ins>
-      <w:ins w:id="673" w:author="Coles, Nicholas A." w:date="2026-08-14T11:52:00Z" w16du:dateUtc="2026-08-14T15:52:00Z">
+      <w:ins w:id="676" w:author="Coles, Nicholas A." w:date="2026-08-14T11:52:00Z" w16du:dateUtc="2026-08-14T15:52:00Z">
         <w:r>
           <w:rPr>
             <w:rFonts w:cs="Times New Roman"/>
@@ -17150,7 +17122,7 @@
           <w:t xml:space="preserve">sitive contexts were </w:t>
         </w:r>
       </w:ins>
-      <w:ins w:id="674" w:author="Coles, Nicholas A." w:date="2026-08-14T12:13:00Z" w16du:dateUtc="2026-08-14T16:13:00Z">
+      <w:ins w:id="677" w:author="Coles, Nicholas A." w:date="2026-08-14T12:13:00Z" w16du:dateUtc="2026-08-14T16:13:00Z">
         <w:r>
           <w:rPr>
             <w:rFonts w:cs="Times New Roman"/>
@@ -17158,7 +17130,7 @@
           <w:t xml:space="preserve">X% </w:t>
         </w:r>
       </w:ins>
-      <w:ins w:id="675" w:author="Coles, Nicholas A." w:date="2026-08-14T11:52:00Z" w16du:dateUtc="2026-08-14T15:52:00Z">
+      <w:ins w:id="678" w:author="Coles, Nicholas A." w:date="2026-08-14T11:52:00Z" w16du:dateUtc="2026-08-14T15:52:00Z">
         <w:r>
           <w:rPr>
             <w:rFonts w:cs="Times New Roman"/>
@@ -17166,7 +17138,7 @@
           <w:t>larger than the mood-boosting effects observed in negative contexts</w:t>
         </w:r>
       </w:ins>
-      <w:ins w:id="676" w:author="Coles, Nicholas A." w:date="2026-08-14T12:13:00Z" w16du:dateUtc="2026-08-14T16:13:00Z">
+      <w:ins w:id="679" w:author="Coles, Nicholas A." w:date="2026-08-14T12:13:00Z" w16du:dateUtc="2026-08-14T16:13:00Z">
         <w:r>
           <w:rPr>
             <w:rFonts w:cs="Times New Roman"/>
@@ -17174,7 +17146,7 @@
           <w:t>.</w:t>
         </w:r>
       </w:ins>
-      <w:ins w:id="677" w:author="Coles, Nicholas A." w:date="2026-08-14T12:11:00Z" w16du:dateUtc="2026-08-14T16:11:00Z">
+      <w:ins w:id="680" w:author="Coles, Nicholas A." w:date="2026-08-14T12:11:00Z" w16du:dateUtc="2026-08-14T16:11:00Z">
         <w:r>
           <w:rPr>
             <w:rFonts w:cs="Times New Roman"/>
@@ -17182,7 +17154,7 @@
           <w:t xml:space="preserve"> </w:t>
         </w:r>
       </w:ins>
-      <w:ins w:id="678" w:author="Coles, Nicholas A." w:date="2026-08-14T12:18:00Z" w16du:dateUtc="2026-08-14T16:18:00Z">
+      <w:ins w:id="681" w:author="Coles, Nicholas A." w:date="2026-08-14T12:18:00Z" w16du:dateUtc="2026-08-14T16:18:00Z">
         <w:r>
           <w:rPr>
             <w:rFonts w:cs="Times New Roman"/>
@@ -17190,7 +17162,7 @@
           <w:t xml:space="preserve">This </w:t>
         </w:r>
       </w:ins>
-      <w:ins w:id="679" w:author="Coles, Nicholas A." w:date="2026-08-14T12:28:00Z" w16du:dateUtc="2026-08-14T16:28:00Z">
+      <w:ins w:id="682" w:author="Coles, Nicholas A." w:date="2026-08-14T12:28:00Z" w16du:dateUtc="2026-08-14T16:28:00Z">
         <w:r>
           <w:rPr>
             <w:rFonts w:cs="Times New Roman"/>
@@ -17198,7 +17170,7 @@
           <w:t xml:space="preserve">finding </w:t>
         </w:r>
       </w:ins>
-      <w:ins w:id="680" w:author="Coles, Nicholas A." w:date="2026-08-14T12:18:00Z" w16du:dateUtc="2026-08-14T16:18:00Z">
+      <w:ins w:id="683" w:author="Coles, Nicholas A." w:date="2026-08-14T12:18:00Z" w16du:dateUtc="2026-08-14T16:18:00Z">
         <w:r>
           <w:rPr>
             <w:rFonts w:cs="Times New Roman"/>
@@ -17206,7 +17178,7 @@
           <w:t>helps resolve</w:t>
         </w:r>
       </w:ins>
-      <w:ins w:id="681" w:author="Coles, Nicholas A." w:date="2026-08-14T12:19:00Z" w16du:dateUtc="2026-08-14T16:19:00Z">
+      <w:ins w:id="684" w:author="Coles, Nicholas A." w:date="2026-08-14T12:19:00Z" w16du:dateUtc="2026-08-14T16:19:00Z">
         <w:r>
           <w:rPr>
             <w:rFonts w:cs="Times New Roman"/>
@@ -17214,7 +17186,7 @@
           <w:t xml:space="preserve"> theoretical tension between emotion</w:t>
         </w:r>
       </w:ins>
-      <w:ins w:id="682" w:author="Coles, Nicholas A." w:date="2026-08-14T12:24:00Z" w16du:dateUtc="2026-08-14T16:24:00Z">
+      <w:ins w:id="685" w:author="Coles, Nicholas A." w:date="2026-08-14T12:24:00Z" w16du:dateUtc="2026-08-14T16:24:00Z">
         <w:r>
           <w:rPr>
             <w:rFonts w:cs="Times New Roman"/>
@@ -17222,7 +17194,7 @@
           <w:t xml:space="preserve"> embodiment and</w:t>
         </w:r>
       </w:ins>
-      <w:ins w:id="683" w:author="Coles, Nicholas A." w:date="2026-08-14T12:19:00Z" w16du:dateUtc="2026-08-14T16:19:00Z">
+      <w:ins w:id="686" w:author="Coles, Nicholas A." w:date="2026-08-14T12:19:00Z" w16du:dateUtc="2026-08-14T16:19:00Z">
         <w:r>
           <w:rPr>
             <w:rFonts w:cs="Times New Roman"/>
@@ -17230,7 +17202,7 @@
           <w:t xml:space="preserve"> labor theor</w:t>
         </w:r>
       </w:ins>
-      <w:ins w:id="684" w:author="Coles, Nicholas A." w:date="2026-08-14T12:21:00Z" w16du:dateUtc="2026-08-14T16:21:00Z">
+      <w:ins w:id="687" w:author="Coles, Nicholas A." w:date="2026-08-14T12:21:00Z" w16du:dateUtc="2026-08-14T16:21:00Z">
         <w:r>
           <w:rPr>
             <w:rFonts w:cs="Times New Roman"/>
@@ -17238,7 +17210,7 @@
           <w:t>ies</w:t>
         </w:r>
       </w:ins>
-      <w:ins w:id="685" w:author="Coles, Nicholas A." w:date="2026-08-14T12:19:00Z" w16du:dateUtc="2026-08-14T16:19:00Z">
+      <w:ins w:id="688" w:author="Coles, Nicholas A." w:date="2026-08-14T12:19:00Z" w16du:dateUtc="2026-08-14T16:19:00Z">
         <w:r>
           <w:rPr>
             <w:rFonts w:cs="Times New Roman"/>
@@ -17246,7 +17218,7 @@
           <w:t xml:space="preserve">: </w:t>
         </w:r>
       </w:ins>
-      <w:ins w:id="686" w:author="Coles, Nicholas A." w:date="2026-08-14T12:21:00Z" w16du:dateUtc="2026-08-14T16:21:00Z">
+      <w:ins w:id="689" w:author="Coles, Nicholas A." w:date="2026-08-14T12:21:00Z" w16du:dateUtc="2026-08-14T16:21:00Z">
         <w:r>
           <w:rPr>
             <w:rFonts w:cs="Times New Roman"/>
@@ -17254,7 +17226,7 @@
           <w:t xml:space="preserve">the </w:t>
         </w:r>
       </w:ins>
-      <w:ins w:id="687" w:author="Coles, Nicholas A." w:date="2026-08-14T12:20:00Z" w16du:dateUtc="2026-08-14T16:20:00Z">
+      <w:ins w:id="690" w:author="Coles, Nicholas A." w:date="2026-08-14T12:20:00Z" w16du:dateUtc="2026-08-14T16:20:00Z">
         <w:r>
           <w:rPr>
             <w:rFonts w:cs="Times New Roman"/>
@@ -17262,7 +17234,7 @@
           <w:t xml:space="preserve">small mood-boosting effects </w:t>
         </w:r>
       </w:ins>
-      <w:ins w:id="688" w:author="Coles, Nicholas A." w:date="2026-08-14T12:21:00Z" w16du:dateUtc="2026-08-14T16:21:00Z">
+      <w:ins w:id="691" w:author="Coles, Nicholas A." w:date="2026-08-14T12:21:00Z" w16du:dateUtc="2026-08-14T16:21:00Z">
         <w:r>
           <w:rPr>
             <w:rFonts w:cs="Times New Roman"/>
@@ -17270,7 +17242,7 @@
           <w:t xml:space="preserve">we </w:t>
         </w:r>
       </w:ins>
-      <w:ins w:id="689" w:author="Coles, Nicholas A." w:date="2026-08-14T12:20:00Z" w16du:dateUtc="2026-08-14T16:20:00Z">
+      <w:ins w:id="692" w:author="Coles, Nicholas A." w:date="2026-08-14T12:20:00Z" w16du:dateUtc="2026-08-14T16:20:00Z">
         <w:r>
           <w:rPr>
             <w:rFonts w:cs="Times New Roman"/>
@@ -17278,7 +17250,7 @@
           <w:t xml:space="preserve">observed in </w:t>
         </w:r>
       </w:ins>
-      <w:ins w:id="690" w:author="Coles, Nicholas A." w:date="2026-08-16T20:37:00Z" w16du:dateUtc="2026-08-17T00:37:00Z">
+      <w:ins w:id="693" w:author="Coles, Nicholas A." w:date="2026-08-16T20:37:00Z" w16du:dateUtc="2026-08-17T00:37:00Z">
         <w:r>
           <w:rPr>
             <w:rFonts w:cs="Times New Roman"/>
@@ -17286,7 +17258,7 @@
           <w:t xml:space="preserve">some experimental </w:t>
         </w:r>
       </w:ins>
-      <w:ins w:id="691" w:author="Coles, Nicholas A." w:date="2026-08-14T12:20:00Z" w16du:dateUtc="2026-08-14T16:20:00Z">
+      <w:ins w:id="694" w:author="Coles, Nicholas A." w:date="2026-08-14T12:20:00Z" w16du:dateUtc="2026-08-14T16:20:00Z">
         <w:r>
           <w:rPr>
             <w:rFonts w:cs="Times New Roman"/>
@@ -17294,7 +17266,7 @@
           <w:t xml:space="preserve">contexts </w:t>
         </w:r>
       </w:ins>
-      <w:ins w:id="692" w:author="Coles, Nicholas A." w:date="2026-08-14T12:21:00Z" w16du:dateUtc="2026-08-14T16:21:00Z">
+      <w:ins w:id="695" w:author="Coles, Nicholas A." w:date="2026-08-14T12:21:00Z" w16du:dateUtc="2026-08-14T16:21:00Z">
         <w:r>
           <w:rPr>
             <w:rFonts w:cs="Times New Roman"/>
@@ -17302,7 +17274,7 @@
           <w:t xml:space="preserve">were </w:t>
         </w:r>
       </w:ins>
-      <w:ins w:id="693" w:author="Coles, Nicholas A." w:date="2026-08-14T12:20:00Z" w16du:dateUtc="2026-08-14T16:20:00Z">
+      <w:ins w:id="696" w:author="Coles, Nicholas A." w:date="2026-08-14T12:20:00Z" w16du:dateUtc="2026-08-14T16:20:00Z">
         <w:r>
           <w:rPr>
             <w:rFonts w:cs="Times New Roman"/>
@@ -17310,7 +17282,7 @@
           <w:t>canceled out by larger mood-</w:t>
         </w:r>
       </w:ins>
-      <w:ins w:id="694" w:author="Coles, Nicholas A." w:date="2026-08-14T12:21:00Z" w16du:dateUtc="2026-08-14T16:21:00Z">
+      <w:ins w:id="697" w:author="Coles, Nicholas A." w:date="2026-08-14T12:21:00Z" w16du:dateUtc="2026-08-14T16:21:00Z">
         <w:r>
           <w:rPr>
             <w:rFonts w:cs="Times New Roman"/>
@@ -17318,7 +17290,7 @@
           <w:t>dampening</w:t>
         </w:r>
       </w:ins>
-      <w:ins w:id="695" w:author="Coles, Nicholas A." w:date="2026-08-14T12:20:00Z" w16du:dateUtc="2026-08-14T16:20:00Z">
+      <w:ins w:id="698" w:author="Coles, Nicholas A." w:date="2026-08-14T12:20:00Z" w16du:dateUtc="2026-08-14T16:20:00Z">
         <w:r>
           <w:rPr>
             <w:rFonts w:cs="Times New Roman"/>
@@ -17326,7 +17298,7 @@
           <w:t xml:space="preserve"> effects observed in contexts</w:t>
         </w:r>
       </w:ins>
-      <w:ins w:id="696" w:author="Coles, Nicholas A." w:date="2026-08-16T20:35:00Z" w16du:dateUtc="2026-08-17T00:35:00Z">
+      <w:ins w:id="699" w:author="Coles, Nicholas A." w:date="2026-08-16T20:35:00Z" w16du:dateUtc="2026-08-17T00:35:00Z">
         <w:r>
           <w:rPr>
             <w:rFonts w:cs="Times New Roman"/>
@@ -17334,7 +17306,7 @@
           <w:t xml:space="preserve"> better resembling</w:t>
         </w:r>
       </w:ins>
-      <w:ins w:id="697" w:author="Coles, Nicholas A." w:date="2026-08-16T20:36:00Z" w16du:dateUtc="2026-08-17T00:36:00Z">
+      <w:ins w:id="700" w:author="Coles, Nicholas A." w:date="2026-08-16T20:36:00Z" w16du:dateUtc="2026-08-17T00:36:00Z">
         <w:r>
           <w:rPr>
             <w:rFonts w:cs="Times New Roman"/>
@@ -17342,7 +17314,7 @@
           <w:t xml:space="preserve"> emotion labor</w:t>
         </w:r>
       </w:ins>
-      <w:ins w:id="698" w:author="Coles, Nicholas A." w:date="2026-08-14T12:20:00Z" w16du:dateUtc="2026-08-14T16:20:00Z">
+      <w:ins w:id="701" w:author="Coles, Nicholas A." w:date="2026-08-14T12:20:00Z" w16du:dateUtc="2026-08-14T16:20:00Z">
         <w:r>
           <w:rPr>
             <w:rFonts w:cs="Times New Roman"/>
@@ -17350,7 +17322,7 @@
           <w:t>.</w:t>
         </w:r>
       </w:ins>
-      <w:ins w:id="699" w:author="Coles, Nicholas A." w:date="2026-08-14T12:29:00Z" w16du:dateUtc="2026-08-14T16:29:00Z">
+      <w:ins w:id="702" w:author="Coles, Nicholas A." w:date="2026-08-14T12:29:00Z" w16du:dateUtc="2026-08-14T16:29:00Z">
         <w:r>
           <w:rPr>
             <w:rFonts w:cs="Times New Roman"/>
@@ -17364,13 +17336,13 @@
         <w:spacing w:before="0"/>
         <w:ind w:firstLine="720"/>
         <w:rPr>
-          <w:ins w:id="700" w:author="Coles, Nicholas A." w:date="2026-08-14T12:42:00Z" w16du:dateUtc="2026-08-14T16:42:00Z"/>
+          <w:ins w:id="703" w:author="Coles, Nicholas A." w:date="2026-08-14T12:42:00Z" w16du:dateUtc="2026-08-14T16:42:00Z"/>
           <w:rFonts w:cs="Times New Roman"/>
           <w:b/>
           <w:bCs/>
         </w:rPr>
       </w:pPr>
-      <w:ins w:id="701" w:author="Coles, Nicholas A." w:date="2026-08-14T12:36:00Z" w16du:dateUtc="2026-08-14T16:36:00Z">
+      <w:ins w:id="704" w:author="Coles, Nicholas A." w:date="2026-08-14T12:36:00Z" w16du:dateUtc="2026-08-14T16:36:00Z">
         <w:r>
           <w:rPr>
             <w:rFonts w:cs="Times New Roman"/>
@@ -17386,11 +17358,11 @@
         <w:spacing w:before="0"/>
         <w:ind w:firstLine="720"/>
         <w:rPr>
-          <w:ins w:id="702" w:author="Coles, Nicholas A." w:date="2026-08-16T08:21:00Z" w16du:dateUtc="2026-08-16T12:21:00Z"/>
+          <w:ins w:id="705" w:author="Coles, Nicholas A." w:date="2026-08-16T08:21:00Z" w16du:dateUtc="2026-08-16T12:21:00Z"/>
           <w:rFonts w:cs="Times New Roman"/>
         </w:rPr>
       </w:pPr>
-      <w:ins w:id="703" w:author="Coles, Nicholas A." w:date="2026-08-16T08:21:00Z" w16du:dateUtc="2026-08-16T12:21:00Z">
+      <w:ins w:id="706" w:author="Coles, Nicholas A." w:date="2026-08-16T08:21:00Z" w16du:dateUtc="2026-08-16T12:21:00Z">
         <w:r>
           <w:rPr>
             <w:rFonts w:cs="Times New Roman"/>
@@ -17398,7 +17370,7 @@
           <w:t xml:space="preserve">Throughout the course of our research, we </w:t>
         </w:r>
       </w:ins>
-      <w:ins w:id="704" w:author="Coles, Nicholas A." w:date="2026-08-16T08:22:00Z" w16du:dateUtc="2026-08-16T12:22:00Z">
+      <w:ins w:id="707" w:author="Coles, Nicholas A." w:date="2026-08-16T08:22:00Z" w16du:dateUtc="2026-08-16T12:22:00Z">
         <w:r>
           <w:rPr>
             <w:rFonts w:cs="Times New Roman"/>
@@ -17406,7 +17378,7 @@
           <w:t xml:space="preserve">navigated several technical and conceptual </w:t>
         </w:r>
       </w:ins>
-      <w:ins w:id="705" w:author="Coles, Nicholas A." w:date="2026-08-16T08:51:00Z" w16du:dateUtc="2026-08-16T12:51:00Z">
+      <w:ins w:id="708" w:author="Coles, Nicholas A." w:date="2026-08-16T08:51:00Z" w16du:dateUtc="2026-08-16T12:51:00Z">
         <w:r>
           <w:rPr>
             <w:rFonts w:cs="Times New Roman"/>
@@ -17414,7 +17386,7 @@
           <w:t>challenges</w:t>
         </w:r>
       </w:ins>
-      <w:ins w:id="706" w:author="Coles, Nicholas A." w:date="2026-08-16T08:22:00Z" w16du:dateUtc="2026-08-16T12:22:00Z">
+      <w:ins w:id="709" w:author="Coles, Nicholas A." w:date="2026-08-16T08:22:00Z" w16du:dateUtc="2026-08-16T12:22:00Z">
         <w:r>
           <w:rPr>
             <w:rFonts w:cs="Times New Roman"/>
@@ -17422,7 +17394,7 @@
           <w:t>. At the technical level, we made two deviations from our pre-registered plan. First</w:t>
         </w:r>
       </w:ins>
-      <w:ins w:id="707" w:author="Coles, Nicholas A." w:date="2026-08-16T08:23:00Z" w16du:dateUtc="2026-08-16T12:23:00Z">
+      <w:ins w:id="710" w:author="Coles, Nicholas A." w:date="2026-08-16T08:23:00Z" w16du:dateUtc="2026-08-16T12:23:00Z">
         <w:r>
           <w:rPr>
             <w:rFonts w:cs="Times New Roman"/>
@@ -17437,7 +17409,7 @@
           <w:t>extracted data on participant ethnicity from the panel provider as opposed to the parti</w:t>
         </w:r>
       </w:ins>
-      <w:ins w:id="708" w:author="Coles, Nicholas A." w:date="2026-08-16T08:24:00Z" w16du:dateUtc="2026-08-16T12:24:00Z">
+      <w:ins w:id="711" w:author="Coles, Nicholas A." w:date="2026-08-16T08:24:00Z" w16du:dateUtc="2026-08-16T12:24:00Z">
         <w:r>
           <w:rPr>
             <w:rFonts w:cs="Times New Roman"/>
@@ -17445,7 +17417,7 @@
           <w:t>cipant</w:t>
         </w:r>
       </w:ins>
-      <w:ins w:id="709" w:author="Coles, Nicholas A." w:date="2026-08-16T08:43:00Z" w16du:dateUtc="2026-08-16T12:43:00Z">
+      <w:ins w:id="712" w:author="Coles, Nicholas A." w:date="2026-08-16T08:43:00Z" w16du:dateUtc="2026-08-16T12:43:00Z">
         <w:r>
           <w:rPr>
             <w:rFonts w:cs="Times New Roman"/>
@@ -17453,7 +17425,7 @@
           <w:t>.</w:t>
         </w:r>
       </w:ins>
-      <w:ins w:id="710" w:author="Coles, Nicholas A." w:date="2026-08-16T08:44:00Z" w16du:dateUtc="2026-08-16T12:44:00Z">
+      <w:ins w:id="713" w:author="Coles, Nicholas A." w:date="2026-08-16T08:44:00Z" w16du:dateUtc="2026-08-16T12:44:00Z">
         <w:r>
           <w:rPr>
             <w:rFonts w:cs="Times New Roman"/>
@@ -17461,7 +17433,7 @@
           <w:t xml:space="preserve"> This was done to reduce </w:t>
         </w:r>
       </w:ins>
-      <w:ins w:id="711" w:author="Coles, Nicholas A." w:date="2026-08-16T08:51:00Z" w16du:dateUtc="2026-08-16T12:51:00Z">
+      <w:ins w:id="714" w:author="Coles, Nicholas A." w:date="2026-08-16T08:51:00Z" w16du:dateUtc="2026-08-16T12:51:00Z">
         <w:r>
           <w:rPr>
             <w:rFonts w:cs="Times New Roman"/>
@@ -17469,7 +17441,7 @@
           <w:t>unnecessary</w:t>
         </w:r>
       </w:ins>
-      <w:ins w:id="712" w:author="Coles, Nicholas A." w:date="2026-08-16T08:44:00Z" w16du:dateUtc="2026-08-16T12:44:00Z">
+      <w:ins w:id="715" w:author="Coles, Nicholas A." w:date="2026-08-16T08:44:00Z" w16du:dateUtc="2026-08-16T12:44:00Z">
         <w:r>
           <w:rPr>
             <w:rFonts w:cs="Times New Roman"/>
@@ -17477,7 +17449,7 @@
           <w:t xml:space="preserve"> participa</w:t>
         </w:r>
       </w:ins>
-      <w:ins w:id="713" w:author="Coles, Nicholas A." w:date="2026-08-16T08:51:00Z" w16du:dateUtc="2026-08-16T12:51:00Z">
+      <w:ins w:id="716" w:author="Coles, Nicholas A." w:date="2026-08-16T08:51:00Z" w16du:dateUtc="2026-08-16T12:51:00Z">
         <w:r>
           <w:rPr>
             <w:rFonts w:cs="Times New Roman"/>
@@ -17485,7 +17457,7 @@
           <w:t>nt burden</w:t>
         </w:r>
       </w:ins>
-      <w:ins w:id="714" w:author="Coles, Nicholas A." w:date="2026-08-16T08:44:00Z" w16du:dateUtc="2026-08-16T12:44:00Z">
+      <w:ins w:id="717" w:author="Coles, Nicholas A." w:date="2026-08-16T08:44:00Z" w16du:dateUtc="2026-08-16T12:44:00Z">
         <w:r>
           <w:rPr>
             <w:rFonts w:cs="Times New Roman"/>
@@ -17493,7 +17465,7 @@
           <w:t>.</w:t>
         </w:r>
       </w:ins>
-      <w:ins w:id="715" w:author="Coles, Nicholas A." w:date="2026-08-16T08:43:00Z" w16du:dateUtc="2026-08-16T12:43:00Z">
+      <w:ins w:id="718" w:author="Coles, Nicholas A." w:date="2026-08-16T08:43:00Z" w16du:dateUtc="2026-08-16T12:43:00Z">
         <w:r>
           <w:rPr>
             <w:rFonts w:cs="Times New Roman"/>
@@ -17501,7 +17473,7 @@
           <w:t xml:space="preserve"> </w:t>
         </w:r>
       </w:ins>
-      <w:ins w:id="716" w:author="Coles, Nicholas A." w:date="2026-08-16T08:24:00Z" w16du:dateUtc="2026-08-16T12:24:00Z">
+      <w:ins w:id="719" w:author="Coles, Nicholas A." w:date="2026-08-16T08:24:00Z" w16du:dateUtc="2026-08-16T12:24:00Z">
         <w:r>
           <w:rPr>
             <w:rFonts w:cs="Times New Roman"/>
@@ -17509,7 +17481,7 @@
           <w:t xml:space="preserve">Second, </w:t>
         </w:r>
       </w:ins>
-      <w:ins w:id="717" w:author="Coles, Nicholas A." w:date="2026-08-16T08:43:00Z" w16du:dateUtc="2026-08-16T12:43:00Z">
+      <w:ins w:id="720" w:author="Coles, Nicholas A." w:date="2026-08-16T08:43:00Z" w16du:dateUtc="2026-08-16T12:43:00Z">
         <w:r>
           <w:rPr>
             <w:rFonts w:cs="Times New Roman"/>
@@ -17545,7 +17517,7 @@
           <w:t xml:space="preserve"> for facial expression analysis ().</w:t>
         </w:r>
       </w:ins>
-      <w:ins w:id="718" w:author="Coles, Nicholas A." w:date="2026-08-16T08:44:00Z" w16du:dateUtc="2026-08-16T12:44:00Z">
+      <w:ins w:id="721" w:author="Coles, Nicholas A." w:date="2026-08-16T08:44:00Z" w16du:dateUtc="2026-08-16T12:44:00Z">
         <w:r>
           <w:rPr>
             <w:rFonts w:cs="Times New Roman"/>
@@ -17567,7 +17539,7 @@
           <w:t xml:space="preserve"> deprecated their expression analysis API</w:t>
         </w:r>
       </w:ins>
-      <w:ins w:id="719" w:author="Coles, Nicholas A." w:date="2026-08-16T08:52:00Z" w16du:dateUtc="2026-08-16T12:52:00Z">
+      <w:ins w:id="722" w:author="Coles, Nicholas A." w:date="2026-08-16T08:52:00Z" w16du:dateUtc="2026-08-16T12:52:00Z">
         <w:r>
           <w:rPr>
             <w:rFonts w:cs="Times New Roman"/>
@@ -17575,7 +17547,7 @@
           <w:t xml:space="preserve"> </w:t>
         </w:r>
       </w:ins>
-      <w:ins w:id="720" w:author="Coles, Nicholas A." w:date="2026-08-16T20:38:00Z" w16du:dateUtc="2026-08-17T00:38:00Z">
+      <w:ins w:id="723" w:author="Coles, Nicholas A." w:date="2026-08-16T20:38:00Z" w16du:dateUtc="2026-08-17T00:38:00Z">
         <w:r>
           <w:rPr>
             <w:rFonts w:cs="Times New Roman"/>
@@ -17584,7 +17556,7 @@
         </w:r>
       </w:ins>
       <w:proofErr w:type="gramStart"/>
-      <w:ins w:id="721" w:author="Coles, Nicholas A." w:date="2026-08-16T08:52:00Z" w16du:dateUtc="2026-08-16T12:52:00Z">
+      <w:ins w:id="724" w:author="Coles, Nicholas A." w:date="2026-08-16T08:52:00Z" w16du:dateUtc="2026-08-16T12:52:00Z">
         <w:r>
           <w:rPr>
             <w:rFonts w:cs="Times New Roman"/>
@@ -17599,7 +17571,7 @@
           <w:t xml:space="preserve"> 2026</w:t>
         </w:r>
       </w:ins>
-      <w:ins w:id="722" w:author="Coles, Nicholas A." w:date="2026-08-16T20:38:00Z" w16du:dateUtc="2026-08-17T00:38:00Z">
+      <w:ins w:id="725" w:author="Coles, Nicholas A." w:date="2026-08-16T20:38:00Z" w16du:dateUtc="2026-08-17T00:38:00Z">
         <w:r>
           <w:rPr>
             <w:rFonts w:cs="Times New Roman"/>
@@ -17607,7 +17579,7 @@
           <w:t>)</w:t>
         </w:r>
       </w:ins>
-      <w:ins w:id="723" w:author="Coles, Nicholas A." w:date="2026-08-16T08:52:00Z" w16du:dateUtc="2026-08-16T12:52:00Z">
+      <w:ins w:id="726" w:author="Coles, Nicholas A." w:date="2026-08-16T08:52:00Z" w16du:dateUtc="2026-08-16T12:52:00Z">
         <w:r>
           <w:rPr>
             <w:rFonts w:cs="Times New Roman"/>
@@ -17621,11 +17593,11 @@
         <w:spacing w:before="0"/>
         <w:ind w:firstLine="720"/>
         <w:rPr>
-          <w:ins w:id="724" w:author="Coles, Nicholas A." w:date="2026-08-16T09:13:00Z" w16du:dateUtc="2026-08-16T13:13:00Z"/>
+          <w:ins w:id="727" w:author="Coles, Nicholas A." w:date="2026-08-16T09:13:00Z" w16du:dateUtc="2026-08-16T13:13:00Z"/>
           <w:rFonts w:cs="Times New Roman"/>
         </w:rPr>
       </w:pPr>
-      <w:ins w:id="725" w:author="Coles, Nicholas A." w:date="2026-08-14T12:43:00Z" w16du:dateUtc="2026-08-14T16:43:00Z">
+      <w:ins w:id="728" w:author="Coles, Nicholas A." w:date="2026-08-14T12:43:00Z" w16du:dateUtc="2026-08-14T16:43:00Z">
         <w:r>
           <w:rPr>
             <w:rFonts w:cs="Times New Roman"/>
@@ -17633,7 +17605,7 @@
           <w:t>Conceptually</w:t>
         </w:r>
       </w:ins>
-      <w:ins w:id="726" w:author="Coles, Nicholas A." w:date="2026-08-14T12:35:00Z" w16du:dateUtc="2026-08-14T16:35:00Z">
+      <w:ins w:id="729" w:author="Coles, Nicholas A." w:date="2026-08-14T12:35:00Z" w16du:dateUtc="2026-08-14T16:35:00Z">
         <w:r>
           <w:rPr>
             <w:rFonts w:cs="Times New Roman"/>
@@ -17641,7 +17613,7 @@
           <w:t xml:space="preserve">, </w:t>
         </w:r>
       </w:ins>
-      <w:ins w:id="727" w:author="Coles, Nicholas A." w:date="2026-08-16T08:57:00Z" w16du:dateUtc="2026-08-16T12:57:00Z">
+      <w:ins w:id="730" w:author="Coles, Nicholas A." w:date="2026-08-16T08:57:00Z" w16du:dateUtc="2026-08-16T12:57:00Z">
         <w:r>
           <w:rPr>
             <w:rFonts w:cs="Times New Roman"/>
@@ -17649,7 +17621,7 @@
           <w:t xml:space="preserve">our most difficult challenge was </w:t>
         </w:r>
       </w:ins>
-      <w:ins w:id="728" w:author="Coles, Nicholas A." w:date="2026-08-16T08:58:00Z" w16du:dateUtc="2026-08-16T12:58:00Z">
+      <w:ins w:id="731" w:author="Coles, Nicholas A." w:date="2026-08-16T08:58:00Z" w16du:dateUtc="2026-08-16T12:58:00Z">
         <w:r>
           <w:rPr>
             <w:rFonts w:cs="Times New Roman"/>
@@ -17657,7 +17629,7 @@
           <w:t xml:space="preserve">developing a paradigm that would connect </w:t>
         </w:r>
       </w:ins>
-      <w:ins w:id="729" w:author="Coles, Nicholas A." w:date="2026-08-16T09:00:00Z" w16du:dateUtc="2026-08-16T13:00:00Z">
+      <w:ins w:id="732" w:author="Coles, Nicholas A." w:date="2026-08-16T09:00:00Z" w16du:dateUtc="2026-08-16T13:00:00Z">
         <w:r>
           <w:rPr>
             <w:rFonts w:cs="Times New Roman"/>
@@ -17665,7 +17637,7 @@
           <w:t xml:space="preserve">the </w:t>
         </w:r>
       </w:ins>
-      <w:ins w:id="730" w:author="Coles, Nicholas A." w:date="2026-08-16T08:57:00Z" w16du:dateUtc="2026-08-16T12:57:00Z">
+      <w:ins w:id="733" w:author="Coles, Nicholas A." w:date="2026-08-16T08:57:00Z" w16du:dateUtc="2026-08-16T12:57:00Z">
         <w:r>
           <w:rPr>
             <w:rFonts w:cs="Times New Roman"/>
@@ -17673,7 +17645,7 @@
           <w:t xml:space="preserve">emotion embodiment </w:t>
         </w:r>
       </w:ins>
-      <w:ins w:id="731" w:author="Coles, Nicholas A." w:date="2026-08-16T08:58:00Z" w16du:dateUtc="2026-08-16T12:58:00Z">
+      <w:ins w:id="734" w:author="Coles, Nicholas A." w:date="2026-08-16T08:58:00Z" w16du:dateUtc="2026-08-16T12:58:00Z">
         <w:r>
           <w:rPr>
             <w:rFonts w:cs="Times New Roman"/>
@@ -17681,7 +17653,7 @@
           <w:t xml:space="preserve">and </w:t>
         </w:r>
       </w:ins>
-      <w:ins w:id="732" w:author="Coles, Nicholas A." w:date="2026-08-16T08:57:00Z" w16du:dateUtc="2026-08-16T12:57:00Z">
+      <w:ins w:id="735" w:author="Coles, Nicholas A." w:date="2026-08-16T08:57:00Z" w16du:dateUtc="2026-08-16T12:57:00Z">
         <w:r>
           <w:rPr>
             <w:rFonts w:cs="Times New Roman"/>
@@ -17689,7 +17661,7 @@
           <w:t>emotion labor rese</w:t>
         </w:r>
       </w:ins>
-      <w:ins w:id="733" w:author="Coles, Nicholas A." w:date="2026-08-16T08:58:00Z" w16du:dateUtc="2026-08-16T12:58:00Z">
+      <w:ins w:id="736" w:author="Coles, Nicholas A." w:date="2026-08-16T08:58:00Z" w16du:dateUtc="2026-08-16T12:58:00Z">
         <w:r>
           <w:rPr>
             <w:rFonts w:cs="Times New Roman"/>
@@ -17697,7 +17669,7 @@
           <w:t>arch traditions.</w:t>
         </w:r>
       </w:ins>
-      <w:ins w:id="734" w:author="Coles, Nicholas A." w:date="2026-08-16T08:59:00Z" w16du:dateUtc="2026-08-16T12:59:00Z">
+      <w:ins w:id="737" w:author="Coles, Nicholas A." w:date="2026-08-16T08:59:00Z" w16du:dateUtc="2026-08-16T12:59:00Z">
         <w:r>
           <w:rPr>
             <w:rFonts w:cs="Times New Roman"/>
@@ -17705,27 +17677,15 @@
           <w:t xml:space="preserve"> </w:t>
         </w:r>
       </w:ins>
-      <w:ins w:id="735" w:author="Coles, Nicholas A." w:date="2026-08-16T09:02:00Z" w16du:dateUtc="2026-08-16T13:02:00Z">
-        <w:r>
-          <w:rPr>
-            <w:rFonts w:cs="Times New Roman"/>
-          </w:rPr>
-          <w:t xml:space="preserve">We borrowed a paradigm from one of the largest experiments on emotion embodiment </w:t>
-        </w:r>
-        <w:r>
-          <w:rPr>
-            <w:rFonts w:cs="Times New Roman"/>
-          </w:rPr>
-          <w:t>(Coles et al., 2021)</w:t>
-        </w:r>
-        <w:r>
-          <w:rPr>
-            <w:rFonts w:cs="Times New Roman"/>
-          </w:rPr>
-          <w:t xml:space="preserve">, but </w:t>
-        </w:r>
-      </w:ins>
-      <w:ins w:id="736" w:author="Coles, Nicholas A." w:date="2026-08-16T20:40:00Z" w16du:dateUtc="2026-08-17T00:40:00Z">
+      <w:ins w:id="738" w:author="Coles, Nicholas A." w:date="2026-08-16T09:02:00Z" w16du:dateUtc="2026-08-16T13:02:00Z">
+        <w:r>
+          <w:rPr>
+            <w:rFonts w:cs="Times New Roman"/>
+          </w:rPr>
+          <w:t xml:space="preserve">We borrowed a paradigm from one of the largest experiments on emotion embodiment (Coles et al., 2021), but </w:t>
+        </w:r>
+      </w:ins>
+      <w:ins w:id="739" w:author="Coles, Nicholas A." w:date="2026-08-16T20:40:00Z" w16du:dateUtc="2026-08-17T00:40:00Z">
         <w:r>
           <w:rPr>
             <w:rFonts w:cs="Times New Roman"/>
@@ -17733,7 +17693,7 @@
           <w:t xml:space="preserve">we </w:t>
         </w:r>
       </w:ins>
-      <w:ins w:id="737" w:author="Coles, Nicholas A." w:date="2026-08-16T09:02:00Z" w16du:dateUtc="2026-08-16T13:02:00Z">
+      <w:ins w:id="740" w:author="Coles, Nicholas A." w:date="2026-08-16T09:02:00Z" w16du:dateUtc="2026-08-16T13:02:00Z">
         <w:r>
           <w:rPr>
             <w:rFonts w:cs="Times New Roman"/>
@@ -17741,21 +17701,151 @@
           <w:t>introduced changes to better match emotion labor</w:t>
         </w:r>
       </w:ins>
-      <w:ins w:id="738" w:author="Coles, Nicholas A." w:date="2026-08-16T20:39:00Z" w16du:dateUtc="2026-08-17T00:39:00Z">
+      <w:ins w:id="741" w:author="Coles, Nicholas A." w:date="2026-08-16T20:39:00Z" w16du:dateUtc="2026-08-17T00:39:00Z">
+        <w:r>
+          <w:rPr>
+            <w:rFonts w:cs="Times New Roman"/>
+          </w:rPr>
+          <w:t xml:space="preserve"> conditions</w:t>
+        </w:r>
+      </w:ins>
+      <w:ins w:id="742" w:author="Coles, Nicholas A." w:date="2026-08-16T09:02:00Z" w16du:dateUtc="2026-08-16T13:02:00Z">
+        <w:r>
+          <w:rPr>
+            <w:rFonts w:cs="Times New Roman"/>
+          </w:rPr>
+          <w:t>.</w:t>
+        </w:r>
+      </w:ins>
+      <w:ins w:id="743" w:author="Coles, Nicholas A." w:date="2026-08-16T09:03:00Z" w16du:dateUtc="2026-08-16T13:03:00Z">
         <w:r>
           <w:rPr>
             <w:rFonts w:cs="Times New Roman"/>
           </w:rPr>
           <w:t xml:space="preserve"> </w:t>
         </w:r>
-        <w:r>
-          <w:rPr>
-            <w:rFonts w:cs="Times New Roman"/>
-          </w:rPr>
-          <w:t>conditions</w:t>
-        </w:r>
-      </w:ins>
-      <w:ins w:id="739" w:author="Coles, Nicholas A." w:date="2026-08-16T09:02:00Z" w16du:dateUtc="2026-08-16T13:02:00Z">
+      </w:ins>
+      <w:ins w:id="744" w:author="Coles, Nicholas A." w:date="2026-08-16T20:43:00Z" w16du:dateUtc="2026-08-17T00:43:00Z">
+        <w:r>
+          <w:rPr>
+            <w:rFonts w:cs="Times New Roman"/>
+          </w:rPr>
+          <w:t>T</w:t>
+        </w:r>
+      </w:ins>
+      <w:ins w:id="745" w:author="Coles, Nicholas A." w:date="2026-08-16T20:40:00Z" w16du:dateUtc="2026-08-17T00:40:00Z">
+        <w:r>
+          <w:rPr>
+            <w:rFonts w:cs="Times New Roman"/>
+          </w:rPr>
+          <w:t>he most critical change may have been to the</w:t>
+        </w:r>
+      </w:ins>
+      <w:ins w:id="746" w:author="Coles, Nicholas A." w:date="2026-08-16T20:42:00Z" w16du:dateUtc="2026-08-17T00:42:00Z">
+        <w:r>
+          <w:rPr>
+            <w:rFonts w:cs="Times New Roman"/>
+          </w:rPr>
+          <w:t>ir</w:t>
+        </w:r>
+      </w:ins>
+      <w:ins w:id="747" w:author="Coles, Nicholas A." w:date="2026-08-16T20:40:00Z" w16du:dateUtc="2026-08-17T00:40:00Z">
+        <w:r>
+          <w:rPr>
+            <w:rFonts w:cs="Times New Roman"/>
+          </w:rPr>
+          <w:t xml:space="preserve"> </w:t>
+        </w:r>
+      </w:ins>
+      <w:ins w:id="748" w:author="Coles, Nicholas A." w:date="2026-08-16T20:42:00Z" w16du:dateUtc="2026-08-17T00:42:00Z">
+        <w:r>
+          <w:rPr>
+            <w:rFonts w:cs="Times New Roman"/>
+          </w:rPr>
+          <w:t>control condition.</w:t>
+        </w:r>
+      </w:ins>
+      <w:ins w:id="749" w:author="Coles, Nicholas A." w:date="2026-08-16T20:41:00Z" w16du:dateUtc="2026-08-17T00:41:00Z">
+        <w:r>
+          <w:rPr>
+            <w:rFonts w:cs="Times New Roman"/>
+          </w:rPr>
+          <w:t xml:space="preserve"> </w:t>
+        </w:r>
+      </w:ins>
+      <w:ins w:id="750" w:author="Coles, Nicholas A." w:date="2026-08-16T20:42:00Z" w16du:dateUtc="2026-08-17T00:42:00Z">
+        <w:r>
+          <w:rPr>
+            <w:rFonts w:cs="Times New Roman"/>
+          </w:rPr>
+          <w:t>As a control condition, Coles et al. (2021) had participants pose neutral expres</w:t>
+        </w:r>
+      </w:ins>
+      <w:ins w:id="751" w:author="Coles, Nicholas A." w:date="2026-08-16T20:43:00Z" w16du:dateUtc="2026-08-17T00:43:00Z">
+        <w:r>
+          <w:rPr>
+            <w:rFonts w:cs="Times New Roman"/>
+          </w:rPr>
+          <w:t xml:space="preserve">sions. However, posing neutral expressions in </w:t>
+        </w:r>
+      </w:ins>
+      <w:ins w:id="752" w:author="Coles, Nicholas A." w:date="2026-08-16T09:07:00Z" w16du:dateUtc="2026-08-16T13:07:00Z">
+        <w:r>
+          <w:rPr>
+            <w:rFonts w:cs="Times New Roman"/>
+          </w:rPr>
+          <w:t xml:space="preserve">emotional contexts is arguably a form of emotion labor. </w:t>
+        </w:r>
+      </w:ins>
+      <w:ins w:id="753" w:author="Coles, Nicholas A." w:date="2026-08-16T20:44:00Z" w16du:dateUtc="2026-08-17T00:44:00Z">
+        <w:r>
+          <w:rPr>
+            <w:rFonts w:cs="Times New Roman"/>
+          </w:rPr>
+          <w:t xml:space="preserve">We thus opted to </w:t>
+        </w:r>
+      </w:ins>
+      <w:ins w:id="754" w:author="Coles, Nicholas A." w:date="2026-08-16T20:45:00Z" w16du:dateUtc="2026-08-17T00:45:00Z">
+        <w:r>
+          <w:rPr>
+            <w:rFonts w:cs="Times New Roman"/>
+          </w:rPr>
+          <w:t xml:space="preserve">permit </w:t>
+        </w:r>
+      </w:ins>
+      <w:ins w:id="755" w:author="Coles, Nicholas A." w:date="2026-08-16T20:44:00Z" w16du:dateUtc="2026-08-17T00:44:00Z">
+        <w:r>
+          <w:rPr>
+            <w:rFonts w:cs="Times New Roman"/>
+          </w:rPr>
+          <w:t xml:space="preserve">participants </w:t>
+        </w:r>
+      </w:ins>
+      <w:ins w:id="756" w:author="Coles, Nicholas A." w:date="2026-08-16T20:45:00Z" w16du:dateUtc="2026-08-17T00:45:00Z">
+        <w:r>
+          <w:rPr>
+            <w:rFonts w:cs="Times New Roman"/>
+          </w:rPr>
+          <w:t xml:space="preserve">to </w:t>
+        </w:r>
+      </w:ins>
+      <w:ins w:id="757" w:author="Coles, Nicholas A." w:date="2026-08-16T20:44:00Z" w16du:dateUtc="2026-08-17T00:44:00Z">
+        <w:r>
+          <w:rPr>
+            <w:rFonts w:cs="Times New Roman"/>
+          </w:rPr>
+          <w:t>express themselves naturally</w:t>
+        </w:r>
+      </w:ins>
+      <w:ins w:id="758" w:author="Coles, Nicholas A." w:date="2026-08-16T20:45:00Z" w16du:dateUtc="2026-08-17T00:45:00Z">
+        <w:r>
+          <w:rPr>
+            <w:rFonts w:cs="Times New Roman"/>
+          </w:rPr>
+          <w:t xml:space="preserve"> in the control condition</w:t>
+        </w:r>
+      </w:ins>
+      <w:ins w:id="759" w:author="Coles, Nicholas A." w:date="2026-08-16T20:44:00Z" w16du:dateUtc="2026-08-17T00:44:00Z">
         <w:r>
           <w:rPr>
             <w:rFonts w:cs="Times New Roman"/>
@@ -17763,143 +17853,7 @@
           <w:t>.</w:t>
         </w:r>
       </w:ins>
-      <w:ins w:id="740" w:author="Coles, Nicholas A." w:date="2026-08-16T09:03:00Z" w16du:dateUtc="2026-08-16T13:03:00Z">
-        <w:r>
-          <w:rPr>
-            <w:rFonts w:cs="Times New Roman"/>
-          </w:rPr>
-          <w:t xml:space="preserve"> </w:t>
-        </w:r>
-      </w:ins>
-      <w:ins w:id="741" w:author="Coles, Nicholas A." w:date="2026-08-16T20:43:00Z" w16du:dateUtc="2026-08-17T00:43:00Z">
-        <w:r>
-          <w:rPr>
-            <w:rFonts w:cs="Times New Roman"/>
-          </w:rPr>
-          <w:t>T</w:t>
-        </w:r>
-      </w:ins>
-      <w:ins w:id="742" w:author="Coles, Nicholas A." w:date="2026-08-16T20:40:00Z" w16du:dateUtc="2026-08-17T00:40:00Z">
-        <w:r>
-          <w:rPr>
-            <w:rFonts w:cs="Times New Roman"/>
-          </w:rPr>
-          <w:t>he most critical change may have been to the</w:t>
-        </w:r>
-      </w:ins>
-      <w:ins w:id="743" w:author="Coles, Nicholas A." w:date="2026-08-16T20:42:00Z" w16du:dateUtc="2026-08-17T00:42:00Z">
-        <w:r>
-          <w:rPr>
-            <w:rFonts w:cs="Times New Roman"/>
-          </w:rPr>
-          <w:t>ir</w:t>
-        </w:r>
-      </w:ins>
-      <w:ins w:id="744" w:author="Coles, Nicholas A." w:date="2026-08-16T20:40:00Z" w16du:dateUtc="2026-08-17T00:40:00Z">
-        <w:r>
-          <w:rPr>
-            <w:rFonts w:cs="Times New Roman"/>
-          </w:rPr>
-          <w:t xml:space="preserve"> </w:t>
-        </w:r>
-      </w:ins>
-      <w:ins w:id="745" w:author="Coles, Nicholas A." w:date="2026-08-16T20:42:00Z" w16du:dateUtc="2026-08-17T00:42:00Z">
-        <w:r>
-          <w:rPr>
-            <w:rFonts w:cs="Times New Roman"/>
-          </w:rPr>
-          <w:t>control condition.</w:t>
-        </w:r>
-      </w:ins>
-      <w:ins w:id="746" w:author="Coles, Nicholas A." w:date="2026-08-16T20:41:00Z" w16du:dateUtc="2026-08-17T00:41:00Z">
-        <w:r>
-          <w:rPr>
-            <w:rFonts w:cs="Times New Roman"/>
-          </w:rPr>
-          <w:t xml:space="preserve"> </w:t>
-        </w:r>
-      </w:ins>
-      <w:ins w:id="747" w:author="Coles, Nicholas A." w:date="2026-08-16T20:42:00Z" w16du:dateUtc="2026-08-17T00:42:00Z">
-        <w:r>
-          <w:rPr>
-            <w:rFonts w:cs="Times New Roman"/>
-          </w:rPr>
-          <w:t>As a control condition, Coles et al. (2021) had participants pose neutral expres</w:t>
-        </w:r>
-      </w:ins>
-      <w:ins w:id="748" w:author="Coles, Nicholas A." w:date="2026-08-16T20:43:00Z" w16du:dateUtc="2026-08-17T00:43:00Z">
-        <w:r>
-          <w:rPr>
-            <w:rFonts w:cs="Times New Roman"/>
-          </w:rPr>
-          <w:t xml:space="preserve">sions. However, posing neutral expressions in </w:t>
-        </w:r>
-      </w:ins>
-      <w:ins w:id="749" w:author="Coles, Nicholas A." w:date="2026-08-16T09:07:00Z" w16du:dateUtc="2026-08-16T13:07:00Z">
-        <w:r>
-          <w:rPr>
-            <w:rFonts w:cs="Times New Roman"/>
-          </w:rPr>
-          <w:t xml:space="preserve">emotional contexts is arguably a form of emotion labor. </w:t>
-        </w:r>
-      </w:ins>
-      <w:ins w:id="750" w:author="Coles, Nicholas A." w:date="2026-08-16T20:44:00Z" w16du:dateUtc="2026-08-17T00:44:00Z">
-        <w:r>
-          <w:rPr>
-            <w:rFonts w:cs="Times New Roman"/>
-          </w:rPr>
-          <w:t xml:space="preserve">We thus opted to </w:t>
-        </w:r>
-      </w:ins>
-      <w:ins w:id="751" w:author="Coles, Nicholas A." w:date="2026-08-16T20:45:00Z" w16du:dateUtc="2026-08-17T00:45:00Z">
-        <w:r>
-          <w:rPr>
-            <w:rFonts w:cs="Times New Roman"/>
-          </w:rPr>
-          <w:t xml:space="preserve">permit </w:t>
-        </w:r>
-      </w:ins>
-      <w:ins w:id="752" w:author="Coles, Nicholas A." w:date="2026-08-16T20:44:00Z" w16du:dateUtc="2026-08-17T00:44:00Z">
-        <w:r>
-          <w:rPr>
-            <w:rFonts w:cs="Times New Roman"/>
-          </w:rPr>
-          <w:t xml:space="preserve">participants </w:t>
-        </w:r>
-      </w:ins>
-      <w:ins w:id="753" w:author="Coles, Nicholas A." w:date="2026-08-16T20:45:00Z" w16du:dateUtc="2026-08-17T00:45:00Z">
-        <w:r>
-          <w:rPr>
-            <w:rFonts w:cs="Times New Roman"/>
-          </w:rPr>
-          <w:t xml:space="preserve">to </w:t>
-        </w:r>
-      </w:ins>
-      <w:ins w:id="754" w:author="Coles, Nicholas A." w:date="2026-08-16T20:44:00Z" w16du:dateUtc="2026-08-17T00:44:00Z">
-        <w:r>
-          <w:rPr>
-            <w:rFonts w:cs="Times New Roman"/>
-          </w:rPr>
-          <w:t>express themselves naturally</w:t>
-        </w:r>
-      </w:ins>
-      <w:ins w:id="755" w:author="Coles, Nicholas A." w:date="2026-08-16T20:45:00Z" w16du:dateUtc="2026-08-17T00:45:00Z">
-        <w:r>
-          <w:rPr>
-            <w:rFonts w:cs="Times New Roman"/>
-          </w:rPr>
-          <w:t xml:space="preserve"> in the control condition</w:t>
-        </w:r>
-      </w:ins>
-      <w:ins w:id="756" w:author="Coles, Nicholas A." w:date="2026-08-16T20:44:00Z" w16du:dateUtc="2026-08-17T00:44:00Z">
-        <w:r>
-          <w:rPr>
-            <w:rFonts w:cs="Times New Roman"/>
-          </w:rPr>
-          <w:t>.</w:t>
-        </w:r>
-      </w:ins>
-      <w:ins w:id="757" w:author="Coles, Nicholas A." w:date="2026-08-16T20:46:00Z" w16du:dateUtc="2026-08-17T00:46:00Z">
+      <w:ins w:id="760" w:author="Coles, Nicholas A." w:date="2026-08-16T20:46:00Z" w16du:dateUtc="2026-08-17T00:46:00Z">
         <w:r>
           <w:rPr>
             <w:rFonts w:cs="Times New Roman"/>
@@ -17907,7 +17861,7 @@
           <w:t xml:space="preserve"> Unfortunately, this introduced necessary confounds oft avoided in the </w:t>
         </w:r>
       </w:ins>
-      <w:ins w:id="758" w:author="Coles, Nicholas A." w:date="2026-08-14T12:50:00Z" w16du:dateUtc="2026-08-14T16:50:00Z">
+      <w:ins w:id="761" w:author="Coles, Nicholas A." w:date="2026-08-14T12:50:00Z" w16du:dateUtc="2026-08-14T16:50:00Z">
         <w:r>
           <w:rPr>
             <w:rFonts w:cs="Times New Roman"/>
@@ -17915,7 +17869,7 @@
           <w:t xml:space="preserve">emotion embodiment research (e.g., </w:t>
         </w:r>
       </w:ins>
-      <w:ins w:id="759" w:author="Coles, Nicholas A." w:date="2026-08-14T12:52:00Z" w16du:dateUtc="2026-08-14T16:52:00Z">
+      <w:ins w:id="762" w:author="Coles, Nicholas A." w:date="2026-08-14T12:52:00Z" w16du:dateUtc="2026-08-14T16:52:00Z">
         <w:r>
           <w:rPr>
             <w:rFonts w:cs="Times New Roman"/>
@@ -17923,7 +17877,7 @@
           <w:t xml:space="preserve">differences in the </w:t>
         </w:r>
       </w:ins>
-      <w:ins w:id="760" w:author="Coles, Nicholas A." w:date="2026-08-14T12:51:00Z" w16du:dateUtc="2026-08-14T16:51:00Z">
+      <w:ins w:id="763" w:author="Coles, Nicholas A." w:date="2026-08-14T12:51:00Z" w16du:dateUtc="2026-08-14T16:51:00Z">
         <w:r>
           <w:rPr>
             <w:rFonts w:cs="Times New Roman"/>
@@ -17931,7 +17885,7 @@
           <w:t>difficulty</w:t>
         </w:r>
       </w:ins>
-      <w:ins w:id="761" w:author="Coles, Nicholas A." w:date="2026-08-14T12:52:00Z" w16du:dateUtc="2026-08-14T16:52:00Z">
+      <w:ins w:id="764" w:author="Coles, Nicholas A." w:date="2026-08-14T12:52:00Z" w16du:dateUtc="2026-08-14T16:52:00Z">
         <w:r>
           <w:rPr>
             <w:rFonts w:cs="Times New Roman"/>
@@ -17939,7 +17893,7 @@
           <w:t xml:space="preserve"> and annoyance</w:t>
         </w:r>
       </w:ins>
-      <w:ins w:id="762" w:author="Coles, Nicholas A." w:date="2026-08-14T12:51:00Z" w16du:dateUtc="2026-08-14T16:51:00Z">
+      <w:ins w:id="765" w:author="Coles, Nicholas A." w:date="2026-08-14T12:51:00Z" w16du:dateUtc="2026-08-14T16:51:00Z">
         <w:r>
           <w:rPr>
             <w:rFonts w:cs="Times New Roman"/>
@@ -17947,7 +17901,7 @@
           <w:t>).</w:t>
         </w:r>
       </w:ins>
-      <w:ins w:id="763" w:author="Coles, Nicholas A." w:date="2026-08-14T12:53:00Z" w16du:dateUtc="2026-08-14T16:53:00Z">
+      <w:ins w:id="766" w:author="Coles, Nicholas A." w:date="2026-08-14T12:53:00Z" w16du:dateUtc="2026-08-14T16:53:00Z">
         <w:r>
           <w:rPr>
             <w:rFonts w:cs="Times New Roman"/>
@@ -17955,7 +17909,7 @@
           <w:t xml:space="preserve"> This may </w:t>
         </w:r>
       </w:ins>
-      <w:ins w:id="764" w:author="Coles, Nicholas A." w:date="2026-08-16T20:46:00Z" w16du:dateUtc="2026-08-17T00:46:00Z">
+      <w:ins w:id="767" w:author="Coles, Nicholas A." w:date="2026-08-16T20:46:00Z" w16du:dateUtc="2026-08-17T00:46:00Z">
         <w:r>
           <w:rPr>
             <w:rFonts w:cs="Times New Roman"/>
@@ -17963,7 +17917,7 @@
           <w:t xml:space="preserve">help </w:t>
         </w:r>
       </w:ins>
-      <w:ins w:id="765" w:author="Coles, Nicholas A." w:date="2026-08-14T12:53:00Z" w16du:dateUtc="2026-08-14T16:53:00Z">
+      <w:ins w:id="768" w:author="Coles, Nicholas A." w:date="2026-08-14T12:53:00Z" w16du:dateUtc="2026-08-14T16:53:00Z">
         <w:r>
           <w:rPr>
             <w:rFonts w:cs="Times New Roman"/>
@@ -17971,7 +17925,7 @@
           <w:t>explain why facial feedback effects were less robust than initially predicted</w:t>
         </w:r>
       </w:ins>
-      <w:ins w:id="766" w:author="Coles, Nicholas A." w:date="2026-08-14T12:54:00Z" w16du:dateUtc="2026-08-14T16:54:00Z">
+      <w:ins w:id="769" w:author="Coles, Nicholas A." w:date="2026-08-14T12:54:00Z" w16du:dateUtc="2026-08-14T16:54:00Z">
         <w:r>
           <w:rPr>
             <w:rFonts w:cs="Times New Roman"/>
@@ -17979,7 +17933,7 @@
           <w:t xml:space="preserve">. </w:t>
         </w:r>
       </w:ins>
-      <w:ins w:id="767" w:author="Coles, Nicholas A." w:date="2026-08-16T09:09:00Z" w16du:dateUtc="2026-08-16T13:09:00Z">
+      <w:ins w:id="770" w:author="Coles, Nicholas A." w:date="2026-08-16T09:09:00Z" w16du:dateUtc="2026-08-16T13:09:00Z">
         <w:r>
           <w:rPr>
             <w:rFonts w:cs="Times New Roman"/>
@@ -17987,7 +17941,7 @@
           <w:t>When controlling for effort via neutral pose comparisons, i</w:t>
         </w:r>
       </w:ins>
-      <w:ins w:id="768" w:author="Coles, Nicholas A." w:date="2026-08-16T09:10:00Z" w16du:dateUtc="2026-08-16T13:10:00Z">
+      <w:ins w:id="771" w:author="Coles, Nicholas A." w:date="2026-08-16T09:10:00Z" w16du:dateUtc="2026-08-16T13:10:00Z">
         <w:r>
           <w:rPr>
             <w:rFonts w:cs="Times New Roman"/>
@@ -17995,7 +17949,7 @@
           <w:t xml:space="preserve">t is possible that participants </w:t>
         </w:r>
       </w:ins>
-      <w:ins w:id="769" w:author="Coles, Nicholas A." w:date="2026-08-16T09:12:00Z" w16du:dateUtc="2026-08-16T13:12:00Z">
+      <w:ins w:id="772" w:author="Coles, Nicholas A." w:date="2026-08-16T09:12:00Z" w16du:dateUtc="2026-08-16T13:12:00Z">
         <w:r>
           <w:rPr>
             <w:rFonts w:cs="Times New Roman"/>
@@ -18003,7 +17957,7 @@
           <w:t xml:space="preserve">would </w:t>
         </w:r>
       </w:ins>
-      <w:ins w:id="770" w:author="Coles, Nicholas A." w:date="2026-08-16T09:10:00Z" w16du:dateUtc="2026-08-16T13:10:00Z">
+      <w:ins w:id="773" w:author="Coles, Nicholas A." w:date="2026-08-16T09:10:00Z" w16du:dateUtc="2026-08-16T13:10:00Z">
         <w:r>
           <w:rPr>
             <w:rFonts w:cs="Times New Roman"/>
@@ -18011,7 +17965,7 @@
           <w:t xml:space="preserve">more reliably report higher levels of happiness after posing smiles. </w:t>
         </w:r>
       </w:ins>
-      <w:ins w:id="771" w:author="Coles, Nicholas A." w:date="2026-08-16T09:12:00Z" w16du:dateUtc="2026-08-16T13:12:00Z">
+      <w:ins w:id="774" w:author="Coles, Nicholas A." w:date="2026-08-16T09:12:00Z" w16du:dateUtc="2026-08-16T13:12:00Z">
         <w:r>
           <w:rPr>
             <w:rFonts w:cs="Times New Roman"/>
@@ -18019,7 +17973,7 @@
           <w:t xml:space="preserve">However, </w:t>
         </w:r>
       </w:ins>
-      <w:ins w:id="772" w:author="Coles, Nicholas A." w:date="2026-08-16T09:13:00Z" w16du:dateUtc="2026-08-16T13:13:00Z">
+      <w:ins w:id="775" w:author="Coles, Nicholas A." w:date="2026-08-16T09:13:00Z" w16du:dateUtc="2026-08-16T13:13:00Z">
         <w:r>
           <w:rPr>
             <w:rFonts w:cs="Times New Roman"/>
@@ -18033,11 +17987,11 @@
         <w:spacing w:before="0"/>
         <w:ind w:firstLine="720"/>
         <w:rPr>
-          <w:ins w:id="773" w:author="Coles, Nicholas A." w:date="2026-08-14T13:14:00Z" w16du:dateUtc="2026-08-14T17:14:00Z"/>
+          <w:ins w:id="776" w:author="Coles, Nicholas A." w:date="2026-08-14T13:14:00Z" w16du:dateUtc="2026-08-14T17:14:00Z"/>
           <w:rFonts w:cs="Times New Roman"/>
         </w:rPr>
       </w:pPr>
-      <w:ins w:id="774" w:author="Coles, Nicholas A." w:date="2026-08-16T09:14:00Z" w16du:dateUtc="2026-08-16T13:14:00Z">
+      <w:ins w:id="777" w:author="Coles, Nicholas A." w:date="2026-08-16T09:14:00Z" w16du:dateUtc="2026-08-16T13:14:00Z">
         <w:r>
           <w:rPr>
             <w:rFonts w:cs="Times New Roman"/>
@@ -18045,7 +17999,7 @@
           <w:t xml:space="preserve">Despite </w:t>
         </w:r>
       </w:ins>
-      <w:ins w:id="775" w:author="Coles, Nicholas A." w:date="2026-08-16T20:48:00Z" w16du:dateUtc="2026-08-17T00:48:00Z">
+      <w:ins w:id="778" w:author="Coles, Nicholas A." w:date="2026-08-16T20:48:00Z" w16du:dateUtc="2026-08-17T00:48:00Z">
         <w:r>
           <w:rPr>
             <w:rFonts w:cs="Times New Roman"/>
@@ -18053,7 +18007,7 @@
           <w:t>attempts to bridge emotion embodiment and labor research traditions</w:t>
         </w:r>
       </w:ins>
-      <w:ins w:id="776" w:author="Coles, Nicholas A." w:date="2026-08-14T13:09:00Z" w16du:dateUtc="2026-08-14T17:09:00Z">
+      <w:ins w:id="779" w:author="Coles, Nicholas A." w:date="2026-08-14T13:09:00Z" w16du:dateUtc="2026-08-14T17:09:00Z">
         <w:r>
           <w:rPr>
             <w:rFonts w:cs="Times New Roman"/>
@@ -18061,7 +18015,7 @@
           <w:t xml:space="preserve">, our experimental context </w:t>
         </w:r>
       </w:ins>
-      <w:ins w:id="777" w:author="Coles, Nicholas A." w:date="2026-08-16T09:15:00Z" w16du:dateUtc="2026-08-16T13:15:00Z">
+      <w:ins w:id="780" w:author="Coles, Nicholas A." w:date="2026-08-16T09:15:00Z" w16du:dateUtc="2026-08-16T13:15:00Z">
         <w:r>
           <w:rPr>
             <w:rFonts w:cs="Times New Roman"/>
@@ -18069,7 +18023,7 @@
           <w:t xml:space="preserve">also </w:t>
         </w:r>
       </w:ins>
-      <w:ins w:id="778" w:author="Coles, Nicholas A." w:date="2026-08-16T09:14:00Z" w16du:dateUtc="2026-08-16T13:14:00Z">
+      <w:ins w:id="781" w:author="Coles, Nicholas A." w:date="2026-08-16T09:14:00Z" w16du:dateUtc="2026-08-16T13:14:00Z">
         <w:r>
           <w:rPr>
             <w:rFonts w:cs="Times New Roman"/>
@@ -18077,7 +18031,7 @@
           <w:t xml:space="preserve">did not strongly </w:t>
         </w:r>
       </w:ins>
-      <w:ins w:id="779" w:author="Coles, Nicholas A." w:date="2026-08-14T13:09:00Z" w16du:dateUtc="2026-08-14T17:09:00Z">
+      <w:ins w:id="782" w:author="Coles, Nicholas A." w:date="2026-08-14T13:09:00Z" w16du:dateUtc="2026-08-14T17:09:00Z">
         <w:r>
           <w:rPr>
             <w:rFonts w:cs="Times New Roman"/>
@@ -18085,7 +18039,7 @@
           <w:t>match the rich real-world c</w:t>
         </w:r>
       </w:ins>
-      <w:ins w:id="780" w:author="Coles, Nicholas A." w:date="2026-08-14T13:10:00Z" w16du:dateUtc="2026-08-14T17:10:00Z">
+      <w:ins w:id="783" w:author="Coles, Nicholas A." w:date="2026-08-14T13:10:00Z" w16du:dateUtc="2026-08-14T17:10:00Z">
         <w:r>
           <w:rPr>
             <w:rFonts w:cs="Times New Roman"/>
@@ -18093,7 +18047,7 @@
           <w:t xml:space="preserve">onditions often studied by emotion labor researchers. </w:t>
         </w:r>
       </w:ins>
-      <w:ins w:id="781" w:author="Coles, Nicholas A." w:date="2026-08-16T09:15:00Z" w16du:dateUtc="2026-08-16T13:15:00Z">
+      <w:ins w:id="784" w:author="Coles, Nicholas A." w:date="2026-08-16T09:15:00Z" w16du:dateUtc="2026-08-16T13:15:00Z">
         <w:r>
           <w:rPr>
             <w:rFonts w:cs="Times New Roman"/>
@@ -18101,7 +18055,7 @@
           <w:t>T</w:t>
         </w:r>
       </w:ins>
-      <w:ins w:id="782" w:author="Coles, Nicholas A." w:date="2026-08-14T13:10:00Z" w16du:dateUtc="2026-08-14T17:10:00Z">
+      <w:ins w:id="785" w:author="Coles, Nicholas A." w:date="2026-08-14T13:10:00Z" w16du:dateUtc="2026-08-14T17:10:00Z">
         <w:r>
           <w:rPr>
             <w:rFonts w:cs="Times New Roman"/>
@@ -18109,7 +18063,7 @@
           <w:t xml:space="preserve">his is particularly </w:t>
         </w:r>
       </w:ins>
-      <w:ins w:id="783" w:author="Coles, Nicholas A." w:date="2026-08-16T09:15:00Z" w16du:dateUtc="2026-08-16T13:15:00Z">
+      <w:ins w:id="786" w:author="Coles, Nicholas A." w:date="2026-08-16T09:15:00Z" w16du:dateUtc="2026-08-16T13:15:00Z">
         <w:r>
           <w:rPr>
             <w:rFonts w:cs="Times New Roman"/>
@@ -18117,7 +18071,7 @@
           <w:t xml:space="preserve">notable </w:t>
         </w:r>
       </w:ins>
-      <w:ins w:id="784" w:author="Coles, Nicholas A." w:date="2026-08-14T13:10:00Z" w16du:dateUtc="2026-08-14T17:10:00Z">
+      <w:ins w:id="787" w:author="Coles, Nicholas A." w:date="2026-08-14T13:10:00Z" w16du:dateUtc="2026-08-14T17:10:00Z">
         <w:r>
           <w:rPr>
             <w:rFonts w:cs="Times New Roman"/>
@@ -18125,7 +18079,7 @@
           <w:t>when considering</w:t>
         </w:r>
       </w:ins>
-      <w:ins w:id="785" w:author="Coles, Nicholas A." w:date="2026-08-14T13:11:00Z" w16du:dateUtc="2026-08-14T17:11:00Z">
+      <w:ins w:id="788" w:author="Coles, Nicholas A." w:date="2026-08-14T13:11:00Z" w16du:dateUtc="2026-08-14T17:11:00Z">
         <w:r>
           <w:rPr>
             <w:rFonts w:cs="Times New Roman"/>
@@ -18133,7 +18087,7 @@
           <w:t xml:space="preserve"> </w:t>
         </w:r>
       </w:ins>
-      <w:ins w:id="786" w:author="Coles, Nicholas A." w:date="2026-08-16T09:16:00Z" w16du:dateUtc="2026-08-16T13:16:00Z">
+      <w:ins w:id="789" w:author="Coles, Nicholas A." w:date="2026-08-16T09:16:00Z" w16du:dateUtc="2026-08-16T13:16:00Z">
         <w:r>
           <w:rPr>
             <w:rFonts w:cs="Times New Roman"/>
@@ -18141,7 +18095,7 @@
           <w:t>our estimated effects on</w:t>
         </w:r>
       </w:ins>
-      <w:ins w:id="787" w:author="Coles, Nicholas A." w:date="2026-08-14T13:11:00Z" w16du:dateUtc="2026-08-14T17:11:00Z">
+      <w:ins w:id="790" w:author="Coles, Nicholas A." w:date="2026-08-14T13:11:00Z" w16du:dateUtc="2026-08-14T17:11:00Z">
         <w:r>
           <w:rPr>
             <w:rFonts w:cs="Times New Roman"/>
@@ -18149,7 +18103,7 @@
           <w:t xml:space="preserve"> burnout and well-being. In the span of a short experimen</w:t>
         </w:r>
       </w:ins>
-      <w:ins w:id="788" w:author="Coles, Nicholas A." w:date="2026-08-14T13:12:00Z" w16du:dateUtc="2026-08-14T17:12:00Z">
+      <w:ins w:id="791" w:author="Coles, Nicholas A." w:date="2026-08-14T13:12:00Z" w16du:dateUtc="2026-08-14T17:12:00Z">
         <w:r>
           <w:rPr>
             <w:rFonts w:cs="Times New Roman"/>
@@ -18157,7 +18111,7 @@
           <w:t xml:space="preserve">t, we did not find that repeated demands to pose smiles led to </w:t>
         </w:r>
       </w:ins>
-      <w:ins w:id="789" w:author="Coles, Nicholas A." w:date="2026-08-16T09:16:00Z" w16du:dateUtc="2026-08-16T13:16:00Z">
+      <w:ins w:id="792" w:author="Coles, Nicholas A." w:date="2026-08-16T09:16:00Z" w16du:dateUtc="2026-08-16T13:16:00Z">
         <w:r>
           <w:rPr>
             <w:rFonts w:cs="Times New Roman"/>
@@ -18165,7 +18119,7 @@
           <w:t xml:space="preserve">substantial </w:t>
         </w:r>
       </w:ins>
-      <w:ins w:id="790" w:author="Coles, Nicholas A." w:date="2026-08-14T13:12:00Z" w16du:dateUtc="2026-08-14T17:12:00Z">
+      <w:ins w:id="793" w:author="Coles, Nicholas A." w:date="2026-08-14T13:12:00Z" w16du:dateUtc="2026-08-14T17:12:00Z">
         <w:r>
           <w:rPr>
             <w:rFonts w:cs="Times New Roman"/>
@@ -18173,7 +18127,7 @@
           <w:t xml:space="preserve">differences in burnout and well-being. However, when repeated </w:t>
         </w:r>
       </w:ins>
-      <w:ins w:id="791" w:author="Coles, Nicholas A." w:date="2026-08-14T13:13:00Z" w16du:dateUtc="2026-08-14T17:13:00Z">
+      <w:ins w:id="794" w:author="Coles, Nicholas A." w:date="2026-08-14T13:13:00Z" w16du:dateUtc="2026-08-14T17:13:00Z">
         <w:r>
           <w:rPr>
             <w:rFonts w:cs="Times New Roman"/>
@@ -18182,7 +18136,7 @@
           <w:t>for days, weeks, or even years, it does not strike us as implausible that such effects could robustly emerge</w:t>
         </w:r>
       </w:ins>
-      <w:ins w:id="792" w:author="Coles, Nicholas A." w:date="2026-08-14T13:14:00Z" w16du:dateUtc="2026-08-14T17:14:00Z">
+      <w:ins w:id="795" w:author="Coles, Nicholas A." w:date="2026-08-14T13:14:00Z" w16du:dateUtc="2026-08-14T17:14:00Z">
         <w:r>
           <w:rPr>
             <w:rFonts w:cs="Times New Roman"/>
@@ -18208,11 +18162,11 @@
         <w:spacing w:before="0"/>
         <w:ind w:firstLine="720"/>
         <w:rPr>
-          <w:ins w:id="793" w:author="Coles, Nicholas A." w:date="2026-08-15T19:49:00Z" w16du:dateUtc="2026-08-15T23:49:00Z"/>
+          <w:ins w:id="796" w:author="Coles, Nicholas A." w:date="2026-08-15T19:49:00Z" w16du:dateUtc="2026-08-15T23:49:00Z"/>
           <w:rFonts w:cs="Times New Roman"/>
         </w:rPr>
       </w:pPr>
-      <w:ins w:id="794" w:author="Coles, Nicholas A." w:date="2026-08-14T13:14:00Z" w16du:dateUtc="2026-08-14T17:14:00Z">
+      <w:ins w:id="797" w:author="Coles, Nicholas A." w:date="2026-08-14T13:14:00Z" w16du:dateUtc="2026-08-14T17:14:00Z">
         <w:r>
           <w:rPr>
             <w:rFonts w:cs="Times New Roman"/>
@@ -18220,7 +18174,7 @@
           <w:t xml:space="preserve">Last, we note that participants </w:t>
         </w:r>
       </w:ins>
-      <w:ins w:id="795" w:author="Coles, Nicholas A." w:date="2026-08-16T21:10:00Z" w16du:dateUtc="2026-08-17T01:10:00Z">
+      <w:ins w:id="798" w:author="Coles, Nicholas A." w:date="2026-08-16T21:10:00Z" w16du:dateUtc="2026-08-17T01:10:00Z">
         <w:r>
           <w:rPr>
             <w:rFonts w:cs="Times New Roman"/>
@@ -18228,7 +18182,7 @@
           <w:t xml:space="preserve">often </w:t>
         </w:r>
       </w:ins>
-      <w:ins w:id="796" w:author="Coles, Nicholas A." w:date="2026-08-14T13:15:00Z" w16du:dateUtc="2026-08-14T17:15:00Z">
+      <w:ins w:id="799" w:author="Coles, Nicholas A." w:date="2026-08-14T13:15:00Z" w16du:dateUtc="2026-08-14T17:15:00Z">
         <w:r>
           <w:rPr>
             <w:rFonts w:cs="Times New Roman"/>
@@ -18236,7 +18190,7 @@
           <w:t>pose</w:t>
         </w:r>
       </w:ins>
-      <w:ins w:id="797" w:author="Coles, Nicholas A." w:date="2026-08-14T13:16:00Z" w16du:dateUtc="2026-08-14T17:16:00Z">
+      <w:ins w:id="800" w:author="Coles, Nicholas A." w:date="2026-08-14T13:16:00Z" w16du:dateUtc="2026-08-14T17:16:00Z">
         <w:r>
           <w:rPr>
             <w:rFonts w:cs="Times New Roman"/>
@@ -18244,7 +18198,7 @@
           <w:t>d</w:t>
         </w:r>
       </w:ins>
-      <w:ins w:id="798" w:author="Coles, Nicholas A." w:date="2026-08-14T13:15:00Z" w16du:dateUtc="2026-08-14T17:15:00Z">
+      <w:ins w:id="801" w:author="Coles, Nicholas A." w:date="2026-08-14T13:15:00Z" w16du:dateUtc="2026-08-14T17:15:00Z">
         <w:r>
           <w:rPr>
             <w:rFonts w:cs="Times New Roman"/>
@@ -18252,7 +18206,15 @@
           <w:t xml:space="preserve"> </w:t>
         </w:r>
       </w:ins>
-      <w:ins w:id="799" w:author="Coles, Nicholas A." w:date="2026-08-16T21:10:00Z" w16du:dateUtc="2026-08-17T01:10:00Z">
+      <w:ins w:id="802" w:author="Coles, Nicholas A." w:date="2026-08-17T02:54:00Z" w16du:dateUtc="2026-08-17T06:54:00Z">
+        <w:r>
+          <w:rPr>
+            <w:rFonts w:cs="Times New Roman"/>
+          </w:rPr>
+          <w:t xml:space="preserve">relatively </w:t>
+        </w:r>
+      </w:ins>
+      <w:ins w:id="803" w:author="Coles, Nicholas A." w:date="2026-08-16T21:10:00Z" w16du:dateUtc="2026-08-17T01:10:00Z">
         <w:r>
           <w:rPr>
             <w:rFonts w:cs="Times New Roman"/>
@@ -18260,7 +18222,7 @@
           <w:t>weak, non-</w:t>
         </w:r>
       </w:ins>
-      <w:ins w:id="800" w:author="Coles, Nicholas A." w:date="2026-08-16T21:05:00Z" w16du:dateUtc="2026-08-17T01:05:00Z">
+      <w:ins w:id="804" w:author="Coles, Nicholas A." w:date="2026-08-16T21:05:00Z" w16du:dateUtc="2026-08-17T01:05:00Z">
         <w:r>
           <w:rPr>
             <w:rFonts w:cs="Times New Roman"/>
@@ -18268,7 +18230,7 @@
           <w:t>prototypical expressions of happiness</w:t>
         </w:r>
       </w:ins>
-      <w:ins w:id="801" w:author="Coles, Nicholas A." w:date="2026-08-14T13:17:00Z" w16du:dateUtc="2026-08-14T17:17:00Z">
+      <w:ins w:id="805" w:author="Coles, Nicholas A." w:date="2026-08-14T13:17:00Z" w16du:dateUtc="2026-08-14T17:17:00Z">
         <w:r>
           <w:rPr>
             <w:rFonts w:cs="Times New Roman"/>
@@ -18276,7 +18238,7 @@
           <w:t>.</w:t>
         </w:r>
       </w:ins>
-      <w:ins w:id="802" w:author="Coles, Nicholas A." w:date="2026-08-14T13:19:00Z" w16du:dateUtc="2026-08-14T17:19:00Z">
+      <w:ins w:id="806" w:author="Coles, Nicholas A." w:date="2026-08-14T13:19:00Z" w16du:dateUtc="2026-08-14T17:19:00Z">
         <w:r>
           <w:rPr>
             <w:rFonts w:cs="Times New Roman"/>
@@ -18284,7 +18246,7 @@
           <w:t xml:space="preserve"> Many emotion embodiment theorists argue that</w:t>
         </w:r>
       </w:ins>
-      <w:ins w:id="803" w:author="Coles, Nicholas A." w:date="2026-08-14T13:20:00Z" w16du:dateUtc="2026-08-14T17:20:00Z">
+      <w:ins w:id="807" w:author="Coles, Nicholas A." w:date="2026-08-14T13:20:00Z" w16du:dateUtc="2026-08-14T17:20:00Z">
         <w:r>
           <w:rPr>
             <w:rFonts w:cs="Times New Roman"/>
@@ -18292,7 +18254,7 @@
           <w:t xml:space="preserve"> </w:t>
         </w:r>
       </w:ins>
-      <w:ins w:id="804" w:author="Coles, Nicholas A." w:date="2026-08-16T21:08:00Z" w16du:dateUtc="2026-08-17T01:08:00Z">
+      <w:ins w:id="808" w:author="Coles, Nicholas A." w:date="2026-08-16T21:08:00Z" w16du:dateUtc="2026-08-17T01:08:00Z">
         <w:r>
           <w:rPr>
             <w:rFonts w:cs="Times New Roman"/>
@@ -18300,15 +18262,31 @@
           <w:t xml:space="preserve">facial movements </w:t>
         </w:r>
       </w:ins>
-      <w:ins w:id="805" w:author="Coles, Nicholas A." w:date="2026-08-16T21:07:00Z" w16du:dateUtc="2026-08-17T01:07:00Z">
-        <w:r>
-          <w:rPr>
-            <w:rFonts w:cs="Times New Roman"/>
-          </w:rPr>
-          <w:t xml:space="preserve">only influence when they match prototypical </w:t>
-        </w:r>
-      </w:ins>
-      <w:ins w:id="806" w:author="Coles, Nicholas A." w:date="2026-08-16T21:08:00Z" w16du:dateUtc="2026-08-17T01:08:00Z">
+      <w:ins w:id="809" w:author="Coles, Nicholas A." w:date="2026-08-16T21:07:00Z" w16du:dateUtc="2026-08-17T01:07:00Z">
+        <w:r>
+          <w:rPr>
+            <w:rFonts w:cs="Times New Roman"/>
+          </w:rPr>
+          <w:t xml:space="preserve">only influence </w:t>
+        </w:r>
+      </w:ins>
+      <w:ins w:id="810" w:author="Coles, Nicholas A." w:date="2026-08-17T02:54:00Z" w16du:dateUtc="2026-08-17T06:54:00Z">
+        <w:r>
+          <w:rPr>
+            <w:rFonts w:cs="Times New Roman"/>
+          </w:rPr>
+          <w:t xml:space="preserve">mood </w:t>
+        </w:r>
+      </w:ins>
+      <w:ins w:id="811" w:author="Coles, Nicholas A." w:date="2026-08-16T21:07:00Z" w16du:dateUtc="2026-08-17T01:07:00Z">
+        <w:r>
+          <w:rPr>
+            <w:rFonts w:cs="Times New Roman"/>
+          </w:rPr>
+          <w:t xml:space="preserve">when they match prototypical </w:t>
+        </w:r>
+      </w:ins>
+      <w:ins w:id="812" w:author="Coles, Nicholas A." w:date="2026-08-16T21:08:00Z" w16du:dateUtc="2026-08-17T01:08:00Z">
         <w:r>
           <w:rPr>
             <w:rFonts w:cs="Times New Roman"/>
@@ -18316,7 +18294,7 @@
           <w:t>expressions</w:t>
         </w:r>
       </w:ins>
-      <w:ins w:id="807" w:author="Coles, Nicholas A." w:date="2026-08-16T21:13:00Z" w16du:dateUtc="2026-08-17T01:13:00Z">
+      <w:ins w:id="813" w:author="Coles, Nicholas A." w:date="2026-08-16T21:13:00Z" w16du:dateUtc="2026-08-17T01:13:00Z">
         <w:r>
           <w:rPr>
             <w:rFonts w:cs="Times New Roman"/>
@@ -18324,7 +18302,7 @@
           <w:t xml:space="preserve"> of emotion</w:t>
         </w:r>
       </w:ins>
-      <w:ins w:id="808" w:author="Coles, Nicholas A." w:date="2026-08-16T21:08:00Z" w16du:dateUtc="2026-08-17T01:08:00Z">
+      <w:ins w:id="814" w:author="Coles, Nicholas A." w:date="2026-08-16T21:08:00Z" w16du:dateUtc="2026-08-17T01:08:00Z">
         <w:r>
           <w:rPr>
             <w:rFonts w:cs="Times New Roman"/>
@@ -18332,7 +18310,7 @@
           <w:t xml:space="preserve"> (Hager &amp; Ekman, 1981; Tomkins, 1981; Matsumoto, 1987; Le</w:t>
         </w:r>
       </w:ins>
-      <w:ins w:id="809" w:author="Coles, Nicholas A." w:date="2026-08-16T21:09:00Z" w16du:dateUtc="2026-08-17T01:09:00Z">
+      <w:ins w:id="815" w:author="Coles, Nicholas A." w:date="2026-08-16T21:09:00Z" w16du:dateUtc="2026-08-17T01:09:00Z">
         <w:r>
           <w:rPr>
             <w:rFonts w:cs="Times New Roman"/>
@@ -18340,7 +18318,7 @@
           <w:t>venson et al., 1992; Ekman, 1993</w:t>
         </w:r>
       </w:ins>
-      <w:ins w:id="810" w:author="Coles, Nicholas A." w:date="2026-08-16T21:08:00Z" w16du:dateUtc="2026-08-17T01:08:00Z">
+      <w:ins w:id="816" w:author="Coles, Nicholas A." w:date="2026-08-16T21:08:00Z" w16du:dateUtc="2026-08-17T01:08:00Z">
         <w:r>
           <w:rPr>
             <w:rFonts w:cs="Times New Roman"/>
@@ -18348,7 +18326,7 @@
           <w:t>)</w:t>
         </w:r>
       </w:ins>
-      <w:ins w:id="811" w:author="Coles, Nicholas A." w:date="2026-08-16T21:09:00Z" w16du:dateUtc="2026-08-17T01:09:00Z">
+      <w:ins w:id="817" w:author="Coles, Nicholas A." w:date="2026-08-16T21:09:00Z" w16du:dateUtc="2026-08-17T01:09:00Z">
         <w:r>
           <w:rPr>
             <w:rFonts w:cs="Times New Roman"/>
@@ -18356,7 +18334,7 @@
           <w:t>.</w:t>
         </w:r>
       </w:ins>
-      <w:ins w:id="812" w:author="Coles, Nicholas A." w:date="2026-08-14T13:20:00Z" w16du:dateUtc="2026-08-14T17:20:00Z">
+      <w:ins w:id="818" w:author="Coles, Nicholas A." w:date="2026-08-14T13:20:00Z" w16du:dateUtc="2026-08-14T17:20:00Z">
         <w:r>
           <w:rPr>
             <w:rFonts w:cs="Times New Roman"/>
@@ -18364,7 +18342,7 @@
           <w:t xml:space="preserve"> </w:t>
         </w:r>
       </w:ins>
-      <w:ins w:id="813" w:author="Coles, Nicholas A." w:date="2026-08-16T21:16:00Z" w16du:dateUtc="2026-08-17T01:16:00Z">
+      <w:ins w:id="819" w:author="Coles, Nicholas A." w:date="2026-08-16T21:16:00Z" w16du:dateUtc="2026-08-17T01:16:00Z">
         <w:r>
           <w:rPr>
             <w:rFonts w:cs="Times New Roman"/>
@@ -18372,15 +18350,39 @@
           <w:t xml:space="preserve">However, only X% of our sample posed smiles </w:t>
         </w:r>
       </w:ins>
-      <w:ins w:id="814" w:author="Coles, Nicholas A." w:date="2026-08-16T21:17:00Z" w16du:dateUtc="2026-08-17T01:17:00Z">
-        <w:r>
-          <w:rPr>
-            <w:rFonts w:cs="Times New Roman"/>
-          </w:rPr>
-          <w:t>whose intensity exceeded pre-registered thresholds. Fortunately,</w:t>
-        </w:r>
-      </w:ins>
-      <w:ins w:id="815" w:author="Coles, Nicholas A." w:date="2026-08-16T21:18:00Z" w16du:dateUtc="2026-08-17T01:18:00Z">
+      <w:ins w:id="820" w:author="Coles, Nicholas A." w:date="2026-08-16T21:17:00Z" w16du:dateUtc="2026-08-17T01:17:00Z">
+        <w:r>
+          <w:rPr>
+            <w:rFonts w:cs="Times New Roman"/>
+          </w:rPr>
+          <w:t xml:space="preserve">whose intensity exceeded </w:t>
+        </w:r>
+      </w:ins>
+      <w:ins w:id="821" w:author="Coles, Nicholas A." w:date="2026-08-17T02:56:00Z" w16du:dateUtc="2026-08-17T06:56:00Z">
+        <w:r>
+          <w:rPr>
+            <w:rFonts w:cs="Times New Roman"/>
+          </w:rPr>
+          <w:t>our initial</w:t>
+        </w:r>
+      </w:ins>
+      <w:ins w:id="822" w:author="Coles, Nicholas A." w:date="2026-08-17T02:57:00Z" w16du:dateUtc="2026-08-17T06:57:00Z">
+        <w:r>
+          <w:rPr>
+            <w:rFonts w:cs="Times New Roman"/>
+          </w:rPr>
+          <w:t xml:space="preserve"> stated </w:t>
+        </w:r>
+      </w:ins>
+      <w:ins w:id="823" w:author="Coles, Nicholas A." w:date="2026-08-16T21:17:00Z" w16du:dateUtc="2026-08-17T01:17:00Z">
+        <w:r>
+          <w:rPr>
+            <w:rFonts w:cs="Times New Roman"/>
+          </w:rPr>
+          <w:t>threshold. Fortunately,</w:t>
+        </w:r>
+      </w:ins>
+      <w:ins w:id="824" w:author="Coles, Nicholas A." w:date="2026-08-16T21:18:00Z" w16du:dateUtc="2026-08-17T01:18:00Z">
         <w:r>
           <w:rPr>
             <w:rFonts w:cs="Times New Roman"/>
@@ -18388,7 +18390,7 @@
           <w:t xml:space="preserve"> similar results were observed regardless of inclusion criteria</w:t>
         </w:r>
       </w:ins>
-      <w:ins w:id="816" w:author="Coles, Nicholas A." w:date="2026-08-16T21:27:00Z" w16du:dateUtc="2026-08-17T01:27:00Z">
+      <w:ins w:id="825" w:author="Coles, Nicholas A." w:date="2026-08-16T21:27:00Z" w16du:dateUtc="2026-08-17T01:27:00Z">
         <w:r>
           <w:rPr>
             <w:rFonts w:cs="Times New Roman"/>
@@ -18400,7 +18402,7 @@
             <w:rFonts w:cs="Times New Roman"/>
             <w:i/>
             <w:iCs/>
-            <w:rPrChange w:id="817" w:author="Coles, Nicholas A." w:date="2026-08-16T21:27:00Z" w16du:dateUtc="2026-08-17T01:27:00Z">
+            <w:rPrChange w:id="826" w:author="Coles, Nicholas A." w:date="2026-08-16T21:27:00Z" w16du:dateUtc="2026-08-17T01:27:00Z">
               <w:rPr>
                 <w:rFonts w:cs="Times New Roman"/>
               </w:rPr>
@@ -18415,7 +18417,7 @@
           <w:t>)</w:t>
         </w:r>
       </w:ins>
-      <w:ins w:id="818" w:author="Coles, Nicholas A." w:date="2026-08-16T21:18:00Z" w16du:dateUtc="2026-08-17T01:18:00Z">
+      <w:ins w:id="827" w:author="Coles, Nicholas A." w:date="2026-08-16T21:18:00Z" w16du:dateUtc="2026-08-17T01:18:00Z">
         <w:r>
           <w:rPr>
             <w:rFonts w:cs="Times New Roman"/>
@@ -18423,7 +18425,7 @@
           <w:t xml:space="preserve"> – suggesting that posed expres</w:t>
         </w:r>
       </w:ins>
-      <w:ins w:id="819" w:author="Coles, Nicholas A." w:date="2026-08-16T21:19:00Z" w16du:dateUtc="2026-08-17T01:19:00Z">
+      <w:ins w:id="828" w:author="Coles, Nicholas A." w:date="2026-08-16T21:19:00Z" w16du:dateUtc="2026-08-17T01:19:00Z">
         <w:r>
           <w:rPr>
             <w:rFonts w:cs="Times New Roman"/>
@@ -18445,7 +18447,7 @@
           <w:t xml:space="preserve"> influence mood (see also Coles et al., 2022, 2023</w:t>
         </w:r>
       </w:ins>
-      <w:ins w:id="820" w:author="Coles, Nicholas A." w:date="2026-08-16T21:24:00Z" w16du:dateUtc="2026-08-17T01:24:00Z">
+      <w:ins w:id="829" w:author="Coles, Nicholas A." w:date="2026-08-16T21:24:00Z" w16du:dateUtc="2026-08-17T01:24:00Z">
         <w:r>
           <w:rPr>
             <w:rFonts w:cs="Times New Roman"/>
@@ -18459,51 +18461,146 @@
         <w:spacing w:before="0"/>
         <w:jc w:val="center"/>
         <w:rPr>
-          <w:ins w:id="821" w:author="Coles, Nicholas A." w:date="2026-08-14T13:30:00Z" w16du:dateUtc="2026-08-14T17:30:00Z"/>
+          <w:ins w:id="830" w:author="Coles, Nicholas A." w:date="2026-08-14T13:30:00Z" w16du:dateUtc="2026-08-14T17:30:00Z"/>
           <w:rFonts w:cs="Times New Roman"/>
           <w:b/>
           <w:bCs/>
         </w:rPr>
-        <w:pPrChange w:id="822" w:author="Coles, Nicholas A." w:date="2026-08-14T13:31:00Z" w16du:dateUtc="2026-08-14T17:31:00Z">
+        <w:pPrChange w:id="831" w:author="Coles, Nicholas A." w:date="2026-08-14T13:31:00Z" w16du:dateUtc="2026-08-14T17:31:00Z">
           <w:pPr>
             <w:spacing w:before="0"/>
             <w:ind w:firstLine="720"/>
           </w:pPr>
         </w:pPrChange>
       </w:pPr>
-      <w:ins w:id="823" w:author="Coles, Nicholas A." w:date="2026-08-14T13:30:00Z" w16du:dateUtc="2026-08-14T17:30:00Z">
+      <w:ins w:id="832" w:author="Coles, Nicholas A." w:date="2026-08-14T13:30:00Z" w16du:dateUtc="2026-08-14T17:30:00Z">
         <w:r>
           <w:rPr>
             <w:rFonts w:cs="Times New Roman"/>
             <w:b/>
             <w:bCs/>
           </w:rPr>
-          <w:t>Conclusion</w:t>
+          <w:t>Conclu</w:t>
+        </w:r>
+      </w:ins>
+      <w:ins w:id="833" w:author="Coles, Nicholas A." w:date="2026-08-17T03:13:00Z" w16du:dateUtc="2026-08-17T07:13:00Z">
+        <w:r>
+          <w:rPr>
+            <w:rFonts w:cs="Times New Roman"/>
+            <w:b/>
+            <w:bCs/>
+          </w:rPr>
+          <w:t>ding Remarks</w:t>
         </w:r>
       </w:ins>
     </w:p>
     <w:p>
       <w:pPr>
         <w:spacing w:before="0"/>
-        <w:rPr>
-          <w:del w:id="824" w:author="Coles, Nicholas A." w:date="2026-08-05T16:28:00Z" w16du:dateUtc="2026-08-05T20:28:00Z"/>
-          <w:rFonts w:cs="Times New Roman"/>
-        </w:rPr>
+        <w:ind w:firstLine="720"/>
+        <w:rPr>
+          <w:del w:id="834" w:author="Coles, Nicholas A." w:date="2026-08-05T16:28:00Z" w16du:dateUtc="2026-08-05T20:28:00Z"/>
+          <w:rFonts w:cs="Times New Roman"/>
+        </w:rPr>
+        <w:pPrChange w:id="835" w:author="Coles, Nicholas A." w:date="2026-08-17T03:23:00Z" w16du:dateUtc="2026-08-17T07:23:00Z">
+          <w:pPr>
+            <w:spacing w:before="0"/>
+          </w:pPr>
+        </w:pPrChange>
       </w:pPr>
-      <w:ins w:id="825" w:author="Coles, Nicholas A." w:date="2026-08-14T13:31:00Z" w16du:dateUtc="2026-08-14T17:31:00Z">
-        <w:r>
-          <w:rPr>
-            <w:rFonts w:cs="Times New Roman"/>
-          </w:rPr>
-          <w:t>&lt;Restate main finding&gt;</w:t>
+      <w:ins w:id="836" w:author="Coles, Nicholas A." w:date="2026-08-17T03:13:00Z" w16du:dateUtc="2026-08-17T07:13:00Z">
+        <w:r>
+          <w:rPr>
+            <w:rFonts w:cs="Times New Roman"/>
+          </w:rPr>
+          <w:t>Although often framed as competing hypotheses</w:t>
+        </w:r>
+      </w:ins>
+      <w:ins w:id="837" w:author="Coles, Nicholas A." w:date="2026-08-17T03:14:00Z" w16du:dateUtc="2026-08-17T07:14:00Z">
+        <w:r>
+          <w:rPr>
+            <w:rFonts w:cs="Times New Roman"/>
+          </w:rPr>
+          <w:t xml:space="preserve">, our results </w:t>
+        </w:r>
+      </w:ins>
+      <w:ins w:id="838" w:author="Coles, Nicholas A." w:date="2026-08-17T03:15:00Z" w16du:dateUtc="2026-08-17T07:15:00Z">
+        <w:r>
+          <w:rPr>
+            <w:rFonts w:cs="Times New Roman"/>
+          </w:rPr>
+          <w:t xml:space="preserve">ultimately </w:t>
+        </w:r>
+      </w:ins>
+      <w:ins w:id="839" w:author="Coles, Nicholas A." w:date="2026-08-17T03:14:00Z" w16du:dateUtc="2026-08-17T07:14:00Z">
+        <w:r>
+          <w:rPr>
+            <w:rFonts w:cs="Times New Roman"/>
+          </w:rPr>
+          <w:t xml:space="preserve">suggest </w:t>
+        </w:r>
+      </w:ins>
+      <w:ins w:id="840" w:author="Coles, Nicholas A." w:date="2026-08-17T03:15:00Z" w16du:dateUtc="2026-08-17T07:15:00Z">
+        <w:r>
+          <w:rPr>
+            <w:rFonts w:cs="Times New Roman"/>
+          </w:rPr>
+          <w:t xml:space="preserve">there is </w:t>
+        </w:r>
+      </w:ins>
+      <w:ins w:id="841" w:author="Coles, Nicholas A." w:date="2026-08-17T03:14:00Z" w16du:dateUtc="2026-08-17T07:14:00Z">
+        <w:r>
+          <w:rPr>
+            <w:rFonts w:cs="Times New Roman"/>
+          </w:rPr>
+          <w:t xml:space="preserve">a duality of posed smiles. </w:t>
+        </w:r>
+        <w:r>
+          <w:rPr>
+            <w:rFonts w:cs="Times New Roman"/>
+          </w:rPr>
+          <w:t xml:space="preserve">In some contexts, posed smiles can </w:t>
+        </w:r>
+      </w:ins>
+      <w:ins w:id="842" w:author="Coles, Nicholas A." w:date="2026-08-17T03:15:00Z" w16du:dateUtc="2026-08-17T07:15:00Z">
+        <w:r>
+          <w:rPr>
+            <w:rFonts w:cs="Times New Roman"/>
+          </w:rPr>
+          <w:t xml:space="preserve">be the source of our happiness – in others </w:t>
+        </w:r>
+      </w:ins>
+      <w:ins w:id="843" w:author="Coles, Nicholas A." w:date="2026-08-17T03:19:00Z" w16du:dateUtc="2026-08-17T07:19:00Z">
+        <w:r>
+          <w:rPr>
+            <w:rFonts w:cs="Times New Roman"/>
+          </w:rPr>
+          <w:t xml:space="preserve">a far more powerful </w:t>
+        </w:r>
+      </w:ins>
+      <w:ins w:id="844" w:author="Coles, Nicholas A." w:date="2026-08-17T03:15:00Z" w16du:dateUtc="2026-08-17T07:15:00Z">
+        <w:r>
+          <w:rPr>
+            <w:rFonts w:cs="Times New Roman"/>
+          </w:rPr>
+          <w:t>source of our misery.</w:t>
+        </w:r>
+      </w:ins>
+      <w:ins w:id="845" w:author="Coles, Nicholas A." w:date="2026-08-17T03:20:00Z" w16du:dateUtc="2026-08-17T07:20:00Z">
+        <w:r>
+          <w:rPr>
+            <w:rFonts w:cs="Times New Roman"/>
+          </w:rPr>
+          <w:t xml:space="preserve"> </w:t>
         </w:r>
       </w:ins>
     </w:p>
     <w:p>
       <w:pPr>
         <w:spacing w:before="0"/>
-        <w:rPr>
-          <w:ins w:id="826" w:author="Coles, Nicholas A." w:date="2026-08-14T13:31:00Z" w16du:dateUtc="2026-08-14T17:31:00Z"/>
+        <w:ind w:firstLine="720"/>
+        <w:rPr>
+          <w:ins w:id="846" w:author="Coles, Nicholas A." w:date="2026-08-14T13:31:00Z" w16du:dateUtc="2026-08-14T17:31:00Z"/>
           <w:rFonts w:cs="Times New Roman"/>
         </w:rPr>
       </w:pPr>
@@ -18512,33 +18609,10 @@
       <w:pPr>
         <w:spacing w:before="0"/>
         <w:rPr>
-          <w:ins w:id="827" w:author="Coles, Nicholas A." w:date="2026-08-14T13:31:00Z" w16du:dateUtc="2026-08-14T17:31:00Z"/>
-          <w:rFonts w:cs="Times New Roman"/>
-        </w:rPr>
-        <w:pPrChange w:id="828" w:author="Coles, Nicholas A." w:date="2026-08-14T10:02:00Z" w16du:dateUtc="2026-08-14T14:02:00Z">
-          <w:pPr>
-            <w:spacing w:before="0"/>
-            <w:ind w:firstLine="720"/>
-          </w:pPr>
-        </w:pPrChange>
-      </w:pPr>
-      <w:ins w:id="829" w:author="Coles, Nicholas A." w:date="2026-08-14T13:31:00Z" w16du:dateUtc="2026-08-14T17:31:00Z">
-        <w:r>
-          <w:rPr>
-            <w:rFonts w:cs="Times New Roman"/>
-          </w:rPr>
-          <w:t>&lt;End on impactful and powerful statement&gt;</w:t>
-        </w:r>
-      </w:ins>
-    </w:p>
-    <w:p>
-      <w:pPr>
-        <w:spacing w:before="0"/>
-        <w:rPr>
-          <w:del w:id="830" w:author="Coles, Nicholas A." w:date="2026-08-05T16:30:00Z" w16du:dateUtc="2026-08-05T20:30:00Z"/>
-          <w:rFonts w:cs="Times New Roman"/>
-        </w:rPr>
-        <w:pPrChange w:id="831" w:author="Coles, Nicholas A." w:date="2026-08-14T10:02:00Z" w16du:dateUtc="2026-08-14T14:02:00Z">
+          <w:del w:id="847" w:author="Coles, Nicholas A." w:date="2026-08-05T16:30:00Z" w16du:dateUtc="2026-08-05T20:30:00Z"/>
+          <w:rFonts w:cs="Times New Roman"/>
+        </w:rPr>
+        <w:pPrChange w:id="848" w:author="Coles, Nicholas A." w:date="2026-08-14T10:02:00Z" w16du:dateUtc="2026-08-14T14:02:00Z">
           <w:pPr>
             <w:spacing w:before="0"/>
             <w:ind w:firstLine="720"/>
@@ -18552,7 +18626,7 @@
         <w:rPr>
           <w:rFonts w:cs="Times New Roman"/>
         </w:rPr>
-        <w:pPrChange w:id="832" w:author="Coles, Nicholas A." w:date="2026-08-14T10:02:00Z" w16du:dateUtc="2026-08-14T14:02:00Z">
+        <w:pPrChange w:id="849" w:author="Coles, Nicholas A." w:date="2026-08-14T10:02:00Z" w16du:dateUtc="2026-08-14T14:02:00Z">
           <w:pPr>
             <w:spacing w:before="0"/>
             <w:ind w:firstLine="720"/>
@@ -25675,7 +25749,6 @@
   <w:style w:type="character" w:default="1" w:styleId="DefaultParagraphFont">
     <w:name w:val="Default Paragraph Font"/>
     <w:uiPriority w:val="1"/>
-    <w:semiHidden/>
     <w:unhideWhenUsed/>
   </w:style>
   <w:style w:type="table" w:default="1" w:styleId="TableNormal">
@@ -27014,6 +27087,15 @@
 </file>
 
 <file path=customXml/item1.xml><?xml version="1.0" encoding="utf-8"?>
+<?mso-contentType ?>
+<FormTemplates xmlns="http://schemas.microsoft.com/sharepoint/v3/contenttype/forms">
+  <Display>DocumentLibraryForm</Display>
+  <Edit>DocumentLibraryForm</Edit>
+  <New>DocumentLibraryForm</New>
+</FormTemplates>
+</file>
+
+<file path=customXml/item2.xml><?xml version="1.0" encoding="utf-8"?>
 <ct:contentTypeSchema xmlns:ct="http://schemas.microsoft.com/office/2006/metadata/contentType" xmlns:ma="http://schemas.microsoft.com/office/2006/metadata/properties/metaAttributes" ct:_="" ma:_="" ma:contentTypeName="Document" ma:contentTypeID="0x0101002E9A67939B0F2B4787EAA086EFF368F8" ma:contentTypeVersion="13" ma:contentTypeDescription="Create a new document." ma:contentTypeScope="" ma:versionID="1e2d45d699f3c022c24befe3d63436e0">
   <xsd:schema xmlns:xsd="http://www.w3.org/2001/XMLSchema" xmlns:xs="http://www.w3.org/2001/XMLSchema" xmlns:p="http://schemas.microsoft.com/office/2006/metadata/properties" xmlns:ns2="7cc633b7-a0d7-44f6-9ebf-b0bcc1d1386b" xmlns:ns3="f1ebdc78-f2a0-4ed8-b1e0-396e97b61f03" targetNamespace="http://schemas.microsoft.com/office/2006/metadata/properties" ma:root="true" ma:fieldsID="6f1289b2472db1d26797b17df202279f" ns2:_="" ns3:_="">
     <xsd:import namespace="7cc633b7-a0d7-44f6-9ebf-b0bcc1d1386b"/>
@@ -27220,20 +27302,7 @@
 </ct:contentTypeSchema>
 </file>
 
-<file path=customXml/item2.xml><?xml version="1.0" encoding="utf-8"?>
-<b:Sources xmlns:b="http://schemas.openxmlformats.org/officeDocument/2006/bibliography" xmlns="http://schemas.openxmlformats.org/officeDocument/2006/bibliography" SelectedStyle="/APASixthEditionOfficeOnline.xsl" StyleName="APA" Version="6"/>
-</file>
-
 <file path=customXml/item3.xml><?xml version="1.0" encoding="utf-8"?>
-<?mso-contentType ?>
-<FormTemplates xmlns="http://schemas.microsoft.com/sharepoint/v3/contenttype/forms">
-  <Display>DocumentLibraryForm</Display>
-  <Edit>DocumentLibraryForm</Edit>
-  <New>DocumentLibraryForm</New>
-</FormTemplates>
-</file>
-
-<file path=customXml/item4.xml><?xml version="1.0" encoding="utf-8"?>
 <p:properties xmlns:p="http://schemas.microsoft.com/office/2006/metadata/properties" xmlns:xsi="http://www.w3.org/2001/XMLSchema-instance" xmlns:pc="http://schemas.microsoft.com/office/infopath/2007/PartnerControls">
   <documentManagement>
     <lcf76f155ced4ddcb4097134ff3c332f xmlns="7cc633b7-a0d7-44f6-9ebf-b0bcc1d1386b">
@@ -27244,7 +27313,19 @@
 </p:properties>
 </file>
 
+<file path=customXml/item4.xml><?xml version="1.0" encoding="utf-8"?>
+<b:Sources xmlns:b="http://schemas.openxmlformats.org/officeDocument/2006/bibliography" xmlns="http://schemas.openxmlformats.org/officeDocument/2006/bibliography" SelectedStyle="/APASixthEditionOfficeOnline.xsl" StyleName="APA" Version="6"/>
+</file>
+
 <file path=customXml/itemProps1.xml><?xml version="1.0" encoding="utf-8"?>
+<ds:datastoreItem xmlns:ds="http://schemas.openxmlformats.org/officeDocument/2006/customXml" ds:itemID="{703402E2-36B3-4ABC-9C86-05E5908464F1}">
+  <ds:schemaRefs>
+    <ds:schemaRef ds:uri="http://schemas.microsoft.com/sharepoint/v3/contenttype/forms"/>
+  </ds:schemaRefs>
+</ds:datastoreItem>
+</file>
+
+<file path=customXml/itemProps2.xml><?xml version="1.0" encoding="utf-8"?>
 <ds:datastoreItem xmlns:ds="http://schemas.openxmlformats.org/officeDocument/2006/customXml" ds:itemID="{D1FC85A0-0764-4F74-84C5-E4214834FDE7}">
   <ds:schemaRefs>
     <ds:schemaRef ds:uri="http://schemas.microsoft.com/office/2006/metadata/contentType"/>
@@ -27263,23 +27344,7 @@
 </ds:datastoreItem>
 </file>
 
-<file path=customXml/itemProps2.xml><?xml version="1.0" encoding="utf-8"?>
-<ds:datastoreItem xmlns:ds="http://schemas.openxmlformats.org/officeDocument/2006/customXml" ds:itemID="{19F2856D-ADF1-EB4E-9755-DA74E0B24BA9}">
-  <ds:schemaRefs>
-    <ds:schemaRef ds:uri="http://schemas.openxmlformats.org/officeDocument/2006/bibliography"/>
-  </ds:schemaRefs>
-</ds:datastoreItem>
-</file>
-
 <file path=customXml/itemProps3.xml><?xml version="1.0" encoding="utf-8"?>
-<ds:datastoreItem xmlns:ds="http://schemas.openxmlformats.org/officeDocument/2006/customXml" ds:itemID="{703402E2-36B3-4ABC-9C86-05E5908464F1}">
-  <ds:schemaRefs>
-    <ds:schemaRef ds:uri="http://schemas.microsoft.com/sharepoint/v3/contenttype/forms"/>
-  </ds:schemaRefs>
-</ds:datastoreItem>
-</file>
-
-<file path=customXml/itemProps4.xml><?xml version="1.0" encoding="utf-8"?>
 <ds:datastoreItem xmlns:ds="http://schemas.openxmlformats.org/officeDocument/2006/customXml" ds:itemID="{A8C7605C-3D8A-46A9-8431-EF4D7F9C1B1F}">
   <ds:schemaRefs>
     <ds:schemaRef ds:uri="http://schemas.microsoft.com/office/2006/metadata/properties"/>
@@ -27288,4 +27353,12 @@
     <ds:schemaRef ds:uri="f1ebdc78-f2a0-4ed8-b1e0-396e97b61f03"/>
   </ds:schemaRefs>
 </ds:datastoreItem>
+</file>
+
+<file path=customXml/itemProps4.xml><?xml version="1.0" encoding="utf-8"?>
+<ds:datastoreItem xmlns:ds="http://schemas.openxmlformats.org/officeDocument/2006/customXml" ds:itemID="{19F2856D-ADF1-EB4E-9755-DA74E0B24BA9}">
+  <ds:schemaRefs>
+    <ds:schemaRef ds:uri="http://schemas.openxmlformats.org/officeDocument/2006/bibliography"/>
+  </ds:schemaRefs>
+</ds:datastoreItem>
 </file>
</xml_diff>